<commit_message>
Interview updated for July 1 2024 to include coercive controlling behavior
</commit_message>
<xml_diff>
--- a/docassemble/RFApackage/data/templates/RFAaffidavit_addendum.docx
+++ b/docassemble/RFApackage/data/templates/RFAaffidavit_addendum.docx
@@ -1,6 +1,6 @@
 
 <file path=word/document.xml><?xml version="1.0" encoding="utf-8"?>
-<w:document xmlns:wpc="http://schemas.microsoft.com/office/word/2010/wordprocessingCanvas" xmlns:cx="http://schemas.microsoft.com/office/drawing/2014/chartex" xmlns:cx1="http://schemas.microsoft.com/office/drawing/2015/9/8/chartex" xmlns:cx2="http://schemas.microsoft.com/office/drawing/2015/10/21/chartex" xmlns:cx3="http://schemas.microsoft.com/office/drawing/2016/5/9/chartex" xmlns:cx4="http://schemas.microsoft.com/office/drawing/2016/5/10/chartex" xmlns:cx5="http://schemas.microsoft.com/office/drawing/2016/5/11/chartex" xmlns:cx6="http://schemas.microsoft.com/office/drawing/2016/5/12/chartex" xmlns:cx7="http://schemas.microsoft.com/office/drawing/2016/5/13/chartex" xmlns:cx8="http://schemas.microsoft.com/office/drawing/2016/5/14/chartex" xmlns:mc="http://schemas.openxmlformats.org/markup-compatibility/2006" xmlns:aink="http://schemas.microsoft.com/office/drawing/2016/ink" xmlns:am3d="http://schemas.microsoft.com/office/drawing/2017/model3d" xmlns:o="urn:schemas-microsoft-com:office:office" xmlns:oel="http://schemas.microsoft.com/office/2019/extlst" xmlns:r="http://schemas.openxmlformats.org/officeDocument/2006/relationships" xmlns:m="http://schemas.openxmlformats.org/officeDocument/2006/math" xmlns:v="urn:schemas-microsoft-com:vml" xmlns:wp14="http://schemas.microsoft.com/office/word/2010/wordprocessingDrawing" xmlns:wp="http://schemas.openxmlformats.org/drawingml/2006/wordprocessingDrawing" xmlns:w10="urn:schemas-microsoft-com:office:word" xmlns:w="http://schemas.openxmlformats.org/wordprocessingml/2006/main" xmlns:w14="http://schemas.microsoft.com/office/word/2010/wordml" xmlns:w15="http://schemas.microsoft.com/office/word/2012/wordml" xmlns:w16cex="http://schemas.microsoft.com/office/word/2018/wordml/cex" xmlns:w16cid="http://schemas.microsoft.com/office/word/2016/wordml/cid" xmlns:w16="http://schemas.microsoft.com/office/word/2018/wordml" xmlns:w16sdtdh="http://schemas.microsoft.com/office/word/2020/wordml/sdtdatahash" xmlns:w16se="http://schemas.microsoft.com/office/word/2015/wordml/symex" xmlns:wpg="http://schemas.microsoft.com/office/word/2010/wordprocessingGroup" xmlns:wpi="http://schemas.microsoft.com/office/word/2010/wordprocessingInk" xmlns:wne="http://schemas.microsoft.com/office/word/2006/wordml" xmlns:wps="http://schemas.microsoft.com/office/word/2010/wordprocessingShape" mc:Ignorable="w14 w15 w16se w16cid w16 w16cex w16sdtdh wp14">
+<w:document xmlns:wpc="http://schemas.microsoft.com/office/word/2010/wordprocessingCanvas" xmlns:cx="http://schemas.microsoft.com/office/drawing/2014/chartex" xmlns:cx1="http://schemas.microsoft.com/office/drawing/2015/9/8/chartex" xmlns:cx2="http://schemas.microsoft.com/office/drawing/2015/10/21/chartex" xmlns:cx3="http://schemas.microsoft.com/office/drawing/2016/5/9/chartex" xmlns:cx4="http://schemas.microsoft.com/office/drawing/2016/5/10/chartex" xmlns:cx5="http://schemas.microsoft.com/office/drawing/2016/5/11/chartex" xmlns:cx6="http://schemas.microsoft.com/office/drawing/2016/5/12/chartex" xmlns:cx7="http://schemas.microsoft.com/office/drawing/2016/5/13/chartex" xmlns:cx8="http://schemas.microsoft.com/office/drawing/2016/5/14/chartex" xmlns:mc="http://schemas.openxmlformats.org/markup-compatibility/2006" xmlns:aink="http://schemas.microsoft.com/office/drawing/2016/ink" xmlns:am3d="http://schemas.microsoft.com/office/drawing/2017/model3d" xmlns:o="urn:schemas-microsoft-com:office:office" xmlns:oel="http://schemas.microsoft.com/office/2019/extlst" xmlns:r="http://schemas.openxmlformats.org/officeDocument/2006/relationships" xmlns:m="http://schemas.openxmlformats.org/officeDocument/2006/math" xmlns:v="urn:schemas-microsoft-com:vml" xmlns:wp14="http://schemas.microsoft.com/office/word/2010/wordprocessingDrawing" xmlns:wp="http://schemas.openxmlformats.org/drawingml/2006/wordprocessingDrawing" xmlns:w10="urn:schemas-microsoft-com:office:word" xmlns:w="http://schemas.openxmlformats.org/wordprocessingml/2006/main" xmlns:w14="http://schemas.microsoft.com/office/word/2010/wordml" xmlns:w15="http://schemas.microsoft.com/office/word/2012/wordml" xmlns:w16cex="http://schemas.microsoft.com/office/word/2018/wordml/cex" xmlns:w16cid="http://schemas.microsoft.com/office/word/2016/wordml/cid" xmlns:w16="http://schemas.microsoft.com/office/word/2018/wordml" xmlns:w16du="http://schemas.microsoft.com/office/word/2023/wordml/word16du" xmlns:w16sdtdh="http://schemas.microsoft.com/office/word/2020/wordml/sdtdatahash" xmlns:w16se="http://schemas.microsoft.com/office/word/2015/wordml/symex" xmlns:wpg="http://schemas.microsoft.com/office/word/2010/wordprocessingGroup" xmlns:wpi="http://schemas.microsoft.com/office/word/2010/wordprocessingInk" xmlns:wne="http://schemas.microsoft.com/office/word/2006/wordml" xmlns:wps="http://schemas.microsoft.com/office/word/2010/wordprocessingShape" mc:Ignorable="w14 w15 w16se w16cid w16 w16cex w16sdtdh w16du wp14">
   <w:body>
     <w:p>
       <w:pPr>
@@ -10,9 +10,79 @@
           <w:numId w:val="2"/>
         </w:numPr>
         <w:jc w:val="center"/>
-      </w:pPr>
-      <w:r>
+        <w:rPr>
+          <w:rFonts w:ascii="Arial" w:hAnsi="Arial" w:cs="Arial"/>
+          <w:sz w:val="32"/>
+          <w:szCs w:val="32"/>
+        </w:rPr>
+      </w:pPr>
+      <w:r>
+        <w:rPr>
+          <w:rFonts w:ascii="Arial" w:hAnsi="Arial" w:cs="Arial"/>
+          <w:sz w:val="32"/>
+          <w:szCs w:val="32"/>
+        </w:rPr>
         <w:t>ADDENDUM</w:t>
+      </w:r>
+    </w:p>
+    <w:p>
+      <w:pPr>
+        <w:pStyle w:val="Heading2"/>
+        <w:spacing w:before="0"/>
+        <w:jc w:val="center"/>
+        <w:rPr>
+          <w:rFonts w:ascii="Arial" w:hAnsi="Arial" w:cs="Arial"/>
+          <w:sz w:val="28"/>
+          <w:szCs w:val="28"/>
+        </w:rPr>
+      </w:pPr>
+      <w:r>
+        <w:rPr>
+          <w:rFonts w:ascii="Arial" w:hAnsi="Arial" w:cs="Arial"/>
+          <w:sz w:val="28"/>
+          <w:szCs w:val="28"/>
+        </w:rPr>
+        <w:t>Affidavit in Support of Relief from Abuse Complaint</w:t>
+      </w:r>
+    </w:p>
+    <w:p>
+      <w:pPr>
+        <w:pStyle w:val="Heading2"/>
+        <w:spacing w:before="0"/>
+        <w:jc w:val="center"/>
+        <w:rPr>
+          <w:rFonts w:ascii="Arial" w:hAnsi="Arial" w:cs="Arial"/>
+          <w:sz w:val="28"/>
+          <w:szCs w:val="28"/>
+        </w:rPr>
+      </w:pPr>
+      <w:r>
+        <w:rPr>
+          <w:rFonts w:ascii="Arial" w:hAnsi="Arial" w:cs="Arial"/>
+          <w:sz w:val="28"/>
+          <w:szCs w:val="28"/>
+        </w:rPr>
+        <w:t>Family Division, {{ trial_court.address.county }} Unit</w:t>
+      </w:r>
+    </w:p>
+    <w:p>
+      <w:pPr>
+        <w:pStyle w:val="Heading2"/>
+        <w:spacing w:before="0"/>
+        <w:jc w:val="center"/>
+        <w:rPr>
+          <w:rFonts w:ascii="Arial" w:hAnsi="Arial" w:cs="Arial"/>
+          <w:sz w:val="28"/>
+          <w:szCs w:val="28"/>
+        </w:rPr>
+      </w:pPr>
+      <w:r>
+        <w:rPr>
+          <w:rFonts w:ascii="Arial" w:hAnsi="Arial" w:cs="Arial"/>
+          <w:sz w:val="28"/>
+          <w:szCs w:val="28"/>
+        </w:rPr>
+        <w:t>{{ users[0] }} v. {{ other_parties[0] }}</w:t>
       </w:r>
     </w:p>
     <w:p>
@@ -24,249 +94,106 @@
         <w:spacing w:after="0" w:line="240" w:lineRule="auto"/>
         <w:jc w:val="center"/>
         <w:rPr>
-          <w:rFonts w:cstheme="minorHAnsi"/>
-          <w:sz w:val="24"/>
-          <w:szCs w:val="24"/>
-        </w:rPr>
-      </w:pPr>
-      <w:r>
-        <w:rPr>
-          <w:rFonts w:cstheme="minorHAnsi"/>
-          <w:sz w:val="24"/>
-          <w:szCs w:val="24"/>
-        </w:rPr>
-        <w:t>FAMILY DIVISION</w:t>
-      </w:r>
+          <w:rFonts w:ascii="Arial" w:hAnsi="Arial" w:cs="Arial"/>
+          <w:sz w:val="24"/>
+          <w:szCs w:val="24"/>
+        </w:rPr>
+      </w:pPr>
     </w:p>
     <w:p>
       <w:pPr>
-        <w:numPr>
-          <w:ilvl w:val="0"/>
-          <w:numId w:val="2"/>
-        </w:numPr>
-        <w:spacing w:after="0" w:line="240" w:lineRule="auto"/>
-        <w:jc w:val="center"/>
-        <w:rPr>
-          <w:rFonts w:cstheme="minorHAnsi"/>
-          <w:sz w:val="24"/>
-          <w:szCs w:val="24"/>
-        </w:rPr>
-      </w:pPr>
-      <w:r>
-        <w:rPr>
-          <w:rFonts w:cstheme="minorHAnsi"/>
-          <w:sz w:val="24"/>
-          <w:szCs w:val="24"/>
-        </w:rPr>
-        <w:t>SUPERIOR</w:t>
-      </w:r>
-      <w:r>
-        <w:rPr>
-          <w:rFonts w:cstheme="minorHAnsi"/>
-          <w:sz w:val="24"/>
-          <w:szCs w:val="24"/>
-        </w:rPr>
-        <w:t xml:space="preserve"> COURT</w:t>
+        <w:rPr>
+          <w:rFonts w:ascii="Arial" w:hAnsi="Arial" w:cs="Arial"/>
+          <w:sz w:val="24"/>
+          <w:szCs w:val="24"/>
+        </w:rPr>
+      </w:pPr>
+      <w:r>
+        <w:rPr>
+          <w:rFonts w:ascii="Arial" w:hAnsi="Arial" w:cs="Arial"/>
+          <w:sz w:val="24"/>
+          <w:szCs w:val="24"/>
+        </w:rPr>
+        <w:t xml:space="preserve">{%p for field in </w:t>
+      </w:r>
+      <w:r>
+        <w:rPr>
+          <w:rFonts w:ascii="Arial" w:hAnsi="Arial" w:cs="Arial"/>
+          <w:sz w:val="24"/>
+          <w:szCs w:val="24"/>
+        </w:rPr>
+        <w:t>RFAaffidavit</w:t>
+      </w:r>
+      <w:r>
+        <w:rPr>
+          <w:rFonts w:ascii="Arial" w:hAnsi="Arial" w:cs="Arial"/>
+          <w:sz w:val="24"/>
+          <w:szCs w:val="24"/>
+        </w:rPr>
+        <w:t>.overflow() %}</w:t>
       </w:r>
     </w:p>
     <w:p>
       <w:pPr>
-        <w:numPr>
-          <w:ilvl w:val="0"/>
-          <w:numId w:val="2"/>
-        </w:numPr>
-        <w:spacing w:after="0" w:line="240" w:lineRule="auto"/>
-        <w:jc w:val="center"/>
-        <w:rPr>
-          <w:rFonts w:cstheme="minorHAnsi"/>
-          <w:sz w:val="24"/>
-          <w:szCs w:val="24"/>
-        </w:rPr>
-      </w:pPr>
-      <w:proofErr w:type="gramStart"/>
-      <w:r>
-        <w:rPr>
-          <w:rFonts w:cstheme="minorHAnsi"/>
-          <w:sz w:val="24"/>
-          <w:szCs w:val="24"/>
-        </w:rPr>
-        <w:t xml:space="preserve">{{ </w:t>
-      </w:r>
-      <w:proofErr w:type="spellStart"/>
-      <w:r>
-        <w:rPr>
-          <w:rFonts w:cstheme="minorHAnsi"/>
-          <w:sz w:val="24"/>
-          <w:szCs w:val="24"/>
-        </w:rPr>
-        <w:t>trial</w:t>
-      </w:r>
-      <w:proofErr w:type="gramEnd"/>
-      <w:r>
-        <w:rPr>
-          <w:rFonts w:cstheme="minorHAnsi"/>
-          <w:sz w:val="24"/>
-          <w:szCs w:val="24"/>
-        </w:rPr>
-        <w:t>_court</w:t>
-      </w:r>
-      <w:r>
-        <w:rPr>
-          <w:rFonts w:cstheme="minorHAnsi"/>
-          <w:sz w:val="24"/>
-          <w:szCs w:val="24"/>
-        </w:rPr>
-        <w:t>.address.county</w:t>
-      </w:r>
-      <w:proofErr w:type="spellEnd"/>
-      <w:r>
-        <w:rPr>
-          <w:rFonts w:cstheme="minorHAnsi"/>
-          <w:sz w:val="24"/>
-          <w:szCs w:val="24"/>
-        </w:rPr>
-        <w:t xml:space="preserve"> }}</w:t>
+        <w:rPr>
+          <w:rFonts w:ascii="Arial" w:hAnsi="Arial" w:cs="Arial"/>
+          <w:sz w:val="24"/>
+          <w:szCs w:val="24"/>
+        </w:rPr>
+      </w:pPr>
+      <w:r>
+        <w:rPr>
+          <w:rFonts w:ascii="Arial" w:hAnsi="Arial" w:cs="Arial"/>
+          <w:sz w:val="24"/>
+          <w:szCs w:val="24"/>
+        </w:rPr>
+        <w:t>{%p if field.is_</w:t>
+      </w:r>
+      <w:r>
+        <w:rPr>
+          <w:rFonts w:ascii="Arial" w:hAnsi="Arial" w:cs="Arial"/>
+          <w:sz w:val="24"/>
+          <w:szCs w:val="24"/>
+        </w:rPr>
+        <w:t>object_list</w:t>
+      </w:r>
+      <w:r>
+        <w:rPr>
+          <w:rFonts w:ascii="Arial" w:hAnsi="Arial" w:cs="Arial"/>
+          <w:sz w:val="24"/>
+          <w:szCs w:val="24"/>
+        </w:rPr>
+        <w:t xml:space="preserve">() %} </w:t>
       </w:r>
     </w:p>
     <w:p>
       <w:pPr>
-        <w:numPr>
-          <w:ilvl w:val="0"/>
-          <w:numId w:val="2"/>
-        </w:numPr>
-        <w:spacing w:after="0" w:line="240" w:lineRule="auto"/>
-        <w:jc w:val="center"/>
-        <w:rPr>
-          <w:rFonts w:cstheme="minorHAnsi"/>
-          <w:sz w:val="24"/>
-          <w:szCs w:val="24"/>
-        </w:rPr>
-      </w:pPr>
-    </w:p>
-    <w:p>
-      <w:pPr>
-        <w:rPr>
-          <w:rFonts w:cstheme="minorHAnsi"/>
-          <w:sz w:val="24"/>
-          <w:szCs w:val="24"/>
-        </w:rPr>
-      </w:pPr>
-      <w:r>
-        <w:rPr>
-          <w:rFonts w:cstheme="minorHAnsi"/>
-          <w:sz w:val="24"/>
-          <w:szCs w:val="24"/>
-        </w:rPr>
-        <w:t xml:space="preserve">{%p for field in </w:t>
-      </w:r>
-      <w:proofErr w:type="spellStart"/>
-      <w:r>
-        <w:rPr>
-          <w:rFonts w:cstheme="minorHAnsi"/>
-          <w:sz w:val="24"/>
-          <w:szCs w:val="24"/>
-        </w:rPr>
-        <w:t>RFAaffidavit</w:t>
-      </w:r>
-      <w:r>
-        <w:rPr>
-          <w:rFonts w:cstheme="minorHAnsi"/>
-          <w:sz w:val="24"/>
-          <w:szCs w:val="24"/>
-        </w:rPr>
-        <w:t>.overflow</w:t>
-      </w:r>
-      <w:proofErr w:type="spellEnd"/>
-      <w:r>
-        <w:rPr>
-          <w:rFonts w:cstheme="minorHAnsi"/>
-          <w:sz w:val="24"/>
-          <w:szCs w:val="24"/>
-        </w:rPr>
-        <w:t>() %}</w:t>
-      </w:r>
-    </w:p>
-    <w:p>
-      <w:pPr>
-        <w:rPr>
-          <w:rFonts w:cstheme="minorHAnsi"/>
-          <w:sz w:val="24"/>
-          <w:szCs w:val="24"/>
-        </w:rPr>
-      </w:pPr>
-      <w:r>
-        <w:rPr>
-          <w:rFonts w:cstheme="minorHAnsi"/>
-          <w:sz w:val="24"/>
-          <w:szCs w:val="24"/>
-        </w:rPr>
-        <w:t xml:space="preserve">{%p if </w:t>
-      </w:r>
-      <w:proofErr w:type="spellStart"/>
-      <w:r>
-        <w:rPr>
-          <w:rFonts w:cstheme="minorHAnsi"/>
-          <w:sz w:val="24"/>
-          <w:szCs w:val="24"/>
-        </w:rPr>
-        <w:t>field.is_</w:t>
-      </w:r>
-      <w:r>
-        <w:rPr>
-          <w:rFonts w:cstheme="minorHAnsi"/>
-          <w:sz w:val="24"/>
-          <w:szCs w:val="24"/>
-        </w:rPr>
-        <w:t>object_list</w:t>
-      </w:r>
-      <w:proofErr w:type="spellEnd"/>
-      <w:r>
-        <w:rPr>
-          <w:rFonts w:cstheme="minorHAnsi"/>
-          <w:sz w:val="24"/>
-          <w:szCs w:val="24"/>
-        </w:rPr>
-        <w:t xml:space="preserve">() %} </w:t>
-      </w:r>
-    </w:p>
-    <w:p>
-      <w:pPr>
         <w:pStyle w:val="Heading2"/>
         <w:rPr>
-          <w:rFonts w:asciiTheme="minorHAnsi" w:hAnsiTheme="minorHAnsi" w:cstheme="minorHAnsi"/>
-          <w:sz w:val="24"/>
-          <w:szCs w:val="24"/>
-        </w:rPr>
-      </w:pPr>
-      <w:r>
-        <w:rPr>
-          <w:rFonts w:asciiTheme="minorHAnsi" w:hAnsiTheme="minorHAnsi" w:cstheme="minorHAnsi"/>
-          <w:sz w:val="24"/>
-          <w:szCs w:val="24"/>
-        </w:rPr>
-        <w:t xml:space="preserve">{{ </w:t>
-      </w:r>
-      <w:proofErr w:type="spellStart"/>
-      <w:r>
-        <w:rPr>
-          <w:rFonts w:asciiTheme="minorHAnsi" w:hAnsiTheme="minorHAnsi" w:cstheme="minorHAnsi"/>
-          <w:sz w:val="24"/>
-          <w:szCs w:val="24"/>
-        </w:rPr>
-        <w:t>field.</w:t>
-      </w:r>
-      <w:r>
-        <w:rPr>
-          <w:rFonts w:asciiTheme="minorHAnsi" w:hAnsiTheme="minorHAnsi" w:cstheme="minorHAnsi"/>
+          <w:rFonts w:ascii="Arial" w:hAnsi="Arial" w:cs="Arial"/>
+          <w:sz w:val="24"/>
+          <w:szCs w:val="24"/>
+        </w:rPr>
+      </w:pPr>
+      <w:r>
+        <w:rPr>
+          <w:rFonts w:ascii="Arial" w:hAnsi="Arial" w:cs="Arial"/>
+          <w:sz w:val="24"/>
+          <w:szCs w:val="24"/>
+        </w:rPr>
+        <w:t>{{ field.</w:t>
+      </w:r>
+      <w:r>
+        <w:rPr>
+          <w:rFonts w:ascii="Arial" w:hAnsi="Arial" w:cs="Arial"/>
           <w:sz w:val="24"/>
           <w:szCs w:val="24"/>
         </w:rPr>
         <w:t>label</w:t>
       </w:r>
-      <w:proofErr w:type="spellEnd"/>
-      <w:r>
-        <w:rPr>
-          <w:rFonts w:asciiTheme="minorHAnsi" w:hAnsiTheme="minorHAnsi" w:cstheme="minorHAnsi"/>
+      <w:r>
+        <w:rPr>
+          <w:rFonts w:ascii="Arial" w:hAnsi="Arial" w:cs="Arial"/>
           <w:sz w:val="24"/>
           <w:szCs w:val="24"/>
         </w:rPr>
@@ -292,7 +219,7 @@
           <w:p>
             <w:pPr>
               <w:rPr>
-                <w:rFonts w:cstheme="minorHAnsi"/>
+                <w:rFonts w:ascii="Arial" w:hAnsi="Arial" w:cs="Arial"/>
                 <w:b/>
                 <w:sz w:val="24"/>
                 <w:szCs w:val="24"/>
@@ -300,7 +227,7 @@
             </w:pPr>
             <w:r>
               <w:rPr>
-                <w:rFonts w:cstheme="minorHAnsi"/>
+                <w:rFonts w:ascii="Arial" w:hAnsi="Arial" w:cs="Arial"/>
                 <w:b/>
                 <w:sz w:val="24"/>
                 <w:szCs w:val="24"/>
@@ -310,7 +237,7 @@
             <w:proofErr w:type="spellStart"/>
             <w:r>
               <w:rPr>
-                <w:rFonts w:cstheme="minorHAnsi"/>
+                <w:rFonts w:ascii="Arial" w:hAnsi="Arial" w:cs="Arial"/>
                 <w:b/>
                 <w:sz w:val="24"/>
                 <w:szCs w:val="24"/>
@@ -320,7 +247,7 @@
             <w:proofErr w:type="spellEnd"/>
             <w:r>
               <w:rPr>
-                <w:rFonts w:cstheme="minorHAnsi"/>
+                <w:rFonts w:ascii="Arial" w:hAnsi="Arial" w:cs="Arial"/>
                 <w:b/>
                 <w:sz w:val="24"/>
                 <w:szCs w:val="24"/>
@@ -330,7 +257,7 @@
             <w:proofErr w:type="spellStart"/>
             <w:r>
               <w:rPr>
-                <w:rFonts w:cstheme="minorHAnsi"/>
+                <w:rFonts w:ascii="Arial" w:hAnsi="Arial" w:cs="Arial"/>
                 <w:b/>
                 <w:sz w:val="24"/>
                 <w:szCs w:val="24"/>
@@ -340,7 +267,7 @@
             <w:proofErr w:type="spellEnd"/>
             <w:r>
               <w:rPr>
-                <w:rFonts w:cstheme="minorHAnsi"/>
+                <w:rFonts w:ascii="Arial" w:hAnsi="Arial" w:cs="Arial"/>
                 <w:b/>
                 <w:sz w:val="24"/>
                 <w:szCs w:val="24"/>
@@ -356,7 +283,7 @@
           <w:p>
             <w:pPr>
               <w:rPr>
-                <w:rFonts w:cstheme="minorHAnsi"/>
+                <w:rFonts w:ascii="Arial" w:hAnsi="Arial" w:cs="Arial"/>
                 <w:b/>
                 <w:sz w:val="24"/>
                 <w:szCs w:val="24"/>
@@ -364,7 +291,7 @@
             </w:pPr>
             <w:r>
               <w:rPr>
-                <w:rFonts w:cstheme="minorHAnsi"/>
+                <w:rFonts w:ascii="Arial" w:hAnsi="Arial" w:cs="Arial"/>
                 <w:b/>
                 <w:sz w:val="24"/>
                 <w:szCs w:val="24"/>
@@ -373,7 +300,7 @@
             </w:r>
             <w:r>
               <w:rPr>
-                <w:rFonts w:cstheme="minorHAnsi"/>
+                <w:rFonts w:ascii="Arial" w:hAnsi="Arial" w:cs="Arial"/>
                 <w:b/>
                 <w:sz w:val="24"/>
                 <w:szCs w:val="24"/>
@@ -382,7 +309,7 @@
             </w:r>
             <w:r>
               <w:rPr>
-                <w:rFonts w:cstheme="minorHAnsi"/>
+                <w:rFonts w:ascii="Arial" w:hAnsi="Arial" w:cs="Arial"/>
                 <w:b/>
                 <w:sz w:val="24"/>
                 <w:szCs w:val="24"/>
@@ -398,7 +325,7 @@
           <w:p>
             <w:pPr>
               <w:rPr>
-                <w:rFonts w:cstheme="minorHAnsi"/>
+                <w:rFonts w:ascii="Arial" w:hAnsi="Arial" w:cs="Arial"/>
                 <w:b/>
                 <w:sz w:val="24"/>
                 <w:szCs w:val="24"/>
@@ -406,7 +333,7 @@
             </w:pPr>
             <w:r>
               <w:rPr>
-                <w:rFonts w:cstheme="minorHAnsi"/>
+                <w:rFonts w:ascii="Arial" w:hAnsi="Arial" w:cs="Arial"/>
                 <w:b/>
                 <w:sz w:val="24"/>
                 <w:szCs w:val="24"/>
@@ -416,7 +343,7 @@
             <w:proofErr w:type="spellStart"/>
             <w:r>
               <w:rPr>
-                <w:rFonts w:cstheme="minorHAnsi"/>
+                <w:rFonts w:ascii="Arial" w:hAnsi="Arial" w:cs="Arial"/>
                 <w:b/>
                 <w:sz w:val="24"/>
                 <w:szCs w:val="24"/>
@@ -426,7 +353,7 @@
             <w:proofErr w:type="spellEnd"/>
             <w:r>
               <w:rPr>
-                <w:rFonts w:cstheme="minorHAnsi"/>
+                <w:rFonts w:ascii="Arial" w:hAnsi="Arial" w:cs="Arial"/>
                 <w:b/>
                 <w:sz w:val="24"/>
                 <w:szCs w:val="24"/>
@@ -436,7 +363,7 @@
             <w:proofErr w:type="spellStart"/>
             <w:r>
               <w:rPr>
-                <w:rFonts w:cstheme="minorHAnsi"/>
+                <w:rFonts w:ascii="Arial" w:hAnsi="Arial" w:cs="Arial"/>
                 <w:b/>
                 <w:sz w:val="24"/>
                 <w:szCs w:val="24"/>
@@ -446,7 +373,7 @@
             <w:proofErr w:type="spellEnd"/>
             <w:r>
               <w:rPr>
-                <w:rFonts w:cstheme="minorHAnsi"/>
+                <w:rFonts w:ascii="Arial" w:hAnsi="Arial" w:cs="Arial"/>
                 <w:b/>
                 <w:sz w:val="24"/>
                 <w:szCs w:val="24"/>
@@ -464,14 +391,14 @@
           <w:p>
             <w:pPr>
               <w:rPr>
-                <w:rFonts w:cstheme="minorHAnsi"/>
+                <w:rFonts w:ascii="Arial" w:hAnsi="Arial" w:cs="Arial"/>
                 <w:sz w:val="24"/>
                 <w:szCs w:val="24"/>
               </w:rPr>
             </w:pPr>
             <w:r>
               <w:rPr>
-                <w:rFonts w:cstheme="minorHAnsi"/>
+                <w:rFonts w:ascii="Arial" w:hAnsi="Arial" w:cs="Arial"/>
                 <w:sz w:val="24"/>
                 <w:szCs w:val="24"/>
               </w:rPr>
@@ -480,7 +407,7 @@
             <w:proofErr w:type="spellStart"/>
             <w:r>
               <w:rPr>
-                <w:rFonts w:cstheme="minorHAnsi"/>
+                <w:rFonts w:ascii="Arial" w:hAnsi="Arial" w:cs="Arial"/>
                 <w:sz w:val="24"/>
                 <w:szCs w:val="24"/>
               </w:rPr>
@@ -489,7 +416,7 @@
             <w:proofErr w:type="spellEnd"/>
             <w:r>
               <w:rPr>
-                <w:rFonts w:cstheme="minorHAnsi"/>
+                <w:rFonts w:ascii="Arial" w:hAnsi="Arial" w:cs="Arial"/>
                 <w:sz w:val="24"/>
                 <w:szCs w:val="24"/>
               </w:rPr>
@@ -504,7 +431,7 @@
           <w:p>
             <w:pPr>
               <w:rPr>
-                <w:rFonts w:cstheme="minorHAnsi"/>
+                <w:rFonts w:ascii="Arial" w:hAnsi="Arial" w:cs="Arial"/>
                 <w:sz w:val="24"/>
                 <w:szCs w:val="24"/>
               </w:rPr>
@@ -518,7 +445,7 @@
           <w:p>
             <w:pPr>
               <w:rPr>
-                <w:rFonts w:cstheme="minorHAnsi"/>
+                <w:rFonts w:ascii="Arial" w:hAnsi="Arial" w:cs="Arial"/>
                 <w:sz w:val="24"/>
                 <w:szCs w:val="24"/>
               </w:rPr>
@@ -534,14 +461,14 @@
           <w:p>
             <w:pPr>
               <w:rPr>
-                <w:rFonts w:cstheme="minorHAnsi"/>
+                <w:rFonts w:ascii="Arial" w:hAnsi="Arial" w:cs="Arial"/>
                 <w:sz w:val="24"/>
                 <w:szCs w:val="24"/>
               </w:rPr>
             </w:pPr>
             <w:r>
               <w:rPr>
-                <w:rFonts w:cstheme="minorHAnsi"/>
+                <w:rFonts w:ascii="Arial" w:hAnsi="Arial" w:cs="Arial"/>
                 <w:sz w:val="24"/>
                 <w:szCs w:val="24"/>
               </w:rPr>
@@ -550,7 +477,7 @@
             <w:proofErr w:type="spellStart"/>
             <w:r>
               <w:rPr>
-                <w:rFonts w:cstheme="minorHAnsi"/>
+                <w:rFonts w:ascii="Arial" w:hAnsi="Arial" w:cs="Arial"/>
                 <w:sz w:val="24"/>
                 <w:szCs w:val="24"/>
               </w:rPr>
@@ -559,7 +486,7 @@
             <w:proofErr w:type="spellEnd"/>
             <w:r>
               <w:rPr>
-                <w:rFonts w:cstheme="minorHAnsi"/>
+                <w:rFonts w:ascii="Arial" w:hAnsi="Arial" w:cs="Arial"/>
                 <w:sz w:val="24"/>
                 <w:szCs w:val="24"/>
               </w:rPr>
@@ -568,7 +495,7 @@
             <w:proofErr w:type="spellStart"/>
             <w:r>
               <w:rPr>
-                <w:rFonts w:cstheme="minorHAnsi"/>
+                <w:rFonts w:ascii="Arial" w:hAnsi="Arial" w:cs="Arial"/>
                 <w:sz w:val="24"/>
                 <w:szCs w:val="24"/>
               </w:rPr>
@@ -577,7 +504,7 @@
             <w:proofErr w:type="spellEnd"/>
             <w:r>
               <w:rPr>
-                <w:rFonts w:cstheme="minorHAnsi"/>
+                <w:rFonts w:ascii="Arial" w:hAnsi="Arial" w:cs="Arial"/>
                 <w:sz w:val="24"/>
                 <w:szCs w:val="24"/>
               </w:rPr>
@@ -592,14 +519,14 @@
           <w:p>
             <w:pPr>
               <w:rPr>
-                <w:rFonts w:cstheme="minorHAnsi"/>
+                <w:rFonts w:ascii="Arial" w:hAnsi="Arial" w:cs="Arial"/>
                 <w:sz w:val="24"/>
                 <w:szCs w:val="24"/>
               </w:rPr>
             </w:pPr>
             <w:r>
               <w:rPr>
-                <w:rFonts w:cstheme="minorHAnsi"/>
+                <w:rFonts w:ascii="Arial" w:hAnsi="Arial" w:cs="Arial"/>
                 <w:sz w:val="24"/>
                 <w:szCs w:val="24"/>
               </w:rPr>
@@ -608,7 +535,7 @@
             <w:proofErr w:type="spellStart"/>
             <w:r>
               <w:rPr>
-                <w:rFonts w:cstheme="minorHAnsi"/>
+                <w:rFonts w:ascii="Arial" w:hAnsi="Arial" w:cs="Arial"/>
                 <w:sz w:val="24"/>
                 <w:szCs w:val="24"/>
               </w:rPr>
@@ -617,7 +544,7 @@
             <w:proofErr w:type="spellEnd"/>
             <w:r>
               <w:rPr>
-                <w:rFonts w:cstheme="minorHAnsi"/>
+                <w:rFonts w:ascii="Arial" w:hAnsi="Arial" w:cs="Arial"/>
                 <w:sz w:val="24"/>
                 <w:szCs w:val="24"/>
               </w:rPr>
@@ -632,14 +559,14 @@
           <w:p>
             <w:pPr>
               <w:rPr>
-                <w:rFonts w:cstheme="minorHAnsi"/>
+                <w:rFonts w:ascii="Arial" w:hAnsi="Arial" w:cs="Arial"/>
                 <w:sz w:val="24"/>
                 <w:szCs w:val="24"/>
               </w:rPr>
             </w:pPr>
             <w:r>
               <w:rPr>
-                <w:rFonts w:cstheme="minorHAnsi"/>
+                <w:rFonts w:ascii="Arial" w:hAnsi="Arial" w:cs="Arial"/>
                 <w:sz w:val="24"/>
                 <w:szCs w:val="24"/>
               </w:rPr>
@@ -648,7 +575,7 @@
             <w:proofErr w:type="spellStart"/>
             <w:r>
               <w:rPr>
-                <w:rFonts w:cstheme="minorHAnsi"/>
+                <w:rFonts w:ascii="Arial" w:hAnsi="Arial" w:cs="Arial"/>
                 <w:sz w:val="24"/>
                 <w:szCs w:val="24"/>
               </w:rPr>
@@ -657,7 +584,7 @@
             <w:proofErr w:type="spellEnd"/>
             <w:r>
               <w:rPr>
-                <w:rFonts w:cstheme="minorHAnsi"/>
+                <w:rFonts w:ascii="Arial" w:hAnsi="Arial" w:cs="Arial"/>
                 <w:sz w:val="24"/>
                 <w:szCs w:val="24"/>
               </w:rPr>
@@ -666,7 +593,7 @@
             <w:proofErr w:type="spellStart"/>
             <w:r>
               <w:rPr>
-                <w:rFonts w:cstheme="minorHAnsi"/>
+                <w:rFonts w:ascii="Arial" w:hAnsi="Arial" w:cs="Arial"/>
                 <w:sz w:val="24"/>
                 <w:szCs w:val="24"/>
               </w:rPr>
@@ -675,7 +602,7 @@
             <w:proofErr w:type="spellEnd"/>
             <w:r>
               <w:rPr>
-                <w:rFonts w:cstheme="minorHAnsi"/>
+                <w:rFonts w:ascii="Arial" w:hAnsi="Arial" w:cs="Arial"/>
                 <w:sz w:val="24"/>
                 <w:szCs w:val="24"/>
               </w:rPr>
@@ -692,14 +619,14 @@
           <w:p>
             <w:pPr>
               <w:rPr>
-                <w:rFonts w:cstheme="minorHAnsi"/>
+                <w:rFonts w:ascii="Arial" w:hAnsi="Arial" w:cs="Arial"/>
                 <w:sz w:val="24"/>
                 <w:szCs w:val="24"/>
               </w:rPr>
             </w:pPr>
             <w:r>
               <w:rPr>
-                <w:rFonts w:cstheme="minorHAnsi"/>
+                <w:rFonts w:ascii="Arial" w:hAnsi="Arial" w:cs="Arial"/>
                 <w:sz w:val="24"/>
                 <w:szCs w:val="24"/>
               </w:rPr>
@@ -708,7 +635,7 @@
             <w:proofErr w:type="spellStart"/>
             <w:r>
               <w:rPr>
-                <w:rFonts w:cstheme="minorHAnsi"/>
+                <w:rFonts w:ascii="Arial" w:hAnsi="Arial" w:cs="Arial"/>
                 <w:sz w:val="24"/>
                 <w:szCs w:val="24"/>
               </w:rPr>
@@ -717,7 +644,7 @@
             <w:proofErr w:type="spellEnd"/>
             <w:r>
               <w:rPr>
-                <w:rFonts w:cstheme="minorHAnsi"/>
+                <w:rFonts w:ascii="Arial" w:hAnsi="Arial" w:cs="Arial"/>
                 <w:sz w:val="24"/>
                 <w:szCs w:val="24"/>
               </w:rPr>
@@ -732,7 +659,7 @@
           <w:p>
             <w:pPr>
               <w:rPr>
-                <w:rFonts w:cstheme="minorHAnsi"/>
+                <w:rFonts w:ascii="Arial" w:hAnsi="Arial" w:cs="Arial"/>
                 <w:sz w:val="24"/>
                 <w:szCs w:val="24"/>
               </w:rPr>
@@ -746,7 +673,7 @@
           <w:p>
             <w:pPr>
               <w:rPr>
-                <w:rFonts w:cstheme="minorHAnsi"/>
+                <w:rFonts w:ascii="Arial" w:hAnsi="Arial" w:cs="Arial"/>
                 <w:sz w:val="24"/>
                 <w:szCs w:val="24"/>
               </w:rPr>
@@ -758,7 +685,7 @@
     <w:p>
       <w:pPr>
         <w:rPr>
-          <w:rFonts w:cstheme="minorHAnsi"/>
+          <w:rFonts w:ascii="Arial" w:hAnsi="Arial" w:cs="Arial"/>
           <w:sz w:val="24"/>
           <w:szCs w:val="24"/>
         </w:rPr>
@@ -767,14 +694,14 @@
     <w:p>
       <w:pPr>
         <w:rPr>
-          <w:rFonts w:cstheme="minorHAnsi"/>
-          <w:sz w:val="24"/>
-          <w:szCs w:val="24"/>
-        </w:rPr>
-      </w:pPr>
-      <w:r>
-        <w:rPr>
-          <w:rFonts w:cstheme="minorHAnsi"/>
+          <w:rFonts w:ascii="Arial" w:hAnsi="Arial" w:cs="Arial"/>
+          <w:sz w:val="24"/>
+          <w:szCs w:val="24"/>
+        </w:rPr>
+      </w:pPr>
+      <w:r>
+        <w:rPr>
+          <w:rFonts w:ascii="Arial" w:hAnsi="Arial" w:cs="Arial"/>
           <w:sz w:val="24"/>
           <w:szCs w:val="24"/>
         </w:rPr>
@@ -783,7 +710,7 @@
       <w:proofErr w:type="spellStart"/>
       <w:r>
         <w:rPr>
-          <w:rFonts w:cstheme="minorHAnsi"/>
+          <w:rFonts w:ascii="Arial" w:hAnsi="Arial" w:cs="Arial"/>
           <w:sz w:val="24"/>
           <w:szCs w:val="24"/>
         </w:rPr>
@@ -792,7 +719,7 @@
       <w:proofErr w:type="spellEnd"/>
       <w:r>
         <w:rPr>
-          <w:rFonts w:cstheme="minorHAnsi"/>
+          <w:rFonts w:ascii="Arial" w:hAnsi="Arial" w:cs="Arial"/>
           <w:sz w:val="24"/>
           <w:szCs w:val="24"/>
         </w:rPr>
@@ -801,7 +728,7 @@
       <w:proofErr w:type="spellStart"/>
       <w:r>
         <w:rPr>
-          <w:rFonts w:cstheme="minorHAnsi"/>
+          <w:rFonts w:ascii="Arial" w:hAnsi="Arial" w:cs="Arial"/>
           <w:sz w:val="24"/>
           <w:szCs w:val="24"/>
         </w:rPr>
@@ -810,7 +737,7 @@
       <w:proofErr w:type="spellEnd"/>
       <w:r>
         <w:rPr>
-          <w:rFonts w:cstheme="minorHAnsi"/>
+          <w:rFonts w:ascii="Arial" w:hAnsi="Arial" w:cs="Arial"/>
           <w:sz w:val="24"/>
           <w:szCs w:val="24"/>
         </w:rPr>
@@ -820,7 +747,7 @@
     <w:p>
       <w:pPr>
         <w:rPr>
-          <w:rFonts w:cstheme="minorHAnsi"/>
+          <w:rFonts w:ascii="Arial" w:hAnsi="Arial" w:cs="Arial"/>
           <w:sz w:val="24"/>
           <w:szCs w:val="24"/>
         </w:rPr>
@@ -830,14 +757,14 @@
       <w:pPr>
         <w:pStyle w:val="Heading2"/>
         <w:rPr>
-          <w:rFonts w:asciiTheme="minorHAnsi" w:hAnsiTheme="minorHAnsi" w:cstheme="minorHAnsi"/>
-          <w:sz w:val="24"/>
-          <w:szCs w:val="24"/>
-        </w:rPr>
-      </w:pPr>
-      <w:r>
-        <w:rPr>
-          <w:rFonts w:asciiTheme="minorHAnsi" w:hAnsiTheme="minorHAnsi" w:cstheme="minorHAnsi"/>
+          <w:rFonts w:ascii="Arial" w:hAnsi="Arial" w:cs="Arial"/>
+          <w:sz w:val="24"/>
+          <w:szCs w:val="24"/>
+        </w:rPr>
+      </w:pPr>
+      <w:r>
+        <w:rPr>
+          <w:rFonts w:ascii="Arial" w:hAnsi="Arial" w:cs="Arial"/>
           <w:sz w:val="24"/>
           <w:szCs w:val="24"/>
         </w:rPr>
@@ -846,7 +773,7 @@
       <w:proofErr w:type="spellStart"/>
       <w:r>
         <w:rPr>
-          <w:rFonts w:asciiTheme="minorHAnsi" w:hAnsiTheme="minorHAnsi" w:cstheme="minorHAnsi"/>
+          <w:rFonts w:ascii="Arial" w:hAnsi="Arial" w:cs="Arial"/>
           <w:sz w:val="24"/>
           <w:szCs w:val="24"/>
         </w:rPr>
@@ -854,7 +781,7 @@
       </w:r>
       <w:r>
         <w:rPr>
-          <w:rFonts w:asciiTheme="minorHAnsi" w:hAnsiTheme="minorHAnsi" w:cstheme="minorHAnsi"/>
+          <w:rFonts w:ascii="Arial" w:hAnsi="Arial" w:cs="Arial"/>
           <w:sz w:val="24"/>
           <w:szCs w:val="24"/>
         </w:rPr>
@@ -863,7 +790,7 @@
       <w:proofErr w:type="spellEnd"/>
       <w:r>
         <w:rPr>
-          <w:rFonts w:asciiTheme="minorHAnsi" w:hAnsiTheme="minorHAnsi" w:cstheme="minorHAnsi"/>
+          <w:rFonts w:ascii="Arial" w:hAnsi="Arial" w:cs="Arial"/>
           <w:sz w:val="24"/>
           <w:szCs w:val="24"/>
         </w:rPr>
@@ -878,14 +805,14 @@
           <w:numId w:val="3"/>
         </w:numPr>
         <w:rPr>
-          <w:rFonts w:cstheme="minorHAnsi"/>
-          <w:sz w:val="24"/>
-          <w:szCs w:val="24"/>
-        </w:rPr>
-      </w:pPr>
-      <w:r>
-        <w:rPr>
-          <w:rFonts w:cstheme="minorHAnsi"/>
+          <w:rFonts w:ascii="Arial" w:hAnsi="Arial" w:cs="Arial"/>
+          <w:sz w:val="24"/>
+          <w:szCs w:val="24"/>
+        </w:rPr>
+      </w:pPr>
+      <w:r>
+        <w:rPr>
+          <w:rFonts w:ascii="Arial" w:hAnsi="Arial" w:cs="Arial"/>
           <w:sz w:val="24"/>
           <w:szCs w:val="24"/>
         </w:rPr>
@@ -894,7 +821,7 @@
       <w:proofErr w:type="spellStart"/>
       <w:r>
         <w:rPr>
-          <w:rFonts w:cstheme="minorHAnsi"/>
+          <w:rFonts w:ascii="Arial" w:hAnsi="Arial" w:cs="Arial"/>
           <w:sz w:val="24"/>
           <w:szCs w:val="24"/>
         </w:rPr>
@@ -903,7 +830,7 @@
       <w:proofErr w:type="spellEnd"/>
       <w:r>
         <w:rPr>
-          <w:rFonts w:cstheme="minorHAnsi"/>
+          <w:rFonts w:ascii="Arial" w:hAnsi="Arial" w:cs="Arial"/>
           <w:sz w:val="24"/>
           <w:szCs w:val="24"/>
         </w:rPr>
@@ -918,14 +845,14 @@
           <w:numId w:val="3"/>
         </w:numPr>
         <w:rPr>
-          <w:rFonts w:cstheme="minorHAnsi"/>
-          <w:sz w:val="24"/>
-          <w:szCs w:val="24"/>
-        </w:rPr>
-      </w:pPr>
-      <w:r>
-        <w:rPr>
-          <w:rFonts w:cstheme="minorHAnsi"/>
+          <w:rFonts w:ascii="Arial" w:hAnsi="Arial" w:cs="Arial"/>
+          <w:sz w:val="24"/>
+          <w:szCs w:val="24"/>
+        </w:rPr>
+      </w:pPr>
+      <w:r>
+        <w:rPr>
+          <w:rFonts w:ascii="Arial" w:hAnsi="Arial" w:cs="Arial"/>
           <w:sz w:val="24"/>
           <w:szCs w:val="24"/>
         </w:rPr>
@@ -940,14 +867,14 @@
           <w:numId w:val="3"/>
         </w:numPr>
         <w:rPr>
-          <w:rFonts w:cstheme="minorHAnsi"/>
-          <w:sz w:val="24"/>
-          <w:szCs w:val="24"/>
-        </w:rPr>
-      </w:pPr>
-      <w:r>
-        <w:rPr>
-          <w:rFonts w:cstheme="minorHAnsi"/>
+          <w:rFonts w:ascii="Arial" w:hAnsi="Arial" w:cs="Arial"/>
+          <w:sz w:val="24"/>
+          <w:szCs w:val="24"/>
+        </w:rPr>
+      </w:pPr>
+      <w:r>
+        <w:rPr>
+          <w:rFonts w:ascii="Arial" w:hAnsi="Arial" w:cs="Arial"/>
           <w:sz w:val="24"/>
           <w:szCs w:val="24"/>
         </w:rPr>
@@ -956,7 +883,7 @@
       <w:proofErr w:type="spellStart"/>
       <w:r>
         <w:rPr>
-          <w:rFonts w:cstheme="minorHAnsi"/>
+          <w:rFonts w:ascii="Arial" w:hAnsi="Arial" w:cs="Arial"/>
           <w:sz w:val="24"/>
           <w:szCs w:val="24"/>
         </w:rPr>
@@ -965,7 +892,7 @@
       <w:proofErr w:type="spellEnd"/>
       <w:r>
         <w:rPr>
-          <w:rFonts w:cstheme="minorHAnsi"/>
+          <w:rFonts w:ascii="Arial" w:hAnsi="Arial" w:cs="Arial"/>
           <w:sz w:val="24"/>
           <w:szCs w:val="24"/>
         </w:rPr>
@@ -973,7 +900,7 @@
       </w:r>
       <w:r>
         <w:rPr>
-          <w:rFonts w:cstheme="minorHAnsi"/>
+          <w:rFonts w:ascii="Arial" w:hAnsi="Arial" w:cs="Arial"/>
           <w:sz w:val="24"/>
           <w:szCs w:val="24"/>
         </w:rPr>
@@ -981,7 +908,7 @@
       </w:r>
       <w:r>
         <w:rPr>
-          <w:rFonts w:cstheme="minorHAnsi"/>
+          <w:rFonts w:ascii="Arial" w:hAnsi="Arial" w:cs="Arial"/>
           <w:sz w:val="24"/>
           <w:szCs w:val="24"/>
         </w:rPr>
@@ -991,7 +918,7 @@
     <w:p>
       <w:pPr>
         <w:rPr>
-          <w:rFonts w:cstheme="minorHAnsi"/>
+          <w:rFonts w:ascii="Arial" w:hAnsi="Arial" w:cs="Arial"/>
           <w:sz w:val="24"/>
           <w:szCs w:val="24"/>
         </w:rPr>
@@ -1000,14 +927,14 @@
     <w:p>
       <w:pPr>
         <w:rPr>
-          <w:rFonts w:cstheme="minorHAnsi"/>
-          <w:sz w:val="24"/>
-          <w:szCs w:val="24"/>
-        </w:rPr>
-      </w:pPr>
-      <w:r>
-        <w:rPr>
-          <w:rFonts w:cstheme="minorHAnsi"/>
+          <w:rFonts w:ascii="Arial" w:hAnsi="Arial" w:cs="Arial"/>
+          <w:sz w:val="24"/>
+          <w:szCs w:val="24"/>
+        </w:rPr>
+      </w:pPr>
+      <w:r>
+        <w:rPr>
+          <w:rFonts w:ascii="Arial" w:hAnsi="Arial" w:cs="Arial"/>
           <w:sz w:val="24"/>
           <w:szCs w:val="24"/>
         </w:rPr>
@@ -1017,14 +944,14 @@
     <w:p>
       <w:pPr>
         <w:rPr>
-          <w:rFonts w:cstheme="minorHAnsi"/>
-          <w:sz w:val="24"/>
-          <w:szCs w:val="24"/>
-        </w:rPr>
-      </w:pPr>
-      <w:r>
-        <w:rPr>
-          <w:rFonts w:cstheme="minorHAnsi"/>
+          <w:rFonts w:ascii="Arial" w:hAnsi="Arial" w:cs="Arial"/>
+          <w:sz w:val="24"/>
+          <w:szCs w:val="24"/>
+        </w:rPr>
+      </w:pPr>
+      <w:r>
+        <w:rPr>
+          <w:rFonts w:ascii="Arial" w:hAnsi="Arial" w:cs="Arial"/>
           <w:b/>
           <w:sz w:val="24"/>
           <w:szCs w:val="24"/>
@@ -1034,7 +961,7 @@
       <w:proofErr w:type="spellStart"/>
       <w:r>
         <w:rPr>
-          <w:rFonts w:cstheme="minorHAnsi"/>
+          <w:rFonts w:ascii="Arial" w:hAnsi="Arial" w:cs="Arial"/>
           <w:b/>
           <w:sz w:val="24"/>
           <w:szCs w:val="24"/>
@@ -1043,7 +970,7 @@
       </w:r>
       <w:r>
         <w:rPr>
-          <w:rFonts w:cstheme="minorHAnsi"/>
+          <w:rFonts w:ascii="Arial" w:hAnsi="Arial" w:cs="Arial"/>
           <w:b/>
           <w:sz w:val="24"/>
           <w:szCs w:val="24"/>
@@ -1053,7 +980,7 @@
       <w:proofErr w:type="spellEnd"/>
       <w:r>
         <w:rPr>
-          <w:rFonts w:cstheme="minorHAnsi"/>
+          <w:rFonts w:ascii="Arial" w:hAnsi="Arial" w:cs="Arial"/>
           <w:b/>
           <w:sz w:val="24"/>
           <w:szCs w:val="24"/>
@@ -1062,7 +989,7 @@
       </w:r>
       <w:r>
         <w:rPr>
-          <w:rFonts w:cstheme="minorHAnsi"/>
+          <w:rFonts w:ascii="Arial" w:hAnsi="Arial" w:cs="Arial"/>
           <w:sz w:val="24"/>
           <w:szCs w:val="24"/>
         </w:rPr>
@@ -1071,7 +998,7 @@
       <w:proofErr w:type="spellStart"/>
       <w:r>
         <w:rPr>
-          <w:rFonts w:cstheme="minorHAnsi"/>
+          <w:rFonts w:ascii="Arial" w:hAnsi="Arial" w:cs="Arial"/>
           <w:sz w:val="24"/>
           <w:szCs w:val="24"/>
         </w:rPr>
@@ -1080,7 +1007,7 @@
       <w:proofErr w:type="spellEnd"/>
       <w:r>
         <w:rPr>
-          <w:rFonts w:cstheme="minorHAnsi"/>
+          <w:rFonts w:ascii="Arial" w:hAnsi="Arial" w:cs="Arial"/>
           <w:sz w:val="24"/>
           <w:szCs w:val="24"/>
         </w:rPr>
@@ -1089,7 +1016,7 @@
       <w:proofErr w:type="spellStart"/>
       <w:r>
         <w:rPr>
-          <w:rFonts w:cstheme="minorHAnsi"/>
+          <w:rFonts w:ascii="Arial" w:hAnsi="Arial" w:cs="Arial"/>
           <w:sz w:val="24"/>
           <w:szCs w:val="24"/>
         </w:rPr>
@@ -1098,7 +1025,7 @@
       <w:proofErr w:type="spellEnd"/>
       <w:r>
         <w:rPr>
-          <w:rFonts w:cstheme="minorHAnsi"/>
+          <w:rFonts w:ascii="Arial" w:hAnsi="Arial" w:cs="Arial"/>
           <w:sz w:val="24"/>
           <w:szCs w:val="24"/>
         </w:rPr>
@@ -1106,7 +1033,7 @@
       </w:r>
       <w:r>
         <w:rPr>
-          <w:rFonts w:cstheme="minorHAnsi"/>
+          <w:rFonts w:ascii="Arial" w:hAnsi="Arial" w:cs="Arial"/>
           <w:sz w:val="24"/>
           <w:szCs w:val="24"/>
         </w:rPr>
@@ -1115,7 +1042,7 @@
       <w:proofErr w:type="spellStart"/>
       <w:r>
         <w:rPr>
-          <w:rFonts w:cstheme="minorHAnsi"/>
+          <w:rFonts w:ascii="Arial" w:hAnsi="Arial" w:cs="Arial"/>
           <w:sz w:val="24"/>
           <w:szCs w:val="24"/>
         </w:rPr>
@@ -1123,7 +1050,7 @@
       </w:r>
       <w:r>
         <w:rPr>
-          <w:rFonts w:cstheme="minorHAnsi"/>
+          <w:rFonts w:ascii="Arial" w:hAnsi="Arial" w:cs="Arial"/>
           <w:sz w:val="24"/>
           <w:szCs w:val="24"/>
         </w:rPr>
@@ -1132,7 +1059,7 @@
       <w:proofErr w:type="spellEnd"/>
       <w:r>
         <w:rPr>
-          <w:rFonts w:cstheme="minorHAnsi"/>
+          <w:rFonts w:ascii="Arial" w:hAnsi="Arial" w:cs="Arial"/>
           <w:sz w:val="24"/>
           <w:szCs w:val="24"/>
         </w:rPr>
@@ -1142,14 +1069,14 @@
     <w:p>
       <w:pPr>
         <w:rPr>
-          <w:rFonts w:cstheme="minorHAnsi"/>
-          <w:sz w:val="24"/>
-          <w:szCs w:val="24"/>
-        </w:rPr>
-      </w:pPr>
-      <w:r>
-        <w:rPr>
-          <w:rFonts w:cstheme="minorHAnsi"/>
+          <w:rFonts w:ascii="Arial" w:hAnsi="Arial" w:cs="Arial"/>
+          <w:sz w:val="24"/>
+          <w:szCs w:val="24"/>
+        </w:rPr>
+      </w:pPr>
+      <w:r>
+        <w:rPr>
+          <w:rFonts w:ascii="Arial" w:hAnsi="Arial" w:cs="Arial"/>
           <w:sz w:val="24"/>
           <w:szCs w:val="24"/>
         </w:rPr>
@@ -1159,14 +1086,14 @@
     <w:p>
       <w:pPr>
         <w:rPr>
-          <w:rFonts w:cstheme="minorHAnsi"/>
-          <w:sz w:val="24"/>
-          <w:szCs w:val="24"/>
-        </w:rPr>
-      </w:pPr>
-      <w:r>
-        <w:rPr>
-          <w:rFonts w:cstheme="minorHAnsi"/>
+          <w:rFonts w:ascii="Arial" w:hAnsi="Arial" w:cs="Arial"/>
+          <w:sz w:val="24"/>
+          <w:szCs w:val="24"/>
+        </w:rPr>
+      </w:pPr>
+      <w:r>
+        <w:rPr>
+          <w:rFonts w:ascii="Arial" w:hAnsi="Arial" w:cs="Arial"/>
           <w:sz w:val="24"/>
           <w:szCs w:val="24"/>
         </w:rPr>
@@ -1175,7 +1102,7 @@
       <w:proofErr w:type="spellStart"/>
       <w:r>
         <w:rPr>
-          <w:rFonts w:cstheme="minorHAnsi"/>
+          <w:rFonts w:ascii="Arial" w:hAnsi="Arial" w:cs="Arial"/>
           <w:sz w:val="24"/>
           <w:szCs w:val="24"/>
         </w:rPr>
@@ -1184,7 +1111,7 @@
       <w:proofErr w:type="spellEnd"/>
       <w:r>
         <w:rPr>
-          <w:rFonts w:cstheme="minorHAnsi"/>
+          <w:rFonts w:ascii="Arial" w:hAnsi="Arial" w:cs="Arial"/>
           <w:sz w:val="24"/>
           <w:szCs w:val="24"/>
         </w:rPr>
@@ -1202,7 +1129,7 @@
 </file>
 
 <file path=word/numbering.xml><?xml version="1.0" encoding="utf-8"?>
-<w:numbering xmlns:wpc="http://schemas.microsoft.com/office/word/2010/wordprocessingCanvas" xmlns:cx="http://schemas.microsoft.com/office/drawing/2014/chartex" xmlns:cx1="http://schemas.microsoft.com/office/drawing/2015/9/8/chartex" xmlns:cx2="http://schemas.microsoft.com/office/drawing/2015/10/21/chartex" xmlns:cx3="http://schemas.microsoft.com/office/drawing/2016/5/9/chartex" xmlns:cx4="http://schemas.microsoft.com/office/drawing/2016/5/10/chartex" xmlns:cx5="http://schemas.microsoft.com/office/drawing/2016/5/11/chartex" xmlns:cx6="http://schemas.microsoft.com/office/drawing/2016/5/12/chartex" xmlns:cx7="http://schemas.microsoft.com/office/drawing/2016/5/13/chartex" xmlns:cx8="http://schemas.microsoft.com/office/drawing/2016/5/14/chartex" xmlns:mc="http://schemas.openxmlformats.org/markup-compatibility/2006" xmlns:aink="http://schemas.microsoft.com/office/drawing/2016/ink" xmlns:am3d="http://schemas.microsoft.com/office/drawing/2017/model3d" xmlns:o="urn:schemas-microsoft-com:office:office" xmlns:oel="http://schemas.microsoft.com/office/2019/extlst" xmlns:r="http://schemas.openxmlformats.org/officeDocument/2006/relationships" xmlns:m="http://schemas.openxmlformats.org/officeDocument/2006/math" xmlns:v="urn:schemas-microsoft-com:vml" xmlns:wp14="http://schemas.microsoft.com/office/word/2010/wordprocessingDrawing" xmlns:wp="http://schemas.openxmlformats.org/drawingml/2006/wordprocessingDrawing" xmlns:w10="urn:schemas-microsoft-com:office:word" xmlns:w="http://schemas.openxmlformats.org/wordprocessingml/2006/main" xmlns:w14="http://schemas.microsoft.com/office/word/2010/wordml" xmlns:w15="http://schemas.microsoft.com/office/word/2012/wordml" xmlns:w16cex="http://schemas.microsoft.com/office/word/2018/wordml/cex" xmlns:w16cid="http://schemas.microsoft.com/office/word/2016/wordml/cid" xmlns:w16="http://schemas.microsoft.com/office/word/2018/wordml" xmlns:w16sdtdh="http://schemas.microsoft.com/office/word/2020/wordml/sdtdatahash" xmlns:w16se="http://schemas.microsoft.com/office/word/2015/wordml/symex" xmlns:wpg="http://schemas.microsoft.com/office/word/2010/wordprocessingGroup" xmlns:wpi="http://schemas.microsoft.com/office/word/2010/wordprocessingInk" xmlns:wne="http://schemas.microsoft.com/office/word/2006/wordml" xmlns:wps="http://schemas.microsoft.com/office/word/2010/wordprocessingShape" mc:Ignorable="w14 w15 w16se w16cid w16 w16cex w16sdtdh wp14">
+<w:numbering xmlns:wpc="http://schemas.microsoft.com/office/word/2010/wordprocessingCanvas" xmlns:cx="http://schemas.microsoft.com/office/drawing/2014/chartex" xmlns:cx1="http://schemas.microsoft.com/office/drawing/2015/9/8/chartex" xmlns:cx2="http://schemas.microsoft.com/office/drawing/2015/10/21/chartex" xmlns:cx3="http://schemas.microsoft.com/office/drawing/2016/5/9/chartex" xmlns:cx4="http://schemas.microsoft.com/office/drawing/2016/5/10/chartex" xmlns:cx5="http://schemas.microsoft.com/office/drawing/2016/5/11/chartex" xmlns:cx6="http://schemas.microsoft.com/office/drawing/2016/5/12/chartex" xmlns:cx7="http://schemas.microsoft.com/office/drawing/2016/5/13/chartex" xmlns:cx8="http://schemas.microsoft.com/office/drawing/2016/5/14/chartex" xmlns:mc="http://schemas.openxmlformats.org/markup-compatibility/2006" xmlns:aink="http://schemas.microsoft.com/office/drawing/2016/ink" xmlns:am3d="http://schemas.microsoft.com/office/drawing/2017/model3d" xmlns:o="urn:schemas-microsoft-com:office:office" xmlns:oel="http://schemas.microsoft.com/office/2019/extlst" xmlns:r="http://schemas.openxmlformats.org/officeDocument/2006/relationships" xmlns:m="http://schemas.openxmlformats.org/officeDocument/2006/math" xmlns:v="urn:schemas-microsoft-com:vml" xmlns:wp14="http://schemas.microsoft.com/office/word/2010/wordprocessingDrawing" xmlns:wp="http://schemas.openxmlformats.org/drawingml/2006/wordprocessingDrawing" xmlns:w10="urn:schemas-microsoft-com:office:word" xmlns:w="http://schemas.openxmlformats.org/wordprocessingml/2006/main" xmlns:w14="http://schemas.microsoft.com/office/word/2010/wordml" xmlns:w15="http://schemas.microsoft.com/office/word/2012/wordml" xmlns:w16cex="http://schemas.microsoft.com/office/word/2018/wordml/cex" xmlns:w16cid="http://schemas.microsoft.com/office/word/2016/wordml/cid" xmlns:w16="http://schemas.microsoft.com/office/word/2018/wordml" xmlns:w16du="http://schemas.microsoft.com/office/word/2023/wordml/word16du" xmlns:w16sdtdh="http://schemas.microsoft.com/office/word/2020/wordml/sdtdatahash" xmlns:w16se="http://schemas.microsoft.com/office/word/2015/wordml/symex" xmlns:wpg="http://schemas.microsoft.com/office/word/2010/wordprocessingGroup" xmlns:wpi="http://schemas.microsoft.com/office/word/2010/wordprocessingInk" xmlns:wne="http://schemas.microsoft.com/office/word/2006/wordml" xmlns:wps="http://schemas.microsoft.com/office/word/2010/wordprocessingShape" mc:Ignorable="w14 w15 w16se w16cid w16 w16cex w16sdtdh w16du wp14">
   <w:abstractNum w:abstractNumId="0" w15:restartNumberingAfterBreak="0">
     <w:nsid w:val="0D5A6C12"/>
     <w:multiLevelType w:val="multilevel"/>
@@ -1520,7 +1447,7 @@
 </file>
 
 <file path=word/styles.xml><?xml version="1.0" encoding="utf-8"?>
-<w:styles xmlns:mc="http://schemas.openxmlformats.org/markup-compatibility/2006" xmlns:r="http://schemas.openxmlformats.org/officeDocument/2006/relationships" xmlns:w="http://schemas.openxmlformats.org/wordprocessingml/2006/main" xmlns:w14="http://schemas.microsoft.com/office/word/2010/wordml" xmlns:w15="http://schemas.microsoft.com/office/word/2012/wordml" xmlns:w16cex="http://schemas.microsoft.com/office/word/2018/wordml/cex" xmlns:w16cid="http://schemas.microsoft.com/office/word/2016/wordml/cid" xmlns:w16="http://schemas.microsoft.com/office/word/2018/wordml" xmlns:w16sdtdh="http://schemas.microsoft.com/office/word/2020/wordml/sdtdatahash" xmlns:w16se="http://schemas.microsoft.com/office/word/2015/wordml/symex" mc:Ignorable="w14 w15 w16se w16cid w16 w16cex w16sdtdh">
+<w:styles xmlns:mc="http://schemas.openxmlformats.org/markup-compatibility/2006" xmlns:r="http://schemas.openxmlformats.org/officeDocument/2006/relationships" xmlns:w="http://schemas.openxmlformats.org/wordprocessingml/2006/main" xmlns:w14="http://schemas.microsoft.com/office/word/2010/wordml" xmlns:w15="http://schemas.microsoft.com/office/word/2012/wordml" xmlns:w16cex="http://schemas.microsoft.com/office/word/2018/wordml/cex" xmlns:w16cid="http://schemas.microsoft.com/office/word/2016/wordml/cid" xmlns:w16="http://schemas.microsoft.com/office/word/2018/wordml" xmlns:w16du="http://schemas.microsoft.com/office/word/2023/wordml/word16du" xmlns:w16sdtdh="http://schemas.microsoft.com/office/word/2020/wordml/sdtdatahash" xmlns:w16se="http://schemas.microsoft.com/office/word/2015/wordml/symex" mc:Ignorable="w14 w15 w16se w16cid w16 w16cex w16sdtdh w16du">
   <w:docDefaults>
     <w:rPrDefault>
       <w:rPr>

</xml_diff>

<commit_message>
working to improve addenda
</commit_message>
<xml_diff>
--- a/docassemble/RFApackage/data/templates/RFAaffidavit_addendum.docx
+++ b/docassemble/RFApackage/data/templates/RFAaffidavit_addendum.docx
@@ -1,6 +1,6 @@
 
 <file path=word/document.xml><?xml version="1.0" encoding="utf-8"?>
-<w:document xmlns:wpc="http://schemas.microsoft.com/office/word/2010/wordprocessingCanvas" xmlns:cx="http://schemas.microsoft.com/office/drawing/2014/chartex" xmlns:cx1="http://schemas.microsoft.com/office/drawing/2015/9/8/chartex" xmlns:cx2="http://schemas.microsoft.com/office/drawing/2015/10/21/chartex" xmlns:cx3="http://schemas.microsoft.com/office/drawing/2016/5/9/chartex" xmlns:cx4="http://schemas.microsoft.com/office/drawing/2016/5/10/chartex" xmlns:cx5="http://schemas.microsoft.com/office/drawing/2016/5/11/chartex" xmlns:cx6="http://schemas.microsoft.com/office/drawing/2016/5/12/chartex" xmlns:cx7="http://schemas.microsoft.com/office/drawing/2016/5/13/chartex" xmlns:cx8="http://schemas.microsoft.com/office/drawing/2016/5/14/chartex" xmlns:mc="http://schemas.openxmlformats.org/markup-compatibility/2006" xmlns:aink="http://schemas.microsoft.com/office/drawing/2016/ink" xmlns:am3d="http://schemas.microsoft.com/office/drawing/2017/model3d" xmlns:o="urn:schemas-microsoft-com:office:office" xmlns:oel="http://schemas.microsoft.com/office/2019/extlst" xmlns:r="http://schemas.openxmlformats.org/officeDocument/2006/relationships" xmlns:m="http://schemas.openxmlformats.org/officeDocument/2006/math" xmlns:v="urn:schemas-microsoft-com:vml" xmlns:wp14="http://schemas.microsoft.com/office/word/2010/wordprocessingDrawing" xmlns:wp="http://schemas.openxmlformats.org/drawingml/2006/wordprocessingDrawing" xmlns:w10="urn:schemas-microsoft-com:office:word" xmlns:w="http://schemas.openxmlformats.org/wordprocessingml/2006/main" xmlns:w14="http://schemas.microsoft.com/office/word/2010/wordml" xmlns:w15="http://schemas.microsoft.com/office/word/2012/wordml" xmlns:w16cex="http://schemas.microsoft.com/office/word/2018/wordml/cex" xmlns:w16cid="http://schemas.microsoft.com/office/word/2016/wordml/cid" xmlns:w16="http://schemas.microsoft.com/office/word/2018/wordml" xmlns:w16du="http://schemas.microsoft.com/office/word/2023/wordml/word16du" xmlns:w16sdtdh="http://schemas.microsoft.com/office/word/2020/wordml/sdtdatahash" xmlns:w16se="http://schemas.microsoft.com/office/word/2015/wordml/symex" xmlns:wpg="http://schemas.microsoft.com/office/word/2010/wordprocessingGroup" xmlns:wpi="http://schemas.microsoft.com/office/word/2010/wordprocessingInk" xmlns:wne="http://schemas.microsoft.com/office/word/2006/wordml" xmlns:wps="http://schemas.microsoft.com/office/word/2010/wordprocessingShape" mc:Ignorable="w14 w15 w16se w16cid w16 w16cex w16sdtdh w16du wp14">
+<w:document xmlns:wpc="http://schemas.microsoft.com/office/word/2010/wordprocessingCanvas" xmlns:cx="http://schemas.microsoft.com/office/drawing/2014/chartex" xmlns:cx1="http://schemas.microsoft.com/office/drawing/2015/9/8/chartex" xmlns:cx2="http://schemas.microsoft.com/office/drawing/2015/10/21/chartex" xmlns:cx3="http://schemas.microsoft.com/office/drawing/2016/5/9/chartex" xmlns:cx4="http://schemas.microsoft.com/office/drawing/2016/5/10/chartex" xmlns:cx5="http://schemas.microsoft.com/office/drawing/2016/5/11/chartex" xmlns:cx6="http://schemas.microsoft.com/office/drawing/2016/5/12/chartex" xmlns:cx7="http://schemas.microsoft.com/office/drawing/2016/5/13/chartex" xmlns:cx8="http://schemas.microsoft.com/office/drawing/2016/5/14/chartex" xmlns:mc="http://schemas.openxmlformats.org/markup-compatibility/2006" xmlns:aink="http://schemas.microsoft.com/office/drawing/2016/ink" xmlns:am3d="http://schemas.microsoft.com/office/drawing/2017/model3d" xmlns:o="urn:schemas-microsoft-com:office:office" xmlns:oel="http://schemas.microsoft.com/office/2019/extlst" xmlns:r="http://schemas.openxmlformats.org/officeDocument/2006/relationships" xmlns:m="http://schemas.openxmlformats.org/officeDocument/2006/math" xmlns:v="urn:schemas-microsoft-com:vml" xmlns:wp14="http://schemas.microsoft.com/office/word/2010/wordprocessingDrawing" xmlns:wp="http://schemas.openxmlformats.org/drawingml/2006/wordprocessingDrawing" xmlns:w10="urn:schemas-microsoft-com:office:word" xmlns:w="http://schemas.openxmlformats.org/wordprocessingml/2006/main" xmlns:w14="http://schemas.microsoft.com/office/word/2010/wordml" xmlns:w15="http://schemas.microsoft.com/office/word/2012/wordml" xmlns:w16cex="http://schemas.microsoft.com/office/word/2018/wordml/cex" xmlns:w16cid="http://schemas.microsoft.com/office/word/2016/wordml/cid" xmlns:w16="http://schemas.microsoft.com/office/word/2018/wordml" xmlns:w16du="http://schemas.microsoft.com/office/word/2023/wordml/word16du" xmlns:w16sdtdh="http://schemas.microsoft.com/office/word/2020/wordml/sdtdatahash" xmlns:w16sdtfl="http://schemas.microsoft.com/office/word/2024/wordml/sdtformatlock" xmlns:w16se="http://schemas.microsoft.com/office/word/2015/wordml/symex" xmlns:wpg="http://schemas.microsoft.com/office/word/2010/wordprocessingGroup" xmlns:wpi="http://schemas.microsoft.com/office/word/2010/wordprocessingInk" xmlns:wne="http://schemas.microsoft.com/office/word/2006/wordml" xmlns:wps="http://schemas.microsoft.com/office/word/2010/wordprocessingShape" mc:Ignorable="w14 w15 w16se w16cid w16 w16cex w16sdtdh w16sdtfl w16du wp14">
   <w:body>
     <w:p>
       <w:pPr>
@@ -62,7 +62,94 @@
           <w:sz w:val="28"/>
           <w:szCs w:val="28"/>
         </w:rPr>
-        <w:t>Family Division, {{ trial_court.address.county }} Unit</w:t>
+        <w:t xml:space="preserve">Family Division, {{ </w:t>
+      </w:r>
+      <w:proofErr w:type="spellStart"/>
+      <w:r>
+        <w:rPr>
+          <w:rFonts w:ascii="Arial" w:hAnsi="Arial" w:cs="Arial"/>
+          <w:sz w:val="28"/>
+          <w:szCs w:val="28"/>
+        </w:rPr>
+        <w:t>trial_court.address.county</w:t>
+      </w:r>
+      <w:proofErr w:type="spellEnd"/>
+      <w:r>
+        <w:rPr>
+          <w:rFonts w:ascii="Arial" w:hAnsi="Arial" w:cs="Arial"/>
+          <w:sz w:val="28"/>
+          <w:szCs w:val="28"/>
+        </w:rPr>
+        <w:t xml:space="preserve"> }} Unit</w:t>
+      </w:r>
+    </w:p>
+    <w:p>
+      <w:pPr>
+        <w:rPr>
+          <w:rFonts w:ascii="Arial" w:hAnsi="Arial" w:cs="Arial"/>
+          <w:sz w:val="24"/>
+          <w:szCs w:val="24"/>
+        </w:rPr>
+      </w:pPr>
+      <w:r>
+        <w:rPr>
+          <w:rFonts w:ascii="Arial" w:hAnsi="Arial" w:cs="Arial"/>
+          <w:sz w:val="24"/>
+          <w:szCs w:val="24"/>
+        </w:rPr>
+        <w:t xml:space="preserve">{%p if </w:t>
+      </w:r>
+      <w:proofErr w:type="spellStart"/>
+      <w:r>
+        <w:rPr>
+          <w:rFonts w:ascii="Arial" w:hAnsi="Arial" w:cs="Arial"/>
+          <w:sz w:val="24"/>
+          <w:szCs w:val="24"/>
+        </w:rPr>
+        <w:t>who_needs_protection</w:t>
+      </w:r>
+      <w:proofErr w:type="spellEnd"/>
+      <w:r>
+        <w:rPr>
+          <w:rFonts w:ascii="Arial" w:hAnsi="Arial" w:cs="Arial"/>
+          <w:sz w:val="24"/>
+          <w:szCs w:val="24"/>
+        </w:rPr>
+        <w:t xml:space="preserve"> == '</w:t>
+      </w:r>
+      <w:proofErr w:type="spellStart"/>
+      <w:r>
+        <w:rPr>
+          <w:rFonts w:ascii="Arial" w:hAnsi="Arial" w:cs="Arial"/>
+          <w:sz w:val="24"/>
+          <w:szCs w:val="24"/>
+        </w:rPr>
+        <w:t>order_obo_child</w:t>
+      </w:r>
+      <w:proofErr w:type="spellEnd"/>
+      <w:r>
+        <w:rPr>
+          <w:rFonts w:ascii="Arial" w:hAnsi="Arial" w:cs="Arial"/>
+          <w:sz w:val="24"/>
+          <w:szCs w:val="24"/>
+        </w:rPr>
+        <w:t>'</w:t>
+      </w:r>
+      <w:r>
+        <w:rPr>
+          <w:rFonts w:ascii="Arial" w:hAnsi="Arial" w:cs="Arial"/>
+          <w:sz w:val="24"/>
+          <w:szCs w:val="24"/>
+        </w:rPr>
+        <w:t xml:space="preserve"> </w:t>
+      </w:r>
+      <w:r>
+        <w:rPr>
+          <w:rFonts w:ascii="Arial" w:hAnsi="Arial" w:cs="Arial"/>
+          <w:sz w:val="24"/>
+          <w:szCs w:val="24"/>
+        </w:rPr>
+        <w:t>%}</w:t>
       </w:r>
     </w:p>
     <w:p>
@@ -82,55 +169,104 @@
           <w:sz w:val="28"/>
           <w:szCs w:val="28"/>
         </w:rPr>
-        <w:t>{{ users[0] }} v. {{ other_parties[0] }}</w:t>
+        <w:t xml:space="preserve">{{ </w:t>
+      </w:r>
+      <w:r>
+        <w:rPr>
+          <w:rFonts w:ascii="Arial" w:hAnsi="Arial" w:cs="Arial"/>
+          <w:sz w:val="28"/>
+          <w:szCs w:val="28"/>
+        </w:rPr>
+        <w:t>children</w:t>
+      </w:r>
+      <w:r>
+        <w:rPr>
+          <w:rFonts w:ascii="Arial" w:hAnsi="Arial" w:cs="Arial"/>
+          <w:sz w:val="28"/>
+          <w:szCs w:val="28"/>
+        </w:rPr>
+        <w:t xml:space="preserve">[0] }} v. {{ </w:t>
+      </w:r>
+      <w:proofErr w:type="spellStart"/>
+      <w:r>
+        <w:rPr>
+          <w:rFonts w:ascii="Arial" w:hAnsi="Arial" w:cs="Arial"/>
+          <w:sz w:val="28"/>
+          <w:szCs w:val="28"/>
+        </w:rPr>
+        <w:t>other_parties</w:t>
+      </w:r>
+      <w:proofErr w:type="spellEnd"/>
+      <w:r>
+        <w:rPr>
+          <w:rFonts w:ascii="Arial" w:hAnsi="Arial" w:cs="Arial"/>
+          <w:sz w:val="28"/>
+          <w:szCs w:val="28"/>
+        </w:rPr>
+        <w:t>[0] }}</w:t>
       </w:r>
     </w:p>
     <w:p>
       <w:pPr>
-        <w:numPr>
-          <w:ilvl w:val="0"/>
-          <w:numId w:val="2"/>
-        </w:numPr>
-        <w:spacing w:after="0" w:line="240" w:lineRule="auto"/>
-        <w:jc w:val="center"/>
-        <w:rPr>
-          <w:rFonts w:ascii="Arial" w:hAnsi="Arial" w:cs="Arial"/>
-          <w:sz w:val="24"/>
-          <w:szCs w:val="24"/>
-        </w:rPr>
-      </w:pPr>
+        <w:rPr>
+          <w:rFonts w:ascii="Arial" w:hAnsi="Arial" w:cs="Arial"/>
+          <w:sz w:val="24"/>
+          <w:szCs w:val="24"/>
+        </w:rPr>
+      </w:pPr>
+      <w:r>
+        <w:rPr>
+          <w:rFonts w:ascii="Arial" w:hAnsi="Arial" w:cs="Arial"/>
+          <w:sz w:val="24"/>
+          <w:szCs w:val="24"/>
+        </w:rPr>
+        <w:t xml:space="preserve">{%p </w:t>
+      </w:r>
+      <w:r>
+        <w:rPr>
+          <w:rFonts w:ascii="Arial" w:hAnsi="Arial" w:cs="Arial"/>
+          <w:sz w:val="24"/>
+          <w:szCs w:val="24"/>
+        </w:rPr>
+        <w:t>else %}</w:t>
+      </w:r>
     </w:p>
     <w:p>
       <w:pPr>
-        <w:rPr>
-          <w:rFonts w:ascii="Arial" w:hAnsi="Arial" w:cs="Arial"/>
-          <w:sz w:val="24"/>
-          <w:szCs w:val="24"/>
-        </w:rPr>
-      </w:pPr>
-      <w:r>
-        <w:rPr>
-          <w:rFonts w:ascii="Arial" w:hAnsi="Arial" w:cs="Arial"/>
-          <w:sz w:val="24"/>
-          <w:szCs w:val="24"/>
-        </w:rPr>
-        <w:t xml:space="preserve">{%p for field in </w:t>
-      </w:r>
-      <w:r>
-        <w:rPr>
-          <w:rFonts w:ascii="Arial" w:hAnsi="Arial" w:cs="Arial"/>
-          <w:sz w:val="24"/>
-          <w:szCs w:val="24"/>
-        </w:rPr>
-        <w:t>RFAaffidavit</w:t>
-      </w:r>
-      <w:r>
-        <w:rPr>
-          <w:rFonts w:ascii="Arial" w:hAnsi="Arial" w:cs="Arial"/>
-          <w:sz w:val="24"/>
-          <w:szCs w:val="24"/>
-        </w:rPr>
-        <w:t>.overflow() %}</w:t>
+        <w:pStyle w:val="Heading2"/>
+        <w:spacing w:before="0"/>
+        <w:jc w:val="center"/>
+        <w:rPr>
+          <w:rFonts w:ascii="Arial" w:hAnsi="Arial" w:cs="Arial"/>
+          <w:sz w:val="28"/>
+          <w:szCs w:val="28"/>
+        </w:rPr>
+      </w:pPr>
+      <w:r>
+        <w:rPr>
+          <w:rFonts w:ascii="Arial" w:hAnsi="Arial" w:cs="Arial"/>
+          <w:sz w:val="28"/>
+          <w:szCs w:val="28"/>
+        </w:rPr>
+        <w:t xml:space="preserve">{{ users[0] }} v. {{ </w:t>
+      </w:r>
+      <w:proofErr w:type="spellStart"/>
+      <w:r>
+        <w:rPr>
+          <w:rFonts w:ascii="Arial" w:hAnsi="Arial" w:cs="Arial"/>
+          <w:sz w:val="28"/>
+          <w:szCs w:val="28"/>
+        </w:rPr>
+        <w:t>other_parties</w:t>
+      </w:r>
+      <w:proofErr w:type="spellEnd"/>
+      <w:r>
+        <w:rPr>
+          <w:rFonts w:ascii="Arial" w:hAnsi="Arial" w:cs="Arial"/>
+          <w:sz w:val="28"/>
+          <w:szCs w:val="28"/>
+        </w:rPr>
+        <w:t>[0] }}</w:t>
       </w:r>
     </w:p>
     <w:p>
@@ -147,27 +283,164 @@
           <w:sz w:val="24"/>
           <w:szCs w:val="24"/>
         </w:rPr>
-        <w:t>{%p if field.is_</w:t>
-      </w:r>
-      <w:r>
-        <w:rPr>
-          <w:rFonts w:ascii="Arial" w:hAnsi="Arial" w:cs="Arial"/>
-          <w:sz w:val="24"/>
-          <w:szCs w:val="24"/>
-        </w:rPr>
-        <w:t>object_list</w:t>
-      </w:r>
-      <w:r>
-        <w:rPr>
-          <w:rFonts w:ascii="Arial" w:hAnsi="Arial" w:cs="Arial"/>
-          <w:sz w:val="24"/>
-          <w:szCs w:val="24"/>
-        </w:rPr>
-        <w:t xml:space="preserve">() %} </w:t>
+        <w:t>{%p endif %}</w:t>
       </w:r>
     </w:p>
     <w:p>
       <w:pPr>
+        <w:rPr>
+          <w:rFonts w:ascii="Arial" w:hAnsi="Arial" w:cs="Arial"/>
+          <w:sz w:val="24"/>
+          <w:szCs w:val="24"/>
+        </w:rPr>
+      </w:pPr>
+      <w:r>
+        <w:rPr>
+          <w:rFonts w:ascii="Arial" w:hAnsi="Arial" w:cs="Arial"/>
+          <w:sz w:val="24"/>
+          <w:szCs w:val="24"/>
+        </w:rPr>
+        <w:t xml:space="preserve">{%p for field in </w:t>
+      </w:r>
+      <w:proofErr w:type="spellStart"/>
+      <w:r>
+        <w:rPr>
+          <w:rFonts w:ascii="Arial" w:hAnsi="Arial" w:cs="Arial"/>
+          <w:sz w:val="24"/>
+          <w:szCs w:val="24"/>
+        </w:rPr>
+        <w:t>RFA</w:t>
+      </w:r>
+      <w:r>
+        <w:rPr>
+          <w:rFonts w:ascii="Arial" w:hAnsi="Arial" w:cs="Arial"/>
+          <w:sz w:val="24"/>
+          <w:szCs w:val="24"/>
+        </w:rPr>
+        <w:t>affidavit</w:t>
+      </w:r>
+      <w:r>
+        <w:rPr>
+          <w:rFonts w:ascii="Arial" w:hAnsi="Arial" w:cs="Arial"/>
+          <w:sz w:val="24"/>
+          <w:szCs w:val="24"/>
+        </w:rPr>
+        <w:t>.overflow</w:t>
+      </w:r>
+      <w:proofErr w:type="spellEnd"/>
+      <w:r>
+        <w:rPr>
+          <w:rFonts w:ascii="Arial" w:hAnsi="Arial" w:cs="Arial"/>
+          <w:sz w:val="24"/>
+          <w:szCs w:val="24"/>
+        </w:rPr>
+        <w:t>()</w:t>
+      </w:r>
+      <w:r>
+        <w:rPr>
+          <w:rFonts w:ascii="Arial" w:hAnsi="Arial" w:cs="Arial"/>
+          <w:sz w:val="24"/>
+          <w:szCs w:val="24"/>
+        </w:rPr>
+        <w:t xml:space="preserve"> or </w:t>
+      </w:r>
+      <w:proofErr w:type="spellStart"/>
+      <w:r>
+        <w:rPr>
+          <w:rFonts w:ascii="Arial" w:hAnsi="Arial" w:cs="Arial"/>
+          <w:sz w:val="24"/>
+          <w:szCs w:val="24"/>
+        </w:rPr>
+        <w:t>RFA</w:t>
+      </w:r>
+      <w:r>
+        <w:rPr>
+          <w:rFonts w:ascii="Arial" w:hAnsi="Arial" w:cs="Arial"/>
+          <w:sz w:val="24"/>
+          <w:szCs w:val="24"/>
+        </w:rPr>
+        <w:t>complaint</w:t>
+      </w:r>
+      <w:r>
+        <w:rPr>
+          <w:rFonts w:ascii="Arial" w:hAnsi="Arial" w:cs="Arial"/>
+          <w:sz w:val="24"/>
+          <w:szCs w:val="24"/>
+        </w:rPr>
+        <w:t>.overflow</w:t>
+      </w:r>
+      <w:proofErr w:type="spellEnd"/>
+      <w:r>
+        <w:rPr>
+          <w:rFonts w:ascii="Arial" w:hAnsi="Arial" w:cs="Arial"/>
+          <w:sz w:val="24"/>
+          <w:szCs w:val="24"/>
+        </w:rPr>
+        <w:t>()</w:t>
+      </w:r>
+      <w:r>
+        <w:rPr>
+          <w:rFonts w:ascii="Arial" w:hAnsi="Arial" w:cs="Arial"/>
+          <w:sz w:val="24"/>
+          <w:szCs w:val="24"/>
+        </w:rPr>
+        <w:t xml:space="preserve"> </w:t>
+      </w:r>
+      <w:r>
+        <w:rPr>
+          <w:rFonts w:ascii="Arial" w:hAnsi="Arial" w:cs="Arial"/>
+          <w:sz w:val="24"/>
+          <w:szCs w:val="24"/>
+        </w:rPr>
+        <w:t>%}</w:t>
+      </w:r>
+    </w:p>
+    <w:p>
+      <w:pPr>
+        <w:rPr>
+          <w:rFonts w:ascii="Arial" w:hAnsi="Arial" w:cs="Arial"/>
+          <w:sz w:val="24"/>
+          <w:szCs w:val="24"/>
+        </w:rPr>
+      </w:pPr>
+    </w:p>
+    <w:p>
+      <w:pPr>
+        <w:rPr>
+          <w:rFonts w:ascii="Arial" w:hAnsi="Arial" w:cs="Arial"/>
+          <w:sz w:val="24"/>
+          <w:szCs w:val="24"/>
+        </w:rPr>
+      </w:pPr>
+      <w:r>
+        <w:rPr>
+          <w:rFonts w:ascii="Arial" w:hAnsi="Arial" w:cs="Arial"/>
+          <w:sz w:val="24"/>
+          <w:szCs w:val="24"/>
+        </w:rPr>
+        <w:t xml:space="preserve">{%p if </w:t>
+      </w:r>
+      <w:proofErr w:type="spellStart"/>
+      <w:r>
+        <w:rPr>
+          <w:rFonts w:ascii="Arial" w:hAnsi="Arial" w:cs="Arial"/>
+          <w:sz w:val="24"/>
+          <w:szCs w:val="24"/>
+        </w:rPr>
+        <w:t>field.field_name</w:t>
+      </w:r>
+      <w:proofErr w:type="spellEnd"/>
+      <w:r>
+        <w:rPr>
+          <w:rFonts w:ascii="Arial" w:hAnsi="Arial" w:cs="Arial"/>
+          <w:sz w:val="24"/>
+          <w:szCs w:val="24"/>
+        </w:rPr>
+        <w:t xml:space="preserve"> == "children" %}</w:t>
+      </w:r>
+    </w:p>
+    <w:p>
+      <w:pPr>
         <w:pStyle w:val="Heading2"/>
         <w:rPr>
           <w:rFonts w:ascii="Arial" w:hAnsi="Arial" w:cs="Arial"/>
@@ -181,7 +454,699 @@
           <w:sz w:val="24"/>
           <w:szCs w:val="24"/>
         </w:rPr>
-        <w:t>{{ field.</w:t>
+        <w:t>Additional children</w:t>
+      </w:r>
+    </w:p>
+    <w:tbl>
+      <w:tblPr>
+        <w:tblStyle w:val="TableGrid"/>
+        <w:tblW w:w="9360" w:type="dxa"/>
+        <w:tblLayout w:type="fixed"/>
+        <w:tblLook w:val="04A0" w:firstRow="1" w:lastRow="0" w:firstColumn="1" w:lastColumn="0" w:noHBand="0" w:noVBand="1"/>
+      </w:tblPr>
+      <w:tblGrid>
+        <w:gridCol w:w="1795"/>
+        <w:gridCol w:w="900"/>
+        <w:gridCol w:w="1260"/>
+        <w:gridCol w:w="1710"/>
+        <w:gridCol w:w="1710"/>
+        <w:gridCol w:w="1985"/>
+      </w:tblGrid>
+      <w:tr>
+        <w:tc>
+          <w:tcPr>
+            <w:tcW w:w="1795" w:type="dxa"/>
+          </w:tcPr>
+          <w:p>
+            <w:pPr>
+              <w:widowControl w:val="0"/>
+              <w:rPr>
+                <w:rFonts w:ascii="Arial" w:hAnsi="Arial" w:cs="Arial"/>
+                <w:b/>
+                <w:sz w:val="20"/>
+                <w:szCs w:val="20"/>
+              </w:rPr>
+            </w:pPr>
+            <w:r>
+              <w:rPr>
+                <w:rFonts w:ascii="Arial" w:eastAsia="Calibri" w:hAnsi="Arial" w:cs="Arial"/>
+                <w:b/>
+                <w:sz w:val="20"/>
+                <w:szCs w:val="20"/>
+              </w:rPr>
+              <w:t>Name</w:t>
+            </w:r>
+          </w:p>
+        </w:tc>
+        <w:tc>
+          <w:tcPr>
+            <w:tcW w:w="900" w:type="dxa"/>
+          </w:tcPr>
+          <w:p>
+            <w:pPr>
+              <w:widowControl w:val="0"/>
+              <w:rPr>
+                <w:rFonts w:ascii="Arial" w:eastAsia="Calibri" w:hAnsi="Arial" w:cs="Arial"/>
+                <w:b/>
+                <w:sz w:val="20"/>
+                <w:szCs w:val="20"/>
+              </w:rPr>
+            </w:pPr>
+            <w:r>
+              <w:rPr>
+                <w:rFonts w:ascii="Arial" w:eastAsia="Calibri" w:hAnsi="Arial" w:cs="Arial"/>
+                <w:b/>
+                <w:sz w:val="20"/>
+                <w:szCs w:val="20"/>
+              </w:rPr>
+              <w:t>Born</w:t>
+            </w:r>
+          </w:p>
+        </w:tc>
+        <w:tc>
+          <w:tcPr>
+            <w:tcW w:w="1260" w:type="dxa"/>
+          </w:tcPr>
+          <w:p>
+            <w:pPr>
+              <w:widowControl w:val="0"/>
+              <w:rPr>
+                <w:rFonts w:ascii="Arial" w:eastAsia="Calibri" w:hAnsi="Arial" w:cs="Arial"/>
+                <w:b/>
+                <w:sz w:val="20"/>
+                <w:szCs w:val="20"/>
+              </w:rPr>
+            </w:pPr>
+            <w:r>
+              <w:rPr>
+                <w:rFonts w:ascii="Arial" w:eastAsia="Calibri" w:hAnsi="Arial" w:cs="Arial"/>
+                <w:b/>
+                <w:sz w:val="20"/>
+                <w:szCs w:val="20"/>
+              </w:rPr>
+              <w:t>In danger?</w:t>
+            </w:r>
+          </w:p>
+        </w:tc>
+        <w:tc>
+          <w:tcPr>
+            <w:tcW w:w="1710" w:type="dxa"/>
+          </w:tcPr>
+          <w:p>
+            <w:pPr>
+              <w:widowControl w:val="0"/>
+              <w:rPr>
+                <w:rFonts w:ascii="Arial" w:eastAsia="Calibri" w:hAnsi="Arial" w:cs="Arial"/>
+                <w:b/>
+                <w:sz w:val="20"/>
+                <w:szCs w:val="20"/>
+              </w:rPr>
+            </w:pPr>
+            <w:r>
+              <w:rPr>
+                <w:rFonts w:ascii="Arial" w:eastAsia="Calibri" w:hAnsi="Arial" w:cs="Arial"/>
+                <w:b/>
+                <w:sz w:val="20"/>
+                <w:szCs w:val="20"/>
+              </w:rPr>
+              <w:t>Relationship to petitioner</w:t>
+            </w:r>
+          </w:p>
+        </w:tc>
+        <w:tc>
+          <w:tcPr>
+            <w:tcW w:w="1710" w:type="dxa"/>
+          </w:tcPr>
+          <w:p>
+            <w:pPr>
+              <w:widowControl w:val="0"/>
+              <w:rPr>
+                <w:rFonts w:ascii="Arial" w:eastAsia="Calibri" w:hAnsi="Arial" w:cs="Arial"/>
+                <w:b/>
+                <w:sz w:val="20"/>
+                <w:szCs w:val="20"/>
+              </w:rPr>
+            </w:pPr>
+            <w:r>
+              <w:rPr>
+                <w:rFonts w:ascii="Arial" w:eastAsia="Calibri" w:hAnsi="Arial" w:cs="Arial"/>
+                <w:b/>
+                <w:sz w:val="20"/>
+                <w:szCs w:val="20"/>
+              </w:rPr>
+              <w:t>Relationship to defendant</w:t>
+            </w:r>
+          </w:p>
+        </w:tc>
+        <w:tc>
+          <w:tcPr>
+            <w:tcW w:w="1985" w:type="dxa"/>
+          </w:tcPr>
+          <w:p>
+            <w:pPr>
+              <w:widowControl w:val="0"/>
+              <w:rPr>
+                <w:rFonts w:ascii="Arial" w:eastAsia="Calibri" w:hAnsi="Arial" w:cs="Arial"/>
+                <w:b/>
+                <w:sz w:val="20"/>
+                <w:szCs w:val="20"/>
+              </w:rPr>
+            </w:pPr>
+            <w:r>
+              <w:rPr>
+                <w:rFonts w:ascii="Arial" w:eastAsia="Calibri" w:hAnsi="Arial" w:cs="Arial"/>
+                <w:b/>
+                <w:sz w:val="20"/>
+                <w:szCs w:val="20"/>
+              </w:rPr>
+              <w:t>Plaintiff/petitioner wants custody?</w:t>
+            </w:r>
+          </w:p>
+        </w:tc>
+      </w:tr>
+      <w:tr>
+        <w:tc>
+          <w:tcPr>
+            <w:tcW w:w="1795" w:type="dxa"/>
+          </w:tcPr>
+          <w:p>
+            <w:pPr>
+              <w:rPr>
+                <w:rFonts w:ascii="Arial" w:hAnsi="Arial" w:cs="Arial"/>
+                <w:sz w:val="20"/>
+                <w:szCs w:val="20"/>
+              </w:rPr>
+            </w:pPr>
+            <w:r>
+              <w:rPr>
+                <w:rFonts w:ascii="Arial" w:eastAsia="Calibri" w:hAnsi="Arial" w:cs="Arial"/>
+                <w:sz w:val="20"/>
+                <w:szCs w:val="20"/>
+              </w:rPr>
+              <w:t xml:space="preserve">{%tr for row in </w:t>
+            </w:r>
+            <w:proofErr w:type="spellStart"/>
+            <w:r>
+              <w:rPr>
+                <w:rFonts w:ascii="Arial" w:eastAsia="Calibri" w:hAnsi="Arial" w:cs="Arial"/>
+                <w:sz w:val="20"/>
+                <w:szCs w:val="20"/>
+              </w:rPr>
+              <w:t>field.overflow_value</w:t>
+            </w:r>
+            <w:proofErr w:type="spellEnd"/>
+            <w:r>
+              <w:rPr>
+                <w:rFonts w:ascii="Arial" w:eastAsia="Calibri" w:hAnsi="Arial" w:cs="Arial"/>
+                <w:sz w:val="20"/>
+                <w:szCs w:val="20"/>
+              </w:rPr>
+              <w:t>() %}</w:t>
+            </w:r>
+          </w:p>
+        </w:tc>
+        <w:tc>
+          <w:tcPr>
+            <w:tcW w:w="900" w:type="dxa"/>
+          </w:tcPr>
+          <w:p>
+            <w:pPr>
+              <w:widowControl w:val="0"/>
+              <w:rPr>
+                <w:rFonts w:ascii="Arial" w:eastAsia="Calibri" w:hAnsi="Arial" w:cs="Arial"/>
+                <w:sz w:val="20"/>
+                <w:szCs w:val="20"/>
+              </w:rPr>
+            </w:pPr>
+          </w:p>
+        </w:tc>
+        <w:tc>
+          <w:tcPr>
+            <w:tcW w:w="1260" w:type="dxa"/>
+          </w:tcPr>
+          <w:p>
+            <w:pPr>
+              <w:widowControl w:val="0"/>
+              <w:rPr>
+                <w:rFonts w:ascii="Arial" w:eastAsia="Calibri" w:hAnsi="Arial" w:cs="Arial"/>
+                <w:sz w:val="20"/>
+                <w:szCs w:val="20"/>
+              </w:rPr>
+            </w:pPr>
+          </w:p>
+        </w:tc>
+        <w:tc>
+          <w:tcPr>
+            <w:tcW w:w="1710" w:type="dxa"/>
+          </w:tcPr>
+          <w:p>
+            <w:pPr>
+              <w:widowControl w:val="0"/>
+              <w:rPr>
+                <w:rFonts w:ascii="Arial" w:eastAsia="Calibri" w:hAnsi="Arial" w:cs="Arial"/>
+                <w:sz w:val="20"/>
+                <w:szCs w:val="20"/>
+              </w:rPr>
+            </w:pPr>
+          </w:p>
+        </w:tc>
+        <w:tc>
+          <w:tcPr>
+            <w:tcW w:w="1710" w:type="dxa"/>
+          </w:tcPr>
+          <w:p>
+            <w:pPr>
+              <w:widowControl w:val="0"/>
+              <w:rPr>
+                <w:rFonts w:ascii="Arial" w:eastAsia="Calibri" w:hAnsi="Arial" w:cs="Arial"/>
+                <w:sz w:val="20"/>
+                <w:szCs w:val="20"/>
+              </w:rPr>
+            </w:pPr>
+          </w:p>
+        </w:tc>
+        <w:tc>
+          <w:tcPr>
+            <w:tcW w:w="1985" w:type="dxa"/>
+          </w:tcPr>
+          <w:p>
+            <w:pPr>
+              <w:widowControl w:val="0"/>
+              <w:rPr>
+                <w:rFonts w:ascii="Arial" w:eastAsia="Calibri" w:hAnsi="Arial" w:cs="Arial"/>
+                <w:sz w:val="20"/>
+                <w:szCs w:val="20"/>
+              </w:rPr>
+            </w:pPr>
+          </w:p>
+        </w:tc>
+      </w:tr>
+      <w:tr>
+        <w:tc>
+          <w:tcPr>
+            <w:tcW w:w="1795" w:type="dxa"/>
+          </w:tcPr>
+          <w:p>
+            <w:pPr>
+              <w:rPr>
+                <w:rFonts w:ascii="Arial" w:hAnsi="Arial" w:cs="Arial"/>
+                <w:sz w:val="24"/>
+                <w:szCs w:val="24"/>
+              </w:rPr>
+            </w:pPr>
+            <w:r>
+              <w:rPr>
+                <w:rFonts w:ascii="Arial" w:eastAsia="Calibri" w:hAnsi="Arial" w:cs="Arial"/>
+                <w:sz w:val="24"/>
+                <w:szCs w:val="24"/>
+              </w:rPr>
+              <w:t>{{ row.name }}</w:t>
+            </w:r>
+          </w:p>
+        </w:tc>
+        <w:tc>
+          <w:tcPr>
+            <w:tcW w:w="900" w:type="dxa"/>
+          </w:tcPr>
+          <w:p>
+            <w:pPr>
+              <w:widowControl w:val="0"/>
+              <w:rPr>
+                <w:rFonts w:ascii="Arial" w:hAnsi="Arial" w:cs="Arial"/>
+                <w:sz w:val="20"/>
+                <w:szCs w:val="20"/>
+              </w:rPr>
+            </w:pPr>
+            <w:r>
+              <w:rPr>
+                <w:rFonts w:ascii="Arial" w:eastAsia="Calibri" w:hAnsi="Arial" w:cs="Arial"/>
+                <w:sz w:val="20"/>
+                <w:szCs w:val="20"/>
+              </w:rPr>
+              <w:t xml:space="preserve">{{ </w:t>
+            </w:r>
+            <w:proofErr w:type="spellStart"/>
+            <w:r>
+              <w:rPr>
+                <w:rFonts w:ascii="Arial" w:eastAsia="Calibri" w:hAnsi="Arial" w:cs="Arial"/>
+                <w:sz w:val="20"/>
+                <w:szCs w:val="20"/>
+              </w:rPr>
+              <w:t>row.birthdate</w:t>
+            </w:r>
+            <w:proofErr w:type="spellEnd"/>
+            <w:r>
+              <w:rPr>
+                <w:rFonts w:ascii="Arial" w:eastAsia="Calibri" w:hAnsi="Arial" w:cs="Arial"/>
+                <w:sz w:val="20"/>
+                <w:szCs w:val="20"/>
+              </w:rPr>
+              <w:t xml:space="preserve"> }}</w:t>
+            </w:r>
+          </w:p>
+        </w:tc>
+        <w:tc>
+          <w:tcPr>
+            <w:tcW w:w="1260" w:type="dxa"/>
+          </w:tcPr>
+          <w:p>
+            <w:pPr>
+              <w:widowControl w:val="0"/>
+              <w:rPr>
+                <w:rFonts w:ascii="Arial" w:hAnsi="Arial" w:cs="Arial"/>
+                <w:sz w:val="20"/>
+                <w:szCs w:val="20"/>
+              </w:rPr>
+            </w:pPr>
+            <w:r>
+              <w:rPr>
+                <w:rFonts w:ascii="Arial" w:eastAsia="Calibri" w:hAnsi="Arial" w:cs="Arial"/>
+                <w:sz w:val="20"/>
+                <w:szCs w:val="20"/>
+              </w:rPr>
+              <w:t xml:space="preserve">{{ </w:t>
+            </w:r>
+            <w:proofErr w:type="spellStart"/>
+            <w:r>
+              <w:rPr>
+                <w:rFonts w:ascii="Arial" w:eastAsia="Calibri" w:hAnsi="Arial" w:cs="Arial"/>
+                <w:sz w:val="20"/>
+                <w:szCs w:val="20"/>
+              </w:rPr>
+              <w:t>row.in_danger</w:t>
+            </w:r>
+            <w:proofErr w:type="spellEnd"/>
+            <w:r>
+              <w:rPr>
+                <w:rFonts w:ascii="Arial" w:eastAsia="Calibri" w:hAnsi="Arial" w:cs="Arial"/>
+                <w:sz w:val="20"/>
+                <w:szCs w:val="20"/>
+              </w:rPr>
+              <w:t xml:space="preserve"> }}</w:t>
+            </w:r>
+          </w:p>
+        </w:tc>
+        <w:tc>
+          <w:tcPr>
+            <w:tcW w:w="1710" w:type="dxa"/>
+          </w:tcPr>
+          <w:p>
+            <w:pPr>
+              <w:widowControl w:val="0"/>
+              <w:rPr>
+                <w:rFonts w:ascii="Arial" w:hAnsi="Arial" w:cs="Arial"/>
+                <w:sz w:val="20"/>
+                <w:szCs w:val="20"/>
+              </w:rPr>
+            </w:pPr>
+            <w:r>
+              <w:rPr>
+                <w:rFonts w:ascii="Arial" w:hAnsi="Arial" w:cs="Arial"/>
+                <w:sz w:val="20"/>
+                <w:szCs w:val="20"/>
+              </w:rPr>
+              <w:t>{{ row.relationship_user1}}</w:t>
+            </w:r>
+          </w:p>
+        </w:tc>
+        <w:tc>
+          <w:tcPr>
+            <w:tcW w:w="1710" w:type="dxa"/>
+          </w:tcPr>
+          <w:p>
+            <w:pPr>
+              <w:widowControl w:val="0"/>
+              <w:rPr>
+                <w:rFonts w:ascii="Arial" w:eastAsia="Calibri" w:hAnsi="Arial" w:cs="Arial"/>
+                <w:sz w:val="20"/>
+                <w:szCs w:val="20"/>
+              </w:rPr>
+            </w:pPr>
+            <w:r>
+              <w:rPr>
+                <w:rFonts w:ascii="Arial" w:hAnsi="Arial" w:cs="Arial"/>
+                <w:sz w:val="20"/>
+                <w:szCs w:val="20"/>
+              </w:rPr>
+              <w:t>{{ row.relationship_op1}}</w:t>
+            </w:r>
+          </w:p>
+        </w:tc>
+        <w:tc>
+          <w:tcPr>
+            <w:tcW w:w="1985" w:type="dxa"/>
+          </w:tcPr>
+          <w:p>
+            <w:pPr>
+              <w:widowControl w:val="0"/>
+              <w:rPr>
+                <w:rFonts w:ascii="Arial" w:hAnsi="Arial" w:cs="Arial"/>
+                <w:sz w:val="20"/>
+                <w:szCs w:val="20"/>
+              </w:rPr>
+            </w:pPr>
+            <w:r>
+              <w:rPr>
+                <w:rFonts w:ascii="Arial" w:hAnsi="Arial" w:cs="Arial"/>
+                <w:sz w:val="20"/>
+                <w:szCs w:val="20"/>
+              </w:rPr>
+              <w:t xml:space="preserve">{{ </w:t>
+            </w:r>
+            <w:proofErr w:type="spellStart"/>
+            <w:r>
+              <w:rPr>
+                <w:rFonts w:ascii="Arial" w:hAnsi="Arial" w:cs="Arial"/>
+                <w:sz w:val="20"/>
+                <w:szCs w:val="20"/>
+              </w:rPr>
+              <w:t>row.custody_wanted</w:t>
+            </w:r>
+            <w:proofErr w:type="spellEnd"/>
+            <w:r>
+              <w:rPr>
+                <w:rFonts w:ascii="Arial" w:hAnsi="Arial" w:cs="Arial"/>
+                <w:sz w:val="20"/>
+                <w:szCs w:val="20"/>
+              </w:rPr>
+              <w:t>}}</w:t>
+            </w:r>
+          </w:p>
+        </w:tc>
+      </w:tr>
+      <w:tr>
+        <w:tc>
+          <w:tcPr>
+            <w:tcW w:w="1795" w:type="dxa"/>
+          </w:tcPr>
+          <w:p>
+            <w:pPr>
+              <w:rPr>
+                <w:rFonts w:ascii="Arial" w:hAnsi="Arial" w:cs="Arial"/>
+                <w:sz w:val="20"/>
+                <w:szCs w:val="20"/>
+              </w:rPr>
+            </w:pPr>
+            <w:r>
+              <w:rPr>
+                <w:rFonts w:ascii="Arial" w:eastAsia="Calibri" w:hAnsi="Arial" w:cs="Arial"/>
+                <w:sz w:val="20"/>
+                <w:szCs w:val="20"/>
+              </w:rPr>
+              <w:t xml:space="preserve">{%tr </w:t>
+            </w:r>
+            <w:proofErr w:type="spellStart"/>
+            <w:r>
+              <w:rPr>
+                <w:rFonts w:ascii="Arial" w:eastAsia="Calibri" w:hAnsi="Arial" w:cs="Arial"/>
+                <w:sz w:val="20"/>
+                <w:szCs w:val="20"/>
+              </w:rPr>
+              <w:t>endfor</w:t>
+            </w:r>
+            <w:proofErr w:type="spellEnd"/>
+            <w:r>
+              <w:rPr>
+                <w:rFonts w:ascii="Arial" w:eastAsia="Calibri" w:hAnsi="Arial" w:cs="Arial"/>
+                <w:sz w:val="20"/>
+                <w:szCs w:val="20"/>
+              </w:rPr>
+              <w:t xml:space="preserve"> %}</w:t>
+            </w:r>
+          </w:p>
+        </w:tc>
+        <w:tc>
+          <w:tcPr>
+            <w:tcW w:w="900" w:type="dxa"/>
+          </w:tcPr>
+          <w:p>
+            <w:pPr>
+              <w:widowControl w:val="0"/>
+              <w:rPr>
+                <w:rFonts w:ascii="Arial" w:eastAsia="Calibri" w:hAnsi="Arial" w:cs="Arial"/>
+                <w:sz w:val="20"/>
+                <w:szCs w:val="20"/>
+              </w:rPr>
+            </w:pPr>
+          </w:p>
+        </w:tc>
+        <w:tc>
+          <w:tcPr>
+            <w:tcW w:w="1260" w:type="dxa"/>
+          </w:tcPr>
+          <w:p>
+            <w:pPr>
+              <w:widowControl w:val="0"/>
+              <w:rPr>
+                <w:rFonts w:ascii="Arial" w:eastAsia="Calibri" w:hAnsi="Arial" w:cs="Arial"/>
+                <w:sz w:val="20"/>
+                <w:szCs w:val="20"/>
+              </w:rPr>
+            </w:pPr>
+          </w:p>
+        </w:tc>
+        <w:tc>
+          <w:tcPr>
+            <w:tcW w:w="1710" w:type="dxa"/>
+          </w:tcPr>
+          <w:p>
+            <w:pPr>
+              <w:widowControl w:val="0"/>
+              <w:rPr>
+                <w:rFonts w:ascii="Arial" w:eastAsia="Calibri" w:hAnsi="Arial" w:cs="Arial"/>
+                <w:sz w:val="20"/>
+                <w:szCs w:val="20"/>
+              </w:rPr>
+            </w:pPr>
+          </w:p>
+        </w:tc>
+        <w:tc>
+          <w:tcPr>
+            <w:tcW w:w="1710" w:type="dxa"/>
+          </w:tcPr>
+          <w:p>
+            <w:pPr>
+              <w:widowControl w:val="0"/>
+              <w:rPr>
+                <w:rFonts w:ascii="Arial" w:eastAsia="Calibri" w:hAnsi="Arial" w:cs="Arial"/>
+                <w:sz w:val="20"/>
+                <w:szCs w:val="20"/>
+              </w:rPr>
+            </w:pPr>
+          </w:p>
+        </w:tc>
+        <w:tc>
+          <w:tcPr>
+            <w:tcW w:w="1985" w:type="dxa"/>
+          </w:tcPr>
+          <w:p>
+            <w:pPr>
+              <w:widowControl w:val="0"/>
+              <w:rPr>
+                <w:rFonts w:ascii="Arial" w:eastAsia="Calibri" w:hAnsi="Arial" w:cs="Arial"/>
+                <w:sz w:val="20"/>
+                <w:szCs w:val="20"/>
+              </w:rPr>
+            </w:pPr>
+          </w:p>
+        </w:tc>
+      </w:tr>
+    </w:tbl>
+    <w:p>
+      <w:pPr>
+        <w:rPr>
+          <w:rFonts w:ascii="Arial" w:hAnsi="Arial" w:cs="Arial"/>
+          <w:sz w:val="24"/>
+          <w:szCs w:val="24"/>
+        </w:rPr>
+      </w:pPr>
+    </w:p>
+    <w:p>
+      <w:pPr>
+        <w:rPr>
+          <w:rFonts w:ascii="Arial" w:hAnsi="Arial" w:cs="Arial"/>
+          <w:sz w:val="24"/>
+          <w:szCs w:val="24"/>
+        </w:rPr>
+      </w:pPr>
+      <w:r>
+        <w:rPr>
+          <w:rFonts w:ascii="Arial" w:hAnsi="Arial" w:cs="Arial"/>
+          <w:sz w:val="24"/>
+          <w:szCs w:val="24"/>
+        </w:rPr>
+        <w:t xml:space="preserve">{%p </w:t>
+      </w:r>
+      <w:proofErr w:type="spellStart"/>
+      <w:r>
+        <w:rPr>
+          <w:rFonts w:ascii="Arial" w:hAnsi="Arial" w:cs="Arial"/>
+          <w:sz w:val="24"/>
+          <w:szCs w:val="24"/>
+        </w:rPr>
+        <w:t>el</w:t>
+      </w:r>
+      <w:r>
+        <w:rPr>
+          <w:rFonts w:ascii="Arial" w:hAnsi="Arial" w:cs="Arial"/>
+          <w:sz w:val="24"/>
+          <w:szCs w:val="24"/>
+        </w:rPr>
+        <w:t>if</w:t>
+      </w:r>
+      <w:proofErr w:type="spellEnd"/>
+      <w:r>
+        <w:rPr>
+          <w:rFonts w:ascii="Arial" w:hAnsi="Arial" w:cs="Arial"/>
+          <w:sz w:val="24"/>
+          <w:szCs w:val="24"/>
+        </w:rPr>
+        <w:t xml:space="preserve"> </w:t>
+      </w:r>
+      <w:proofErr w:type="spellStart"/>
+      <w:r>
+        <w:rPr>
+          <w:rFonts w:ascii="Arial" w:hAnsi="Arial" w:cs="Arial"/>
+          <w:sz w:val="24"/>
+          <w:szCs w:val="24"/>
+        </w:rPr>
+        <w:t>field.is_object_list</w:t>
+      </w:r>
+      <w:proofErr w:type="spellEnd"/>
+      <w:r>
+        <w:rPr>
+          <w:rFonts w:ascii="Arial" w:hAnsi="Arial" w:cs="Arial"/>
+          <w:sz w:val="24"/>
+          <w:szCs w:val="24"/>
+        </w:rPr>
+        <w:t xml:space="preserve">() %} </w:t>
+      </w:r>
+    </w:p>
+    <w:p>
+      <w:pPr>
+        <w:pStyle w:val="Heading2"/>
+        <w:rPr>
+          <w:rFonts w:ascii="Arial" w:hAnsi="Arial" w:cs="Arial"/>
+          <w:sz w:val="24"/>
+          <w:szCs w:val="24"/>
+        </w:rPr>
+      </w:pPr>
+      <w:r>
+        <w:rPr>
+          <w:rFonts w:ascii="Arial" w:hAnsi="Arial" w:cs="Arial"/>
+          <w:sz w:val="24"/>
+          <w:szCs w:val="24"/>
+        </w:rPr>
+        <w:t xml:space="preserve">{{ </w:t>
+      </w:r>
+      <w:proofErr w:type="spellStart"/>
+      <w:r>
+        <w:rPr>
+          <w:rFonts w:ascii="Arial" w:hAnsi="Arial" w:cs="Arial"/>
+          <w:sz w:val="24"/>
+          <w:szCs w:val="24"/>
+        </w:rPr>
+        <w:t>field.</w:t>
       </w:r>
       <w:r>
         <w:rPr>
@@ -191,6 +1156,7 @@
         </w:rPr>
         <w:t>label</w:t>
       </w:r>
+      <w:proofErr w:type="spellEnd"/>
       <w:r>
         <w:rPr>
           <w:rFonts w:ascii="Arial" w:hAnsi="Arial" w:cs="Arial"/>
@@ -768,6 +1734,7 @@
           <w:sz w:val="24"/>
           <w:szCs w:val="24"/>
         </w:rPr>
+        <w:lastRenderedPageBreak/>
         <w:t xml:space="preserve">{{ </w:t>
       </w:r>
       <w:proofErr w:type="spellStart"/>
@@ -1117,6 +2084,1698 @@
         </w:rPr>
         <w:t xml:space="preserve"> %}</w:t>
       </w:r>
+    </w:p>
+    <w:p>
+      <w:pPr>
+        <w:rPr>
+          <w:rFonts w:ascii="Arial" w:hAnsi="Arial" w:cs="Arial"/>
+          <w:sz w:val="24"/>
+          <w:szCs w:val="24"/>
+        </w:rPr>
+      </w:pPr>
+      <w:r>
+        <w:rPr>
+          <w:rFonts w:ascii="Arial" w:hAnsi="Arial" w:cs="Arial"/>
+          <w:sz w:val="24"/>
+          <w:szCs w:val="24"/>
+        </w:rPr>
+        <w:t xml:space="preserve">{%p for field in </w:t>
+      </w:r>
+      <w:proofErr w:type="spellStart"/>
+      <w:r>
+        <w:rPr>
+          <w:rFonts w:ascii="Arial" w:hAnsi="Arial" w:cs="Arial"/>
+          <w:sz w:val="24"/>
+          <w:szCs w:val="24"/>
+        </w:rPr>
+        <w:t>RFAaffidavitonbehalfofminor.overflow</w:t>
+      </w:r>
+      <w:proofErr w:type="spellEnd"/>
+      <w:r>
+        <w:rPr>
+          <w:rFonts w:ascii="Arial" w:hAnsi="Arial" w:cs="Arial"/>
+          <w:sz w:val="24"/>
+          <w:szCs w:val="24"/>
+        </w:rPr>
+        <w:t>()</w:t>
+      </w:r>
+      <w:r>
+        <w:rPr>
+          <w:rFonts w:ascii="Arial" w:hAnsi="Arial" w:cs="Arial"/>
+          <w:sz w:val="24"/>
+          <w:szCs w:val="24"/>
+        </w:rPr>
+        <w:t xml:space="preserve"> </w:t>
+      </w:r>
+      <w:r>
+        <w:rPr>
+          <w:rFonts w:ascii="Arial" w:hAnsi="Arial" w:cs="Arial"/>
+          <w:sz w:val="24"/>
+          <w:szCs w:val="24"/>
+        </w:rPr>
+        <w:t xml:space="preserve">or </w:t>
+      </w:r>
+      <w:proofErr w:type="spellStart"/>
+      <w:r>
+        <w:rPr>
+          <w:rFonts w:ascii="Arial" w:hAnsi="Arial" w:cs="Arial"/>
+          <w:sz w:val="24"/>
+          <w:szCs w:val="24"/>
+        </w:rPr>
+        <w:t>RFAcomplaintonbehalfofminor.overflow</w:t>
+      </w:r>
+      <w:proofErr w:type="spellEnd"/>
+      <w:r>
+        <w:rPr>
+          <w:rFonts w:ascii="Arial" w:hAnsi="Arial" w:cs="Arial"/>
+          <w:sz w:val="24"/>
+          <w:szCs w:val="24"/>
+        </w:rPr>
+        <w:t>()</w:t>
+      </w:r>
+      <w:r>
+        <w:rPr>
+          <w:rFonts w:ascii="Arial" w:hAnsi="Arial" w:cs="Arial"/>
+          <w:sz w:val="24"/>
+          <w:szCs w:val="24"/>
+        </w:rPr>
+        <w:t xml:space="preserve"> %}</w:t>
+      </w:r>
+    </w:p>
+    <w:p>
+      <w:pPr>
+        <w:rPr>
+          <w:rFonts w:ascii="Arial" w:hAnsi="Arial" w:cs="Arial"/>
+          <w:sz w:val="24"/>
+          <w:szCs w:val="24"/>
+        </w:rPr>
+      </w:pPr>
+      <w:r>
+        <w:rPr>
+          <w:rFonts w:ascii="Arial" w:hAnsi="Arial" w:cs="Arial"/>
+          <w:sz w:val="24"/>
+          <w:szCs w:val="24"/>
+        </w:rPr>
+        <w:t xml:space="preserve">{%p if </w:t>
+      </w:r>
+      <w:proofErr w:type="spellStart"/>
+      <w:r>
+        <w:rPr>
+          <w:rFonts w:ascii="Arial" w:hAnsi="Arial" w:cs="Arial"/>
+          <w:sz w:val="24"/>
+          <w:szCs w:val="24"/>
+        </w:rPr>
+        <w:t>field.field_name</w:t>
+      </w:r>
+      <w:proofErr w:type="spellEnd"/>
+      <w:r>
+        <w:rPr>
+          <w:rFonts w:ascii="Arial" w:hAnsi="Arial" w:cs="Arial"/>
+          <w:sz w:val="24"/>
+          <w:szCs w:val="24"/>
+        </w:rPr>
+        <w:t xml:space="preserve"> == "children" %}</w:t>
+      </w:r>
+    </w:p>
+    <w:p>
+      <w:pPr>
+        <w:pStyle w:val="Heading2"/>
+        <w:rPr>
+          <w:rFonts w:ascii="Arial" w:hAnsi="Arial" w:cs="Arial"/>
+          <w:sz w:val="24"/>
+          <w:szCs w:val="24"/>
+        </w:rPr>
+      </w:pPr>
+      <w:r>
+        <w:rPr>
+          <w:rFonts w:ascii="Arial" w:hAnsi="Arial" w:cs="Arial"/>
+          <w:sz w:val="24"/>
+          <w:szCs w:val="24"/>
+        </w:rPr>
+        <w:t>Additional children</w:t>
+      </w:r>
+    </w:p>
+    <w:tbl>
+      <w:tblPr>
+        <w:tblStyle w:val="TableGrid"/>
+        <w:tblW w:w="9360" w:type="dxa"/>
+        <w:tblLayout w:type="fixed"/>
+        <w:tblLook w:val="04A0" w:firstRow="1" w:lastRow="0" w:firstColumn="1" w:lastColumn="0" w:noHBand="0" w:noVBand="1"/>
+      </w:tblPr>
+      <w:tblGrid>
+        <w:gridCol w:w="1795"/>
+        <w:gridCol w:w="900"/>
+        <w:gridCol w:w="1260"/>
+        <w:gridCol w:w="1710"/>
+        <w:gridCol w:w="1710"/>
+        <w:gridCol w:w="1985"/>
+      </w:tblGrid>
+      <w:tr>
+        <w:tc>
+          <w:tcPr>
+            <w:tcW w:w="1795" w:type="dxa"/>
+          </w:tcPr>
+          <w:p>
+            <w:pPr>
+              <w:widowControl w:val="0"/>
+              <w:rPr>
+                <w:rFonts w:ascii="Arial" w:hAnsi="Arial" w:cs="Arial"/>
+                <w:b/>
+                <w:sz w:val="20"/>
+                <w:szCs w:val="20"/>
+              </w:rPr>
+            </w:pPr>
+            <w:r>
+              <w:rPr>
+                <w:rFonts w:ascii="Arial" w:eastAsia="Calibri" w:hAnsi="Arial" w:cs="Arial"/>
+                <w:b/>
+                <w:sz w:val="20"/>
+                <w:szCs w:val="20"/>
+              </w:rPr>
+              <w:t>Name</w:t>
+            </w:r>
+          </w:p>
+        </w:tc>
+        <w:tc>
+          <w:tcPr>
+            <w:tcW w:w="900" w:type="dxa"/>
+          </w:tcPr>
+          <w:p>
+            <w:pPr>
+              <w:widowControl w:val="0"/>
+              <w:rPr>
+                <w:rFonts w:ascii="Arial" w:eastAsia="Calibri" w:hAnsi="Arial" w:cs="Arial"/>
+                <w:b/>
+                <w:sz w:val="20"/>
+                <w:szCs w:val="20"/>
+              </w:rPr>
+            </w:pPr>
+            <w:r>
+              <w:rPr>
+                <w:rFonts w:ascii="Arial" w:eastAsia="Calibri" w:hAnsi="Arial" w:cs="Arial"/>
+                <w:b/>
+                <w:sz w:val="20"/>
+                <w:szCs w:val="20"/>
+              </w:rPr>
+              <w:t>Born</w:t>
+            </w:r>
+          </w:p>
+        </w:tc>
+        <w:tc>
+          <w:tcPr>
+            <w:tcW w:w="1260" w:type="dxa"/>
+          </w:tcPr>
+          <w:p>
+            <w:pPr>
+              <w:widowControl w:val="0"/>
+              <w:rPr>
+                <w:rFonts w:ascii="Arial" w:eastAsia="Calibri" w:hAnsi="Arial" w:cs="Arial"/>
+                <w:b/>
+                <w:sz w:val="20"/>
+                <w:szCs w:val="20"/>
+              </w:rPr>
+            </w:pPr>
+            <w:r>
+              <w:rPr>
+                <w:rFonts w:ascii="Arial" w:eastAsia="Calibri" w:hAnsi="Arial" w:cs="Arial"/>
+                <w:b/>
+                <w:sz w:val="20"/>
+                <w:szCs w:val="20"/>
+              </w:rPr>
+              <w:t>In danger?</w:t>
+            </w:r>
+          </w:p>
+        </w:tc>
+        <w:tc>
+          <w:tcPr>
+            <w:tcW w:w="1710" w:type="dxa"/>
+          </w:tcPr>
+          <w:p>
+            <w:pPr>
+              <w:widowControl w:val="0"/>
+              <w:rPr>
+                <w:rFonts w:ascii="Arial" w:eastAsia="Calibri" w:hAnsi="Arial" w:cs="Arial"/>
+                <w:b/>
+                <w:sz w:val="20"/>
+                <w:szCs w:val="20"/>
+              </w:rPr>
+            </w:pPr>
+            <w:r>
+              <w:rPr>
+                <w:rFonts w:ascii="Arial" w:eastAsia="Calibri" w:hAnsi="Arial" w:cs="Arial"/>
+                <w:b/>
+                <w:sz w:val="20"/>
+                <w:szCs w:val="20"/>
+              </w:rPr>
+              <w:t>Relationship to petitioner</w:t>
+            </w:r>
+          </w:p>
+        </w:tc>
+        <w:tc>
+          <w:tcPr>
+            <w:tcW w:w="1710" w:type="dxa"/>
+          </w:tcPr>
+          <w:p>
+            <w:pPr>
+              <w:widowControl w:val="0"/>
+              <w:rPr>
+                <w:rFonts w:ascii="Arial" w:eastAsia="Calibri" w:hAnsi="Arial" w:cs="Arial"/>
+                <w:b/>
+                <w:sz w:val="20"/>
+                <w:szCs w:val="20"/>
+              </w:rPr>
+            </w:pPr>
+            <w:r>
+              <w:rPr>
+                <w:rFonts w:ascii="Arial" w:eastAsia="Calibri" w:hAnsi="Arial" w:cs="Arial"/>
+                <w:b/>
+                <w:sz w:val="20"/>
+                <w:szCs w:val="20"/>
+              </w:rPr>
+              <w:t>Relationship to defendant</w:t>
+            </w:r>
+          </w:p>
+        </w:tc>
+        <w:tc>
+          <w:tcPr>
+            <w:tcW w:w="1985" w:type="dxa"/>
+          </w:tcPr>
+          <w:p>
+            <w:pPr>
+              <w:widowControl w:val="0"/>
+              <w:rPr>
+                <w:rFonts w:ascii="Arial" w:eastAsia="Calibri" w:hAnsi="Arial" w:cs="Arial"/>
+                <w:b/>
+                <w:sz w:val="20"/>
+                <w:szCs w:val="20"/>
+              </w:rPr>
+            </w:pPr>
+            <w:r>
+              <w:rPr>
+                <w:rFonts w:ascii="Arial" w:eastAsia="Calibri" w:hAnsi="Arial" w:cs="Arial"/>
+                <w:b/>
+                <w:sz w:val="20"/>
+                <w:szCs w:val="20"/>
+              </w:rPr>
+              <w:t>Plaintiff/petitioner wants custody?</w:t>
+            </w:r>
+          </w:p>
+        </w:tc>
+      </w:tr>
+      <w:tr>
+        <w:tc>
+          <w:tcPr>
+            <w:tcW w:w="1795" w:type="dxa"/>
+          </w:tcPr>
+          <w:p>
+            <w:pPr>
+              <w:rPr>
+                <w:rFonts w:ascii="Arial" w:hAnsi="Arial" w:cs="Arial"/>
+                <w:sz w:val="20"/>
+                <w:szCs w:val="20"/>
+              </w:rPr>
+            </w:pPr>
+            <w:r>
+              <w:rPr>
+                <w:rFonts w:ascii="Arial" w:eastAsia="Calibri" w:hAnsi="Arial" w:cs="Arial"/>
+                <w:sz w:val="20"/>
+                <w:szCs w:val="20"/>
+              </w:rPr>
+              <w:t xml:space="preserve">{%tr for row in </w:t>
+            </w:r>
+            <w:proofErr w:type="spellStart"/>
+            <w:r>
+              <w:rPr>
+                <w:rFonts w:ascii="Arial" w:eastAsia="Calibri" w:hAnsi="Arial" w:cs="Arial"/>
+                <w:sz w:val="20"/>
+                <w:szCs w:val="20"/>
+              </w:rPr>
+              <w:t>field.overflow_value</w:t>
+            </w:r>
+            <w:proofErr w:type="spellEnd"/>
+            <w:r>
+              <w:rPr>
+                <w:rFonts w:ascii="Arial" w:eastAsia="Calibri" w:hAnsi="Arial" w:cs="Arial"/>
+                <w:sz w:val="20"/>
+                <w:szCs w:val="20"/>
+              </w:rPr>
+              <w:t>() %}</w:t>
+            </w:r>
+          </w:p>
+        </w:tc>
+        <w:tc>
+          <w:tcPr>
+            <w:tcW w:w="900" w:type="dxa"/>
+          </w:tcPr>
+          <w:p>
+            <w:pPr>
+              <w:widowControl w:val="0"/>
+              <w:rPr>
+                <w:rFonts w:ascii="Arial" w:eastAsia="Calibri" w:hAnsi="Arial" w:cs="Arial"/>
+                <w:sz w:val="20"/>
+                <w:szCs w:val="20"/>
+              </w:rPr>
+            </w:pPr>
+          </w:p>
+        </w:tc>
+        <w:tc>
+          <w:tcPr>
+            <w:tcW w:w="1260" w:type="dxa"/>
+          </w:tcPr>
+          <w:p>
+            <w:pPr>
+              <w:widowControl w:val="0"/>
+              <w:rPr>
+                <w:rFonts w:ascii="Arial" w:eastAsia="Calibri" w:hAnsi="Arial" w:cs="Arial"/>
+                <w:sz w:val="20"/>
+                <w:szCs w:val="20"/>
+              </w:rPr>
+            </w:pPr>
+          </w:p>
+        </w:tc>
+        <w:tc>
+          <w:tcPr>
+            <w:tcW w:w="1710" w:type="dxa"/>
+          </w:tcPr>
+          <w:p>
+            <w:pPr>
+              <w:widowControl w:val="0"/>
+              <w:rPr>
+                <w:rFonts w:ascii="Arial" w:eastAsia="Calibri" w:hAnsi="Arial" w:cs="Arial"/>
+                <w:sz w:val="20"/>
+                <w:szCs w:val="20"/>
+              </w:rPr>
+            </w:pPr>
+          </w:p>
+        </w:tc>
+        <w:tc>
+          <w:tcPr>
+            <w:tcW w:w="1710" w:type="dxa"/>
+          </w:tcPr>
+          <w:p>
+            <w:pPr>
+              <w:widowControl w:val="0"/>
+              <w:rPr>
+                <w:rFonts w:ascii="Arial" w:eastAsia="Calibri" w:hAnsi="Arial" w:cs="Arial"/>
+                <w:sz w:val="20"/>
+                <w:szCs w:val="20"/>
+              </w:rPr>
+            </w:pPr>
+          </w:p>
+        </w:tc>
+        <w:tc>
+          <w:tcPr>
+            <w:tcW w:w="1985" w:type="dxa"/>
+          </w:tcPr>
+          <w:p>
+            <w:pPr>
+              <w:widowControl w:val="0"/>
+              <w:rPr>
+                <w:rFonts w:ascii="Arial" w:eastAsia="Calibri" w:hAnsi="Arial" w:cs="Arial"/>
+                <w:sz w:val="20"/>
+                <w:szCs w:val="20"/>
+              </w:rPr>
+            </w:pPr>
+          </w:p>
+        </w:tc>
+      </w:tr>
+      <w:tr>
+        <w:tc>
+          <w:tcPr>
+            <w:tcW w:w="1795" w:type="dxa"/>
+          </w:tcPr>
+          <w:p>
+            <w:pPr>
+              <w:rPr>
+                <w:rFonts w:ascii="Arial" w:hAnsi="Arial" w:cs="Arial"/>
+                <w:sz w:val="24"/>
+                <w:szCs w:val="24"/>
+              </w:rPr>
+            </w:pPr>
+            <w:r>
+              <w:rPr>
+                <w:rFonts w:ascii="Arial" w:eastAsia="Calibri" w:hAnsi="Arial" w:cs="Arial"/>
+                <w:sz w:val="24"/>
+                <w:szCs w:val="24"/>
+              </w:rPr>
+              <w:t>{{ row.name }}</w:t>
+            </w:r>
+          </w:p>
+        </w:tc>
+        <w:tc>
+          <w:tcPr>
+            <w:tcW w:w="900" w:type="dxa"/>
+          </w:tcPr>
+          <w:p>
+            <w:pPr>
+              <w:widowControl w:val="0"/>
+              <w:rPr>
+                <w:rFonts w:ascii="Arial" w:hAnsi="Arial" w:cs="Arial"/>
+                <w:sz w:val="20"/>
+                <w:szCs w:val="20"/>
+              </w:rPr>
+            </w:pPr>
+            <w:r>
+              <w:rPr>
+                <w:rFonts w:ascii="Arial" w:eastAsia="Calibri" w:hAnsi="Arial" w:cs="Arial"/>
+                <w:sz w:val="20"/>
+                <w:szCs w:val="20"/>
+              </w:rPr>
+              <w:t xml:space="preserve">{{ </w:t>
+            </w:r>
+            <w:proofErr w:type="spellStart"/>
+            <w:r>
+              <w:rPr>
+                <w:rFonts w:ascii="Arial" w:eastAsia="Calibri" w:hAnsi="Arial" w:cs="Arial"/>
+                <w:sz w:val="20"/>
+                <w:szCs w:val="20"/>
+              </w:rPr>
+              <w:t>row.birthdate</w:t>
+            </w:r>
+            <w:proofErr w:type="spellEnd"/>
+            <w:r>
+              <w:rPr>
+                <w:rFonts w:ascii="Arial" w:eastAsia="Calibri" w:hAnsi="Arial" w:cs="Arial"/>
+                <w:sz w:val="20"/>
+                <w:szCs w:val="20"/>
+              </w:rPr>
+              <w:t xml:space="preserve"> }}</w:t>
+            </w:r>
+          </w:p>
+        </w:tc>
+        <w:tc>
+          <w:tcPr>
+            <w:tcW w:w="1260" w:type="dxa"/>
+          </w:tcPr>
+          <w:p>
+            <w:pPr>
+              <w:widowControl w:val="0"/>
+              <w:rPr>
+                <w:rFonts w:ascii="Arial" w:hAnsi="Arial" w:cs="Arial"/>
+                <w:sz w:val="20"/>
+                <w:szCs w:val="20"/>
+              </w:rPr>
+            </w:pPr>
+            <w:r>
+              <w:rPr>
+                <w:rFonts w:ascii="Arial" w:eastAsia="Calibri" w:hAnsi="Arial" w:cs="Arial"/>
+                <w:sz w:val="20"/>
+                <w:szCs w:val="20"/>
+              </w:rPr>
+              <w:t xml:space="preserve">{{ </w:t>
+            </w:r>
+            <w:proofErr w:type="spellStart"/>
+            <w:r>
+              <w:rPr>
+                <w:rFonts w:ascii="Arial" w:eastAsia="Calibri" w:hAnsi="Arial" w:cs="Arial"/>
+                <w:sz w:val="20"/>
+                <w:szCs w:val="20"/>
+              </w:rPr>
+              <w:t>row.in_danger</w:t>
+            </w:r>
+            <w:proofErr w:type="spellEnd"/>
+            <w:r>
+              <w:rPr>
+                <w:rFonts w:ascii="Arial" w:eastAsia="Calibri" w:hAnsi="Arial" w:cs="Arial"/>
+                <w:sz w:val="20"/>
+                <w:szCs w:val="20"/>
+              </w:rPr>
+              <w:t xml:space="preserve"> }}</w:t>
+            </w:r>
+          </w:p>
+        </w:tc>
+        <w:tc>
+          <w:tcPr>
+            <w:tcW w:w="1710" w:type="dxa"/>
+          </w:tcPr>
+          <w:p>
+            <w:pPr>
+              <w:widowControl w:val="0"/>
+              <w:rPr>
+                <w:rFonts w:ascii="Arial" w:hAnsi="Arial" w:cs="Arial"/>
+                <w:sz w:val="20"/>
+                <w:szCs w:val="20"/>
+              </w:rPr>
+            </w:pPr>
+            <w:r>
+              <w:rPr>
+                <w:rFonts w:ascii="Arial" w:hAnsi="Arial" w:cs="Arial"/>
+                <w:sz w:val="20"/>
+                <w:szCs w:val="20"/>
+              </w:rPr>
+              <w:t>{{ row.relationship_user1}}</w:t>
+            </w:r>
+          </w:p>
+        </w:tc>
+        <w:tc>
+          <w:tcPr>
+            <w:tcW w:w="1710" w:type="dxa"/>
+          </w:tcPr>
+          <w:p>
+            <w:pPr>
+              <w:widowControl w:val="0"/>
+              <w:rPr>
+                <w:rFonts w:ascii="Arial" w:eastAsia="Calibri" w:hAnsi="Arial" w:cs="Arial"/>
+                <w:sz w:val="20"/>
+                <w:szCs w:val="20"/>
+              </w:rPr>
+            </w:pPr>
+            <w:r>
+              <w:rPr>
+                <w:rFonts w:ascii="Arial" w:hAnsi="Arial" w:cs="Arial"/>
+                <w:sz w:val="20"/>
+                <w:szCs w:val="20"/>
+              </w:rPr>
+              <w:t>{{ row.relationship_op1}}</w:t>
+            </w:r>
+          </w:p>
+        </w:tc>
+        <w:tc>
+          <w:tcPr>
+            <w:tcW w:w="1985" w:type="dxa"/>
+          </w:tcPr>
+          <w:p>
+            <w:pPr>
+              <w:widowControl w:val="0"/>
+              <w:rPr>
+                <w:rFonts w:ascii="Arial" w:hAnsi="Arial" w:cs="Arial"/>
+                <w:sz w:val="20"/>
+                <w:szCs w:val="20"/>
+              </w:rPr>
+            </w:pPr>
+            <w:r>
+              <w:rPr>
+                <w:rFonts w:ascii="Arial" w:hAnsi="Arial" w:cs="Arial"/>
+                <w:sz w:val="20"/>
+                <w:szCs w:val="20"/>
+              </w:rPr>
+              <w:t xml:space="preserve">{{ </w:t>
+            </w:r>
+            <w:proofErr w:type="spellStart"/>
+            <w:r>
+              <w:rPr>
+                <w:rFonts w:ascii="Arial" w:hAnsi="Arial" w:cs="Arial"/>
+                <w:sz w:val="20"/>
+                <w:szCs w:val="20"/>
+              </w:rPr>
+              <w:t>row.custody_wanted</w:t>
+            </w:r>
+            <w:proofErr w:type="spellEnd"/>
+            <w:r>
+              <w:rPr>
+                <w:rFonts w:ascii="Arial" w:hAnsi="Arial" w:cs="Arial"/>
+                <w:sz w:val="20"/>
+                <w:szCs w:val="20"/>
+              </w:rPr>
+              <w:t>}}</w:t>
+            </w:r>
+          </w:p>
+        </w:tc>
+      </w:tr>
+      <w:tr>
+        <w:tc>
+          <w:tcPr>
+            <w:tcW w:w="1795" w:type="dxa"/>
+          </w:tcPr>
+          <w:p>
+            <w:pPr>
+              <w:rPr>
+                <w:rFonts w:ascii="Arial" w:hAnsi="Arial" w:cs="Arial"/>
+                <w:sz w:val="20"/>
+                <w:szCs w:val="20"/>
+              </w:rPr>
+            </w:pPr>
+            <w:r>
+              <w:rPr>
+                <w:rFonts w:ascii="Arial" w:eastAsia="Calibri" w:hAnsi="Arial" w:cs="Arial"/>
+                <w:sz w:val="20"/>
+                <w:szCs w:val="20"/>
+              </w:rPr>
+              <w:t xml:space="preserve">{%tr </w:t>
+            </w:r>
+            <w:proofErr w:type="spellStart"/>
+            <w:r>
+              <w:rPr>
+                <w:rFonts w:ascii="Arial" w:eastAsia="Calibri" w:hAnsi="Arial" w:cs="Arial"/>
+                <w:sz w:val="20"/>
+                <w:szCs w:val="20"/>
+              </w:rPr>
+              <w:t>endfor</w:t>
+            </w:r>
+            <w:proofErr w:type="spellEnd"/>
+            <w:r>
+              <w:rPr>
+                <w:rFonts w:ascii="Arial" w:eastAsia="Calibri" w:hAnsi="Arial" w:cs="Arial"/>
+                <w:sz w:val="20"/>
+                <w:szCs w:val="20"/>
+              </w:rPr>
+              <w:t xml:space="preserve"> %}</w:t>
+            </w:r>
+          </w:p>
+        </w:tc>
+        <w:tc>
+          <w:tcPr>
+            <w:tcW w:w="900" w:type="dxa"/>
+          </w:tcPr>
+          <w:p>
+            <w:pPr>
+              <w:widowControl w:val="0"/>
+              <w:rPr>
+                <w:rFonts w:ascii="Arial" w:eastAsia="Calibri" w:hAnsi="Arial" w:cs="Arial"/>
+                <w:sz w:val="20"/>
+                <w:szCs w:val="20"/>
+              </w:rPr>
+            </w:pPr>
+          </w:p>
+        </w:tc>
+        <w:tc>
+          <w:tcPr>
+            <w:tcW w:w="1260" w:type="dxa"/>
+          </w:tcPr>
+          <w:p>
+            <w:pPr>
+              <w:widowControl w:val="0"/>
+              <w:rPr>
+                <w:rFonts w:ascii="Arial" w:eastAsia="Calibri" w:hAnsi="Arial" w:cs="Arial"/>
+                <w:sz w:val="20"/>
+                <w:szCs w:val="20"/>
+              </w:rPr>
+            </w:pPr>
+          </w:p>
+        </w:tc>
+        <w:tc>
+          <w:tcPr>
+            <w:tcW w:w="1710" w:type="dxa"/>
+          </w:tcPr>
+          <w:p>
+            <w:pPr>
+              <w:widowControl w:val="0"/>
+              <w:rPr>
+                <w:rFonts w:ascii="Arial" w:eastAsia="Calibri" w:hAnsi="Arial" w:cs="Arial"/>
+                <w:sz w:val="20"/>
+                <w:szCs w:val="20"/>
+              </w:rPr>
+            </w:pPr>
+          </w:p>
+        </w:tc>
+        <w:tc>
+          <w:tcPr>
+            <w:tcW w:w="1710" w:type="dxa"/>
+          </w:tcPr>
+          <w:p>
+            <w:pPr>
+              <w:widowControl w:val="0"/>
+              <w:rPr>
+                <w:rFonts w:ascii="Arial" w:eastAsia="Calibri" w:hAnsi="Arial" w:cs="Arial"/>
+                <w:sz w:val="20"/>
+                <w:szCs w:val="20"/>
+              </w:rPr>
+            </w:pPr>
+          </w:p>
+        </w:tc>
+        <w:tc>
+          <w:tcPr>
+            <w:tcW w:w="1985" w:type="dxa"/>
+          </w:tcPr>
+          <w:p>
+            <w:pPr>
+              <w:widowControl w:val="0"/>
+              <w:rPr>
+                <w:rFonts w:ascii="Arial" w:eastAsia="Calibri" w:hAnsi="Arial" w:cs="Arial"/>
+                <w:sz w:val="20"/>
+                <w:szCs w:val="20"/>
+              </w:rPr>
+            </w:pPr>
+          </w:p>
+        </w:tc>
+      </w:tr>
+    </w:tbl>
+    <w:p>
+      <w:pPr>
+        <w:rPr>
+          <w:rFonts w:ascii="Arial" w:hAnsi="Arial" w:cs="Arial"/>
+          <w:sz w:val="24"/>
+          <w:szCs w:val="24"/>
+        </w:rPr>
+      </w:pPr>
+    </w:p>
+    <w:p>
+      <w:pPr>
+        <w:rPr>
+          <w:rFonts w:ascii="Arial" w:hAnsi="Arial" w:cs="Arial"/>
+          <w:sz w:val="24"/>
+          <w:szCs w:val="24"/>
+        </w:rPr>
+      </w:pPr>
+      <w:r>
+        <w:rPr>
+          <w:rFonts w:ascii="Arial" w:hAnsi="Arial" w:cs="Arial"/>
+          <w:sz w:val="24"/>
+          <w:szCs w:val="24"/>
+        </w:rPr>
+        <w:t xml:space="preserve">{%p </w:t>
+      </w:r>
+      <w:proofErr w:type="spellStart"/>
+      <w:r>
+        <w:rPr>
+          <w:rFonts w:ascii="Arial" w:hAnsi="Arial" w:cs="Arial"/>
+          <w:sz w:val="24"/>
+          <w:szCs w:val="24"/>
+        </w:rPr>
+        <w:t>el</w:t>
+      </w:r>
+      <w:r>
+        <w:rPr>
+          <w:rFonts w:ascii="Arial" w:hAnsi="Arial" w:cs="Arial"/>
+          <w:sz w:val="24"/>
+          <w:szCs w:val="24"/>
+        </w:rPr>
+        <w:t>if</w:t>
+      </w:r>
+      <w:proofErr w:type="spellEnd"/>
+      <w:r>
+        <w:rPr>
+          <w:rFonts w:ascii="Arial" w:hAnsi="Arial" w:cs="Arial"/>
+          <w:sz w:val="24"/>
+          <w:szCs w:val="24"/>
+        </w:rPr>
+        <w:t xml:space="preserve"> </w:t>
+      </w:r>
+      <w:proofErr w:type="spellStart"/>
+      <w:r>
+        <w:rPr>
+          <w:rFonts w:ascii="Arial" w:hAnsi="Arial" w:cs="Arial"/>
+          <w:sz w:val="24"/>
+          <w:szCs w:val="24"/>
+        </w:rPr>
+        <w:t>field.is_object_list</w:t>
+      </w:r>
+      <w:proofErr w:type="spellEnd"/>
+      <w:r>
+        <w:rPr>
+          <w:rFonts w:ascii="Arial" w:hAnsi="Arial" w:cs="Arial"/>
+          <w:sz w:val="24"/>
+          <w:szCs w:val="24"/>
+        </w:rPr>
+        <w:t xml:space="preserve">() %} </w:t>
+      </w:r>
+    </w:p>
+    <w:p>
+      <w:pPr>
+        <w:pStyle w:val="Heading2"/>
+        <w:rPr>
+          <w:rFonts w:ascii="Arial" w:hAnsi="Arial" w:cs="Arial"/>
+          <w:sz w:val="24"/>
+          <w:szCs w:val="24"/>
+        </w:rPr>
+      </w:pPr>
+      <w:r>
+        <w:rPr>
+          <w:rFonts w:ascii="Arial" w:hAnsi="Arial" w:cs="Arial"/>
+          <w:sz w:val="24"/>
+          <w:szCs w:val="24"/>
+        </w:rPr>
+        <w:t xml:space="preserve">{{ </w:t>
+      </w:r>
+      <w:proofErr w:type="spellStart"/>
+      <w:r>
+        <w:rPr>
+          <w:rFonts w:ascii="Arial" w:hAnsi="Arial" w:cs="Arial"/>
+          <w:sz w:val="24"/>
+          <w:szCs w:val="24"/>
+        </w:rPr>
+        <w:t>field.label</w:t>
+      </w:r>
+      <w:proofErr w:type="spellEnd"/>
+      <w:r>
+        <w:rPr>
+          <w:rFonts w:ascii="Arial" w:hAnsi="Arial" w:cs="Arial"/>
+          <w:sz w:val="24"/>
+          <w:szCs w:val="24"/>
+        </w:rPr>
+        <w:t xml:space="preserve"> }}</w:t>
+      </w:r>
+    </w:p>
+    <w:tbl>
+      <w:tblPr>
+        <w:tblStyle w:val="TableGrid"/>
+        <w:tblW w:w="0" w:type="auto"/>
+        <w:tblLook w:val="04A0" w:firstRow="1" w:lastRow="0" w:firstColumn="1" w:lastColumn="0" w:noHBand="0" w:noVBand="1"/>
+      </w:tblPr>
+      <w:tblGrid>
+        <w:gridCol w:w="3116"/>
+        <w:gridCol w:w="3117"/>
+        <w:gridCol w:w="3117"/>
+      </w:tblGrid>
+      <w:tr>
+        <w:tc>
+          <w:tcPr>
+            <w:tcW w:w="3116" w:type="dxa"/>
+          </w:tcPr>
+          <w:p>
+            <w:pPr>
+              <w:rPr>
+                <w:rFonts w:ascii="Arial" w:hAnsi="Arial" w:cs="Arial"/>
+                <w:b/>
+                <w:sz w:val="24"/>
+                <w:szCs w:val="24"/>
+              </w:rPr>
+            </w:pPr>
+            <w:r>
+              <w:rPr>
+                <w:rFonts w:ascii="Arial" w:hAnsi="Arial" w:cs="Arial"/>
+                <w:b/>
+                <w:sz w:val="24"/>
+                <w:szCs w:val="24"/>
+              </w:rPr>
+              <w:t>{%</w:t>
+            </w:r>
+            <w:proofErr w:type="spellStart"/>
+            <w:r>
+              <w:rPr>
+                <w:rFonts w:ascii="Arial" w:hAnsi="Arial" w:cs="Arial"/>
+                <w:b/>
+                <w:sz w:val="24"/>
+                <w:szCs w:val="24"/>
+              </w:rPr>
+              <w:t>tc</w:t>
+            </w:r>
+            <w:proofErr w:type="spellEnd"/>
+            <w:r>
+              <w:rPr>
+                <w:rFonts w:ascii="Arial" w:hAnsi="Arial" w:cs="Arial"/>
+                <w:b/>
+                <w:sz w:val="24"/>
+                <w:szCs w:val="24"/>
+              </w:rPr>
+              <w:t xml:space="preserve"> for column in </w:t>
+            </w:r>
+            <w:proofErr w:type="spellStart"/>
+            <w:r>
+              <w:rPr>
+                <w:rFonts w:ascii="Arial" w:hAnsi="Arial" w:cs="Arial"/>
+                <w:b/>
+                <w:sz w:val="24"/>
+                <w:szCs w:val="24"/>
+              </w:rPr>
+              <w:t>field.columns</w:t>
+            </w:r>
+            <w:proofErr w:type="spellEnd"/>
+            <w:r>
+              <w:rPr>
+                <w:rFonts w:ascii="Arial" w:hAnsi="Arial" w:cs="Arial"/>
+                <w:b/>
+                <w:sz w:val="24"/>
+                <w:szCs w:val="24"/>
+              </w:rPr>
+              <w:t>() %}</w:t>
+            </w:r>
+          </w:p>
+        </w:tc>
+        <w:tc>
+          <w:tcPr>
+            <w:tcW w:w="3117" w:type="dxa"/>
+          </w:tcPr>
+          <w:p>
+            <w:pPr>
+              <w:rPr>
+                <w:rFonts w:ascii="Arial" w:hAnsi="Arial" w:cs="Arial"/>
+                <w:b/>
+                <w:sz w:val="24"/>
+                <w:szCs w:val="24"/>
+              </w:rPr>
+            </w:pPr>
+            <w:r>
+              <w:rPr>
+                <w:rFonts w:ascii="Arial" w:hAnsi="Arial" w:cs="Arial"/>
+                <w:b/>
+                <w:sz w:val="24"/>
+                <w:szCs w:val="24"/>
+              </w:rPr>
+              <w:t>{{ label(column).capitalize() }}</w:t>
+            </w:r>
+          </w:p>
+        </w:tc>
+        <w:tc>
+          <w:tcPr>
+            <w:tcW w:w="3117" w:type="dxa"/>
+          </w:tcPr>
+          <w:p>
+            <w:pPr>
+              <w:rPr>
+                <w:rFonts w:ascii="Arial" w:hAnsi="Arial" w:cs="Arial"/>
+                <w:b/>
+                <w:sz w:val="24"/>
+                <w:szCs w:val="24"/>
+              </w:rPr>
+            </w:pPr>
+            <w:r>
+              <w:rPr>
+                <w:rFonts w:ascii="Arial" w:hAnsi="Arial" w:cs="Arial"/>
+                <w:b/>
+                <w:sz w:val="24"/>
+                <w:szCs w:val="24"/>
+              </w:rPr>
+              <w:t>{%</w:t>
+            </w:r>
+            <w:proofErr w:type="spellStart"/>
+            <w:r>
+              <w:rPr>
+                <w:rFonts w:ascii="Arial" w:hAnsi="Arial" w:cs="Arial"/>
+                <w:b/>
+                <w:sz w:val="24"/>
+                <w:szCs w:val="24"/>
+              </w:rPr>
+              <w:t>tc</w:t>
+            </w:r>
+            <w:proofErr w:type="spellEnd"/>
+            <w:r>
+              <w:rPr>
+                <w:rFonts w:ascii="Arial" w:hAnsi="Arial" w:cs="Arial"/>
+                <w:b/>
+                <w:sz w:val="24"/>
+                <w:szCs w:val="24"/>
+              </w:rPr>
+              <w:t xml:space="preserve"> </w:t>
+            </w:r>
+            <w:proofErr w:type="spellStart"/>
+            <w:r>
+              <w:rPr>
+                <w:rFonts w:ascii="Arial" w:hAnsi="Arial" w:cs="Arial"/>
+                <w:b/>
+                <w:sz w:val="24"/>
+                <w:szCs w:val="24"/>
+              </w:rPr>
+              <w:t>endfor</w:t>
+            </w:r>
+            <w:proofErr w:type="spellEnd"/>
+            <w:r>
+              <w:rPr>
+                <w:rFonts w:ascii="Arial" w:hAnsi="Arial" w:cs="Arial"/>
+                <w:b/>
+                <w:sz w:val="24"/>
+                <w:szCs w:val="24"/>
+              </w:rPr>
+              <w:t xml:space="preserve"> %}</w:t>
+            </w:r>
+          </w:p>
+        </w:tc>
+      </w:tr>
+      <w:tr>
+        <w:tc>
+          <w:tcPr>
+            <w:tcW w:w="3116" w:type="dxa"/>
+          </w:tcPr>
+          <w:p>
+            <w:pPr>
+              <w:rPr>
+                <w:rFonts w:ascii="Arial" w:hAnsi="Arial" w:cs="Arial"/>
+                <w:sz w:val="24"/>
+                <w:szCs w:val="24"/>
+              </w:rPr>
+            </w:pPr>
+            <w:r>
+              <w:rPr>
+                <w:rFonts w:ascii="Arial" w:hAnsi="Arial" w:cs="Arial"/>
+                <w:sz w:val="24"/>
+                <w:szCs w:val="24"/>
+              </w:rPr>
+              <w:t xml:space="preserve">{%tr for row in </w:t>
+            </w:r>
+            <w:proofErr w:type="spellStart"/>
+            <w:r>
+              <w:rPr>
+                <w:rFonts w:ascii="Arial" w:hAnsi="Arial" w:cs="Arial"/>
+                <w:sz w:val="24"/>
+                <w:szCs w:val="24"/>
+              </w:rPr>
+              <w:t>field.overflow_value</w:t>
+            </w:r>
+            <w:proofErr w:type="spellEnd"/>
+            <w:r>
+              <w:rPr>
+                <w:rFonts w:ascii="Arial" w:hAnsi="Arial" w:cs="Arial"/>
+                <w:sz w:val="24"/>
+                <w:szCs w:val="24"/>
+              </w:rPr>
+              <w:t>() %}</w:t>
+            </w:r>
+          </w:p>
+        </w:tc>
+        <w:tc>
+          <w:tcPr>
+            <w:tcW w:w="3117" w:type="dxa"/>
+          </w:tcPr>
+          <w:p>
+            <w:pPr>
+              <w:rPr>
+                <w:rFonts w:ascii="Arial" w:hAnsi="Arial" w:cs="Arial"/>
+                <w:sz w:val="24"/>
+                <w:szCs w:val="24"/>
+              </w:rPr>
+            </w:pPr>
+          </w:p>
+        </w:tc>
+        <w:tc>
+          <w:tcPr>
+            <w:tcW w:w="3117" w:type="dxa"/>
+          </w:tcPr>
+          <w:p>
+            <w:pPr>
+              <w:rPr>
+                <w:rFonts w:ascii="Arial" w:hAnsi="Arial" w:cs="Arial"/>
+                <w:sz w:val="24"/>
+                <w:szCs w:val="24"/>
+              </w:rPr>
+            </w:pPr>
+          </w:p>
+        </w:tc>
+      </w:tr>
+      <w:tr>
+        <w:tc>
+          <w:tcPr>
+            <w:tcW w:w="3116" w:type="dxa"/>
+          </w:tcPr>
+          <w:p>
+            <w:pPr>
+              <w:rPr>
+                <w:rFonts w:ascii="Arial" w:hAnsi="Arial" w:cs="Arial"/>
+                <w:sz w:val="24"/>
+                <w:szCs w:val="24"/>
+              </w:rPr>
+            </w:pPr>
+            <w:r>
+              <w:rPr>
+                <w:rFonts w:ascii="Arial" w:hAnsi="Arial" w:cs="Arial"/>
+                <w:sz w:val="24"/>
+                <w:szCs w:val="24"/>
+              </w:rPr>
+              <w:t>{%</w:t>
+            </w:r>
+            <w:proofErr w:type="spellStart"/>
+            <w:r>
+              <w:rPr>
+                <w:rFonts w:ascii="Arial" w:hAnsi="Arial" w:cs="Arial"/>
+                <w:sz w:val="24"/>
+                <w:szCs w:val="24"/>
+              </w:rPr>
+              <w:t>tc</w:t>
+            </w:r>
+            <w:proofErr w:type="spellEnd"/>
+            <w:r>
+              <w:rPr>
+                <w:rFonts w:ascii="Arial" w:hAnsi="Arial" w:cs="Arial"/>
+                <w:sz w:val="24"/>
+                <w:szCs w:val="24"/>
+              </w:rPr>
+              <w:t xml:space="preserve"> for column in </w:t>
+            </w:r>
+            <w:proofErr w:type="spellStart"/>
+            <w:r>
+              <w:rPr>
+                <w:rFonts w:ascii="Arial" w:hAnsi="Arial" w:cs="Arial"/>
+                <w:sz w:val="24"/>
+                <w:szCs w:val="24"/>
+              </w:rPr>
+              <w:t>field.columns</w:t>
+            </w:r>
+            <w:proofErr w:type="spellEnd"/>
+            <w:r>
+              <w:rPr>
+                <w:rFonts w:ascii="Arial" w:hAnsi="Arial" w:cs="Arial"/>
+                <w:sz w:val="24"/>
+                <w:szCs w:val="24"/>
+              </w:rPr>
+              <w:t>() %}</w:t>
+            </w:r>
+          </w:p>
+        </w:tc>
+        <w:tc>
+          <w:tcPr>
+            <w:tcW w:w="3117" w:type="dxa"/>
+          </w:tcPr>
+          <w:p>
+            <w:pPr>
+              <w:rPr>
+                <w:rFonts w:ascii="Arial" w:hAnsi="Arial" w:cs="Arial"/>
+                <w:sz w:val="24"/>
+                <w:szCs w:val="24"/>
+              </w:rPr>
+            </w:pPr>
+            <w:r>
+              <w:rPr>
+                <w:rFonts w:ascii="Arial" w:hAnsi="Arial" w:cs="Arial"/>
+                <w:sz w:val="24"/>
+                <w:szCs w:val="24"/>
+              </w:rPr>
+              <w:t xml:space="preserve">{{ </w:t>
+            </w:r>
+            <w:proofErr w:type="spellStart"/>
+            <w:r>
+              <w:rPr>
+                <w:rFonts w:ascii="Arial" w:hAnsi="Arial" w:cs="Arial"/>
+                <w:sz w:val="24"/>
+                <w:szCs w:val="24"/>
+              </w:rPr>
+              <w:t>safeattr</w:t>
+            </w:r>
+            <w:proofErr w:type="spellEnd"/>
+            <w:r>
+              <w:rPr>
+                <w:rFonts w:ascii="Arial" w:hAnsi="Arial" w:cs="Arial"/>
+                <w:sz w:val="24"/>
+                <w:szCs w:val="24"/>
+              </w:rPr>
+              <w:t>(row, key(column)) }}</w:t>
+            </w:r>
+          </w:p>
+        </w:tc>
+        <w:tc>
+          <w:tcPr>
+            <w:tcW w:w="3117" w:type="dxa"/>
+          </w:tcPr>
+          <w:p>
+            <w:pPr>
+              <w:rPr>
+                <w:rFonts w:ascii="Arial" w:hAnsi="Arial" w:cs="Arial"/>
+                <w:sz w:val="24"/>
+                <w:szCs w:val="24"/>
+              </w:rPr>
+            </w:pPr>
+            <w:r>
+              <w:rPr>
+                <w:rFonts w:ascii="Arial" w:hAnsi="Arial" w:cs="Arial"/>
+                <w:sz w:val="24"/>
+                <w:szCs w:val="24"/>
+              </w:rPr>
+              <w:t>{%</w:t>
+            </w:r>
+            <w:proofErr w:type="spellStart"/>
+            <w:r>
+              <w:rPr>
+                <w:rFonts w:ascii="Arial" w:hAnsi="Arial" w:cs="Arial"/>
+                <w:sz w:val="24"/>
+                <w:szCs w:val="24"/>
+              </w:rPr>
+              <w:t>tc</w:t>
+            </w:r>
+            <w:proofErr w:type="spellEnd"/>
+            <w:r>
+              <w:rPr>
+                <w:rFonts w:ascii="Arial" w:hAnsi="Arial" w:cs="Arial"/>
+                <w:sz w:val="24"/>
+                <w:szCs w:val="24"/>
+              </w:rPr>
+              <w:t xml:space="preserve"> </w:t>
+            </w:r>
+            <w:proofErr w:type="spellStart"/>
+            <w:r>
+              <w:rPr>
+                <w:rFonts w:ascii="Arial" w:hAnsi="Arial" w:cs="Arial"/>
+                <w:sz w:val="24"/>
+                <w:szCs w:val="24"/>
+              </w:rPr>
+              <w:t>endfor</w:t>
+            </w:r>
+            <w:proofErr w:type="spellEnd"/>
+            <w:r>
+              <w:rPr>
+                <w:rFonts w:ascii="Arial" w:hAnsi="Arial" w:cs="Arial"/>
+                <w:sz w:val="24"/>
+                <w:szCs w:val="24"/>
+              </w:rPr>
+              <w:t xml:space="preserve"> %}</w:t>
+            </w:r>
+          </w:p>
+        </w:tc>
+      </w:tr>
+      <w:tr>
+        <w:tc>
+          <w:tcPr>
+            <w:tcW w:w="3116" w:type="dxa"/>
+          </w:tcPr>
+          <w:p>
+            <w:pPr>
+              <w:rPr>
+                <w:rFonts w:ascii="Arial" w:hAnsi="Arial" w:cs="Arial"/>
+                <w:sz w:val="24"/>
+                <w:szCs w:val="24"/>
+              </w:rPr>
+            </w:pPr>
+            <w:r>
+              <w:rPr>
+                <w:rFonts w:ascii="Arial" w:hAnsi="Arial" w:cs="Arial"/>
+                <w:sz w:val="24"/>
+                <w:szCs w:val="24"/>
+              </w:rPr>
+              <w:t xml:space="preserve">{%tr </w:t>
+            </w:r>
+            <w:proofErr w:type="spellStart"/>
+            <w:r>
+              <w:rPr>
+                <w:rFonts w:ascii="Arial" w:hAnsi="Arial" w:cs="Arial"/>
+                <w:sz w:val="24"/>
+                <w:szCs w:val="24"/>
+              </w:rPr>
+              <w:t>endfor</w:t>
+            </w:r>
+            <w:proofErr w:type="spellEnd"/>
+            <w:r>
+              <w:rPr>
+                <w:rFonts w:ascii="Arial" w:hAnsi="Arial" w:cs="Arial"/>
+                <w:sz w:val="24"/>
+                <w:szCs w:val="24"/>
+              </w:rPr>
+              <w:t xml:space="preserve"> %}</w:t>
+            </w:r>
+          </w:p>
+        </w:tc>
+        <w:tc>
+          <w:tcPr>
+            <w:tcW w:w="3117" w:type="dxa"/>
+          </w:tcPr>
+          <w:p>
+            <w:pPr>
+              <w:rPr>
+                <w:rFonts w:ascii="Arial" w:hAnsi="Arial" w:cs="Arial"/>
+                <w:sz w:val="24"/>
+                <w:szCs w:val="24"/>
+              </w:rPr>
+            </w:pPr>
+          </w:p>
+        </w:tc>
+        <w:tc>
+          <w:tcPr>
+            <w:tcW w:w="3117" w:type="dxa"/>
+          </w:tcPr>
+          <w:p>
+            <w:pPr>
+              <w:rPr>
+                <w:rFonts w:ascii="Arial" w:hAnsi="Arial" w:cs="Arial"/>
+                <w:sz w:val="24"/>
+                <w:szCs w:val="24"/>
+              </w:rPr>
+            </w:pPr>
+          </w:p>
+        </w:tc>
+      </w:tr>
+    </w:tbl>
+    <w:p>
+      <w:pPr>
+        <w:rPr>
+          <w:rFonts w:ascii="Arial" w:hAnsi="Arial" w:cs="Arial"/>
+          <w:sz w:val="24"/>
+          <w:szCs w:val="24"/>
+        </w:rPr>
+      </w:pPr>
+    </w:p>
+    <w:p>
+      <w:pPr>
+        <w:rPr>
+          <w:rFonts w:ascii="Arial" w:hAnsi="Arial" w:cs="Arial"/>
+          <w:sz w:val="24"/>
+          <w:szCs w:val="24"/>
+        </w:rPr>
+      </w:pPr>
+      <w:r>
+        <w:rPr>
+          <w:rFonts w:ascii="Arial" w:hAnsi="Arial" w:cs="Arial"/>
+          <w:sz w:val="24"/>
+          <w:szCs w:val="24"/>
+        </w:rPr>
+        <w:t xml:space="preserve">{%p </w:t>
+      </w:r>
+      <w:proofErr w:type="spellStart"/>
+      <w:r>
+        <w:rPr>
+          <w:rFonts w:ascii="Arial" w:hAnsi="Arial" w:cs="Arial"/>
+          <w:sz w:val="24"/>
+          <w:szCs w:val="24"/>
+        </w:rPr>
+        <w:t>elif</w:t>
+      </w:r>
+      <w:proofErr w:type="spellEnd"/>
+      <w:r>
+        <w:rPr>
+          <w:rFonts w:ascii="Arial" w:hAnsi="Arial" w:cs="Arial"/>
+          <w:sz w:val="24"/>
+          <w:szCs w:val="24"/>
+        </w:rPr>
+        <w:t xml:space="preserve"> </w:t>
+      </w:r>
+      <w:proofErr w:type="spellStart"/>
+      <w:r>
+        <w:rPr>
+          <w:rFonts w:ascii="Arial" w:hAnsi="Arial" w:cs="Arial"/>
+          <w:sz w:val="24"/>
+          <w:szCs w:val="24"/>
+        </w:rPr>
+        <w:t>field.is_list</w:t>
+      </w:r>
+      <w:proofErr w:type="spellEnd"/>
+      <w:r>
+        <w:rPr>
+          <w:rFonts w:ascii="Arial" w:hAnsi="Arial" w:cs="Arial"/>
+          <w:sz w:val="24"/>
+          <w:szCs w:val="24"/>
+        </w:rPr>
+        <w:t>() %}</w:t>
+      </w:r>
+    </w:p>
+    <w:p>
+      <w:pPr>
+        <w:rPr>
+          <w:rFonts w:ascii="Arial" w:hAnsi="Arial" w:cs="Arial"/>
+          <w:sz w:val="24"/>
+          <w:szCs w:val="24"/>
+        </w:rPr>
+      </w:pPr>
+    </w:p>
+    <w:p>
+      <w:pPr>
+        <w:pStyle w:val="Heading2"/>
+        <w:rPr>
+          <w:rFonts w:ascii="Arial" w:hAnsi="Arial" w:cs="Arial"/>
+          <w:sz w:val="24"/>
+          <w:szCs w:val="24"/>
+        </w:rPr>
+      </w:pPr>
+      <w:r>
+        <w:rPr>
+          <w:rFonts w:ascii="Arial" w:hAnsi="Arial" w:cs="Arial"/>
+          <w:sz w:val="24"/>
+          <w:szCs w:val="24"/>
+        </w:rPr>
+        <w:lastRenderedPageBreak/>
+        <w:t xml:space="preserve">{{ </w:t>
+      </w:r>
+      <w:proofErr w:type="spellStart"/>
+      <w:r>
+        <w:rPr>
+          <w:rFonts w:ascii="Arial" w:hAnsi="Arial" w:cs="Arial"/>
+          <w:sz w:val="24"/>
+          <w:szCs w:val="24"/>
+        </w:rPr>
+        <w:t>field.label</w:t>
+      </w:r>
+      <w:proofErr w:type="spellEnd"/>
+      <w:r>
+        <w:rPr>
+          <w:rFonts w:ascii="Arial" w:hAnsi="Arial" w:cs="Arial"/>
+          <w:sz w:val="24"/>
+          <w:szCs w:val="24"/>
+        </w:rPr>
+        <w:t xml:space="preserve"> }}</w:t>
+      </w:r>
+    </w:p>
+    <w:p>
+      <w:pPr>
+        <w:pStyle w:val="ListParagraph"/>
+        <w:numPr>
+          <w:ilvl w:val="0"/>
+          <w:numId w:val="3"/>
+        </w:numPr>
+        <w:rPr>
+          <w:rFonts w:ascii="Arial" w:hAnsi="Arial" w:cs="Arial"/>
+          <w:sz w:val="24"/>
+          <w:szCs w:val="24"/>
+        </w:rPr>
+      </w:pPr>
+      <w:r>
+        <w:rPr>
+          <w:rFonts w:ascii="Arial" w:hAnsi="Arial" w:cs="Arial"/>
+          <w:sz w:val="24"/>
+          <w:szCs w:val="24"/>
+        </w:rPr>
+        <w:t xml:space="preserve">{%p for item in </w:t>
+      </w:r>
+      <w:proofErr w:type="spellStart"/>
+      <w:r>
+        <w:rPr>
+          <w:rFonts w:ascii="Arial" w:hAnsi="Arial" w:cs="Arial"/>
+          <w:sz w:val="24"/>
+          <w:szCs w:val="24"/>
+        </w:rPr>
+        <w:t>field.overflow_value</w:t>
+      </w:r>
+      <w:proofErr w:type="spellEnd"/>
+      <w:r>
+        <w:rPr>
+          <w:rFonts w:ascii="Arial" w:hAnsi="Arial" w:cs="Arial"/>
+          <w:sz w:val="24"/>
+          <w:szCs w:val="24"/>
+        </w:rPr>
+        <w:t>() %}</w:t>
+      </w:r>
+    </w:p>
+    <w:p>
+      <w:pPr>
+        <w:pStyle w:val="ListParagraph"/>
+        <w:numPr>
+          <w:ilvl w:val="0"/>
+          <w:numId w:val="3"/>
+        </w:numPr>
+        <w:rPr>
+          <w:rFonts w:ascii="Arial" w:hAnsi="Arial" w:cs="Arial"/>
+          <w:sz w:val="24"/>
+          <w:szCs w:val="24"/>
+        </w:rPr>
+      </w:pPr>
+      <w:r>
+        <w:rPr>
+          <w:rFonts w:ascii="Arial" w:hAnsi="Arial" w:cs="Arial"/>
+          <w:sz w:val="24"/>
+          <w:szCs w:val="24"/>
+        </w:rPr>
+        <w:t>{{ item }}</w:t>
+      </w:r>
+    </w:p>
+    <w:p>
+      <w:pPr>
+        <w:pStyle w:val="ListParagraph"/>
+        <w:numPr>
+          <w:ilvl w:val="0"/>
+          <w:numId w:val="3"/>
+        </w:numPr>
+        <w:rPr>
+          <w:rFonts w:ascii="Arial" w:hAnsi="Arial" w:cs="Arial"/>
+          <w:sz w:val="24"/>
+          <w:szCs w:val="24"/>
+        </w:rPr>
+      </w:pPr>
+      <w:r>
+        <w:rPr>
+          <w:rFonts w:ascii="Arial" w:hAnsi="Arial" w:cs="Arial"/>
+          <w:sz w:val="24"/>
+          <w:szCs w:val="24"/>
+        </w:rPr>
+        <w:t xml:space="preserve">{%p </w:t>
+      </w:r>
+      <w:proofErr w:type="spellStart"/>
+      <w:r>
+        <w:rPr>
+          <w:rFonts w:ascii="Arial" w:hAnsi="Arial" w:cs="Arial"/>
+          <w:sz w:val="24"/>
+          <w:szCs w:val="24"/>
+        </w:rPr>
+        <w:t>endfor</w:t>
+      </w:r>
+      <w:proofErr w:type="spellEnd"/>
+      <w:r>
+        <w:rPr>
+          <w:rFonts w:ascii="Arial" w:hAnsi="Arial" w:cs="Arial"/>
+          <w:sz w:val="24"/>
+          <w:szCs w:val="24"/>
+        </w:rPr>
+        <w:t xml:space="preserve"> %}</w:t>
+      </w:r>
+    </w:p>
+    <w:p>
+      <w:pPr>
+        <w:rPr>
+          <w:rFonts w:ascii="Arial" w:hAnsi="Arial" w:cs="Arial"/>
+          <w:sz w:val="24"/>
+          <w:szCs w:val="24"/>
+        </w:rPr>
+      </w:pPr>
+    </w:p>
+    <w:p>
+      <w:pPr>
+        <w:rPr>
+          <w:rFonts w:ascii="Arial" w:hAnsi="Arial" w:cs="Arial"/>
+          <w:sz w:val="24"/>
+          <w:szCs w:val="24"/>
+        </w:rPr>
+      </w:pPr>
+      <w:r>
+        <w:rPr>
+          <w:rFonts w:ascii="Arial" w:hAnsi="Arial" w:cs="Arial"/>
+          <w:sz w:val="24"/>
+          <w:szCs w:val="24"/>
+        </w:rPr>
+        <w:t>{%p else %}</w:t>
+      </w:r>
+    </w:p>
+    <w:p>
+      <w:pPr>
+        <w:rPr>
+          <w:rFonts w:ascii="Arial" w:hAnsi="Arial" w:cs="Arial"/>
+          <w:sz w:val="24"/>
+          <w:szCs w:val="24"/>
+        </w:rPr>
+      </w:pPr>
+      <w:r>
+        <w:rPr>
+          <w:rFonts w:ascii="Arial" w:hAnsi="Arial" w:cs="Arial"/>
+          <w:b/>
+          <w:sz w:val="24"/>
+          <w:szCs w:val="24"/>
+        </w:rPr>
+        <w:t xml:space="preserve">{{ </w:t>
+      </w:r>
+      <w:proofErr w:type="spellStart"/>
+      <w:r>
+        <w:rPr>
+          <w:rFonts w:ascii="Arial" w:hAnsi="Arial" w:cs="Arial"/>
+          <w:b/>
+          <w:sz w:val="24"/>
+          <w:szCs w:val="24"/>
+        </w:rPr>
+        <w:t>field.label</w:t>
+      </w:r>
+      <w:proofErr w:type="spellEnd"/>
+      <w:r>
+        <w:rPr>
+          <w:rFonts w:ascii="Arial" w:hAnsi="Arial" w:cs="Arial"/>
+          <w:b/>
+          <w:sz w:val="24"/>
+          <w:szCs w:val="24"/>
+        </w:rPr>
+        <w:t xml:space="preserve"> }}</w:t>
+      </w:r>
+      <w:r>
+        <w:rPr>
+          <w:rFonts w:ascii="Arial" w:hAnsi="Arial" w:cs="Arial"/>
+          <w:sz w:val="24"/>
+          <w:szCs w:val="24"/>
+        </w:rPr>
+        <w:t xml:space="preserve">: {{ </w:t>
+      </w:r>
+      <w:proofErr w:type="spellStart"/>
+      <w:r>
+        <w:rPr>
+          <w:rFonts w:ascii="Arial" w:hAnsi="Arial" w:cs="Arial"/>
+          <w:sz w:val="24"/>
+          <w:szCs w:val="24"/>
+        </w:rPr>
+        <w:t>field.overflow_value</w:t>
+      </w:r>
+      <w:proofErr w:type="spellEnd"/>
+      <w:r>
+        <w:rPr>
+          <w:rFonts w:ascii="Arial" w:hAnsi="Arial" w:cs="Arial"/>
+          <w:sz w:val="24"/>
+          <w:szCs w:val="24"/>
+        </w:rPr>
+        <w:t>(</w:t>
+      </w:r>
+      <w:proofErr w:type="spellStart"/>
+      <w:r>
+        <w:rPr>
+          <w:rFonts w:ascii="Arial" w:hAnsi="Arial" w:cs="Arial"/>
+          <w:sz w:val="24"/>
+          <w:szCs w:val="24"/>
+        </w:rPr>
+        <w:t>overflow_message</w:t>
+      </w:r>
+      <w:proofErr w:type="spellEnd"/>
+      <w:r>
+        <w:rPr>
+          <w:rFonts w:ascii="Arial" w:hAnsi="Arial" w:cs="Arial"/>
+          <w:sz w:val="24"/>
+          <w:szCs w:val="24"/>
+        </w:rPr>
+        <w:t xml:space="preserve">= </w:t>
+      </w:r>
+      <w:proofErr w:type="spellStart"/>
+      <w:r>
+        <w:rPr>
+          <w:rFonts w:ascii="Arial" w:hAnsi="Arial" w:cs="Arial"/>
+          <w:sz w:val="24"/>
+          <w:szCs w:val="24"/>
+        </w:rPr>
+        <w:t>RFAaffidavit.default_overflow_message</w:t>
+      </w:r>
+      <w:proofErr w:type="spellEnd"/>
+      <w:r>
+        <w:rPr>
+          <w:rFonts w:ascii="Arial" w:hAnsi="Arial" w:cs="Arial"/>
+          <w:sz w:val="24"/>
+          <w:szCs w:val="24"/>
+        </w:rPr>
+        <w:t>) }}</w:t>
+      </w:r>
+    </w:p>
+    <w:p>
+      <w:pPr>
+        <w:rPr>
+          <w:rFonts w:ascii="Arial" w:hAnsi="Arial" w:cs="Arial"/>
+          <w:sz w:val="24"/>
+          <w:szCs w:val="24"/>
+        </w:rPr>
+      </w:pPr>
+      <w:r>
+        <w:rPr>
+          <w:rFonts w:ascii="Arial" w:hAnsi="Arial" w:cs="Arial"/>
+          <w:sz w:val="24"/>
+          <w:szCs w:val="24"/>
+        </w:rPr>
+        <w:t>{%p endif %}</w:t>
+      </w:r>
+    </w:p>
+    <w:p>
+      <w:pPr>
+        <w:rPr>
+          <w:rFonts w:ascii="Arial" w:hAnsi="Arial" w:cs="Arial"/>
+          <w:sz w:val="24"/>
+          <w:szCs w:val="24"/>
+        </w:rPr>
+      </w:pPr>
+      <w:r>
+        <w:rPr>
+          <w:rFonts w:ascii="Arial" w:hAnsi="Arial" w:cs="Arial"/>
+          <w:sz w:val="24"/>
+          <w:szCs w:val="24"/>
+        </w:rPr>
+        <w:t xml:space="preserve">{%p </w:t>
+      </w:r>
+      <w:proofErr w:type="spellStart"/>
+      <w:r>
+        <w:rPr>
+          <w:rFonts w:ascii="Arial" w:hAnsi="Arial" w:cs="Arial"/>
+          <w:sz w:val="24"/>
+          <w:szCs w:val="24"/>
+        </w:rPr>
+        <w:t>endfor</w:t>
+      </w:r>
+      <w:proofErr w:type="spellEnd"/>
+      <w:r>
+        <w:rPr>
+          <w:rFonts w:ascii="Arial" w:hAnsi="Arial" w:cs="Arial"/>
+          <w:sz w:val="24"/>
+          <w:szCs w:val="24"/>
+        </w:rPr>
+        <w:t xml:space="preserve"> %}</w:t>
+      </w:r>
+    </w:p>
+    <w:p>
+      <w:pPr>
+        <w:rPr>
+          <w:rFonts w:ascii="Arial" w:hAnsi="Arial" w:cs="Arial"/>
+          <w:sz w:val="24"/>
+          <w:szCs w:val="24"/>
+        </w:rPr>
+      </w:pPr>
     </w:p>
     <w:sectPr>
       <w:pgSz w:w="12240" w:h="15840"/>
@@ -1129,7 +3788,7 @@
 </file>
 
 <file path=word/numbering.xml><?xml version="1.0" encoding="utf-8"?>
-<w:numbering xmlns:wpc="http://schemas.microsoft.com/office/word/2010/wordprocessingCanvas" xmlns:cx="http://schemas.microsoft.com/office/drawing/2014/chartex" xmlns:cx1="http://schemas.microsoft.com/office/drawing/2015/9/8/chartex" xmlns:cx2="http://schemas.microsoft.com/office/drawing/2015/10/21/chartex" xmlns:cx3="http://schemas.microsoft.com/office/drawing/2016/5/9/chartex" xmlns:cx4="http://schemas.microsoft.com/office/drawing/2016/5/10/chartex" xmlns:cx5="http://schemas.microsoft.com/office/drawing/2016/5/11/chartex" xmlns:cx6="http://schemas.microsoft.com/office/drawing/2016/5/12/chartex" xmlns:cx7="http://schemas.microsoft.com/office/drawing/2016/5/13/chartex" xmlns:cx8="http://schemas.microsoft.com/office/drawing/2016/5/14/chartex" xmlns:mc="http://schemas.openxmlformats.org/markup-compatibility/2006" xmlns:aink="http://schemas.microsoft.com/office/drawing/2016/ink" xmlns:am3d="http://schemas.microsoft.com/office/drawing/2017/model3d" xmlns:o="urn:schemas-microsoft-com:office:office" xmlns:oel="http://schemas.microsoft.com/office/2019/extlst" xmlns:r="http://schemas.openxmlformats.org/officeDocument/2006/relationships" xmlns:m="http://schemas.openxmlformats.org/officeDocument/2006/math" xmlns:v="urn:schemas-microsoft-com:vml" xmlns:wp14="http://schemas.microsoft.com/office/word/2010/wordprocessingDrawing" xmlns:wp="http://schemas.openxmlformats.org/drawingml/2006/wordprocessingDrawing" xmlns:w10="urn:schemas-microsoft-com:office:word" xmlns:w="http://schemas.openxmlformats.org/wordprocessingml/2006/main" xmlns:w14="http://schemas.microsoft.com/office/word/2010/wordml" xmlns:w15="http://schemas.microsoft.com/office/word/2012/wordml" xmlns:w16cex="http://schemas.microsoft.com/office/word/2018/wordml/cex" xmlns:w16cid="http://schemas.microsoft.com/office/word/2016/wordml/cid" xmlns:w16="http://schemas.microsoft.com/office/word/2018/wordml" xmlns:w16du="http://schemas.microsoft.com/office/word/2023/wordml/word16du" xmlns:w16sdtdh="http://schemas.microsoft.com/office/word/2020/wordml/sdtdatahash" xmlns:w16se="http://schemas.microsoft.com/office/word/2015/wordml/symex" xmlns:wpg="http://schemas.microsoft.com/office/word/2010/wordprocessingGroup" xmlns:wpi="http://schemas.microsoft.com/office/word/2010/wordprocessingInk" xmlns:wne="http://schemas.microsoft.com/office/word/2006/wordml" xmlns:wps="http://schemas.microsoft.com/office/word/2010/wordprocessingShape" mc:Ignorable="w14 w15 w16se w16cid w16 w16cex w16sdtdh w16du wp14">
+<w:numbering xmlns:wpc="http://schemas.microsoft.com/office/word/2010/wordprocessingCanvas" xmlns:cx="http://schemas.microsoft.com/office/drawing/2014/chartex" xmlns:cx1="http://schemas.microsoft.com/office/drawing/2015/9/8/chartex" xmlns:cx2="http://schemas.microsoft.com/office/drawing/2015/10/21/chartex" xmlns:cx3="http://schemas.microsoft.com/office/drawing/2016/5/9/chartex" xmlns:cx4="http://schemas.microsoft.com/office/drawing/2016/5/10/chartex" xmlns:cx5="http://schemas.microsoft.com/office/drawing/2016/5/11/chartex" xmlns:cx6="http://schemas.microsoft.com/office/drawing/2016/5/12/chartex" xmlns:cx7="http://schemas.microsoft.com/office/drawing/2016/5/13/chartex" xmlns:cx8="http://schemas.microsoft.com/office/drawing/2016/5/14/chartex" xmlns:mc="http://schemas.openxmlformats.org/markup-compatibility/2006" xmlns:aink="http://schemas.microsoft.com/office/drawing/2016/ink" xmlns:am3d="http://schemas.microsoft.com/office/drawing/2017/model3d" xmlns:o="urn:schemas-microsoft-com:office:office" xmlns:oel="http://schemas.microsoft.com/office/2019/extlst" xmlns:r="http://schemas.openxmlformats.org/officeDocument/2006/relationships" xmlns:m="http://schemas.openxmlformats.org/officeDocument/2006/math" xmlns:v="urn:schemas-microsoft-com:vml" xmlns:wp14="http://schemas.microsoft.com/office/word/2010/wordprocessingDrawing" xmlns:wp="http://schemas.openxmlformats.org/drawingml/2006/wordprocessingDrawing" xmlns:w10="urn:schemas-microsoft-com:office:word" xmlns:w="http://schemas.openxmlformats.org/wordprocessingml/2006/main" xmlns:w14="http://schemas.microsoft.com/office/word/2010/wordml" xmlns:w15="http://schemas.microsoft.com/office/word/2012/wordml" xmlns:w16cex="http://schemas.microsoft.com/office/word/2018/wordml/cex" xmlns:w16cid="http://schemas.microsoft.com/office/word/2016/wordml/cid" xmlns:w16="http://schemas.microsoft.com/office/word/2018/wordml" xmlns:w16du="http://schemas.microsoft.com/office/word/2023/wordml/word16du" xmlns:w16sdtdh="http://schemas.microsoft.com/office/word/2020/wordml/sdtdatahash" xmlns:w16sdtfl="http://schemas.microsoft.com/office/word/2024/wordml/sdtformatlock" xmlns:w16se="http://schemas.microsoft.com/office/word/2015/wordml/symex" xmlns:wpg="http://schemas.microsoft.com/office/word/2010/wordprocessingGroup" xmlns:wpi="http://schemas.microsoft.com/office/word/2010/wordprocessingInk" xmlns:wne="http://schemas.microsoft.com/office/word/2006/wordml" xmlns:wps="http://schemas.microsoft.com/office/word/2010/wordprocessingShape" mc:Ignorable="w14 w15 w16se w16cid w16 w16cex w16sdtdh w16sdtfl w16du wp14">
   <w:abstractNum w:abstractNumId="0" w15:restartNumberingAfterBreak="0">
     <w:nsid w:val="0D5A6C12"/>
     <w:multiLevelType w:val="multilevel"/>
@@ -1447,7 +4106,7 @@
 </file>
 
 <file path=word/styles.xml><?xml version="1.0" encoding="utf-8"?>
-<w:styles xmlns:mc="http://schemas.openxmlformats.org/markup-compatibility/2006" xmlns:r="http://schemas.openxmlformats.org/officeDocument/2006/relationships" xmlns:w="http://schemas.openxmlformats.org/wordprocessingml/2006/main" xmlns:w14="http://schemas.microsoft.com/office/word/2010/wordml" xmlns:w15="http://schemas.microsoft.com/office/word/2012/wordml" xmlns:w16cex="http://schemas.microsoft.com/office/word/2018/wordml/cex" xmlns:w16cid="http://schemas.microsoft.com/office/word/2016/wordml/cid" xmlns:w16="http://schemas.microsoft.com/office/word/2018/wordml" xmlns:w16du="http://schemas.microsoft.com/office/word/2023/wordml/word16du" xmlns:w16sdtdh="http://schemas.microsoft.com/office/word/2020/wordml/sdtdatahash" xmlns:w16se="http://schemas.microsoft.com/office/word/2015/wordml/symex" mc:Ignorable="w14 w15 w16se w16cid w16 w16cex w16sdtdh w16du">
+<w:styles xmlns:mc="http://schemas.openxmlformats.org/markup-compatibility/2006" xmlns:r="http://schemas.openxmlformats.org/officeDocument/2006/relationships" xmlns:w="http://schemas.openxmlformats.org/wordprocessingml/2006/main" xmlns:w14="http://schemas.microsoft.com/office/word/2010/wordml" xmlns:w15="http://schemas.microsoft.com/office/word/2012/wordml" xmlns:w16cex="http://schemas.microsoft.com/office/word/2018/wordml/cex" xmlns:w16cid="http://schemas.microsoft.com/office/word/2016/wordml/cid" xmlns:w16="http://schemas.microsoft.com/office/word/2018/wordml" xmlns:w16du="http://schemas.microsoft.com/office/word/2023/wordml/word16du" xmlns:w16sdtdh="http://schemas.microsoft.com/office/word/2020/wordml/sdtdatahash" xmlns:w16sdtfl="http://schemas.microsoft.com/office/word/2024/wordml/sdtformatlock" xmlns:w16se="http://schemas.microsoft.com/office/word/2015/wordml/symex" mc:Ignorable="w14 w15 w16se w16cid w16 w16cex w16sdtdh w16sdtfl w16du">
   <w:docDefaults>
     <w:rPrDefault>
       <w:rPr>

</xml_diff>

<commit_message>
made two addenda files; still seeing default addendum
</commit_message>
<xml_diff>
--- a/docassemble/RFApackage/data/templates/RFAaffidavit_addendum.docx
+++ b/docassemble/RFApackage/data/templates/RFAaffidavit_addendum.docx
@@ -42,7 +42,23 @@
           <w:sz w:val="28"/>
           <w:szCs w:val="28"/>
         </w:rPr>
+        <w:t xml:space="preserve">Affidavit in Support of </w:t>
+      </w:r>
+      <w:r>
+        <w:rPr>
+          <w:rFonts w:ascii="Arial" w:hAnsi="Arial" w:cs="Arial"/>
+          <w:sz w:val="28"/>
+          <w:szCs w:val="28"/>
+        </w:rPr>
         <w:t>Relief from Abuse</w:t>
+      </w:r>
+      <w:r>
+        <w:rPr>
+          <w:rFonts w:ascii="Arial" w:hAnsi="Arial" w:cs="Arial"/>
+          <w:sz w:val="28"/>
+          <w:szCs w:val="28"/>
+        </w:rPr>
+        <w:t xml:space="preserve"> Complaint</w:t>
       </w:r>
     </w:p>
     <w:p>
@@ -62,7 +78,25 @@
           <w:sz w:val="28"/>
           <w:szCs w:val="28"/>
         </w:rPr>
-        <w:t>Family Division, {{ trial_court.address.county }} Unit</w:t>
+        <w:t xml:space="preserve">Family Division, {{ </w:t>
+      </w:r>
+      <w:proofErr w:type="spellStart"/>
+      <w:r>
+        <w:rPr>
+          <w:rFonts w:ascii="Arial" w:hAnsi="Arial" w:cs="Arial"/>
+          <w:sz w:val="28"/>
+          <w:szCs w:val="28"/>
+        </w:rPr>
+        <w:t>trial_court.address.county</w:t>
+      </w:r>
+      <w:proofErr w:type="spellEnd"/>
+      <w:r>
+        <w:rPr>
+          <w:rFonts w:ascii="Arial" w:hAnsi="Arial" w:cs="Arial"/>
+          <w:sz w:val="28"/>
+          <w:szCs w:val="28"/>
+        </w:rPr>
+        <w:t xml:space="preserve"> }} Unit</w:t>
       </w:r>
     </w:p>
     <w:p>
@@ -81,13 +115,41 @@
         </w:rPr>
         <w:t xml:space="preserve">{%p if </w:t>
       </w:r>
-      <w:r>
-        <w:rPr>
-          <w:rFonts w:ascii="Arial" w:hAnsi="Arial" w:cs="Arial"/>
-          <w:sz w:val="24"/>
-          <w:szCs w:val="24"/>
-        </w:rPr>
-        <w:t>who_needs_protection == 'order_obo_child'</w:t>
+      <w:proofErr w:type="spellStart"/>
+      <w:r>
+        <w:rPr>
+          <w:rFonts w:ascii="Arial" w:hAnsi="Arial" w:cs="Arial"/>
+          <w:sz w:val="24"/>
+          <w:szCs w:val="24"/>
+        </w:rPr>
+        <w:t>who_needs_protection</w:t>
+      </w:r>
+      <w:proofErr w:type="spellEnd"/>
+      <w:r>
+        <w:rPr>
+          <w:rFonts w:ascii="Arial" w:hAnsi="Arial" w:cs="Arial"/>
+          <w:sz w:val="24"/>
+          <w:szCs w:val="24"/>
+        </w:rPr>
+        <w:t xml:space="preserve"> == '</w:t>
+      </w:r>
+      <w:proofErr w:type="spellStart"/>
+      <w:r>
+        <w:rPr>
+          <w:rFonts w:ascii="Arial" w:hAnsi="Arial" w:cs="Arial"/>
+          <w:sz w:val="24"/>
+          <w:szCs w:val="24"/>
+        </w:rPr>
+        <w:t>order_obo_child</w:t>
+      </w:r>
+      <w:proofErr w:type="spellEnd"/>
+      <w:r>
+        <w:rPr>
+          <w:rFonts w:ascii="Arial" w:hAnsi="Arial" w:cs="Arial"/>
+          <w:sz w:val="24"/>
+          <w:szCs w:val="24"/>
+        </w:rPr>
+        <w:t>'</w:t>
       </w:r>
       <w:r>
         <w:rPr>
@@ -139,8 +201,36 @@
           <w:sz w:val="28"/>
           <w:szCs w:val="28"/>
         </w:rPr>
-        <w:t>[0] }} v. {{ other_parties[0] }}</w:t>
-      </w:r>
+        <w:t xml:space="preserve">[0] }} v. {{ </w:t>
+      </w:r>
+      <w:proofErr w:type="spellStart"/>
+      <w:r>
+        <w:rPr>
+          <w:rFonts w:ascii="Arial" w:hAnsi="Arial" w:cs="Arial"/>
+          <w:sz w:val="28"/>
+          <w:szCs w:val="28"/>
+        </w:rPr>
+        <w:t>other_parties</w:t>
+      </w:r>
+      <w:proofErr w:type="spellEnd"/>
+      <w:r>
+        <w:rPr>
+          <w:rFonts w:ascii="Arial" w:hAnsi="Arial" w:cs="Arial"/>
+          <w:sz w:val="28"/>
+          <w:szCs w:val="28"/>
+        </w:rPr>
+        <w:t>[0</w:t>
+      </w:r>
+      <w:proofErr w:type="gramStart"/>
+      <w:r>
+        <w:rPr>
+          <w:rFonts w:ascii="Arial" w:hAnsi="Arial" w:cs="Arial"/>
+          <w:sz w:val="28"/>
+          <w:szCs w:val="28"/>
+        </w:rPr>
+        <w:t>] }}</w:t>
+      </w:r>
+      <w:proofErr w:type="gramEnd"/>
     </w:p>
     <w:p>
       <w:pPr>
@@ -184,7 +274,25 @@
           <w:sz w:val="28"/>
           <w:szCs w:val="28"/>
         </w:rPr>
-        <w:t>{{ users[0] }} v. {{ other_parties[0] }}</w:t>
+        <w:t xml:space="preserve">{{ users[0] }} v. {{ </w:t>
+      </w:r>
+      <w:proofErr w:type="spellStart"/>
+      <w:r>
+        <w:rPr>
+          <w:rFonts w:ascii="Arial" w:hAnsi="Arial" w:cs="Arial"/>
+          <w:sz w:val="28"/>
+          <w:szCs w:val="28"/>
+        </w:rPr>
+        <w:t>other_parties</w:t>
+      </w:r>
+      <w:proofErr w:type="spellEnd"/>
+      <w:r>
+        <w:rPr>
+          <w:rFonts w:ascii="Arial" w:hAnsi="Arial" w:cs="Arial"/>
+          <w:sz w:val="28"/>
+          <w:szCs w:val="28"/>
+        </w:rPr>
+        <w:t>[0] }}</w:t>
       </w:r>
     </w:p>
     <w:p>
@@ -220,29 +328,31 @@
         </w:rPr>
         <w:t xml:space="preserve">{%p for field in </w:t>
       </w:r>
-      <w:r>
-        <w:rPr>
-          <w:rFonts w:ascii="Arial" w:hAnsi="Arial" w:cs="Arial"/>
-          <w:sz w:val="24"/>
-          <w:szCs w:val="24"/>
-        </w:rPr>
-        <w:t>RFA</w:t>
-      </w:r>
-      <w:r>
-        <w:rPr>
-          <w:rFonts w:ascii="Arial" w:hAnsi="Arial" w:cs="Arial"/>
-          <w:sz w:val="24"/>
-          <w:szCs w:val="24"/>
-        </w:rPr>
-        <w:t>complaint</w:t>
-      </w:r>
-      <w:r>
-        <w:rPr>
-          <w:rFonts w:ascii="Arial" w:hAnsi="Arial" w:cs="Arial"/>
-          <w:sz w:val="24"/>
-          <w:szCs w:val="24"/>
-        </w:rPr>
-        <w:t>.overflow()</w:t>
+      <w:proofErr w:type="spellStart"/>
+      <w:r>
+        <w:rPr>
+          <w:rFonts w:ascii="Arial" w:hAnsi="Arial" w:cs="Arial"/>
+          <w:sz w:val="24"/>
+          <w:szCs w:val="24"/>
+        </w:rPr>
+        <w:t>RFAaffidavit</w:t>
+      </w:r>
+      <w:r>
+        <w:rPr>
+          <w:rFonts w:ascii="Arial" w:hAnsi="Arial" w:cs="Arial"/>
+          <w:sz w:val="24"/>
+          <w:szCs w:val="24"/>
+        </w:rPr>
+        <w:t>.overflow</w:t>
+      </w:r>
+      <w:proofErr w:type="spellEnd"/>
+      <w:r>
+        <w:rPr>
+          <w:rFonts w:ascii="Arial" w:hAnsi="Arial" w:cs="Arial"/>
+          <w:sz w:val="24"/>
+          <w:szCs w:val="24"/>
+        </w:rPr>
+        <w:t>()</w:t>
       </w:r>
       <w:r>
         <w:rPr>
@@ -258,31 +368,49 @@
           <w:sz w:val="24"/>
           <w:szCs w:val="24"/>
         </w:rPr>
-        <w:t xml:space="preserve">and </w:t>
-      </w:r>
-      <w:r>
-        <w:rPr>
-          <w:rFonts w:ascii="Arial" w:hAnsi="Arial" w:cs="Arial"/>
-          <w:sz w:val="24"/>
-          <w:szCs w:val="24"/>
-        </w:rPr>
-        <w:t>RFA</w:t>
-      </w:r>
-      <w:r>
-        <w:rPr>
-          <w:rFonts w:ascii="Arial" w:hAnsi="Arial" w:cs="Arial"/>
-          <w:sz w:val="24"/>
-          <w:szCs w:val="24"/>
-        </w:rPr>
-        <w:t>affidavit</w:t>
-      </w:r>
-      <w:r>
-        <w:rPr>
-          <w:rFonts w:ascii="Arial" w:hAnsi="Arial" w:cs="Arial"/>
-          <w:sz w:val="24"/>
-          <w:szCs w:val="24"/>
-        </w:rPr>
-        <w:t>.overflow()</w:t>
+        <w:t>or</w:t>
+      </w:r>
+      <w:r>
+        <w:rPr>
+          <w:rFonts w:ascii="Arial" w:hAnsi="Arial" w:cs="Arial"/>
+          <w:sz w:val="24"/>
+          <w:szCs w:val="24"/>
+        </w:rPr>
+        <w:t xml:space="preserve"> </w:t>
+      </w:r>
+      <w:proofErr w:type="spellStart"/>
+      <w:r>
+        <w:rPr>
+          <w:rFonts w:ascii="Arial" w:hAnsi="Arial" w:cs="Arial"/>
+          <w:sz w:val="24"/>
+          <w:szCs w:val="24"/>
+        </w:rPr>
+        <w:t>RFAaffidavitonbehalfofminor</w:t>
+      </w:r>
+      <w:r>
+        <w:rPr>
+          <w:rFonts w:ascii="Arial" w:hAnsi="Arial" w:cs="Arial"/>
+          <w:sz w:val="24"/>
+          <w:szCs w:val="24"/>
+        </w:rPr>
+        <w:t>.overflow</w:t>
+      </w:r>
+      <w:proofErr w:type="spellEnd"/>
+      <w:r>
+        <w:rPr>
+          <w:rFonts w:ascii="Arial" w:hAnsi="Arial" w:cs="Arial"/>
+          <w:sz w:val="24"/>
+          <w:szCs w:val="24"/>
+        </w:rPr>
+        <w:t>()</w:t>
+      </w:r>
+      <w:r>
+        <w:rPr>
+          <w:rFonts w:ascii="Arial" w:hAnsi="Arial" w:cs="Arial"/>
+          <w:sz w:val="24"/>
+          <w:szCs w:val="24"/>
+        </w:rPr>
+        <w:t xml:space="preserve"> </w:t>
       </w:r>
       <w:r>
         <w:rPr>
@@ -316,7 +444,25 @@
           <w:sz w:val="24"/>
           <w:szCs w:val="24"/>
         </w:rPr>
-        <w:t>{%p if field.field_name == "children" %}</w:t>
+        <w:t xml:space="preserve">{%p if </w:t>
+      </w:r>
+      <w:proofErr w:type="spellStart"/>
+      <w:r>
+        <w:rPr>
+          <w:rFonts w:ascii="Arial" w:hAnsi="Arial" w:cs="Arial"/>
+          <w:sz w:val="24"/>
+          <w:szCs w:val="24"/>
+        </w:rPr>
+        <w:t>field.field_name</w:t>
+      </w:r>
+      <w:proofErr w:type="spellEnd"/>
+      <w:r>
+        <w:rPr>
+          <w:rFonts w:ascii="Arial" w:hAnsi="Arial" w:cs="Arial"/>
+          <w:sz w:val="24"/>
+          <w:szCs w:val="24"/>
+        </w:rPr>
+        <w:t xml:space="preserve"> == "children" %}</w:t>
       </w:r>
     </w:p>
     <w:p>
@@ -523,7 +669,25 @@
                 <w:sz w:val="20"/>
                 <w:szCs w:val="20"/>
               </w:rPr>
-              <w:t>{%tr for row in field.overflow_value() %}</w:t>
+              <w:t xml:space="preserve">{%tr for row in </w:t>
+            </w:r>
+            <w:proofErr w:type="spellStart"/>
+            <w:r>
+              <w:rPr>
+                <w:rFonts w:ascii="Arial" w:eastAsia="Calibri" w:hAnsi="Arial" w:cs="Arial"/>
+                <w:sz w:val="20"/>
+                <w:szCs w:val="20"/>
+              </w:rPr>
+              <w:t>field.overflow_value</w:t>
+            </w:r>
+            <w:proofErr w:type="spellEnd"/>
+            <w:r>
+              <w:rPr>
+                <w:rFonts w:ascii="Arial" w:eastAsia="Calibri" w:hAnsi="Arial" w:cs="Arial"/>
+                <w:sz w:val="20"/>
+                <w:szCs w:val="20"/>
+              </w:rPr>
+              <w:t>() %}</w:t>
             </w:r>
           </w:p>
         </w:tc>
@@ -645,7 +809,25 @@
                 <w:sz w:val="20"/>
                 <w:szCs w:val="20"/>
               </w:rPr>
-              <w:t>{{ row.birthdate }}</w:t>
+              <w:t xml:space="preserve">{{ </w:t>
+            </w:r>
+            <w:proofErr w:type="spellStart"/>
+            <w:r>
+              <w:rPr>
+                <w:rFonts w:ascii="Arial" w:eastAsia="Calibri" w:hAnsi="Arial" w:cs="Arial"/>
+                <w:sz w:val="20"/>
+                <w:szCs w:val="20"/>
+              </w:rPr>
+              <w:t>row.birthdate</w:t>
+            </w:r>
+            <w:proofErr w:type="spellEnd"/>
+            <w:r>
+              <w:rPr>
+                <w:rFonts w:ascii="Arial" w:eastAsia="Calibri" w:hAnsi="Arial" w:cs="Arial"/>
+                <w:sz w:val="20"/>
+                <w:szCs w:val="20"/>
+              </w:rPr>
+              <w:t xml:space="preserve"> }}</w:t>
             </w:r>
           </w:p>
         </w:tc>
@@ -668,7 +850,25 @@
                 <w:sz w:val="20"/>
                 <w:szCs w:val="20"/>
               </w:rPr>
-              <w:t>{{ row.in_danger }}</w:t>
+              <w:t xml:space="preserve">{{ </w:t>
+            </w:r>
+            <w:proofErr w:type="spellStart"/>
+            <w:r>
+              <w:rPr>
+                <w:rFonts w:ascii="Arial" w:eastAsia="Calibri" w:hAnsi="Arial" w:cs="Arial"/>
+                <w:sz w:val="20"/>
+                <w:szCs w:val="20"/>
+              </w:rPr>
+              <w:t>row.in_danger</w:t>
+            </w:r>
+            <w:proofErr w:type="spellEnd"/>
+            <w:r>
+              <w:rPr>
+                <w:rFonts w:ascii="Arial" w:eastAsia="Calibri" w:hAnsi="Arial" w:cs="Arial"/>
+                <w:sz w:val="20"/>
+                <w:szCs w:val="20"/>
+              </w:rPr>
+              <w:t xml:space="preserve"> }}</w:t>
             </w:r>
           </w:p>
         </w:tc>
@@ -737,7 +937,25 @@
                 <w:sz w:val="20"/>
                 <w:szCs w:val="20"/>
               </w:rPr>
-              <w:t>{{ row.custody_wanted}}</w:t>
+              <w:t xml:space="preserve">{{ </w:t>
+            </w:r>
+            <w:proofErr w:type="spellStart"/>
+            <w:r>
+              <w:rPr>
+                <w:rFonts w:ascii="Arial" w:hAnsi="Arial" w:cs="Arial"/>
+                <w:sz w:val="20"/>
+                <w:szCs w:val="20"/>
+              </w:rPr>
+              <w:t>row.custody_wanted</w:t>
+            </w:r>
+            <w:proofErr w:type="spellEnd"/>
+            <w:r>
+              <w:rPr>
+                <w:rFonts w:ascii="Arial" w:hAnsi="Arial" w:cs="Arial"/>
+                <w:sz w:val="20"/>
+                <w:szCs w:val="20"/>
+              </w:rPr>
+              <w:t>}}</w:t>
             </w:r>
           </w:p>
         </w:tc>
@@ -761,7 +979,25 @@
                 <w:sz w:val="20"/>
                 <w:szCs w:val="20"/>
               </w:rPr>
-              <w:t>{%tr endfor %}</w:t>
+              <w:t xml:space="preserve">{%tr </w:t>
+            </w:r>
+            <w:proofErr w:type="spellStart"/>
+            <w:r>
+              <w:rPr>
+                <w:rFonts w:ascii="Arial" w:eastAsia="Calibri" w:hAnsi="Arial" w:cs="Arial"/>
+                <w:sz w:val="20"/>
+                <w:szCs w:val="20"/>
+              </w:rPr>
+              <w:t>endfor</w:t>
+            </w:r>
+            <w:proofErr w:type="spellEnd"/>
+            <w:r>
+              <w:rPr>
+                <w:rFonts w:ascii="Arial" w:eastAsia="Calibri" w:hAnsi="Arial" w:cs="Arial"/>
+                <w:sz w:val="20"/>
+                <w:szCs w:val="20"/>
+              </w:rPr>
+              <w:t xml:space="preserve"> %}</w:t>
             </w:r>
           </w:p>
         </w:tc>
@@ -867,6 +1103,7 @@
         </w:rPr>
         <w:t xml:space="preserve">{%p </w:t>
       </w:r>
+      <w:proofErr w:type="spellStart"/>
       <w:r>
         <w:rPr>
           <w:rFonts w:ascii="Arial" w:hAnsi="Arial" w:cs="Arial"/>
@@ -881,7 +1118,34 @@
           <w:sz w:val="24"/>
           <w:szCs w:val="24"/>
         </w:rPr>
-        <w:t xml:space="preserve">if field.is_object_list() %} </w:t>
+        <w:t>if</w:t>
+      </w:r>
+      <w:proofErr w:type="spellEnd"/>
+      <w:r>
+        <w:rPr>
+          <w:rFonts w:ascii="Arial" w:hAnsi="Arial" w:cs="Arial"/>
+          <w:sz w:val="24"/>
+          <w:szCs w:val="24"/>
+        </w:rPr>
+        <w:t xml:space="preserve"> </w:t>
+      </w:r>
+      <w:proofErr w:type="spellStart"/>
+      <w:r>
+        <w:rPr>
+          <w:rFonts w:ascii="Arial" w:hAnsi="Arial" w:cs="Arial"/>
+          <w:sz w:val="24"/>
+          <w:szCs w:val="24"/>
+        </w:rPr>
+        <w:t>field.is_object_list</w:t>
+      </w:r>
+      <w:proofErr w:type="spellEnd"/>
+      <w:r>
+        <w:rPr>
+          <w:rFonts w:ascii="Arial" w:hAnsi="Arial" w:cs="Arial"/>
+          <w:sz w:val="24"/>
+          <w:szCs w:val="24"/>
+        </w:rPr>
+        <w:t xml:space="preserve">() %} </w:t>
       </w:r>
     </w:p>
     <w:p>
@@ -899,7 +1163,16 @@
           <w:sz w:val="24"/>
           <w:szCs w:val="24"/>
         </w:rPr>
-        <w:t>{{ field.</w:t>
+        <w:t xml:space="preserve">{{ </w:t>
+      </w:r>
+      <w:proofErr w:type="spellStart"/>
+      <w:r>
+        <w:rPr>
+          <w:rFonts w:ascii="Arial" w:hAnsi="Arial" w:cs="Arial"/>
+          <w:sz w:val="24"/>
+          <w:szCs w:val="24"/>
+        </w:rPr>
+        <w:t>field.</w:t>
       </w:r>
       <w:r>
         <w:rPr>
@@ -909,6 +1182,7 @@
         </w:rPr>
         <w:t>label</w:t>
       </w:r>
+      <w:proofErr w:type="spellEnd"/>
       <w:r>
         <w:rPr>
           <w:rFonts w:ascii="Arial" w:hAnsi="Arial" w:cs="Arial"/>
@@ -950,7 +1224,47 @@
                 <w:sz w:val="24"/>
                 <w:szCs w:val="24"/>
               </w:rPr>
-              <w:t>{%tc for column in field.columns() %}</w:t>
+              <w:t>{%</w:t>
+            </w:r>
+            <w:proofErr w:type="spellStart"/>
+            <w:r>
+              <w:rPr>
+                <w:rFonts w:ascii="Arial" w:hAnsi="Arial" w:cs="Arial"/>
+                <w:b/>
+                <w:sz w:val="24"/>
+                <w:szCs w:val="24"/>
+              </w:rPr>
+              <w:t>tc</w:t>
+            </w:r>
+            <w:proofErr w:type="spellEnd"/>
+            <w:r>
+              <w:rPr>
+                <w:rFonts w:ascii="Arial" w:hAnsi="Arial" w:cs="Arial"/>
+                <w:b/>
+                <w:sz w:val="24"/>
+                <w:szCs w:val="24"/>
+              </w:rPr>
+              <w:t xml:space="preserve"> for column in </w:t>
+            </w:r>
+            <w:proofErr w:type="spellStart"/>
+            <w:r>
+              <w:rPr>
+                <w:rFonts w:ascii="Arial" w:hAnsi="Arial" w:cs="Arial"/>
+                <w:b/>
+                <w:sz w:val="24"/>
+                <w:szCs w:val="24"/>
+              </w:rPr>
+              <w:t>field.columns</w:t>
+            </w:r>
+            <w:proofErr w:type="spellEnd"/>
+            <w:r>
+              <w:rPr>
+                <w:rFonts w:ascii="Arial" w:hAnsi="Arial" w:cs="Arial"/>
+                <w:b/>
+                <w:sz w:val="24"/>
+                <w:szCs w:val="24"/>
+              </w:rPr>
+              <w:t>() %}</w:t>
             </w:r>
           </w:p>
         </w:tc>
@@ -1016,7 +1330,47 @@
                 <w:sz w:val="24"/>
                 <w:szCs w:val="24"/>
               </w:rPr>
-              <w:t>{%tc endfor %}</w:t>
+              <w:t>{%</w:t>
+            </w:r>
+            <w:proofErr w:type="spellStart"/>
+            <w:r>
+              <w:rPr>
+                <w:rFonts w:ascii="Arial" w:hAnsi="Arial" w:cs="Arial"/>
+                <w:b/>
+                <w:sz w:val="24"/>
+                <w:szCs w:val="24"/>
+              </w:rPr>
+              <w:t>tc</w:t>
+            </w:r>
+            <w:proofErr w:type="spellEnd"/>
+            <w:r>
+              <w:rPr>
+                <w:rFonts w:ascii="Arial" w:hAnsi="Arial" w:cs="Arial"/>
+                <w:b/>
+                <w:sz w:val="24"/>
+                <w:szCs w:val="24"/>
+              </w:rPr>
+              <w:t xml:space="preserve"> </w:t>
+            </w:r>
+            <w:proofErr w:type="spellStart"/>
+            <w:r>
+              <w:rPr>
+                <w:rFonts w:ascii="Arial" w:hAnsi="Arial" w:cs="Arial"/>
+                <w:b/>
+                <w:sz w:val="24"/>
+                <w:szCs w:val="24"/>
+              </w:rPr>
+              <w:t>endfor</w:t>
+            </w:r>
+            <w:proofErr w:type="spellEnd"/>
+            <w:r>
+              <w:rPr>
+                <w:rFonts w:ascii="Arial" w:hAnsi="Arial" w:cs="Arial"/>
+                <w:b/>
+                <w:sz w:val="24"/>
+                <w:szCs w:val="24"/>
+              </w:rPr>
+              <w:t xml:space="preserve"> %}</w:t>
             </w:r>
           </w:p>
         </w:tc>
@@ -1040,7 +1394,25 @@
                 <w:sz w:val="24"/>
                 <w:szCs w:val="24"/>
               </w:rPr>
-              <w:t>{%tr for row in field.overflow_value() %}</w:t>
+              <w:t xml:space="preserve">{%tr for row in </w:t>
+            </w:r>
+            <w:proofErr w:type="spellStart"/>
+            <w:r>
+              <w:rPr>
+                <w:rFonts w:ascii="Arial" w:hAnsi="Arial" w:cs="Arial"/>
+                <w:sz w:val="24"/>
+                <w:szCs w:val="24"/>
+              </w:rPr>
+              <w:t>field.overflow_value</w:t>
+            </w:r>
+            <w:proofErr w:type="spellEnd"/>
+            <w:r>
+              <w:rPr>
+                <w:rFonts w:ascii="Arial" w:hAnsi="Arial" w:cs="Arial"/>
+                <w:sz w:val="24"/>
+                <w:szCs w:val="24"/>
+              </w:rPr>
+              <w:t>() %}</w:t>
             </w:r>
           </w:p>
         </w:tc>
@@ -1092,7 +1464,43 @@
                 <w:sz w:val="24"/>
                 <w:szCs w:val="24"/>
               </w:rPr>
-              <w:t>{%tc for column in field.columns() %}</w:t>
+              <w:t>{%</w:t>
+            </w:r>
+            <w:proofErr w:type="spellStart"/>
+            <w:r>
+              <w:rPr>
+                <w:rFonts w:ascii="Arial" w:hAnsi="Arial" w:cs="Arial"/>
+                <w:sz w:val="24"/>
+                <w:szCs w:val="24"/>
+              </w:rPr>
+              <w:t>tc</w:t>
+            </w:r>
+            <w:proofErr w:type="spellEnd"/>
+            <w:r>
+              <w:rPr>
+                <w:rFonts w:ascii="Arial" w:hAnsi="Arial" w:cs="Arial"/>
+                <w:sz w:val="24"/>
+                <w:szCs w:val="24"/>
+              </w:rPr>
+              <w:t xml:space="preserve"> for column in </w:t>
+            </w:r>
+            <w:proofErr w:type="spellStart"/>
+            <w:r>
+              <w:rPr>
+                <w:rFonts w:ascii="Arial" w:hAnsi="Arial" w:cs="Arial"/>
+                <w:sz w:val="24"/>
+                <w:szCs w:val="24"/>
+              </w:rPr>
+              <w:t>field.columns</w:t>
+            </w:r>
+            <w:proofErr w:type="spellEnd"/>
+            <w:r>
+              <w:rPr>
+                <w:rFonts w:ascii="Arial" w:hAnsi="Arial" w:cs="Arial"/>
+                <w:sz w:val="24"/>
+                <w:szCs w:val="24"/>
+              </w:rPr>
+              <w:t>() %}</w:t>
             </w:r>
           </w:p>
         </w:tc>
@@ -1114,7 +1522,25 @@
                 <w:sz w:val="24"/>
                 <w:szCs w:val="24"/>
               </w:rPr>
-              <w:t>{{ safeattr(row, key(column)) }}</w:t>
+              <w:t xml:space="preserve">{{ </w:t>
+            </w:r>
+            <w:proofErr w:type="spellStart"/>
+            <w:r>
+              <w:rPr>
+                <w:rFonts w:ascii="Arial" w:hAnsi="Arial" w:cs="Arial"/>
+                <w:sz w:val="24"/>
+                <w:szCs w:val="24"/>
+              </w:rPr>
+              <w:t>safeattr</w:t>
+            </w:r>
+            <w:proofErr w:type="spellEnd"/>
+            <w:r>
+              <w:rPr>
+                <w:rFonts w:ascii="Arial" w:hAnsi="Arial" w:cs="Arial"/>
+                <w:sz w:val="24"/>
+                <w:szCs w:val="24"/>
+              </w:rPr>
+              <w:t>(row, key(column)) }}</w:t>
             </w:r>
           </w:p>
         </w:tc>
@@ -1136,7 +1562,43 @@
                 <w:sz w:val="24"/>
                 <w:szCs w:val="24"/>
               </w:rPr>
-              <w:t>{%tc endfor %}</w:t>
+              <w:t>{%</w:t>
+            </w:r>
+            <w:proofErr w:type="spellStart"/>
+            <w:r>
+              <w:rPr>
+                <w:rFonts w:ascii="Arial" w:hAnsi="Arial" w:cs="Arial"/>
+                <w:sz w:val="24"/>
+                <w:szCs w:val="24"/>
+              </w:rPr>
+              <w:t>tc</w:t>
+            </w:r>
+            <w:proofErr w:type="spellEnd"/>
+            <w:r>
+              <w:rPr>
+                <w:rFonts w:ascii="Arial" w:hAnsi="Arial" w:cs="Arial"/>
+                <w:sz w:val="24"/>
+                <w:szCs w:val="24"/>
+              </w:rPr>
+              <w:t xml:space="preserve"> </w:t>
+            </w:r>
+            <w:proofErr w:type="spellStart"/>
+            <w:r>
+              <w:rPr>
+                <w:rFonts w:ascii="Arial" w:hAnsi="Arial" w:cs="Arial"/>
+                <w:sz w:val="24"/>
+                <w:szCs w:val="24"/>
+              </w:rPr>
+              <w:t>endfor</w:t>
+            </w:r>
+            <w:proofErr w:type="spellEnd"/>
+            <w:r>
+              <w:rPr>
+                <w:rFonts w:ascii="Arial" w:hAnsi="Arial" w:cs="Arial"/>
+                <w:sz w:val="24"/>
+                <w:szCs w:val="24"/>
+              </w:rPr>
+              <w:t xml:space="preserve"> %}</w:t>
             </w:r>
           </w:p>
         </w:tc>
@@ -1160,7 +1622,25 @@
                 <w:sz w:val="24"/>
                 <w:szCs w:val="24"/>
               </w:rPr>
-              <w:t>{%tr endfor %}</w:t>
+              <w:t xml:space="preserve">{%tr </w:t>
+            </w:r>
+            <w:proofErr w:type="spellStart"/>
+            <w:r>
+              <w:rPr>
+                <w:rFonts w:ascii="Arial" w:hAnsi="Arial" w:cs="Arial"/>
+                <w:sz w:val="24"/>
+                <w:szCs w:val="24"/>
+              </w:rPr>
+              <w:t>endfor</w:t>
+            </w:r>
+            <w:proofErr w:type="spellEnd"/>
+            <w:r>
+              <w:rPr>
+                <w:rFonts w:ascii="Arial" w:hAnsi="Arial" w:cs="Arial"/>
+                <w:sz w:val="24"/>
+                <w:szCs w:val="24"/>
+              </w:rPr>
+              <w:t xml:space="preserve"> %}</w:t>
             </w:r>
           </w:p>
         </w:tc>
@@ -1217,7 +1697,43 @@
           <w:sz w:val="24"/>
           <w:szCs w:val="24"/>
         </w:rPr>
-        <w:t>{%p elif field.is_list() %}</w:t>
+        <w:t xml:space="preserve">{%p </w:t>
+      </w:r>
+      <w:proofErr w:type="spellStart"/>
+      <w:r>
+        <w:rPr>
+          <w:rFonts w:ascii="Arial" w:hAnsi="Arial" w:cs="Arial"/>
+          <w:sz w:val="24"/>
+          <w:szCs w:val="24"/>
+        </w:rPr>
+        <w:t>elif</w:t>
+      </w:r>
+      <w:proofErr w:type="spellEnd"/>
+      <w:r>
+        <w:rPr>
+          <w:rFonts w:ascii="Arial" w:hAnsi="Arial" w:cs="Arial"/>
+          <w:sz w:val="24"/>
+          <w:szCs w:val="24"/>
+        </w:rPr>
+        <w:t xml:space="preserve"> </w:t>
+      </w:r>
+      <w:proofErr w:type="spellStart"/>
+      <w:r>
+        <w:rPr>
+          <w:rFonts w:ascii="Arial" w:hAnsi="Arial" w:cs="Arial"/>
+          <w:sz w:val="24"/>
+          <w:szCs w:val="24"/>
+        </w:rPr>
+        <w:t>field.is_list</w:t>
+      </w:r>
+      <w:proofErr w:type="spellEnd"/>
+      <w:r>
+        <w:rPr>
+          <w:rFonts w:ascii="Arial" w:hAnsi="Arial" w:cs="Arial"/>
+          <w:sz w:val="24"/>
+          <w:szCs w:val="24"/>
+        </w:rPr>
+        <w:t>() %}</w:t>
       </w:r>
     </w:p>
     <w:p>
@@ -1245,7 +1761,16 @@
           <w:szCs w:val="24"/>
         </w:rPr>
         <w:lastRenderedPageBreak/>
-        <w:t>{{ field.</w:t>
+        <w:t xml:space="preserve">{{ </w:t>
+      </w:r>
+      <w:proofErr w:type="spellStart"/>
+      <w:r>
+        <w:rPr>
+          <w:rFonts w:ascii="Arial" w:hAnsi="Arial" w:cs="Arial"/>
+          <w:sz w:val="24"/>
+          <w:szCs w:val="24"/>
+        </w:rPr>
+        <w:t>field.</w:t>
       </w:r>
       <w:r>
         <w:rPr>
@@ -1255,6 +1780,7 @@
         </w:rPr>
         <w:t>label</w:t>
       </w:r>
+      <w:proofErr w:type="spellEnd"/>
       <w:r>
         <w:rPr>
           <w:rFonts w:ascii="Arial" w:hAnsi="Arial" w:cs="Arial"/>
@@ -1283,7 +1809,25 @@
           <w:sz w:val="24"/>
           <w:szCs w:val="24"/>
         </w:rPr>
-        <w:t>{%p for item in field.overflow_value() %}</w:t>
+        <w:t xml:space="preserve">{%p for item in </w:t>
+      </w:r>
+      <w:proofErr w:type="spellStart"/>
+      <w:r>
+        <w:rPr>
+          <w:rFonts w:ascii="Arial" w:hAnsi="Arial" w:cs="Arial"/>
+          <w:sz w:val="24"/>
+          <w:szCs w:val="24"/>
+        </w:rPr>
+        <w:t>field.overflow_value</w:t>
+      </w:r>
+      <w:proofErr w:type="spellEnd"/>
+      <w:r>
+        <w:rPr>
+          <w:rFonts w:ascii="Arial" w:hAnsi="Arial" w:cs="Arial"/>
+          <w:sz w:val="24"/>
+          <w:szCs w:val="24"/>
+        </w:rPr>
+        <w:t>() %}</w:t>
       </w:r>
     </w:p>
     <w:p>
@@ -1327,8 +1871,18 @@
           <w:sz w:val="24"/>
           <w:szCs w:val="24"/>
         </w:rPr>
-        <w:t>{%p endfor</w:t>
-      </w:r>
+        <w:t xml:space="preserve">{%p </w:t>
+      </w:r>
+      <w:proofErr w:type="spellStart"/>
+      <w:r>
+        <w:rPr>
+          <w:rFonts w:ascii="Arial" w:hAnsi="Arial" w:cs="Arial"/>
+          <w:sz w:val="24"/>
+          <w:szCs w:val="24"/>
+        </w:rPr>
+        <w:t>endfor</w:t>
+      </w:r>
+      <w:proofErr w:type="spellEnd"/>
       <w:r>
         <w:rPr>
           <w:rFonts w:ascii="Arial" w:hAnsi="Arial" w:cs="Arial"/>
@@ -1395,8 +1949,9 @@
           <w:sz w:val="24"/>
           <w:szCs w:val="24"/>
         </w:rPr>
-        <w:t>{{ field.</w:t>
-      </w:r>
+        <w:t xml:space="preserve">{{ </w:t>
+      </w:r>
+      <w:proofErr w:type="spellStart"/>
       <w:r>
         <w:rPr>
           <w:rFonts w:ascii="Arial" w:hAnsi="Arial" w:cs="Arial"/>
@@ -1404,8 +1959,18 @@
           <w:sz w:val="24"/>
           <w:szCs w:val="24"/>
         </w:rPr>
+        <w:t>field.</w:t>
+      </w:r>
+      <w:r>
+        <w:rPr>
+          <w:rFonts w:ascii="Arial" w:hAnsi="Arial" w:cs="Arial"/>
+          <w:b/>
+          <w:sz w:val="24"/>
+          <w:szCs w:val="24"/>
+        </w:rPr>
         <w:t>label</w:t>
       </w:r>
+      <w:proofErr w:type="spellEnd"/>
       <w:r>
         <w:rPr>
           <w:rFonts w:ascii="Arial" w:hAnsi="Arial" w:cs="Arial"/>
@@ -1421,23 +1986,60 @@
           <w:sz w:val="24"/>
           <w:szCs w:val="24"/>
         </w:rPr>
-        <w:t>: {{ field.overflow_value(</w:t>
-      </w:r>
-      <w:r>
-        <w:rPr>
-          <w:rFonts w:ascii="Arial" w:hAnsi="Arial" w:cs="Arial"/>
-          <w:sz w:val="24"/>
-          <w:szCs w:val="24"/>
-        </w:rPr>
-        <w:t>overflow_message=</w:t>
-      </w:r>
-      <w:r>
-        <w:rPr>
-          <w:rFonts w:ascii="Arial" w:hAnsi="Arial" w:cs="Arial"/>
-          <w:sz w:val="24"/>
-          <w:szCs w:val="24"/>
-        </w:rPr>
-        <w:t xml:space="preserve"> RFAaffidavit</w:t>
+        <w:t xml:space="preserve">: {{ </w:t>
+      </w:r>
+      <w:proofErr w:type="spellStart"/>
+      <w:r>
+        <w:rPr>
+          <w:rFonts w:ascii="Arial" w:hAnsi="Arial" w:cs="Arial"/>
+          <w:sz w:val="24"/>
+          <w:szCs w:val="24"/>
+        </w:rPr>
+        <w:t>field.overflow_value</w:t>
+      </w:r>
+      <w:proofErr w:type="spellEnd"/>
+      <w:r>
+        <w:rPr>
+          <w:rFonts w:ascii="Arial" w:hAnsi="Arial" w:cs="Arial"/>
+          <w:sz w:val="24"/>
+          <w:szCs w:val="24"/>
+        </w:rPr>
+        <w:t>(</w:t>
+      </w:r>
+      <w:proofErr w:type="spellStart"/>
+      <w:r>
+        <w:rPr>
+          <w:rFonts w:ascii="Arial" w:hAnsi="Arial" w:cs="Arial"/>
+          <w:sz w:val="24"/>
+          <w:szCs w:val="24"/>
+        </w:rPr>
+        <w:t>overflow_message</w:t>
+      </w:r>
+      <w:proofErr w:type="spellEnd"/>
+      <w:r>
+        <w:rPr>
+          <w:rFonts w:ascii="Arial" w:hAnsi="Arial" w:cs="Arial"/>
+          <w:sz w:val="24"/>
+          <w:szCs w:val="24"/>
+        </w:rPr>
+        <w:t>=</w:t>
+      </w:r>
+      <w:r>
+        <w:rPr>
+          <w:rFonts w:ascii="Arial" w:hAnsi="Arial" w:cs="Arial"/>
+          <w:sz w:val="24"/>
+          <w:szCs w:val="24"/>
+        </w:rPr>
+        <w:t xml:space="preserve"> </w:t>
+      </w:r>
+      <w:proofErr w:type="spellStart"/>
+      <w:r>
+        <w:rPr>
+          <w:rFonts w:ascii="Arial" w:hAnsi="Arial" w:cs="Arial"/>
+          <w:sz w:val="24"/>
+          <w:szCs w:val="24"/>
+        </w:rPr>
+        <w:t>RFAaffidavit</w:t>
       </w:r>
       <w:r>
         <w:rPr>
@@ -1447,6 +2049,7 @@
         </w:rPr>
         <w:t>.default_overflow_message</w:t>
       </w:r>
+      <w:proofErr w:type="spellEnd"/>
       <w:r>
         <w:rPr>
           <w:rFonts w:ascii="Arial" w:hAnsi="Arial" w:cs="Arial"/>
@@ -1487,57 +2090,18 @@
           <w:sz w:val="24"/>
           <w:szCs w:val="24"/>
         </w:rPr>
-        <w:t>{%p endfor %}</w:t>
-      </w:r>
-    </w:p>
-    <w:p>
-      <w:pPr>
-        <w:rPr>
-          <w:rFonts w:ascii="Arial" w:hAnsi="Arial" w:cs="Arial"/>
-          <w:sz w:val="24"/>
-          <w:szCs w:val="24"/>
-        </w:rPr>
-      </w:pPr>
-      <w:r>
-        <w:rPr>
-          <w:rFonts w:ascii="Arial" w:hAnsi="Arial" w:cs="Arial"/>
-          <w:sz w:val="24"/>
-          <w:szCs w:val="24"/>
-        </w:rPr>
-        <w:t xml:space="preserve">{%p for field in </w:t>
-      </w:r>
-      <w:r>
-        <w:rPr>
-          <w:rFonts w:ascii="Arial" w:hAnsi="Arial" w:cs="Arial"/>
-          <w:sz w:val="24"/>
-          <w:szCs w:val="24"/>
-        </w:rPr>
-        <w:t>RFAcomplaintonbehalfofminor.overflow()</w:t>
-      </w:r>
-      <w:r>
-        <w:rPr>
-          <w:rFonts w:ascii="Arial" w:hAnsi="Arial" w:cs="Arial"/>
-          <w:sz w:val="24"/>
-          <w:szCs w:val="24"/>
-        </w:rPr>
-        <w:t xml:space="preserve"> </w:t>
-      </w:r>
-      <w:r>
-        <w:rPr>
-          <w:rFonts w:ascii="Arial" w:hAnsi="Arial" w:cs="Arial"/>
-          <w:sz w:val="24"/>
-          <w:szCs w:val="24"/>
-        </w:rPr>
-        <w:t xml:space="preserve">and </w:t>
-      </w:r>
-      <w:r>
-        <w:rPr>
-          <w:rFonts w:ascii="Arial" w:hAnsi="Arial" w:cs="Arial"/>
-          <w:sz w:val="24"/>
-          <w:szCs w:val="24"/>
-        </w:rPr>
-        <w:t>RFAaffidavitonbehalfofminor.overflow()</w:t>
-      </w:r>
+        <w:t xml:space="preserve">{%p </w:t>
+      </w:r>
+      <w:proofErr w:type="spellStart"/>
+      <w:r>
+        <w:rPr>
+          <w:rFonts w:ascii="Arial" w:hAnsi="Arial" w:cs="Arial"/>
+          <w:sz w:val="24"/>
+          <w:szCs w:val="24"/>
+        </w:rPr>
+        <w:t>endfor</w:t>
+      </w:r>
+      <w:proofErr w:type="spellEnd"/>
       <w:r>
         <w:rPr>
           <w:rFonts w:ascii="Arial" w:hAnsi="Arial" w:cs="Arial"/>
@@ -1545,1070 +2109,6 @@
           <w:szCs w:val="24"/>
         </w:rPr>
         <w:t xml:space="preserve"> %}</w:t>
-      </w:r>
-    </w:p>
-    <w:p>
-      <w:pPr>
-        <w:rPr>
-          <w:rFonts w:ascii="Arial" w:hAnsi="Arial" w:cs="Arial"/>
-          <w:sz w:val="24"/>
-          <w:szCs w:val="24"/>
-        </w:rPr>
-      </w:pPr>
-      <w:r>
-        <w:rPr>
-          <w:rFonts w:ascii="Arial" w:hAnsi="Arial" w:cs="Arial"/>
-          <w:sz w:val="24"/>
-          <w:szCs w:val="24"/>
-        </w:rPr>
-        <w:t>{%p if field.field_name == "children" %}</w:t>
-      </w:r>
-    </w:p>
-    <w:p>
-      <w:pPr>
-        <w:pStyle w:val="Heading2"/>
-        <w:rPr>
-          <w:rFonts w:ascii="Arial" w:hAnsi="Arial" w:cs="Arial"/>
-          <w:sz w:val="24"/>
-          <w:szCs w:val="24"/>
-        </w:rPr>
-      </w:pPr>
-      <w:r>
-        <w:rPr>
-          <w:rFonts w:ascii="Arial" w:hAnsi="Arial" w:cs="Arial"/>
-          <w:sz w:val="24"/>
-          <w:szCs w:val="24"/>
-        </w:rPr>
-        <w:t>Additional children</w:t>
-      </w:r>
-    </w:p>
-    <w:tbl>
-      <w:tblPr>
-        <w:tblStyle w:val="TableGrid"/>
-        <w:tblW w:w="9360" w:type="dxa"/>
-        <w:tblLayout w:type="fixed"/>
-        <w:tblLook w:val="04A0" w:firstRow="1" w:lastRow="0" w:firstColumn="1" w:lastColumn="0" w:noHBand="0" w:noVBand="1"/>
-      </w:tblPr>
-      <w:tblGrid>
-        <w:gridCol w:w="1795"/>
-        <w:gridCol w:w="900"/>
-        <w:gridCol w:w="1260"/>
-        <w:gridCol w:w="1710"/>
-        <w:gridCol w:w="1710"/>
-        <w:gridCol w:w="1985"/>
-      </w:tblGrid>
-      <w:tr>
-        <w:tc>
-          <w:tcPr>
-            <w:tcW w:w="1795" w:type="dxa"/>
-          </w:tcPr>
-          <w:p>
-            <w:pPr>
-              <w:widowControl w:val="0"/>
-              <w:rPr>
-                <w:rFonts w:ascii="Arial" w:hAnsi="Arial" w:cs="Arial"/>
-                <w:b/>
-                <w:sz w:val="20"/>
-                <w:szCs w:val="20"/>
-              </w:rPr>
-            </w:pPr>
-            <w:r>
-              <w:rPr>
-                <w:rFonts w:ascii="Arial" w:eastAsia="Calibri" w:hAnsi="Arial" w:cs="Arial"/>
-                <w:b/>
-                <w:sz w:val="20"/>
-                <w:szCs w:val="20"/>
-              </w:rPr>
-              <w:t>Name</w:t>
-            </w:r>
-          </w:p>
-        </w:tc>
-        <w:tc>
-          <w:tcPr>
-            <w:tcW w:w="900" w:type="dxa"/>
-          </w:tcPr>
-          <w:p>
-            <w:pPr>
-              <w:widowControl w:val="0"/>
-              <w:rPr>
-                <w:rFonts w:ascii="Arial" w:eastAsia="Calibri" w:hAnsi="Arial" w:cs="Arial"/>
-                <w:b/>
-                <w:sz w:val="20"/>
-                <w:szCs w:val="20"/>
-              </w:rPr>
-            </w:pPr>
-            <w:r>
-              <w:rPr>
-                <w:rFonts w:ascii="Arial" w:eastAsia="Calibri" w:hAnsi="Arial" w:cs="Arial"/>
-                <w:b/>
-                <w:sz w:val="20"/>
-                <w:szCs w:val="20"/>
-              </w:rPr>
-              <w:t>Born</w:t>
-            </w:r>
-          </w:p>
-        </w:tc>
-        <w:tc>
-          <w:tcPr>
-            <w:tcW w:w="1260" w:type="dxa"/>
-          </w:tcPr>
-          <w:p>
-            <w:pPr>
-              <w:widowControl w:val="0"/>
-              <w:rPr>
-                <w:rFonts w:ascii="Arial" w:eastAsia="Calibri" w:hAnsi="Arial" w:cs="Arial"/>
-                <w:b/>
-                <w:sz w:val="20"/>
-                <w:szCs w:val="20"/>
-              </w:rPr>
-            </w:pPr>
-            <w:r>
-              <w:rPr>
-                <w:rFonts w:ascii="Arial" w:eastAsia="Calibri" w:hAnsi="Arial" w:cs="Arial"/>
-                <w:b/>
-                <w:sz w:val="20"/>
-                <w:szCs w:val="20"/>
-              </w:rPr>
-              <w:t>In danger?</w:t>
-            </w:r>
-          </w:p>
-        </w:tc>
-        <w:tc>
-          <w:tcPr>
-            <w:tcW w:w="1710" w:type="dxa"/>
-          </w:tcPr>
-          <w:p>
-            <w:pPr>
-              <w:widowControl w:val="0"/>
-              <w:rPr>
-                <w:rFonts w:ascii="Arial" w:eastAsia="Calibri" w:hAnsi="Arial" w:cs="Arial"/>
-                <w:b/>
-                <w:sz w:val="20"/>
-                <w:szCs w:val="20"/>
-              </w:rPr>
-            </w:pPr>
-            <w:r>
-              <w:rPr>
-                <w:rFonts w:ascii="Arial" w:eastAsia="Calibri" w:hAnsi="Arial" w:cs="Arial"/>
-                <w:b/>
-                <w:sz w:val="20"/>
-                <w:szCs w:val="20"/>
-              </w:rPr>
-              <w:t>Relationship to petitioner</w:t>
-            </w:r>
-          </w:p>
-        </w:tc>
-        <w:tc>
-          <w:tcPr>
-            <w:tcW w:w="1710" w:type="dxa"/>
-          </w:tcPr>
-          <w:p>
-            <w:pPr>
-              <w:widowControl w:val="0"/>
-              <w:rPr>
-                <w:rFonts w:ascii="Arial" w:eastAsia="Calibri" w:hAnsi="Arial" w:cs="Arial"/>
-                <w:b/>
-                <w:sz w:val="20"/>
-                <w:szCs w:val="20"/>
-              </w:rPr>
-            </w:pPr>
-            <w:r>
-              <w:rPr>
-                <w:rFonts w:ascii="Arial" w:eastAsia="Calibri" w:hAnsi="Arial" w:cs="Arial"/>
-                <w:b/>
-                <w:sz w:val="20"/>
-                <w:szCs w:val="20"/>
-              </w:rPr>
-              <w:t>Relationship to defendant</w:t>
-            </w:r>
-          </w:p>
-        </w:tc>
-        <w:tc>
-          <w:tcPr>
-            <w:tcW w:w="1985" w:type="dxa"/>
-          </w:tcPr>
-          <w:p>
-            <w:pPr>
-              <w:widowControl w:val="0"/>
-              <w:rPr>
-                <w:rFonts w:ascii="Arial" w:eastAsia="Calibri" w:hAnsi="Arial" w:cs="Arial"/>
-                <w:b/>
-                <w:sz w:val="20"/>
-                <w:szCs w:val="20"/>
-              </w:rPr>
-            </w:pPr>
-            <w:r>
-              <w:rPr>
-                <w:rFonts w:ascii="Arial" w:eastAsia="Calibri" w:hAnsi="Arial" w:cs="Arial"/>
-                <w:b/>
-                <w:sz w:val="20"/>
-                <w:szCs w:val="20"/>
-              </w:rPr>
-              <w:t>Plaintiff/petitioner wants custody?</w:t>
-            </w:r>
-          </w:p>
-        </w:tc>
-      </w:tr>
-      <w:tr>
-        <w:tc>
-          <w:tcPr>
-            <w:tcW w:w="1795" w:type="dxa"/>
-          </w:tcPr>
-          <w:p>
-            <w:pPr>
-              <w:rPr>
-                <w:rFonts w:ascii="Arial" w:hAnsi="Arial" w:cs="Arial"/>
-                <w:sz w:val="20"/>
-                <w:szCs w:val="20"/>
-              </w:rPr>
-            </w:pPr>
-            <w:r>
-              <w:rPr>
-                <w:rFonts w:ascii="Arial" w:eastAsia="Calibri" w:hAnsi="Arial" w:cs="Arial"/>
-                <w:sz w:val="20"/>
-                <w:szCs w:val="20"/>
-              </w:rPr>
-              <w:t>{%tr for row in field.overflow_value() %}</w:t>
-            </w:r>
-          </w:p>
-        </w:tc>
-        <w:tc>
-          <w:tcPr>
-            <w:tcW w:w="900" w:type="dxa"/>
-          </w:tcPr>
-          <w:p>
-            <w:pPr>
-              <w:widowControl w:val="0"/>
-              <w:rPr>
-                <w:rFonts w:ascii="Arial" w:eastAsia="Calibri" w:hAnsi="Arial" w:cs="Arial"/>
-                <w:sz w:val="20"/>
-                <w:szCs w:val="20"/>
-              </w:rPr>
-            </w:pPr>
-          </w:p>
-        </w:tc>
-        <w:tc>
-          <w:tcPr>
-            <w:tcW w:w="1260" w:type="dxa"/>
-          </w:tcPr>
-          <w:p>
-            <w:pPr>
-              <w:widowControl w:val="0"/>
-              <w:rPr>
-                <w:rFonts w:ascii="Arial" w:eastAsia="Calibri" w:hAnsi="Arial" w:cs="Arial"/>
-                <w:sz w:val="20"/>
-                <w:szCs w:val="20"/>
-              </w:rPr>
-            </w:pPr>
-          </w:p>
-        </w:tc>
-        <w:tc>
-          <w:tcPr>
-            <w:tcW w:w="1710" w:type="dxa"/>
-          </w:tcPr>
-          <w:p>
-            <w:pPr>
-              <w:widowControl w:val="0"/>
-              <w:rPr>
-                <w:rFonts w:ascii="Arial" w:eastAsia="Calibri" w:hAnsi="Arial" w:cs="Arial"/>
-                <w:sz w:val="20"/>
-                <w:szCs w:val="20"/>
-              </w:rPr>
-            </w:pPr>
-          </w:p>
-        </w:tc>
-        <w:tc>
-          <w:tcPr>
-            <w:tcW w:w="1710" w:type="dxa"/>
-          </w:tcPr>
-          <w:p>
-            <w:pPr>
-              <w:widowControl w:val="0"/>
-              <w:rPr>
-                <w:rFonts w:ascii="Arial" w:eastAsia="Calibri" w:hAnsi="Arial" w:cs="Arial"/>
-                <w:sz w:val="20"/>
-                <w:szCs w:val="20"/>
-              </w:rPr>
-            </w:pPr>
-          </w:p>
-        </w:tc>
-        <w:tc>
-          <w:tcPr>
-            <w:tcW w:w="1985" w:type="dxa"/>
-          </w:tcPr>
-          <w:p>
-            <w:pPr>
-              <w:widowControl w:val="0"/>
-              <w:rPr>
-                <w:rFonts w:ascii="Arial" w:eastAsia="Calibri" w:hAnsi="Arial" w:cs="Arial"/>
-                <w:sz w:val="20"/>
-                <w:szCs w:val="20"/>
-              </w:rPr>
-            </w:pPr>
-          </w:p>
-        </w:tc>
-      </w:tr>
-      <w:tr>
-        <w:tc>
-          <w:tcPr>
-            <w:tcW w:w="1795" w:type="dxa"/>
-          </w:tcPr>
-          <w:p>
-            <w:pPr>
-              <w:rPr>
-                <w:rFonts w:ascii="Arial" w:hAnsi="Arial" w:cs="Arial"/>
-                <w:sz w:val="24"/>
-                <w:szCs w:val="24"/>
-              </w:rPr>
-            </w:pPr>
-            <w:r>
-              <w:rPr>
-                <w:rFonts w:ascii="Arial" w:eastAsia="Calibri" w:hAnsi="Arial" w:cs="Arial"/>
-                <w:sz w:val="24"/>
-                <w:szCs w:val="24"/>
-              </w:rPr>
-              <w:t>{{ row.name }}</w:t>
-            </w:r>
-          </w:p>
-        </w:tc>
-        <w:tc>
-          <w:tcPr>
-            <w:tcW w:w="900" w:type="dxa"/>
-          </w:tcPr>
-          <w:p>
-            <w:pPr>
-              <w:widowControl w:val="0"/>
-              <w:rPr>
-                <w:rFonts w:ascii="Arial" w:hAnsi="Arial" w:cs="Arial"/>
-                <w:sz w:val="20"/>
-                <w:szCs w:val="20"/>
-              </w:rPr>
-            </w:pPr>
-            <w:r>
-              <w:rPr>
-                <w:rFonts w:ascii="Arial" w:eastAsia="Calibri" w:hAnsi="Arial" w:cs="Arial"/>
-                <w:sz w:val="20"/>
-                <w:szCs w:val="20"/>
-              </w:rPr>
-              <w:t>{{ row.birthdate }}</w:t>
-            </w:r>
-          </w:p>
-        </w:tc>
-        <w:tc>
-          <w:tcPr>
-            <w:tcW w:w="1260" w:type="dxa"/>
-          </w:tcPr>
-          <w:p>
-            <w:pPr>
-              <w:widowControl w:val="0"/>
-              <w:rPr>
-                <w:rFonts w:ascii="Arial" w:hAnsi="Arial" w:cs="Arial"/>
-                <w:sz w:val="20"/>
-                <w:szCs w:val="20"/>
-              </w:rPr>
-            </w:pPr>
-            <w:r>
-              <w:rPr>
-                <w:rFonts w:ascii="Arial" w:eastAsia="Calibri" w:hAnsi="Arial" w:cs="Arial"/>
-                <w:sz w:val="20"/>
-                <w:szCs w:val="20"/>
-              </w:rPr>
-              <w:t>{{ row.in_danger }}</w:t>
-            </w:r>
-          </w:p>
-        </w:tc>
-        <w:tc>
-          <w:tcPr>
-            <w:tcW w:w="1710" w:type="dxa"/>
-          </w:tcPr>
-          <w:p>
-            <w:pPr>
-              <w:widowControl w:val="0"/>
-              <w:rPr>
-                <w:rFonts w:ascii="Arial" w:hAnsi="Arial" w:cs="Arial"/>
-                <w:sz w:val="20"/>
-                <w:szCs w:val="20"/>
-              </w:rPr>
-            </w:pPr>
-            <w:r>
-              <w:rPr>
-                <w:rFonts w:ascii="Arial" w:hAnsi="Arial" w:cs="Arial"/>
-                <w:sz w:val="20"/>
-                <w:szCs w:val="20"/>
-              </w:rPr>
-              <w:t>{{ row.relationship_user1}}</w:t>
-            </w:r>
-          </w:p>
-        </w:tc>
-        <w:tc>
-          <w:tcPr>
-            <w:tcW w:w="1710" w:type="dxa"/>
-          </w:tcPr>
-          <w:p>
-            <w:pPr>
-              <w:widowControl w:val="0"/>
-              <w:rPr>
-                <w:rFonts w:ascii="Arial" w:eastAsia="Calibri" w:hAnsi="Arial" w:cs="Arial"/>
-                <w:sz w:val="20"/>
-                <w:szCs w:val="20"/>
-              </w:rPr>
-            </w:pPr>
-            <w:r>
-              <w:rPr>
-                <w:rFonts w:ascii="Arial" w:hAnsi="Arial" w:cs="Arial"/>
-                <w:sz w:val="20"/>
-                <w:szCs w:val="20"/>
-              </w:rPr>
-              <w:t>{{ row.relationship_op1}}</w:t>
-            </w:r>
-          </w:p>
-        </w:tc>
-        <w:tc>
-          <w:tcPr>
-            <w:tcW w:w="1985" w:type="dxa"/>
-          </w:tcPr>
-          <w:p>
-            <w:pPr>
-              <w:widowControl w:val="0"/>
-              <w:rPr>
-                <w:rFonts w:ascii="Arial" w:hAnsi="Arial" w:cs="Arial"/>
-                <w:sz w:val="20"/>
-                <w:szCs w:val="20"/>
-              </w:rPr>
-            </w:pPr>
-            <w:r>
-              <w:rPr>
-                <w:rFonts w:ascii="Arial" w:hAnsi="Arial" w:cs="Arial"/>
-                <w:sz w:val="20"/>
-                <w:szCs w:val="20"/>
-              </w:rPr>
-              <w:t>{{ row.custody_wanted}}</w:t>
-            </w:r>
-          </w:p>
-        </w:tc>
-      </w:tr>
-      <w:tr>
-        <w:tc>
-          <w:tcPr>
-            <w:tcW w:w="1795" w:type="dxa"/>
-          </w:tcPr>
-          <w:p>
-            <w:pPr>
-              <w:rPr>
-                <w:rFonts w:ascii="Arial" w:hAnsi="Arial" w:cs="Arial"/>
-                <w:sz w:val="20"/>
-                <w:szCs w:val="20"/>
-              </w:rPr>
-            </w:pPr>
-            <w:r>
-              <w:rPr>
-                <w:rFonts w:ascii="Arial" w:eastAsia="Calibri" w:hAnsi="Arial" w:cs="Arial"/>
-                <w:sz w:val="20"/>
-                <w:szCs w:val="20"/>
-              </w:rPr>
-              <w:t>{%tr endfor %}</w:t>
-            </w:r>
-          </w:p>
-        </w:tc>
-        <w:tc>
-          <w:tcPr>
-            <w:tcW w:w="900" w:type="dxa"/>
-          </w:tcPr>
-          <w:p>
-            <w:pPr>
-              <w:widowControl w:val="0"/>
-              <w:rPr>
-                <w:rFonts w:ascii="Arial" w:eastAsia="Calibri" w:hAnsi="Arial" w:cs="Arial"/>
-                <w:sz w:val="20"/>
-                <w:szCs w:val="20"/>
-              </w:rPr>
-            </w:pPr>
-          </w:p>
-        </w:tc>
-        <w:tc>
-          <w:tcPr>
-            <w:tcW w:w="1260" w:type="dxa"/>
-          </w:tcPr>
-          <w:p>
-            <w:pPr>
-              <w:widowControl w:val="0"/>
-              <w:rPr>
-                <w:rFonts w:ascii="Arial" w:eastAsia="Calibri" w:hAnsi="Arial" w:cs="Arial"/>
-                <w:sz w:val="20"/>
-                <w:szCs w:val="20"/>
-              </w:rPr>
-            </w:pPr>
-          </w:p>
-        </w:tc>
-        <w:tc>
-          <w:tcPr>
-            <w:tcW w:w="1710" w:type="dxa"/>
-          </w:tcPr>
-          <w:p>
-            <w:pPr>
-              <w:widowControl w:val="0"/>
-              <w:rPr>
-                <w:rFonts w:ascii="Arial" w:eastAsia="Calibri" w:hAnsi="Arial" w:cs="Arial"/>
-                <w:sz w:val="20"/>
-                <w:szCs w:val="20"/>
-              </w:rPr>
-            </w:pPr>
-          </w:p>
-        </w:tc>
-        <w:tc>
-          <w:tcPr>
-            <w:tcW w:w="1710" w:type="dxa"/>
-          </w:tcPr>
-          <w:p>
-            <w:pPr>
-              <w:widowControl w:val="0"/>
-              <w:rPr>
-                <w:rFonts w:ascii="Arial" w:eastAsia="Calibri" w:hAnsi="Arial" w:cs="Arial"/>
-                <w:sz w:val="20"/>
-                <w:szCs w:val="20"/>
-              </w:rPr>
-            </w:pPr>
-          </w:p>
-        </w:tc>
-        <w:tc>
-          <w:tcPr>
-            <w:tcW w:w="1985" w:type="dxa"/>
-          </w:tcPr>
-          <w:p>
-            <w:pPr>
-              <w:widowControl w:val="0"/>
-              <w:rPr>
-                <w:rFonts w:ascii="Arial" w:eastAsia="Calibri" w:hAnsi="Arial" w:cs="Arial"/>
-                <w:sz w:val="20"/>
-                <w:szCs w:val="20"/>
-              </w:rPr>
-            </w:pPr>
-          </w:p>
-        </w:tc>
-      </w:tr>
-    </w:tbl>
-    <w:p>
-      <w:pPr>
-        <w:rPr>
-          <w:rFonts w:ascii="Arial" w:hAnsi="Arial" w:cs="Arial"/>
-          <w:sz w:val="24"/>
-          <w:szCs w:val="24"/>
-        </w:rPr>
-      </w:pPr>
-    </w:p>
-    <w:p>
-      <w:pPr>
-        <w:rPr>
-          <w:rFonts w:ascii="Arial" w:hAnsi="Arial" w:cs="Arial"/>
-          <w:sz w:val="24"/>
-          <w:szCs w:val="24"/>
-        </w:rPr>
-      </w:pPr>
-      <w:r>
-        <w:rPr>
-          <w:rFonts w:ascii="Arial" w:hAnsi="Arial" w:cs="Arial"/>
-          <w:sz w:val="24"/>
-          <w:szCs w:val="24"/>
-        </w:rPr>
-        <w:t xml:space="preserve">{%p </w:t>
-      </w:r>
-      <w:r>
-        <w:rPr>
-          <w:rFonts w:ascii="Arial" w:hAnsi="Arial" w:cs="Arial"/>
-          <w:sz w:val="24"/>
-          <w:szCs w:val="24"/>
-        </w:rPr>
-        <w:t>el</w:t>
-      </w:r>
-      <w:r>
-        <w:rPr>
-          <w:rFonts w:ascii="Arial" w:hAnsi="Arial" w:cs="Arial"/>
-          <w:sz w:val="24"/>
-          <w:szCs w:val="24"/>
-        </w:rPr>
-        <w:t xml:space="preserve">if field.is_object_list() %} </w:t>
-      </w:r>
-    </w:p>
-    <w:p>
-      <w:pPr>
-        <w:pStyle w:val="Heading2"/>
-        <w:rPr>
-          <w:rFonts w:ascii="Arial" w:hAnsi="Arial" w:cs="Arial"/>
-          <w:sz w:val="24"/>
-          <w:szCs w:val="24"/>
-        </w:rPr>
-      </w:pPr>
-      <w:r>
-        <w:rPr>
-          <w:rFonts w:ascii="Arial" w:hAnsi="Arial" w:cs="Arial"/>
-          <w:sz w:val="24"/>
-          <w:szCs w:val="24"/>
-        </w:rPr>
-        <w:t>{{ field.label }}</w:t>
-      </w:r>
-    </w:p>
-    <w:tbl>
-      <w:tblPr>
-        <w:tblStyle w:val="TableGrid"/>
-        <w:tblW w:w="0" w:type="auto"/>
-        <w:tblLook w:val="04A0" w:firstRow="1" w:lastRow="0" w:firstColumn="1" w:lastColumn="0" w:noHBand="0" w:noVBand="1"/>
-      </w:tblPr>
-      <w:tblGrid>
-        <w:gridCol w:w="3116"/>
-        <w:gridCol w:w="3117"/>
-        <w:gridCol w:w="3117"/>
-      </w:tblGrid>
-      <w:tr>
-        <w:tc>
-          <w:tcPr>
-            <w:tcW w:w="3116" w:type="dxa"/>
-          </w:tcPr>
-          <w:p>
-            <w:pPr>
-              <w:rPr>
-                <w:rFonts w:ascii="Arial" w:hAnsi="Arial" w:cs="Arial"/>
-                <w:b/>
-                <w:sz w:val="24"/>
-                <w:szCs w:val="24"/>
-              </w:rPr>
-            </w:pPr>
-            <w:r>
-              <w:rPr>
-                <w:rFonts w:ascii="Arial" w:hAnsi="Arial" w:cs="Arial"/>
-                <w:b/>
-                <w:sz w:val="24"/>
-                <w:szCs w:val="24"/>
-              </w:rPr>
-              <w:t>{%tc for column in field.columns() %}</w:t>
-            </w:r>
-          </w:p>
-        </w:tc>
-        <w:tc>
-          <w:tcPr>
-            <w:tcW w:w="3117" w:type="dxa"/>
-          </w:tcPr>
-          <w:p>
-            <w:pPr>
-              <w:rPr>
-                <w:rFonts w:ascii="Arial" w:hAnsi="Arial" w:cs="Arial"/>
-                <w:b/>
-                <w:sz w:val="24"/>
-                <w:szCs w:val="24"/>
-              </w:rPr>
-            </w:pPr>
-            <w:r>
-              <w:rPr>
-                <w:rFonts w:ascii="Arial" w:hAnsi="Arial" w:cs="Arial"/>
-                <w:b/>
-                <w:sz w:val="24"/>
-                <w:szCs w:val="24"/>
-              </w:rPr>
-              <w:t>{{ label(column).capitalize() }}</w:t>
-            </w:r>
-          </w:p>
-        </w:tc>
-        <w:tc>
-          <w:tcPr>
-            <w:tcW w:w="3117" w:type="dxa"/>
-          </w:tcPr>
-          <w:p>
-            <w:pPr>
-              <w:rPr>
-                <w:rFonts w:ascii="Arial" w:hAnsi="Arial" w:cs="Arial"/>
-                <w:b/>
-                <w:sz w:val="24"/>
-                <w:szCs w:val="24"/>
-              </w:rPr>
-            </w:pPr>
-            <w:r>
-              <w:rPr>
-                <w:rFonts w:ascii="Arial" w:hAnsi="Arial" w:cs="Arial"/>
-                <w:b/>
-                <w:sz w:val="24"/>
-                <w:szCs w:val="24"/>
-              </w:rPr>
-              <w:t>{%tc endfor %}</w:t>
-            </w:r>
-          </w:p>
-        </w:tc>
-      </w:tr>
-      <w:tr>
-        <w:tc>
-          <w:tcPr>
-            <w:tcW w:w="3116" w:type="dxa"/>
-          </w:tcPr>
-          <w:p>
-            <w:pPr>
-              <w:rPr>
-                <w:rFonts w:ascii="Arial" w:hAnsi="Arial" w:cs="Arial"/>
-                <w:sz w:val="24"/>
-                <w:szCs w:val="24"/>
-              </w:rPr>
-            </w:pPr>
-            <w:r>
-              <w:rPr>
-                <w:rFonts w:ascii="Arial" w:hAnsi="Arial" w:cs="Arial"/>
-                <w:sz w:val="24"/>
-                <w:szCs w:val="24"/>
-              </w:rPr>
-              <w:t>{%tr for row in field.overflow_value() %}</w:t>
-            </w:r>
-          </w:p>
-        </w:tc>
-        <w:tc>
-          <w:tcPr>
-            <w:tcW w:w="3117" w:type="dxa"/>
-          </w:tcPr>
-          <w:p>
-            <w:pPr>
-              <w:rPr>
-                <w:rFonts w:ascii="Arial" w:hAnsi="Arial" w:cs="Arial"/>
-                <w:sz w:val="24"/>
-                <w:szCs w:val="24"/>
-              </w:rPr>
-            </w:pPr>
-          </w:p>
-        </w:tc>
-        <w:tc>
-          <w:tcPr>
-            <w:tcW w:w="3117" w:type="dxa"/>
-          </w:tcPr>
-          <w:p>
-            <w:pPr>
-              <w:rPr>
-                <w:rFonts w:ascii="Arial" w:hAnsi="Arial" w:cs="Arial"/>
-                <w:sz w:val="24"/>
-                <w:szCs w:val="24"/>
-              </w:rPr>
-            </w:pPr>
-          </w:p>
-        </w:tc>
-      </w:tr>
-      <w:tr>
-        <w:tc>
-          <w:tcPr>
-            <w:tcW w:w="3116" w:type="dxa"/>
-          </w:tcPr>
-          <w:p>
-            <w:pPr>
-              <w:rPr>
-                <w:rFonts w:ascii="Arial" w:hAnsi="Arial" w:cs="Arial"/>
-                <w:sz w:val="24"/>
-                <w:szCs w:val="24"/>
-              </w:rPr>
-            </w:pPr>
-            <w:r>
-              <w:rPr>
-                <w:rFonts w:ascii="Arial" w:hAnsi="Arial" w:cs="Arial"/>
-                <w:sz w:val="24"/>
-                <w:szCs w:val="24"/>
-              </w:rPr>
-              <w:t>{%tc for column in field.columns() %}</w:t>
-            </w:r>
-          </w:p>
-        </w:tc>
-        <w:tc>
-          <w:tcPr>
-            <w:tcW w:w="3117" w:type="dxa"/>
-          </w:tcPr>
-          <w:p>
-            <w:pPr>
-              <w:rPr>
-                <w:rFonts w:ascii="Arial" w:hAnsi="Arial" w:cs="Arial"/>
-                <w:sz w:val="24"/>
-                <w:szCs w:val="24"/>
-              </w:rPr>
-            </w:pPr>
-            <w:r>
-              <w:rPr>
-                <w:rFonts w:ascii="Arial" w:hAnsi="Arial" w:cs="Arial"/>
-                <w:sz w:val="24"/>
-                <w:szCs w:val="24"/>
-              </w:rPr>
-              <w:t>{{ safeattr(row, key(column)) }}</w:t>
-            </w:r>
-          </w:p>
-        </w:tc>
-        <w:tc>
-          <w:tcPr>
-            <w:tcW w:w="3117" w:type="dxa"/>
-          </w:tcPr>
-          <w:p>
-            <w:pPr>
-              <w:rPr>
-                <w:rFonts w:ascii="Arial" w:hAnsi="Arial" w:cs="Arial"/>
-                <w:sz w:val="24"/>
-                <w:szCs w:val="24"/>
-              </w:rPr>
-            </w:pPr>
-            <w:r>
-              <w:rPr>
-                <w:rFonts w:ascii="Arial" w:hAnsi="Arial" w:cs="Arial"/>
-                <w:sz w:val="24"/>
-                <w:szCs w:val="24"/>
-              </w:rPr>
-              <w:t>{%tc endfor %}</w:t>
-            </w:r>
-          </w:p>
-        </w:tc>
-      </w:tr>
-      <w:tr>
-        <w:tc>
-          <w:tcPr>
-            <w:tcW w:w="3116" w:type="dxa"/>
-          </w:tcPr>
-          <w:p>
-            <w:pPr>
-              <w:rPr>
-                <w:rFonts w:ascii="Arial" w:hAnsi="Arial" w:cs="Arial"/>
-                <w:sz w:val="24"/>
-                <w:szCs w:val="24"/>
-              </w:rPr>
-            </w:pPr>
-            <w:r>
-              <w:rPr>
-                <w:rFonts w:ascii="Arial" w:hAnsi="Arial" w:cs="Arial"/>
-                <w:sz w:val="24"/>
-                <w:szCs w:val="24"/>
-              </w:rPr>
-              <w:t>{%tr endfor %}</w:t>
-            </w:r>
-          </w:p>
-        </w:tc>
-        <w:tc>
-          <w:tcPr>
-            <w:tcW w:w="3117" w:type="dxa"/>
-          </w:tcPr>
-          <w:p>
-            <w:pPr>
-              <w:rPr>
-                <w:rFonts w:ascii="Arial" w:hAnsi="Arial" w:cs="Arial"/>
-                <w:sz w:val="24"/>
-                <w:szCs w:val="24"/>
-              </w:rPr>
-            </w:pPr>
-          </w:p>
-        </w:tc>
-        <w:tc>
-          <w:tcPr>
-            <w:tcW w:w="3117" w:type="dxa"/>
-          </w:tcPr>
-          <w:p>
-            <w:pPr>
-              <w:rPr>
-                <w:rFonts w:ascii="Arial" w:hAnsi="Arial" w:cs="Arial"/>
-                <w:sz w:val="24"/>
-                <w:szCs w:val="24"/>
-              </w:rPr>
-            </w:pPr>
-          </w:p>
-        </w:tc>
-      </w:tr>
-    </w:tbl>
-    <w:p>
-      <w:pPr>
-        <w:rPr>
-          <w:rFonts w:ascii="Arial" w:hAnsi="Arial" w:cs="Arial"/>
-          <w:sz w:val="24"/>
-          <w:szCs w:val="24"/>
-        </w:rPr>
-      </w:pPr>
-    </w:p>
-    <w:p>
-      <w:pPr>
-        <w:rPr>
-          <w:rFonts w:ascii="Arial" w:hAnsi="Arial" w:cs="Arial"/>
-          <w:sz w:val="24"/>
-          <w:szCs w:val="24"/>
-        </w:rPr>
-      </w:pPr>
-      <w:r>
-        <w:rPr>
-          <w:rFonts w:ascii="Arial" w:hAnsi="Arial" w:cs="Arial"/>
-          <w:sz w:val="24"/>
-          <w:szCs w:val="24"/>
-        </w:rPr>
-        <w:t>{%p elif field.is_list() %}</w:t>
-      </w:r>
-    </w:p>
-    <w:p>
-      <w:pPr>
-        <w:rPr>
-          <w:rFonts w:ascii="Arial" w:hAnsi="Arial" w:cs="Arial"/>
-          <w:sz w:val="24"/>
-          <w:szCs w:val="24"/>
-        </w:rPr>
-      </w:pPr>
-    </w:p>
-    <w:p>
-      <w:pPr>
-        <w:pStyle w:val="Heading2"/>
-        <w:rPr>
-          <w:rFonts w:ascii="Arial" w:hAnsi="Arial" w:cs="Arial"/>
-          <w:sz w:val="24"/>
-          <w:szCs w:val="24"/>
-        </w:rPr>
-      </w:pPr>
-      <w:r>
-        <w:rPr>
-          <w:rFonts w:ascii="Arial" w:hAnsi="Arial" w:cs="Arial"/>
-          <w:sz w:val="24"/>
-          <w:szCs w:val="24"/>
-        </w:rPr>
-        <w:lastRenderedPageBreak/>
-        <w:t>{{ field.label }}</w:t>
-      </w:r>
-    </w:p>
-    <w:p>
-      <w:pPr>
-        <w:pStyle w:val="ListParagraph"/>
-        <w:numPr>
-          <w:ilvl w:val="0"/>
-          <w:numId w:val="3"/>
-        </w:numPr>
-        <w:rPr>
-          <w:rFonts w:ascii="Arial" w:hAnsi="Arial" w:cs="Arial"/>
-          <w:sz w:val="24"/>
-          <w:szCs w:val="24"/>
-        </w:rPr>
-      </w:pPr>
-      <w:r>
-        <w:rPr>
-          <w:rFonts w:ascii="Arial" w:hAnsi="Arial" w:cs="Arial"/>
-          <w:sz w:val="24"/>
-          <w:szCs w:val="24"/>
-        </w:rPr>
-        <w:t>{%p for item in field.overflow_value() %}</w:t>
-      </w:r>
-    </w:p>
-    <w:p>
-      <w:pPr>
-        <w:pStyle w:val="ListParagraph"/>
-        <w:numPr>
-          <w:ilvl w:val="0"/>
-          <w:numId w:val="3"/>
-        </w:numPr>
-        <w:rPr>
-          <w:rFonts w:ascii="Arial" w:hAnsi="Arial" w:cs="Arial"/>
-          <w:sz w:val="24"/>
-          <w:szCs w:val="24"/>
-        </w:rPr>
-      </w:pPr>
-      <w:r>
-        <w:rPr>
-          <w:rFonts w:ascii="Arial" w:hAnsi="Arial" w:cs="Arial"/>
-          <w:sz w:val="24"/>
-          <w:szCs w:val="24"/>
-        </w:rPr>
-        <w:t>{{ item }}</w:t>
-      </w:r>
-    </w:p>
-    <w:p>
-      <w:pPr>
-        <w:pStyle w:val="ListParagraph"/>
-        <w:numPr>
-          <w:ilvl w:val="0"/>
-          <w:numId w:val="3"/>
-        </w:numPr>
-        <w:rPr>
-          <w:rFonts w:ascii="Arial" w:hAnsi="Arial" w:cs="Arial"/>
-          <w:sz w:val="24"/>
-          <w:szCs w:val="24"/>
-        </w:rPr>
-      </w:pPr>
-      <w:r>
-        <w:rPr>
-          <w:rFonts w:ascii="Arial" w:hAnsi="Arial" w:cs="Arial"/>
-          <w:sz w:val="24"/>
-          <w:szCs w:val="24"/>
-        </w:rPr>
-        <w:t>{%p endfor %}</w:t>
-      </w:r>
-    </w:p>
-    <w:p>
-      <w:pPr>
-        <w:rPr>
-          <w:rFonts w:ascii="Arial" w:hAnsi="Arial" w:cs="Arial"/>
-          <w:sz w:val="24"/>
-          <w:szCs w:val="24"/>
-        </w:rPr>
-      </w:pPr>
-    </w:p>
-    <w:p>
-      <w:pPr>
-        <w:rPr>
-          <w:rFonts w:ascii="Arial" w:hAnsi="Arial" w:cs="Arial"/>
-          <w:sz w:val="24"/>
-          <w:szCs w:val="24"/>
-        </w:rPr>
-      </w:pPr>
-      <w:r>
-        <w:rPr>
-          <w:rFonts w:ascii="Arial" w:hAnsi="Arial" w:cs="Arial"/>
-          <w:sz w:val="24"/>
-          <w:szCs w:val="24"/>
-        </w:rPr>
-        <w:t>{%p else %}</w:t>
-      </w:r>
-    </w:p>
-    <w:p>
-      <w:pPr>
-        <w:rPr>
-          <w:rFonts w:ascii="Arial" w:hAnsi="Arial" w:cs="Arial"/>
-          <w:sz w:val="24"/>
-          <w:szCs w:val="24"/>
-        </w:rPr>
-      </w:pPr>
-      <w:r>
-        <w:rPr>
-          <w:rFonts w:ascii="Arial" w:hAnsi="Arial" w:cs="Arial"/>
-          <w:b/>
-          <w:sz w:val="24"/>
-          <w:szCs w:val="24"/>
-        </w:rPr>
-        <w:t>{{ field.label }}</w:t>
-      </w:r>
-      <w:r>
-        <w:rPr>
-          <w:rFonts w:ascii="Arial" w:hAnsi="Arial" w:cs="Arial"/>
-          <w:sz w:val="24"/>
-          <w:szCs w:val="24"/>
-        </w:rPr>
-        <w:t>: {{ field.overflow_value(overflow_message= RFAaffidavit.default_overflow_message) }}</w:t>
-      </w:r>
-    </w:p>
-    <w:p>
-      <w:pPr>
-        <w:rPr>
-          <w:rFonts w:ascii="Arial" w:hAnsi="Arial" w:cs="Arial"/>
-          <w:sz w:val="24"/>
-          <w:szCs w:val="24"/>
-        </w:rPr>
-      </w:pPr>
-      <w:r>
-        <w:rPr>
-          <w:rFonts w:ascii="Arial" w:hAnsi="Arial" w:cs="Arial"/>
-          <w:sz w:val="24"/>
-          <w:szCs w:val="24"/>
-        </w:rPr>
-        <w:t>{%p endif %}</w:t>
-      </w:r>
-    </w:p>
-    <w:p>
-      <w:pPr>
-        <w:rPr>
-          <w:rFonts w:ascii="Arial" w:hAnsi="Arial" w:cs="Arial"/>
-          <w:sz w:val="24"/>
-          <w:szCs w:val="24"/>
-        </w:rPr>
-      </w:pPr>
-      <w:r>
-        <w:rPr>
-          <w:rFonts w:ascii="Arial" w:hAnsi="Arial" w:cs="Arial"/>
-          <w:sz w:val="24"/>
-          <w:szCs w:val="24"/>
-        </w:rPr>
-        <w:t>{%p endfor %}</w:t>
       </w:r>
     </w:p>
     <w:p>

</xml_diff>

<commit_message>
fixed so now showing my addenda correctly
</commit_message>
<xml_diff>
--- a/docassemble/RFApackage/data/templates/RFAaffidavit_addendum.docx
+++ b/docassemble/RFApackage/data/templates/RFAaffidavit_addendum.docx
@@ -1927,7 +1927,23 @@
                 <w:sz w:val="20"/>
                 <w:szCs w:val="20"/>
               </w:rPr>
-              <w:t>{{ row.relationship_user1}}</w:t>
+              <w:t>{{ row.relationship_user</w:t>
+            </w:r>
+            <w:r>
+              <w:rPr>
+                <w:rFonts w:ascii="Arial" w:hAnsi="Arial" w:cs="Arial"/>
+                <w:sz w:val="20"/>
+                <w:szCs w:val="20"/>
+              </w:rPr>
+              <w:t>s</w:t>
+            </w:r>
+            <w:r>
+              <w:rPr>
+                <w:rFonts w:ascii="Arial" w:hAnsi="Arial" w:cs="Arial"/>
+                <w:sz w:val="20"/>
+                <w:szCs w:val="20"/>
+              </w:rPr>
+              <w:t>1}}</w:t>
             </w:r>
           </w:p>
         </w:tc>

</xml_diff>

<commit_message>
more polish for the addenda
</commit_message>
<xml_diff>
--- a/docassemble/RFApackage/data/templates/RFAaffidavit_addendum.docx
+++ b/docassemble/RFApackage/data/templates/RFAaffidavit_addendum.docx
@@ -78,7 +78,25 @@
           <w:sz w:val="28"/>
           <w:szCs w:val="28"/>
         </w:rPr>
-        <w:t>Family Division, {{ trial_court.address.county }} Unit</w:t>
+        <w:t xml:space="preserve">Family Division, {{ </w:t>
+      </w:r>
+      <w:proofErr w:type="spellStart"/>
+      <w:r>
+        <w:rPr>
+          <w:rFonts w:ascii="Arial" w:hAnsi="Arial" w:cs="Arial"/>
+          <w:sz w:val="28"/>
+          <w:szCs w:val="28"/>
+        </w:rPr>
+        <w:t>trial_court.address.county</w:t>
+      </w:r>
+      <w:proofErr w:type="spellEnd"/>
+      <w:r>
+        <w:rPr>
+          <w:rFonts w:ascii="Arial" w:hAnsi="Arial" w:cs="Arial"/>
+          <w:sz w:val="28"/>
+          <w:szCs w:val="28"/>
+        </w:rPr>
+        <w:t xml:space="preserve"> }} Unit</w:t>
       </w:r>
     </w:p>
     <w:p>
@@ -97,13 +115,41 @@
         </w:rPr>
         <w:t xml:space="preserve">{%p if </w:t>
       </w:r>
-      <w:r>
-        <w:rPr>
-          <w:rFonts w:ascii="Arial" w:hAnsi="Arial" w:cs="Arial"/>
-          <w:sz w:val="24"/>
-          <w:szCs w:val="24"/>
-        </w:rPr>
-        <w:t>who_needs_protection == 'order_obo_child'</w:t>
+      <w:proofErr w:type="spellStart"/>
+      <w:r>
+        <w:rPr>
+          <w:rFonts w:ascii="Arial" w:hAnsi="Arial" w:cs="Arial"/>
+          <w:sz w:val="24"/>
+          <w:szCs w:val="24"/>
+        </w:rPr>
+        <w:t>who_needs_protection</w:t>
+      </w:r>
+      <w:proofErr w:type="spellEnd"/>
+      <w:r>
+        <w:rPr>
+          <w:rFonts w:ascii="Arial" w:hAnsi="Arial" w:cs="Arial"/>
+          <w:sz w:val="24"/>
+          <w:szCs w:val="24"/>
+        </w:rPr>
+        <w:t xml:space="preserve"> == '</w:t>
+      </w:r>
+      <w:proofErr w:type="spellStart"/>
+      <w:r>
+        <w:rPr>
+          <w:rFonts w:ascii="Arial" w:hAnsi="Arial" w:cs="Arial"/>
+          <w:sz w:val="24"/>
+          <w:szCs w:val="24"/>
+        </w:rPr>
+        <w:t>order_obo_child</w:t>
+      </w:r>
+      <w:proofErr w:type="spellEnd"/>
+      <w:r>
+        <w:rPr>
+          <w:rFonts w:ascii="Arial" w:hAnsi="Arial" w:cs="Arial"/>
+          <w:sz w:val="24"/>
+          <w:szCs w:val="24"/>
+        </w:rPr>
+        <w:t>'</w:t>
       </w:r>
       <w:r>
         <w:rPr>
@@ -155,8 +201,36 @@
           <w:sz w:val="28"/>
           <w:szCs w:val="28"/>
         </w:rPr>
-        <w:t>[0] }} v. {{ other_parties[0] }}</w:t>
-      </w:r>
+        <w:t xml:space="preserve">[0] }} v. {{ </w:t>
+      </w:r>
+      <w:proofErr w:type="spellStart"/>
+      <w:r>
+        <w:rPr>
+          <w:rFonts w:ascii="Arial" w:hAnsi="Arial" w:cs="Arial"/>
+          <w:sz w:val="28"/>
+          <w:szCs w:val="28"/>
+        </w:rPr>
+        <w:t>other_parties</w:t>
+      </w:r>
+      <w:proofErr w:type="spellEnd"/>
+      <w:r>
+        <w:rPr>
+          <w:rFonts w:ascii="Arial" w:hAnsi="Arial" w:cs="Arial"/>
+          <w:sz w:val="28"/>
+          <w:szCs w:val="28"/>
+        </w:rPr>
+        <w:t>[0</w:t>
+      </w:r>
+      <w:proofErr w:type="gramStart"/>
+      <w:r>
+        <w:rPr>
+          <w:rFonts w:ascii="Arial" w:hAnsi="Arial" w:cs="Arial"/>
+          <w:sz w:val="28"/>
+          <w:szCs w:val="28"/>
+        </w:rPr>
+        <w:t>] }}</w:t>
+      </w:r>
+      <w:proofErr w:type="gramEnd"/>
     </w:p>
     <w:p>
       <w:pPr>
@@ -200,7 +274,25 @@
           <w:sz w:val="28"/>
           <w:szCs w:val="28"/>
         </w:rPr>
-        <w:t>{{ users[0] }} v. {{ other_parties[0] }}</w:t>
+        <w:t xml:space="preserve">{{ users[0] }} v. {{ </w:t>
+      </w:r>
+      <w:proofErr w:type="spellStart"/>
+      <w:r>
+        <w:rPr>
+          <w:rFonts w:ascii="Arial" w:hAnsi="Arial" w:cs="Arial"/>
+          <w:sz w:val="28"/>
+          <w:szCs w:val="28"/>
+        </w:rPr>
+        <w:t>other_parties</w:t>
+      </w:r>
+      <w:proofErr w:type="spellEnd"/>
+      <w:r>
+        <w:rPr>
+          <w:rFonts w:ascii="Arial" w:hAnsi="Arial" w:cs="Arial"/>
+          <w:sz w:val="28"/>
+          <w:szCs w:val="28"/>
+        </w:rPr>
+        <w:t>[0] }}</w:t>
       </w:r>
     </w:p>
     <w:p>
@@ -234,8 +326,52 @@
           <w:sz w:val="24"/>
           <w:szCs w:val="24"/>
         </w:rPr>
+        <w:t xml:space="preserve">{%p if </w:t>
+      </w:r>
+      <w:proofErr w:type="spellStart"/>
+      <w:r>
+        <w:rPr>
+          <w:rFonts w:ascii="Arial" w:hAnsi="Arial" w:cs="Arial"/>
+          <w:sz w:val="24"/>
+          <w:szCs w:val="24"/>
+        </w:rPr>
+        <w:t>RFA</w:t>
+      </w:r>
+      <w:r>
+        <w:rPr>
+          <w:rFonts w:ascii="Arial" w:hAnsi="Arial" w:cs="Arial"/>
+          <w:sz w:val="24"/>
+          <w:szCs w:val="24"/>
+        </w:rPr>
+        <w:t>affidavit.enabled</w:t>
+      </w:r>
+      <w:proofErr w:type="spellEnd"/>
+      <w:r>
+        <w:rPr>
+          <w:rFonts w:ascii="Arial" w:hAnsi="Arial" w:cs="Arial"/>
+          <w:sz w:val="24"/>
+          <w:szCs w:val="24"/>
+        </w:rPr>
+        <w:t xml:space="preserve"> %}</w:t>
+      </w:r>
+    </w:p>
+    <w:p>
+      <w:pPr>
+        <w:rPr>
+          <w:rFonts w:ascii="Arial" w:hAnsi="Arial" w:cs="Arial"/>
+          <w:sz w:val="24"/>
+          <w:szCs w:val="24"/>
+        </w:rPr>
+      </w:pPr>
+      <w:r>
+        <w:rPr>
+          <w:rFonts w:ascii="Arial" w:hAnsi="Arial" w:cs="Arial"/>
+          <w:sz w:val="24"/>
+          <w:szCs w:val="24"/>
+        </w:rPr>
         <w:t xml:space="preserve">{%p for field in </w:t>
       </w:r>
+      <w:proofErr w:type="spellStart"/>
       <w:r>
         <w:rPr>
           <w:rFonts w:ascii="Arial" w:hAnsi="Arial" w:cs="Arial"/>
@@ -250,7 +386,16 @@
           <w:sz w:val="24"/>
           <w:szCs w:val="24"/>
         </w:rPr>
-        <w:t>.overflow()</w:t>
+        <w:t>.overflow</w:t>
+      </w:r>
+      <w:proofErr w:type="spellEnd"/>
+      <w:r>
+        <w:rPr>
+          <w:rFonts w:ascii="Arial" w:hAnsi="Arial" w:cs="Arial"/>
+          <w:sz w:val="24"/>
+          <w:szCs w:val="24"/>
+        </w:rPr>
+        <w:t>()</w:t>
       </w:r>
       <w:r>
         <w:rPr>
@@ -283,7 +428,41 @@
           <w:sz w:val="24"/>
           <w:szCs w:val="24"/>
         </w:rPr>
-        <w:t>{%p if field.field_name == "children" %}</w:t>
+        <w:t>{%p</w:t>
+      </w:r>
+      <w:r>
+        <w:rPr>
+          <w:rFonts w:ascii="Arial" w:hAnsi="Arial" w:cs="Arial"/>
+          <w:sz w:val="24"/>
+          <w:szCs w:val="24"/>
+        </w:rPr>
+        <w:t xml:space="preserve"> </w:t>
+      </w:r>
+      <w:r>
+        <w:rPr>
+          <w:rFonts w:ascii="Arial" w:hAnsi="Arial" w:cs="Arial"/>
+          <w:sz w:val="24"/>
+          <w:szCs w:val="24"/>
+        </w:rPr>
+        <w:t xml:space="preserve">if </w:t>
+      </w:r>
+      <w:proofErr w:type="spellStart"/>
+      <w:r>
+        <w:rPr>
+          <w:rFonts w:ascii="Arial" w:hAnsi="Arial" w:cs="Arial"/>
+          <w:sz w:val="24"/>
+          <w:szCs w:val="24"/>
+        </w:rPr>
+        <w:t>field.is_object_list</w:t>
+      </w:r>
+      <w:proofErr w:type="spellEnd"/>
+      <w:r>
+        <w:rPr>
+          <w:rFonts w:ascii="Arial" w:hAnsi="Arial" w:cs="Arial"/>
+          <w:sz w:val="24"/>
+          <w:szCs w:val="24"/>
+        </w:rPr>
+        <w:t xml:space="preserve">() %} </w:t>
       </w:r>
     </w:p>
     <w:p>
@@ -301,604 +480,16 @@
           <w:sz w:val="24"/>
           <w:szCs w:val="24"/>
         </w:rPr>
-        <w:t>Additional children</w:t>
-      </w:r>
-    </w:p>
-    <w:tbl>
-      <w:tblPr>
-        <w:tblStyle w:val="TableGrid"/>
-        <w:tblW w:w="9360" w:type="dxa"/>
-        <w:tblLayout w:type="fixed"/>
-        <w:tblLook w:val="04A0" w:firstRow="1" w:lastRow="0" w:firstColumn="1" w:lastColumn="0" w:noHBand="0" w:noVBand="1"/>
-      </w:tblPr>
-      <w:tblGrid>
-        <w:gridCol w:w="1795"/>
-        <w:gridCol w:w="900"/>
-        <w:gridCol w:w="1260"/>
-        <w:gridCol w:w="1710"/>
-        <w:gridCol w:w="1710"/>
-        <w:gridCol w:w="1985"/>
-      </w:tblGrid>
-      <w:tr>
-        <w:tc>
-          <w:tcPr>
-            <w:tcW w:w="1795" w:type="dxa"/>
-          </w:tcPr>
-          <w:p>
-            <w:pPr>
-              <w:widowControl w:val="0"/>
-              <w:rPr>
-                <w:rFonts w:ascii="Arial" w:hAnsi="Arial" w:cs="Arial"/>
-                <w:b/>
-                <w:sz w:val="20"/>
-                <w:szCs w:val="20"/>
-              </w:rPr>
-            </w:pPr>
-            <w:r>
-              <w:rPr>
-                <w:rFonts w:ascii="Arial" w:eastAsia="Calibri" w:hAnsi="Arial" w:cs="Arial"/>
-                <w:b/>
-                <w:sz w:val="20"/>
-                <w:szCs w:val="20"/>
-              </w:rPr>
-              <w:t>Name</w:t>
-            </w:r>
-          </w:p>
-        </w:tc>
-        <w:tc>
-          <w:tcPr>
-            <w:tcW w:w="900" w:type="dxa"/>
-          </w:tcPr>
-          <w:p>
-            <w:pPr>
-              <w:widowControl w:val="0"/>
-              <w:rPr>
-                <w:rFonts w:ascii="Arial" w:eastAsia="Calibri" w:hAnsi="Arial" w:cs="Arial"/>
-                <w:b/>
-                <w:sz w:val="20"/>
-                <w:szCs w:val="20"/>
-              </w:rPr>
-            </w:pPr>
-            <w:r>
-              <w:rPr>
-                <w:rFonts w:ascii="Arial" w:eastAsia="Calibri" w:hAnsi="Arial" w:cs="Arial"/>
-                <w:b/>
-                <w:sz w:val="20"/>
-                <w:szCs w:val="20"/>
-              </w:rPr>
-              <w:t>Born</w:t>
-            </w:r>
-          </w:p>
-        </w:tc>
-        <w:tc>
-          <w:tcPr>
-            <w:tcW w:w="1260" w:type="dxa"/>
-          </w:tcPr>
-          <w:p>
-            <w:pPr>
-              <w:widowControl w:val="0"/>
-              <w:rPr>
-                <w:rFonts w:ascii="Arial" w:eastAsia="Calibri" w:hAnsi="Arial" w:cs="Arial"/>
-                <w:b/>
-                <w:sz w:val="20"/>
-                <w:szCs w:val="20"/>
-              </w:rPr>
-            </w:pPr>
-            <w:r>
-              <w:rPr>
-                <w:rFonts w:ascii="Arial" w:eastAsia="Calibri" w:hAnsi="Arial" w:cs="Arial"/>
-                <w:b/>
-                <w:sz w:val="20"/>
-                <w:szCs w:val="20"/>
-              </w:rPr>
-              <w:t>In danger?</w:t>
-            </w:r>
-          </w:p>
-        </w:tc>
-        <w:tc>
-          <w:tcPr>
-            <w:tcW w:w="1710" w:type="dxa"/>
-          </w:tcPr>
-          <w:p>
-            <w:pPr>
-              <w:widowControl w:val="0"/>
-              <w:rPr>
-                <w:rFonts w:ascii="Arial" w:eastAsia="Calibri" w:hAnsi="Arial" w:cs="Arial"/>
-                <w:b/>
-                <w:sz w:val="20"/>
-                <w:szCs w:val="20"/>
-              </w:rPr>
-            </w:pPr>
-            <w:r>
-              <w:rPr>
-                <w:rFonts w:ascii="Arial" w:eastAsia="Calibri" w:hAnsi="Arial" w:cs="Arial"/>
-                <w:b/>
-                <w:sz w:val="20"/>
-                <w:szCs w:val="20"/>
-              </w:rPr>
-              <w:t>Relationship to petitioner</w:t>
-            </w:r>
-          </w:p>
-        </w:tc>
-        <w:tc>
-          <w:tcPr>
-            <w:tcW w:w="1710" w:type="dxa"/>
-          </w:tcPr>
-          <w:p>
-            <w:pPr>
-              <w:widowControl w:val="0"/>
-              <w:rPr>
-                <w:rFonts w:ascii="Arial" w:eastAsia="Calibri" w:hAnsi="Arial" w:cs="Arial"/>
-                <w:b/>
-                <w:sz w:val="20"/>
-                <w:szCs w:val="20"/>
-              </w:rPr>
-            </w:pPr>
-            <w:r>
-              <w:rPr>
-                <w:rFonts w:ascii="Arial" w:eastAsia="Calibri" w:hAnsi="Arial" w:cs="Arial"/>
-                <w:b/>
-                <w:sz w:val="20"/>
-                <w:szCs w:val="20"/>
-              </w:rPr>
-              <w:t>Relationship to defendant</w:t>
-            </w:r>
-          </w:p>
-        </w:tc>
-        <w:tc>
-          <w:tcPr>
-            <w:tcW w:w="1985" w:type="dxa"/>
-          </w:tcPr>
-          <w:p>
-            <w:pPr>
-              <w:widowControl w:val="0"/>
-              <w:rPr>
-                <w:rFonts w:ascii="Arial" w:eastAsia="Calibri" w:hAnsi="Arial" w:cs="Arial"/>
-                <w:b/>
-                <w:sz w:val="20"/>
-                <w:szCs w:val="20"/>
-              </w:rPr>
-            </w:pPr>
-            <w:r>
-              <w:rPr>
-                <w:rFonts w:ascii="Arial" w:eastAsia="Calibri" w:hAnsi="Arial" w:cs="Arial"/>
-                <w:b/>
-                <w:sz w:val="20"/>
-                <w:szCs w:val="20"/>
-              </w:rPr>
-              <w:t>Plaintiff/petitioner wants custody?</w:t>
-            </w:r>
-          </w:p>
-        </w:tc>
-      </w:tr>
-      <w:tr>
-        <w:tc>
-          <w:tcPr>
-            <w:tcW w:w="1795" w:type="dxa"/>
-          </w:tcPr>
-          <w:p>
-            <w:pPr>
-              <w:rPr>
-                <w:rFonts w:ascii="Arial" w:hAnsi="Arial" w:cs="Arial"/>
-                <w:sz w:val="20"/>
-                <w:szCs w:val="20"/>
-              </w:rPr>
-            </w:pPr>
-            <w:r>
-              <w:rPr>
-                <w:rFonts w:ascii="Arial" w:eastAsia="Calibri" w:hAnsi="Arial" w:cs="Arial"/>
-                <w:sz w:val="20"/>
-                <w:szCs w:val="20"/>
-              </w:rPr>
-              <w:t>{%tr for row in field.overflow_value() %}</w:t>
-            </w:r>
-          </w:p>
-        </w:tc>
-        <w:tc>
-          <w:tcPr>
-            <w:tcW w:w="900" w:type="dxa"/>
-          </w:tcPr>
-          <w:p>
-            <w:pPr>
-              <w:widowControl w:val="0"/>
-              <w:rPr>
-                <w:rFonts w:ascii="Arial" w:eastAsia="Calibri" w:hAnsi="Arial" w:cs="Arial"/>
-                <w:sz w:val="20"/>
-                <w:szCs w:val="20"/>
-              </w:rPr>
-            </w:pPr>
-          </w:p>
-        </w:tc>
-        <w:tc>
-          <w:tcPr>
-            <w:tcW w:w="1260" w:type="dxa"/>
-          </w:tcPr>
-          <w:p>
-            <w:pPr>
-              <w:widowControl w:val="0"/>
-              <w:rPr>
-                <w:rFonts w:ascii="Arial" w:eastAsia="Calibri" w:hAnsi="Arial" w:cs="Arial"/>
-                <w:sz w:val="20"/>
-                <w:szCs w:val="20"/>
-              </w:rPr>
-            </w:pPr>
-          </w:p>
-        </w:tc>
-        <w:tc>
-          <w:tcPr>
-            <w:tcW w:w="1710" w:type="dxa"/>
-          </w:tcPr>
-          <w:p>
-            <w:pPr>
-              <w:widowControl w:val="0"/>
-              <w:rPr>
-                <w:rFonts w:ascii="Arial" w:eastAsia="Calibri" w:hAnsi="Arial" w:cs="Arial"/>
-                <w:sz w:val="20"/>
-                <w:szCs w:val="20"/>
-              </w:rPr>
-            </w:pPr>
-          </w:p>
-        </w:tc>
-        <w:tc>
-          <w:tcPr>
-            <w:tcW w:w="1710" w:type="dxa"/>
-          </w:tcPr>
-          <w:p>
-            <w:pPr>
-              <w:widowControl w:val="0"/>
-              <w:rPr>
-                <w:rFonts w:ascii="Arial" w:eastAsia="Calibri" w:hAnsi="Arial" w:cs="Arial"/>
-                <w:sz w:val="20"/>
-                <w:szCs w:val="20"/>
-              </w:rPr>
-            </w:pPr>
-          </w:p>
-        </w:tc>
-        <w:tc>
-          <w:tcPr>
-            <w:tcW w:w="1985" w:type="dxa"/>
-          </w:tcPr>
-          <w:p>
-            <w:pPr>
-              <w:widowControl w:val="0"/>
-              <w:rPr>
-                <w:rFonts w:ascii="Arial" w:eastAsia="Calibri" w:hAnsi="Arial" w:cs="Arial"/>
-                <w:sz w:val="20"/>
-                <w:szCs w:val="20"/>
-              </w:rPr>
-            </w:pPr>
-          </w:p>
-        </w:tc>
-      </w:tr>
-      <w:tr>
-        <w:tc>
-          <w:tcPr>
-            <w:tcW w:w="1795" w:type="dxa"/>
-          </w:tcPr>
-          <w:p>
-            <w:pPr>
-              <w:rPr>
-                <w:rFonts w:ascii="Arial" w:hAnsi="Arial" w:cs="Arial"/>
-                <w:sz w:val="24"/>
-                <w:szCs w:val="24"/>
-              </w:rPr>
-            </w:pPr>
-            <w:r>
-              <w:rPr>
-                <w:rFonts w:ascii="Arial" w:eastAsia="Calibri" w:hAnsi="Arial" w:cs="Arial"/>
-                <w:sz w:val="24"/>
-                <w:szCs w:val="24"/>
-              </w:rPr>
-              <w:t>{{ row.name }}</w:t>
-            </w:r>
-          </w:p>
-        </w:tc>
-        <w:tc>
-          <w:tcPr>
-            <w:tcW w:w="900" w:type="dxa"/>
-          </w:tcPr>
-          <w:p>
-            <w:pPr>
-              <w:widowControl w:val="0"/>
-              <w:rPr>
-                <w:rFonts w:ascii="Arial" w:hAnsi="Arial" w:cs="Arial"/>
-                <w:sz w:val="20"/>
-                <w:szCs w:val="20"/>
-              </w:rPr>
-            </w:pPr>
-            <w:r>
-              <w:rPr>
-                <w:rFonts w:ascii="Arial" w:eastAsia="Calibri" w:hAnsi="Arial" w:cs="Arial"/>
-                <w:sz w:val="20"/>
-                <w:szCs w:val="20"/>
-              </w:rPr>
-              <w:t>{{ row.birthdate }}</w:t>
-            </w:r>
-          </w:p>
-        </w:tc>
-        <w:tc>
-          <w:tcPr>
-            <w:tcW w:w="1260" w:type="dxa"/>
-          </w:tcPr>
-          <w:p>
-            <w:pPr>
-              <w:widowControl w:val="0"/>
-              <w:rPr>
-                <w:rFonts w:ascii="Arial" w:hAnsi="Arial" w:cs="Arial"/>
-                <w:sz w:val="20"/>
-                <w:szCs w:val="20"/>
-              </w:rPr>
-            </w:pPr>
-            <w:r>
-              <w:rPr>
-                <w:rFonts w:ascii="Arial" w:eastAsia="Calibri" w:hAnsi="Arial" w:cs="Arial"/>
-                <w:sz w:val="20"/>
-                <w:szCs w:val="20"/>
-              </w:rPr>
-              <w:t>{{ row.in_danger }}</w:t>
-            </w:r>
-          </w:p>
-        </w:tc>
-        <w:tc>
-          <w:tcPr>
-            <w:tcW w:w="1710" w:type="dxa"/>
-          </w:tcPr>
-          <w:p>
-            <w:pPr>
-              <w:widowControl w:val="0"/>
-              <w:rPr>
-                <w:rFonts w:ascii="Arial" w:hAnsi="Arial" w:cs="Arial"/>
-                <w:sz w:val="20"/>
-                <w:szCs w:val="20"/>
-              </w:rPr>
-            </w:pPr>
-            <w:r>
-              <w:rPr>
-                <w:rFonts w:ascii="Arial" w:hAnsi="Arial" w:cs="Arial"/>
-                <w:sz w:val="20"/>
-                <w:szCs w:val="20"/>
-              </w:rPr>
-              <w:t>{{ row.relationship_user</w:t>
-            </w:r>
-            <w:r>
-              <w:rPr>
-                <w:rFonts w:ascii="Arial" w:hAnsi="Arial" w:cs="Arial"/>
-                <w:sz w:val="20"/>
-                <w:szCs w:val="20"/>
-              </w:rPr>
-              <w:t>s</w:t>
-            </w:r>
-            <w:r>
-              <w:rPr>
-                <w:rFonts w:ascii="Arial" w:hAnsi="Arial" w:cs="Arial"/>
-                <w:sz w:val="20"/>
-                <w:szCs w:val="20"/>
-              </w:rPr>
-              <w:t>1}}</w:t>
-            </w:r>
-          </w:p>
-        </w:tc>
-        <w:tc>
-          <w:tcPr>
-            <w:tcW w:w="1710" w:type="dxa"/>
-          </w:tcPr>
-          <w:p>
-            <w:pPr>
-              <w:widowControl w:val="0"/>
-              <w:rPr>
-                <w:rFonts w:ascii="Arial" w:eastAsia="Calibri" w:hAnsi="Arial" w:cs="Arial"/>
-                <w:sz w:val="20"/>
-                <w:szCs w:val="20"/>
-              </w:rPr>
-            </w:pPr>
-            <w:r>
-              <w:rPr>
-                <w:rFonts w:ascii="Arial" w:hAnsi="Arial" w:cs="Arial"/>
-                <w:sz w:val="20"/>
-                <w:szCs w:val="20"/>
-              </w:rPr>
-              <w:t>{{ row.relationship_</w:t>
-            </w:r>
-            <w:r>
-              <w:rPr>
-                <w:rFonts w:ascii="Arial" w:hAnsi="Arial" w:cs="Arial"/>
-                <w:sz w:val="20"/>
-                <w:szCs w:val="20"/>
-              </w:rPr>
-              <w:t>OP</w:t>
-            </w:r>
-            <w:r>
-              <w:rPr>
-                <w:rFonts w:ascii="Arial" w:hAnsi="Arial" w:cs="Arial"/>
-                <w:sz w:val="20"/>
-                <w:szCs w:val="20"/>
-              </w:rPr>
-              <w:t>}}</w:t>
-            </w:r>
-          </w:p>
-        </w:tc>
-        <w:tc>
-          <w:tcPr>
-            <w:tcW w:w="1985" w:type="dxa"/>
-          </w:tcPr>
-          <w:p>
-            <w:pPr>
-              <w:widowControl w:val="0"/>
-              <w:rPr>
-                <w:rFonts w:ascii="Arial" w:hAnsi="Arial" w:cs="Arial"/>
-                <w:sz w:val="20"/>
-                <w:szCs w:val="20"/>
-              </w:rPr>
-            </w:pPr>
-            <w:r>
-              <w:rPr>
-                <w:rFonts w:ascii="Arial" w:hAnsi="Arial" w:cs="Arial"/>
-                <w:sz w:val="20"/>
-                <w:szCs w:val="20"/>
-              </w:rPr>
-              <w:t>{{ row.custody_wanted}}</w:t>
-            </w:r>
-          </w:p>
-        </w:tc>
-      </w:tr>
-      <w:tr>
-        <w:tc>
-          <w:tcPr>
-            <w:tcW w:w="1795" w:type="dxa"/>
-          </w:tcPr>
-          <w:p>
-            <w:pPr>
-              <w:rPr>
-                <w:rFonts w:ascii="Arial" w:hAnsi="Arial" w:cs="Arial"/>
-                <w:sz w:val="20"/>
-                <w:szCs w:val="20"/>
-              </w:rPr>
-            </w:pPr>
-            <w:r>
-              <w:rPr>
-                <w:rFonts w:ascii="Arial" w:eastAsia="Calibri" w:hAnsi="Arial" w:cs="Arial"/>
-                <w:sz w:val="20"/>
-                <w:szCs w:val="20"/>
-              </w:rPr>
-              <w:t>{%tr endfor %}</w:t>
-            </w:r>
-          </w:p>
-        </w:tc>
-        <w:tc>
-          <w:tcPr>
-            <w:tcW w:w="900" w:type="dxa"/>
-          </w:tcPr>
-          <w:p>
-            <w:pPr>
-              <w:widowControl w:val="0"/>
-              <w:rPr>
-                <w:rFonts w:ascii="Arial" w:eastAsia="Calibri" w:hAnsi="Arial" w:cs="Arial"/>
-                <w:sz w:val="20"/>
-                <w:szCs w:val="20"/>
-              </w:rPr>
-            </w:pPr>
-          </w:p>
-        </w:tc>
-        <w:tc>
-          <w:tcPr>
-            <w:tcW w:w="1260" w:type="dxa"/>
-          </w:tcPr>
-          <w:p>
-            <w:pPr>
-              <w:widowControl w:val="0"/>
-              <w:rPr>
-                <w:rFonts w:ascii="Arial" w:eastAsia="Calibri" w:hAnsi="Arial" w:cs="Arial"/>
-                <w:sz w:val="20"/>
-                <w:szCs w:val="20"/>
-              </w:rPr>
-            </w:pPr>
-          </w:p>
-        </w:tc>
-        <w:tc>
-          <w:tcPr>
-            <w:tcW w:w="1710" w:type="dxa"/>
-          </w:tcPr>
-          <w:p>
-            <w:pPr>
-              <w:widowControl w:val="0"/>
-              <w:rPr>
-                <w:rFonts w:ascii="Arial" w:eastAsia="Calibri" w:hAnsi="Arial" w:cs="Arial"/>
-                <w:sz w:val="20"/>
-                <w:szCs w:val="20"/>
-              </w:rPr>
-            </w:pPr>
-          </w:p>
-        </w:tc>
-        <w:tc>
-          <w:tcPr>
-            <w:tcW w:w="1710" w:type="dxa"/>
-          </w:tcPr>
-          <w:p>
-            <w:pPr>
-              <w:widowControl w:val="0"/>
-              <w:rPr>
-                <w:rFonts w:ascii="Arial" w:eastAsia="Calibri" w:hAnsi="Arial" w:cs="Arial"/>
-                <w:sz w:val="20"/>
-                <w:szCs w:val="20"/>
-              </w:rPr>
-            </w:pPr>
-          </w:p>
-        </w:tc>
-        <w:tc>
-          <w:tcPr>
-            <w:tcW w:w="1985" w:type="dxa"/>
-          </w:tcPr>
-          <w:p>
-            <w:pPr>
-              <w:widowControl w:val="0"/>
-              <w:rPr>
-                <w:rFonts w:ascii="Arial" w:eastAsia="Calibri" w:hAnsi="Arial" w:cs="Arial"/>
-                <w:sz w:val="20"/>
-                <w:szCs w:val="20"/>
-              </w:rPr>
-            </w:pPr>
-          </w:p>
-        </w:tc>
-      </w:tr>
-    </w:tbl>
-    <w:p>
-      <w:pPr>
-        <w:rPr>
-          <w:rFonts w:ascii="Arial" w:hAnsi="Arial" w:cs="Arial"/>
-          <w:sz w:val="24"/>
-          <w:szCs w:val="24"/>
-        </w:rPr>
-      </w:pPr>
-    </w:p>
-    <w:p>
-      <w:pPr>
-        <w:rPr>
-          <w:rFonts w:ascii="Arial" w:hAnsi="Arial" w:cs="Arial"/>
-          <w:sz w:val="24"/>
-          <w:szCs w:val="24"/>
-        </w:rPr>
-      </w:pPr>
-      <w:r>
-        <w:rPr>
-          <w:rFonts w:ascii="Arial" w:hAnsi="Arial" w:cs="Arial"/>
-          <w:sz w:val="24"/>
-          <w:szCs w:val="24"/>
-        </w:rPr>
-        <w:t xml:space="preserve">{%p </w:t>
-      </w:r>
-      <w:r>
-        <w:rPr>
-          <w:rFonts w:ascii="Arial" w:hAnsi="Arial" w:cs="Arial"/>
-          <w:sz w:val="24"/>
-          <w:szCs w:val="24"/>
-        </w:rPr>
-        <w:t>el</w:t>
-      </w:r>
-      <w:r>
-        <w:rPr>
-          <w:rFonts w:ascii="Arial" w:hAnsi="Arial" w:cs="Arial"/>
-          <w:sz w:val="24"/>
-          <w:szCs w:val="24"/>
-        </w:rPr>
-        <w:t xml:space="preserve">if field.is_object_list() %} </w:t>
-      </w:r>
-    </w:p>
-    <w:p>
-      <w:pPr>
-        <w:pStyle w:val="Heading2"/>
-        <w:rPr>
-          <w:rFonts w:ascii="Arial" w:hAnsi="Arial" w:cs="Arial"/>
-          <w:sz w:val="24"/>
-          <w:szCs w:val="24"/>
-        </w:rPr>
-      </w:pPr>
-      <w:r>
-        <w:rPr>
-          <w:rFonts w:ascii="Arial" w:hAnsi="Arial" w:cs="Arial"/>
-          <w:sz w:val="24"/>
-          <w:szCs w:val="24"/>
-        </w:rPr>
-        <w:t>{{ field.</w:t>
+        <w:t xml:space="preserve">{{ </w:t>
+      </w:r>
+      <w:proofErr w:type="spellStart"/>
+      <w:r>
+        <w:rPr>
+          <w:rFonts w:ascii="Arial" w:hAnsi="Arial" w:cs="Arial"/>
+          <w:sz w:val="24"/>
+          <w:szCs w:val="24"/>
+        </w:rPr>
+        <w:t>field.</w:t>
       </w:r>
       <w:r>
         <w:rPr>
@@ -908,6 +499,7 @@
         </w:rPr>
         <w:t>label</w:t>
       </w:r>
+      <w:proofErr w:type="spellEnd"/>
       <w:r>
         <w:rPr>
           <w:rFonts w:ascii="Arial" w:hAnsi="Arial" w:cs="Arial"/>
@@ -949,7 +541,47 @@
                 <w:sz w:val="24"/>
                 <w:szCs w:val="24"/>
               </w:rPr>
-              <w:t>{%tc for column in field.columns() %}</w:t>
+              <w:t>{%</w:t>
+            </w:r>
+            <w:proofErr w:type="spellStart"/>
+            <w:r>
+              <w:rPr>
+                <w:rFonts w:ascii="Arial" w:hAnsi="Arial" w:cs="Arial"/>
+                <w:b/>
+                <w:sz w:val="24"/>
+                <w:szCs w:val="24"/>
+              </w:rPr>
+              <w:t>tc</w:t>
+            </w:r>
+            <w:proofErr w:type="spellEnd"/>
+            <w:r>
+              <w:rPr>
+                <w:rFonts w:ascii="Arial" w:hAnsi="Arial" w:cs="Arial"/>
+                <w:b/>
+                <w:sz w:val="24"/>
+                <w:szCs w:val="24"/>
+              </w:rPr>
+              <w:t xml:space="preserve"> for column in </w:t>
+            </w:r>
+            <w:proofErr w:type="spellStart"/>
+            <w:r>
+              <w:rPr>
+                <w:rFonts w:ascii="Arial" w:hAnsi="Arial" w:cs="Arial"/>
+                <w:b/>
+                <w:sz w:val="24"/>
+                <w:szCs w:val="24"/>
+              </w:rPr>
+              <w:t>field.columns</w:t>
+            </w:r>
+            <w:proofErr w:type="spellEnd"/>
+            <w:r>
+              <w:rPr>
+                <w:rFonts w:ascii="Arial" w:hAnsi="Arial" w:cs="Arial"/>
+                <w:b/>
+                <w:sz w:val="24"/>
+                <w:szCs w:val="24"/>
+              </w:rPr>
+              <w:t>() %}</w:t>
             </w:r>
           </w:p>
         </w:tc>
@@ -1015,7 +647,47 @@
                 <w:sz w:val="24"/>
                 <w:szCs w:val="24"/>
               </w:rPr>
-              <w:t>{%tc endfor %}</w:t>
+              <w:t>{%</w:t>
+            </w:r>
+            <w:proofErr w:type="spellStart"/>
+            <w:r>
+              <w:rPr>
+                <w:rFonts w:ascii="Arial" w:hAnsi="Arial" w:cs="Arial"/>
+                <w:b/>
+                <w:sz w:val="24"/>
+                <w:szCs w:val="24"/>
+              </w:rPr>
+              <w:t>tc</w:t>
+            </w:r>
+            <w:proofErr w:type="spellEnd"/>
+            <w:r>
+              <w:rPr>
+                <w:rFonts w:ascii="Arial" w:hAnsi="Arial" w:cs="Arial"/>
+                <w:b/>
+                <w:sz w:val="24"/>
+                <w:szCs w:val="24"/>
+              </w:rPr>
+              <w:t xml:space="preserve"> </w:t>
+            </w:r>
+            <w:proofErr w:type="spellStart"/>
+            <w:r>
+              <w:rPr>
+                <w:rFonts w:ascii="Arial" w:hAnsi="Arial" w:cs="Arial"/>
+                <w:b/>
+                <w:sz w:val="24"/>
+                <w:szCs w:val="24"/>
+              </w:rPr>
+              <w:t>endfor</w:t>
+            </w:r>
+            <w:proofErr w:type="spellEnd"/>
+            <w:r>
+              <w:rPr>
+                <w:rFonts w:ascii="Arial" w:hAnsi="Arial" w:cs="Arial"/>
+                <w:b/>
+                <w:sz w:val="24"/>
+                <w:szCs w:val="24"/>
+              </w:rPr>
+              <w:t xml:space="preserve"> %}</w:t>
             </w:r>
           </w:p>
         </w:tc>
@@ -1039,7 +711,25 @@
                 <w:sz w:val="24"/>
                 <w:szCs w:val="24"/>
               </w:rPr>
-              <w:t>{%tr for row in field.overflow_value() %}</w:t>
+              <w:t xml:space="preserve">{%tr for row in </w:t>
+            </w:r>
+            <w:proofErr w:type="spellStart"/>
+            <w:r>
+              <w:rPr>
+                <w:rFonts w:ascii="Arial" w:hAnsi="Arial" w:cs="Arial"/>
+                <w:sz w:val="24"/>
+                <w:szCs w:val="24"/>
+              </w:rPr>
+              <w:t>field.overflow_value</w:t>
+            </w:r>
+            <w:proofErr w:type="spellEnd"/>
+            <w:r>
+              <w:rPr>
+                <w:rFonts w:ascii="Arial" w:hAnsi="Arial" w:cs="Arial"/>
+                <w:sz w:val="24"/>
+                <w:szCs w:val="24"/>
+              </w:rPr>
+              <w:t>() %}</w:t>
             </w:r>
           </w:p>
         </w:tc>
@@ -1091,7 +781,43 @@
                 <w:sz w:val="24"/>
                 <w:szCs w:val="24"/>
               </w:rPr>
-              <w:t>{%tc for column in field.columns() %}</w:t>
+              <w:t>{%</w:t>
+            </w:r>
+            <w:proofErr w:type="spellStart"/>
+            <w:r>
+              <w:rPr>
+                <w:rFonts w:ascii="Arial" w:hAnsi="Arial" w:cs="Arial"/>
+                <w:sz w:val="24"/>
+                <w:szCs w:val="24"/>
+              </w:rPr>
+              <w:t>tc</w:t>
+            </w:r>
+            <w:proofErr w:type="spellEnd"/>
+            <w:r>
+              <w:rPr>
+                <w:rFonts w:ascii="Arial" w:hAnsi="Arial" w:cs="Arial"/>
+                <w:sz w:val="24"/>
+                <w:szCs w:val="24"/>
+              </w:rPr>
+              <w:t xml:space="preserve"> for column in </w:t>
+            </w:r>
+            <w:proofErr w:type="spellStart"/>
+            <w:r>
+              <w:rPr>
+                <w:rFonts w:ascii="Arial" w:hAnsi="Arial" w:cs="Arial"/>
+                <w:sz w:val="24"/>
+                <w:szCs w:val="24"/>
+              </w:rPr>
+              <w:t>field.columns</w:t>
+            </w:r>
+            <w:proofErr w:type="spellEnd"/>
+            <w:r>
+              <w:rPr>
+                <w:rFonts w:ascii="Arial" w:hAnsi="Arial" w:cs="Arial"/>
+                <w:sz w:val="24"/>
+                <w:szCs w:val="24"/>
+              </w:rPr>
+              <w:t>() %}</w:t>
             </w:r>
           </w:p>
         </w:tc>
@@ -1113,7 +839,25 @@
                 <w:sz w:val="24"/>
                 <w:szCs w:val="24"/>
               </w:rPr>
-              <w:t>{{ safeattr(row, key(column)) }}</w:t>
+              <w:t xml:space="preserve">{{ </w:t>
+            </w:r>
+            <w:proofErr w:type="spellStart"/>
+            <w:r>
+              <w:rPr>
+                <w:rFonts w:ascii="Arial" w:hAnsi="Arial" w:cs="Arial"/>
+                <w:sz w:val="24"/>
+                <w:szCs w:val="24"/>
+              </w:rPr>
+              <w:t>safeattr</w:t>
+            </w:r>
+            <w:proofErr w:type="spellEnd"/>
+            <w:r>
+              <w:rPr>
+                <w:rFonts w:ascii="Arial" w:hAnsi="Arial" w:cs="Arial"/>
+                <w:sz w:val="24"/>
+                <w:szCs w:val="24"/>
+              </w:rPr>
+              <w:t>(row, key(column)) }}</w:t>
             </w:r>
           </w:p>
         </w:tc>
@@ -1135,7 +879,43 @@
                 <w:sz w:val="24"/>
                 <w:szCs w:val="24"/>
               </w:rPr>
-              <w:t>{%tc endfor %}</w:t>
+              <w:t>{%</w:t>
+            </w:r>
+            <w:proofErr w:type="spellStart"/>
+            <w:r>
+              <w:rPr>
+                <w:rFonts w:ascii="Arial" w:hAnsi="Arial" w:cs="Arial"/>
+                <w:sz w:val="24"/>
+                <w:szCs w:val="24"/>
+              </w:rPr>
+              <w:t>tc</w:t>
+            </w:r>
+            <w:proofErr w:type="spellEnd"/>
+            <w:r>
+              <w:rPr>
+                <w:rFonts w:ascii="Arial" w:hAnsi="Arial" w:cs="Arial"/>
+                <w:sz w:val="24"/>
+                <w:szCs w:val="24"/>
+              </w:rPr>
+              <w:t xml:space="preserve"> </w:t>
+            </w:r>
+            <w:proofErr w:type="spellStart"/>
+            <w:r>
+              <w:rPr>
+                <w:rFonts w:ascii="Arial" w:hAnsi="Arial" w:cs="Arial"/>
+                <w:sz w:val="24"/>
+                <w:szCs w:val="24"/>
+              </w:rPr>
+              <w:t>endfor</w:t>
+            </w:r>
+            <w:proofErr w:type="spellEnd"/>
+            <w:r>
+              <w:rPr>
+                <w:rFonts w:ascii="Arial" w:hAnsi="Arial" w:cs="Arial"/>
+                <w:sz w:val="24"/>
+                <w:szCs w:val="24"/>
+              </w:rPr>
+              <w:t xml:space="preserve"> %}</w:t>
             </w:r>
           </w:p>
         </w:tc>
@@ -1159,7 +939,25 @@
                 <w:sz w:val="24"/>
                 <w:szCs w:val="24"/>
               </w:rPr>
-              <w:t>{%tr endfor %}</w:t>
+              <w:t xml:space="preserve">{%tr </w:t>
+            </w:r>
+            <w:proofErr w:type="spellStart"/>
+            <w:r>
+              <w:rPr>
+                <w:rFonts w:ascii="Arial" w:hAnsi="Arial" w:cs="Arial"/>
+                <w:sz w:val="24"/>
+                <w:szCs w:val="24"/>
+              </w:rPr>
+              <w:t>endfor</w:t>
+            </w:r>
+            <w:proofErr w:type="spellEnd"/>
+            <w:r>
+              <w:rPr>
+                <w:rFonts w:ascii="Arial" w:hAnsi="Arial" w:cs="Arial"/>
+                <w:sz w:val="24"/>
+                <w:szCs w:val="24"/>
+              </w:rPr>
+              <w:t xml:space="preserve"> %}</w:t>
             </w:r>
           </w:p>
         </w:tc>
@@ -1216,7 +1014,43 @@
           <w:sz w:val="24"/>
           <w:szCs w:val="24"/>
         </w:rPr>
-        <w:t>{%p elif field.is_list() %}</w:t>
+        <w:t xml:space="preserve">{%p </w:t>
+      </w:r>
+      <w:proofErr w:type="spellStart"/>
+      <w:r>
+        <w:rPr>
+          <w:rFonts w:ascii="Arial" w:hAnsi="Arial" w:cs="Arial"/>
+          <w:sz w:val="24"/>
+          <w:szCs w:val="24"/>
+        </w:rPr>
+        <w:t>elif</w:t>
+      </w:r>
+      <w:proofErr w:type="spellEnd"/>
+      <w:r>
+        <w:rPr>
+          <w:rFonts w:ascii="Arial" w:hAnsi="Arial" w:cs="Arial"/>
+          <w:sz w:val="24"/>
+          <w:szCs w:val="24"/>
+        </w:rPr>
+        <w:t xml:space="preserve"> </w:t>
+      </w:r>
+      <w:proofErr w:type="spellStart"/>
+      <w:r>
+        <w:rPr>
+          <w:rFonts w:ascii="Arial" w:hAnsi="Arial" w:cs="Arial"/>
+          <w:sz w:val="24"/>
+          <w:szCs w:val="24"/>
+        </w:rPr>
+        <w:t>field.is_list</w:t>
+      </w:r>
+      <w:proofErr w:type="spellEnd"/>
+      <w:r>
+        <w:rPr>
+          <w:rFonts w:ascii="Arial" w:hAnsi="Arial" w:cs="Arial"/>
+          <w:sz w:val="24"/>
+          <w:szCs w:val="24"/>
+        </w:rPr>
+        <w:t>() %}</w:t>
       </w:r>
     </w:p>
     <w:p>
@@ -1243,8 +1077,16 @@
           <w:sz w:val="24"/>
           <w:szCs w:val="24"/>
         </w:rPr>
-        <w:lastRenderedPageBreak/>
-        <w:t>{{ field.</w:t>
+        <w:t xml:space="preserve">{{ </w:t>
+      </w:r>
+      <w:proofErr w:type="spellStart"/>
+      <w:r>
+        <w:rPr>
+          <w:rFonts w:ascii="Arial" w:hAnsi="Arial" w:cs="Arial"/>
+          <w:sz w:val="24"/>
+          <w:szCs w:val="24"/>
+        </w:rPr>
+        <w:t>field.</w:t>
       </w:r>
       <w:r>
         <w:rPr>
@@ -1254,6 +1096,7 @@
         </w:rPr>
         <w:t>label</w:t>
       </w:r>
+      <w:proofErr w:type="spellEnd"/>
       <w:r>
         <w:rPr>
           <w:rFonts w:ascii="Arial" w:hAnsi="Arial" w:cs="Arial"/>
@@ -1282,7 +1125,25 @@
           <w:sz w:val="24"/>
           <w:szCs w:val="24"/>
         </w:rPr>
-        <w:t>{%p for item in field.overflow_value() %}</w:t>
+        <w:t xml:space="preserve">{%p for item in </w:t>
+      </w:r>
+      <w:proofErr w:type="spellStart"/>
+      <w:r>
+        <w:rPr>
+          <w:rFonts w:ascii="Arial" w:hAnsi="Arial" w:cs="Arial"/>
+          <w:sz w:val="24"/>
+          <w:szCs w:val="24"/>
+        </w:rPr>
+        <w:t>field.overflow_value</w:t>
+      </w:r>
+      <w:proofErr w:type="spellEnd"/>
+      <w:r>
+        <w:rPr>
+          <w:rFonts w:ascii="Arial" w:hAnsi="Arial" w:cs="Arial"/>
+          <w:sz w:val="24"/>
+          <w:szCs w:val="24"/>
+        </w:rPr>
+        <w:t>() %}</w:t>
       </w:r>
     </w:p>
     <w:p>
@@ -1326,8 +1187,18 @@
           <w:sz w:val="24"/>
           <w:szCs w:val="24"/>
         </w:rPr>
-        <w:t>{%p endfor</w:t>
-      </w:r>
+        <w:t xml:space="preserve">{%p </w:t>
+      </w:r>
+      <w:proofErr w:type="spellStart"/>
+      <w:r>
+        <w:rPr>
+          <w:rFonts w:ascii="Arial" w:hAnsi="Arial" w:cs="Arial"/>
+          <w:sz w:val="24"/>
+          <w:szCs w:val="24"/>
+        </w:rPr>
+        <w:t>endfor</w:t>
+      </w:r>
+      <w:proofErr w:type="spellEnd"/>
       <w:r>
         <w:rPr>
           <w:rFonts w:ascii="Arial" w:hAnsi="Arial" w:cs="Arial"/>
@@ -1394,8 +1265,9 @@
           <w:sz w:val="24"/>
           <w:szCs w:val="24"/>
         </w:rPr>
-        <w:t>{{ field.</w:t>
-      </w:r>
+        <w:t xml:space="preserve">{{ </w:t>
+      </w:r>
+      <w:proofErr w:type="spellStart"/>
       <w:r>
         <w:rPr>
           <w:rFonts w:ascii="Arial" w:hAnsi="Arial" w:cs="Arial"/>
@@ -1403,8 +1275,18 @@
           <w:sz w:val="24"/>
           <w:szCs w:val="24"/>
         </w:rPr>
+        <w:t>field.</w:t>
+      </w:r>
+      <w:r>
+        <w:rPr>
+          <w:rFonts w:ascii="Arial" w:hAnsi="Arial" w:cs="Arial"/>
+          <w:b/>
+          <w:sz w:val="24"/>
+          <w:szCs w:val="24"/>
+        </w:rPr>
         <w:t>label</w:t>
       </w:r>
+      <w:proofErr w:type="spellEnd"/>
       <w:r>
         <w:rPr>
           <w:rFonts w:ascii="Arial" w:hAnsi="Arial" w:cs="Arial"/>
@@ -1420,23 +1302,60 @@
           <w:sz w:val="24"/>
           <w:szCs w:val="24"/>
         </w:rPr>
-        <w:t>: {{ field.overflow_value(</w:t>
-      </w:r>
-      <w:r>
-        <w:rPr>
-          <w:rFonts w:ascii="Arial" w:hAnsi="Arial" w:cs="Arial"/>
-          <w:sz w:val="24"/>
-          <w:szCs w:val="24"/>
-        </w:rPr>
-        <w:t>overflow_message=</w:t>
-      </w:r>
-      <w:r>
-        <w:rPr>
-          <w:rFonts w:ascii="Arial" w:hAnsi="Arial" w:cs="Arial"/>
-          <w:sz w:val="24"/>
-          <w:szCs w:val="24"/>
-        </w:rPr>
-        <w:t xml:space="preserve"> RFAaffidavit</w:t>
+        <w:t xml:space="preserve">: {{ </w:t>
+      </w:r>
+      <w:proofErr w:type="spellStart"/>
+      <w:r>
+        <w:rPr>
+          <w:rFonts w:ascii="Arial" w:hAnsi="Arial" w:cs="Arial"/>
+          <w:sz w:val="24"/>
+          <w:szCs w:val="24"/>
+        </w:rPr>
+        <w:t>field.overflow_value</w:t>
+      </w:r>
+      <w:proofErr w:type="spellEnd"/>
+      <w:r>
+        <w:rPr>
+          <w:rFonts w:ascii="Arial" w:hAnsi="Arial" w:cs="Arial"/>
+          <w:sz w:val="24"/>
+          <w:szCs w:val="24"/>
+        </w:rPr>
+        <w:t>(</w:t>
+      </w:r>
+      <w:proofErr w:type="spellStart"/>
+      <w:r>
+        <w:rPr>
+          <w:rFonts w:ascii="Arial" w:hAnsi="Arial" w:cs="Arial"/>
+          <w:sz w:val="24"/>
+          <w:szCs w:val="24"/>
+        </w:rPr>
+        <w:t>overflow_message</w:t>
+      </w:r>
+      <w:proofErr w:type="spellEnd"/>
+      <w:r>
+        <w:rPr>
+          <w:rFonts w:ascii="Arial" w:hAnsi="Arial" w:cs="Arial"/>
+          <w:sz w:val="24"/>
+          <w:szCs w:val="24"/>
+        </w:rPr>
+        <w:t>=</w:t>
+      </w:r>
+      <w:r>
+        <w:rPr>
+          <w:rFonts w:ascii="Arial" w:hAnsi="Arial" w:cs="Arial"/>
+          <w:sz w:val="24"/>
+          <w:szCs w:val="24"/>
+        </w:rPr>
+        <w:t xml:space="preserve"> </w:t>
+      </w:r>
+      <w:proofErr w:type="spellStart"/>
+      <w:r>
+        <w:rPr>
+          <w:rFonts w:ascii="Arial" w:hAnsi="Arial" w:cs="Arial"/>
+          <w:sz w:val="24"/>
+          <w:szCs w:val="24"/>
+        </w:rPr>
+        <w:t>RFAaffidavit</w:t>
       </w:r>
       <w:r>
         <w:rPr>
@@ -1446,6 +1365,7 @@
         </w:rPr>
         <w:t>.default_overflow_message</w:t>
       </w:r>
+      <w:proofErr w:type="spellEnd"/>
       <w:r>
         <w:rPr>
           <w:rFonts w:ascii="Arial" w:hAnsi="Arial" w:cs="Arial"/>
@@ -1486,7 +1406,86 @@
           <w:sz w:val="24"/>
           <w:szCs w:val="24"/>
         </w:rPr>
-        <w:t>{%p endfor %}</w:t>
+        <w:lastRenderedPageBreak/>
+        <w:t xml:space="preserve">{%p </w:t>
+      </w:r>
+      <w:proofErr w:type="spellStart"/>
+      <w:r>
+        <w:rPr>
+          <w:rFonts w:ascii="Arial" w:hAnsi="Arial" w:cs="Arial"/>
+          <w:sz w:val="24"/>
+          <w:szCs w:val="24"/>
+        </w:rPr>
+        <w:t>endfor</w:t>
+      </w:r>
+      <w:proofErr w:type="spellEnd"/>
+      <w:r>
+        <w:rPr>
+          <w:rFonts w:ascii="Arial" w:hAnsi="Arial" w:cs="Arial"/>
+          <w:sz w:val="24"/>
+          <w:szCs w:val="24"/>
+        </w:rPr>
+        <w:t xml:space="preserve"> %}</w:t>
+      </w:r>
+    </w:p>
+    <w:p>
+      <w:pPr>
+        <w:rPr>
+          <w:rFonts w:ascii="Arial" w:hAnsi="Arial" w:cs="Arial"/>
+          <w:sz w:val="24"/>
+          <w:szCs w:val="24"/>
+        </w:rPr>
+      </w:pPr>
+      <w:r>
+        <w:rPr>
+          <w:rFonts w:ascii="Arial" w:hAnsi="Arial" w:cs="Arial"/>
+          <w:sz w:val="24"/>
+          <w:szCs w:val="24"/>
+        </w:rPr>
+        <w:t>{%p endif %}</w:t>
+      </w:r>
+    </w:p>
+    <w:p>
+      <w:pPr>
+        <w:rPr>
+          <w:rFonts w:ascii="Arial" w:hAnsi="Arial" w:cs="Arial"/>
+          <w:sz w:val="24"/>
+          <w:szCs w:val="24"/>
+        </w:rPr>
+      </w:pPr>
+      <w:r>
+        <w:rPr>
+          <w:rFonts w:ascii="Arial" w:hAnsi="Arial" w:cs="Arial"/>
+          <w:sz w:val="24"/>
+          <w:szCs w:val="24"/>
+        </w:rPr>
+        <w:t xml:space="preserve">{%p if </w:t>
+      </w:r>
+      <w:proofErr w:type="spellStart"/>
+      <w:r>
+        <w:rPr>
+          <w:rFonts w:ascii="Arial" w:hAnsi="Arial" w:cs="Arial"/>
+          <w:sz w:val="24"/>
+          <w:szCs w:val="24"/>
+        </w:rPr>
+        <w:t>RFAaffidavitonbehalfofminor</w:t>
+      </w:r>
+      <w:r>
+        <w:rPr>
+          <w:rFonts w:ascii="Arial" w:hAnsi="Arial" w:cs="Arial"/>
+          <w:sz w:val="24"/>
+          <w:szCs w:val="24"/>
+        </w:rPr>
+        <w:t>.enabled</w:t>
+      </w:r>
+      <w:proofErr w:type="spellEnd"/>
+      <w:r>
+        <w:rPr>
+          <w:rFonts w:ascii="Arial" w:hAnsi="Arial" w:cs="Arial"/>
+          <w:sz w:val="24"/>
+          <w:szCs w:val="24"/>
+        </w:rPr>
+        <w:t xml:space="preserve"> %}</w:t>
       </w:r>
     </w:p>
     <w:p>
@@ -1505,6 +1504,7 @@
         </w:rPr>
         <w:t xml:space="preserve">{%p for field in </w:t>
       </w:r>
+      <w:proofErr w:type="spellStart"/>
       <w:r>
         <w:rPr>
           <w:rFonts w:ascii="Arial" w:hAnsi="Arial" w:cs="Arial"/>
@@ -1519,7 +1519,16 @@
           <w:sz w:val="24"/>
           <w:szCs w:val="24"/>
         </w:rPr>
-        <w:t>.overflow()</w:t>
+        <w:t>.overflow</w:t>
+      </w:r>
+      <w:proofErr w:type="spellEnd"/>
+      <w:r>
+        <w:rPr>
+          <w:rFonts w:ascii="Arial" w:hAnsi="Arial" w:cs="Arial"/>
+          <w:sz w:val="24"/>
+          <w:szCs w:val="24"/>
+        </w:rPr>
+        <w:t>()</w:t>
       </w:r>
       <w:r>
         <w:rPr>
@@ -1552,7 +1561,25 @@
           <w:sz w:val="24"/>
           <w:szCs w:val="24"/>
         </w:rPr>
-        <w:t>{%p if field.field_name == "children" %}</w:t>
+        <w:t xml:space="preserve">{%p if </w:t>
+      </w:r>
+      <w:proofErr w:type="spellStart"/>
+      <w:r>
+        <w:rPr>
+          <w:rFonts w:ascii="Arial" w:hAnsi="Arial" w:cs="Arial"/>
+          <w:sz w:val="24"/>
+          <w:szCs w:val="24"/>
+        </w:rPr>
+        <w:t>field.is_object_list</w:t>
+      </w:r>
+      <w:proofErr w:type="spellEnd"/>
+      <w:r>
+        <w:rPr>
+          <w:rFonts w:ascii="Arial" w:hAnsi="Arial" w:cs="Arial"/>
+          <w:sz w:val="24"/>
+          <w:szCs w:val="24"/>
+        </w:rPr>
+        <w:t xml:space="preserve">() %} </w:t>
       </w:r>
     </w:p>
     <w:p>
@@ -1570,588 +1597,25 @@
           <w:sz w:val="24"/>
           <w:szCs w:val="24"/>
         </w:rPr>
-        <w:t>Additional children</w:t>
-      </w:r>
-    </w:p>
-    <w:tbl>
-      <w:tblPr>
-        <w:tblStyle w:val="TableGrid"/>
-        <w:tblW w:w="9360" w:type="dxa"/>
-        <w:tblLayout w:type="fixed"/>
-        <w:tblLook w:val="04A0" w:firstRow="1" w:lastRow="0" w:firstColumn="1" w:lastColumn="0" w:noHBand="0" w:noVBand="1"/>
-      </w:tblPr>
-      <w:tblGrid>
-        <w:gridCol w:w="1795"/>
-        <w:gridCol w:w="900"/>
-        <w:gridCol w:w="1260"/>
-        <w:gridCol w:w="1710"/>
-        <w:gridCol w:w="1710"/>
-        <w:gridCol w:w="1985"/>
-      </w:tblGrid>
-      <w:tr>
-        <w:tc>
-          <w:tcPr>
-            <w:tcW w:w="1795" w:type="dxa"/>
-          </w:tcPr>
-          <w:p>
-            <w:pPr>
-              <w:widowControl w:val="0"/>
-              <w:rPr>
-                <w:rFonts w:ascii="Arial" w:hAnsi="Arial" w:cs="Arial"/>
-                <w:b/>
-                <w:sz w:val="20"/>
-                <w:szCs w:val="20"/>
-              </w:rPr>
-            </w:pPr>
-            <w:r>
-              <w:rPr>
-                <w:rFonts w:ascii="Arial" w:eastAsia="Calibri" w:hAnsi="Arial" w:cs="Arial"/>
-                <w:b/>
-                <w:sz w:val="20"/>
-                <w:szCs w:val="20"/>
-              </w:rPr>
-              <w:t>Name</w:t>
-            </w:r>
-          </w:p>
-        </w:tc>
-        <w:tc>
-          <w:tcPr>
-            <w:tcW w:w="900" w:type="dxa"/>
-          </w:tcPr>
-          <w:p>
-            <w:pPr>
-              <w:widowControl w:val="0"/>
-              <w:rPr>
-                <w:rFonts w:ascii="Arial" w:eastAsia="Calibri" w:hAnsi="Arial" w:cs="Arial"/>
-                <w:b/>
-                <w:sz w:val="20"/>
-                <w:szCs w:val="20"/>
-              </w:rPr>
-            </w:pPr>
-            <w:r>
-              <w:rPr>
-                <w:rFonts w:ascii="Arial" w:eastAsia="Calibri" w:hAnsi="Arial" w:cs="Arial"/>
-                <w:b/>
-                <w:sz w:val="20"/>
-                <w:szCs w:val="20"/>
-              </w:rPr>
-              <w:t>Born</w:t>
-            </w:r>
-          </w:p>
-        </w:tc>
-        <w:tc>
-          <w:tcPr>
-            <w:tcW w:w="1260" w:type="dxa"/>
-          </w:tcPr>
-          <w:p>
-            <w:pPr>
-              <w:widowControl w:val="0"/>
-              <w:rPr>
-                <w:rFonts w:ascii="Arial" w:eastAsia="Calibri" w:hAnsi="Arial" w:cs="Arial"/>
-                <w:b/>
-                <w:sz w:val="20"/>
-                <w:szCs w:val="20"/>
-              </w:rPr>
-            </w:pPr>
-            <w:r>
-              <w:rPr>
-                <w:rFonts w:ascii="Arial" w:eastAsia="Calibri" w:hAnsi="Arial" w:cs="Arial"/>
-                <w:b/>
-                <w:sz w:val="20"/>
-                <w:szCs w:val="20"/>
-              </w:rPr>
-              <w:t>In danger?</w:t>
-            </w:r>
-          </w:p>
-        </w:tc>
-        <w:tc>
-          <w:tcPr>
-            <w:tcW w:w="1710" w:type="dxa"/>
-          </w:tcPr>
-          <w:p>
-            <w:pPr>
-              <w:widowControl w:val="0"/>
-              <w:rPr>
-                <w:rFonts w:ascii="Arial" w:eastAsia="Calibri" w:hAnsi="Arial" w:cs="Arial"/>
-                <w:b/>
-                <w:sz w:val="20"/>
-                <w:szCs w:val="20"/>
-              </w:rPr>
-            </w:pPr>
-            <w:r>
-              <w:rPr>
-                <w:rFonts w:ascii="Arial" w:eastAsia="Calibri" w:hAnsi="Arial" w:cs="Arial"/>
-                <w:b/>
-                <w:sz w:val="20"/>
-                <w:szCs w:val="20"/>
-              </w:rPr>
-              <w:t>Relationship to petitioner</w:t>
-            </w:r>
-          </w:p>
-        </w:tc>
-        <w:tc>
-          <w:tcPr>
-            <w:tcW w:w="1710" w:type="dxa"/>
-          </w:tcPr>
-          <w:p>
-            <w:pPr>
-              <w:widowControl w:val="0"/>
-              <w:rPr>
-                <w:rFonts w:ascii="Arial" w:eastAsia="Calibri" w:hAnsi="Arial" w:cs="Arial"/>
-                <w:b/>
-                <w:sz w:val="20"/>
-                <w:szCs w:val="20"/>
-              </w:rPr>
-            </w:pPr>
-            <w:r>
-              <w:rPr>
-                <w:rFonts w:ascii="Arial" w:eastAsia="Calibri" w:hAnsi="Arial" w:cs="Arial"/>
-                <w:b/>
-                <w:sz w:val="20"/>
-                <w:szCs w:val="20"/>
-              </w:rPr>
-              <w:t>Relationship to defendant</w:t>
-            </w:r>
-          </w:p>
-        </w:tc>
-        <w:tc>
-          <w:tcPr>
-            <w:tcW w:w="1985" w:type="dxa"/>
-          </w:tcPr>
-          <w:p>
-            <w:pPr>
-              <w:widowControl w:val="0"/>
-              <w:rPr>
-                <w:rFonts w:ascii="Arial" w:eastAsia="Calibri" w:hAnsi="Arial" w:cs="Arial"/>
-                <w:b/>
-                <w:sz w:val="20"/>
-                <w:szCs w:val="20"/>
-              </w:rPr>
-            </w:pPr>
-            <w:r>
-              <w:rPr>
-                <w:rFonts w:ascii="Arial" w:eastAsia="Calibri" w:hAnsi="Arial" w:cs="Arial"/>
-                <w:b/>
-                <w:sz w:val="20"/>
-                <w:szCs w:val="20"/>
-              </w:rPr>
-              <w:t>Plaintiff/petitioner wants custody?</w:t>
-            </w:r>
-          </w:p>
-        </w:tc>
-      </w:tr>
-      <w:tr>
-        <w:tc>
-          <w:tcPr>
-            <w:tcW w:w="1795" w:type="dxa"/>
-          </w:tcPr>
-          <w:p>
-            <w:pPr>
-              <w:rPr>
-                <w:rFonts w:ascii="Arial" w:hAnsi="Arial" w:cs="Arial"/>
-                <w:sz w:val="20"/>
-                <w:szCs w:val="20"/>
-              </w:rPr>
-            </w:pPr>
-            <w:r>
-              <w:rPr>
-                <w:rFonts w:ascii="Arial" w:eastAsia="Calibri" w:hAnsi="Arial" w:cs="Arial"/>
-                <w:sz w:val="20"/>
-                <w:szCs w:val="20"/>
-              </w:rPr>
-              <w:t>{%tr for row in field.overflow_value() %}</w:t>
-            </w:r>
-          </w:p>
-        </w:tc>
-        <w:tc>
-          <w:tcPr>
-            <w:tcW w:w="900" w:type="dxa"/>
-          </w:tcPr>
-          <w:p>
-            <w:pPr>
-              <w:widowControl w:val="0"/>
-              <w:rPr>
-                <w:rFonts w:ascii="Arial" w:eastAsia="Calibri" w:hAnsi="Arial" w:cs="Arial"/>
-                <w:sz w:val="20"/>
-                <w:szCs w:val="20"/>
-              </w:rPr>
-            </w:pPr>
-          </w:p>
-        </w:tc>
-        <w:tc>
-          <w:tcPr>
-            <w:tcW w:w="1260" w:type="dxa"/>
-          </w:tcPr>
-          <w:p>
-            <w:pPr>
-              <w:widowControl w:val="0"/>
-              <w:rPr>
-                <w:rFonts w:ascii="Arial" w:eastAsia="Calibri" w:hAnsi="Arial" w:cs="Arial"/>
-                <w:sz w:val="20"/>
-                <w:szCs w:val="20"/>
-              </w:rPr>
-            </w:pPr>
-          </w:p>
-        </w:tc>
-        <w:tc>
-          <w:tcPr>
-            <w:tcW w:w="1710" w:type="dxa"/>
-          </w:tcPr>
-          <w:p>
-            <w:pPr>
-              <w:widowControl w:val="0"/>
-              <w:rPr>
-                <w:rFonts w:ascii="Arial" w:eastAsia="Calibri" w:hAnsi="Arial" w:cs="Arial"/>
-                <w:sz w:val="20"/>
-                <w:szCs w:val="20"/>
-              </w:rPr>
-            </w:pPr>
-          </w:p>
-        </w:tc>
-        <w:tc>
-          <w:tcPr>
-            <w:tcW w:w="1710" w:type="dxa"/>
-          </w:tcPr>
-          <w:p>
-            <w:pPr>
-              <w:widowControl w:val="0"/>
-              <w:rPr>
-                <w:rFonts w:ascii="Arial" w:eastAsia="Calibri" w:hAnsi="Arial" w:cs="Arial"/>
-                <w:sz w:val="20"/>
-                <w:szCs w:val="20"/>
-              </w:rPr>
-            </w:pPr>
-          </w:p>
-        </w:tc>
-        <w:tc>
-          <w:tcPr>
-            <w:tcW w:w="1985" w:type="dxa"/>
-          </w:tcPr>
-          <w:p>
-            <w:pPr>
-              <w:widowControl w:val="0"/>
-              <w:rPr>
-                <w:rFonts w:ascii="Arial" w:eastAsia="Calibri" w:hAnsi="Arial" w:cs="Arial"/>
-                <w:sz w:val="20"/>
-                <w:szCs w:val="20"/>
-              </w:rPr>
-            </w:pPr>
-          </w:p>
-        </w:tc>
-      </w:tr>
-      <w:tr>
-        <w:tc>
-          <w:tcPr>
-            <w:tcW w:w="1795" w:type="dxa"/>
-          </w:tcPr>
-          <w:p>
-            <w:pPr>
-              <w:rPr>
-                <w:rFonts w:ascii="Arial" w:hAnsi="Arial" w:cs="Arial"/>
-                <w:sz w:val="24"/>
-                <w:szCs w:val="24"/>
-              </w:rPr>
-            </w:pPr>
-            <w:r>
-              <w:rPr>
-                <w:rFonts w:ascii="Arial" w:eastAsia="Calibri" w:hAnsi="Arial" w:cs="Arial"/>
-                <w:sz w:val="24"/>
-                <w:szCs w:val="24"/>
-              </w:rPr>
-              <w:t>{{ row.name }}</w:t>
-            </w:r>
-          </w:p>
-        </w:tc>
-        <w:tc>
-          <w:tcPr>
-            <w:tcW w:w="900" w:type="dxa"/>
-          </w:tcPr>
-          <w:p>
-            <w:pPr>
-              <w:widowControl w:val="0"/>
-              <w:rPr>
-                <w:rFonts w:ascii="Arial" w:hAnsi="Arial" w:cs="Arial"/>
-                <w:sz w:val="20"/>
-                <w:szCs w:val="20"/>
-              </w:rPr>
-            </w:pPr>
-            <w:r>
-              <w:rPr>
-                <w:rFonts w:ascii="Arial" w:eastAsia="Calibri" w:hAnsi="Arial" w:cs="Arial"/>
-                <w:sz w:val="20"/>
-                <w:szCs w:val="20"/>
-              </w:rPr>
-              <w:t>{{ row.birthdate }}</w:t>
-            </w:r>
-          </w:p>
-        </w:tc>
-        <w:tc>
-          <w:tcPr>
-            <w:tcW w:w="1260" w:type="dxa"/>
-          </w:tcPr>
-          <w:p>
-            <w:pPr>
-              <w:widowControl w:val="0"/>
-              <w:rPr>
-                <w:rFonts w:ascii="Arial" w:hAnsi="Arial" w:cs="Arial"/>
-                <w:sz w:val="20"/>
-                <w:szCs w:val="20"/>
-              </w:rPr>
-            </w:pPr>
-            <w:r>
-              <w:rPr>
-                <w:rFonts w:ascii="Arial" w:eastAsia="Calibri" w:hAnsi="Arial" w:cs="Arial"/>
-                <w:sz w:val="20"/>
-                <w:szCs w:val="20"/>
-              </w:rPr>
-              <w:t>{{ row.in_danger }}</w:t>
-            </w:r>
-          </w:p>
-        </w:tc>
-        <w:tc>
-          <w:tcPr>
-            <w:tcW w:w="1710" w:type="dxa"/>
-          </w:tcPr>
-          <w:p>
-            <w:pPr>
-              <w:widowControl w:val="0"/>
-              <w:rPr>
-                <w:rFonts w:ascii="Arial" w:hAnsi="Arial" w:cs="Arial"/>
-                <w:sz w:val="20"/>
-                <w:szCs w:val="20"/>
-              </w:rPr>
-            </w:pPr>
-            <w:r>
-              <w:rPr>
-                <w:rFonts w:ascii="Arial" w:hAnsi="Arial" w:cs="Arial"/>
-                <w:sz w:val="20"/>
-                <w:szCs w:val="20"/>
-              </w:rPr>
-              <w:t>{{ row.relationship_user</w:t>
-            </w:r>
-            <w:r>
-              <w:rPr>
-                <w:rFonts w:ascii="Arial" w:hAnsi="Arial" w:cs="Arial"/>
-                <w:sz w:val="20"/>
-                <w:szCs w:val="20"/>
-              </w:rPr>
-              <w:t>s</w:t>
-            </w:r>
-            <w:r>
-              <w:rPr>
-                <w:rFonts w:ascii="Arial" w:hAnsi="Arial" w:cs="Arial"/>
-                <w:sz w:val="20"/>
-                <w:szCs w:val="20"/>
-              </w:rPr>
-              <w:t>1}}</w:t>
-            </w:r>
-          </w:p>
-        </w:tc>
-        <w:tc>
-          <w:tcPr>
-            <w:tcW w:w="1710" w:type="dxa"/>
-          </w:tcPr>
-          <w:p>
-            <w:pPr>
-              <w:widowControl w:val="0"/>
-              <w:rPr>
-                <w:rFonts w:ascii="Arial" w:eastAsia="Calibri" w:hAnsi="Arial" w:cs="Arial"/>
-                <w:sz w:val="20"/>
-                <w:szCs w:val="20"/>
-              </w:rPr>
-            </w:pPr>
-            <w:r>
-              <w:rPr>
-                <w:rFonts w:ascii="Arial" w:hAnsi="Arial" w:cs="Arial"/>
-                <w:sz w:val="20"/>
-                <w:szCs w:val="20"/>
-              </w:rPr>
-              <w:t>{{ row.relationship_op1}}</w:t>
-            </w:r>
-          </w:p>
-        </w:tc>
-        <w:tc>
-          <w:tcPr>
-            <w:tcW w:w="1985" w:type="dxa"/>
-          </w:tcPr>
-          <w:p>
-            <w:pPr>
-              <w:widowControl w:val="0"/>
-              <w:rPr>
-                <w:rFonts w:ascii="Arial" w:hAnsi="Arial" w:cs="Arial"/>
-                <w:sz w:val="20"/>
-                <w:szCs w:val="20"/>
-              </w:rPr>
-            </w:pPr>
-            <w:r>
-              <w:rPr>
-                <w:rFonts w:ascii="Arial" w:hAnsi="Arial" w:cs="Arial"/>
-                <w:sz w:val="20"/>
-                <w:szCs w:val="20"/>
-              </w:rPr>
-              <w:t>{{ row.custody_wanted}}</w:t>
-            </w:r>
-          </w:p>
-        </w:tc>
-      </w:tr>
-      <w:tr>
-        <w:tc>
-          <w:tcPr>
-            <w:tcW w:w="1795" w:type="dxa"/>
-          </w:tcPr>
-          <w:p>
-            <w:pPr>
-              <w:rPr>
-                <w:rFonts w:ascii="Arial" w:hAnsi="Arial" w:cs="Arial"/>
-                <w:sz w:val="20"/>
-                <w:szCs w:val="20"/>
-              </w:rPr>
-            </w:pPr>
-            <w:r>
-              <w:rPr>
-                <w:rFonts w:ascii="Arial" w:eastAsia="Calibri" w:hAnsi="Arial" w:cs="Arial"/>
-                <w:sz w:val="20"/>
-                <w:szCs w:val="20"/>
-              </w:rPr>
-              <w:t>{%tr endfor %}</w:t>
-            </w:r>
-          </w:p>
-        </w:tc>
-        <w:tc>
-          <w:tcPr>
-            <w:tcW w:w="900" w:type="dxa"/>
-          </w:tcPr>
-          <w:p>
-            <w:pPr>
-              <w:widowControl w:val="0"/>
-              <w:rPr>
-                <w:rFonts w:ascii="Arial" w:eastAsia="Calibri" w:hAnsi="Arial" w:cs="Arial"/>
-                <w:sz w:val="20"/>
-                <w:szCs w:val="20"/>
-              </w:rPr>
-            </w:pPr>
-          </w:p>
-        </w:tc>
-        <w:tc>
-          <w:tcPr>
-            <w:tcW w:w="1260" w:type="dxa"/>
-          </w:tcPr>
-          <w:p>
-            <w:pPr>
-              <w:widowControl w:val="0"/>
-              <w:rPr>
-                <w:rFonts w:ascii="Arial" w:eastAsia="Calibri" w:hAnsi="Arial" w:cs="Arial"/>
-                <w:sz w:val="20"/>
-                <w:szCs w:val="20"/>
-              </w:rPr>
-            </w:pPr>
-          </w:p>
-        </w:tc>
-        <w:tc>
-          <w:tcPr>
-            <w:tcW w:w="1710" w:type="dxa"/>
-          </w:tcPr>
-          <w:p>
-            <w:pPr>
-              <w:widowControl w:val="0"/>
-              <w:rPr>
-                <w:rFonts w:ascii="Arial" w:eastAsia="Calibri" w:hAnsi="Arial" w:cs="Arial"/>
-                <w:sz w:val="20"/>
-                <w:szCs w:val="20"/>
-              </w:rPr>
-            </w:pPr>
-          </w:p>
-        </w:tc>
-        <w:tc>
-          <w:tcPr>
-            <w:tcW w:w="1710" w:type="dxa"/>
-          </w:tcPr>
-          <w:p>
-            <w:pPr>
-              <w:widowControl w:val="0"/>
-              <w:rPr>
-                <w:rFonts w:ascii="Arial" w:eastAsia="Calibri" w:hAnsi="Arial" w:cs="Arial"/>
-                <w:sz w:val="20"/>
-                <w:szCs w:val="20"/>
-              </w:rPr>
-            </w:pPr>
-          </w:p>
-        </w:tc>
-        <w:tc>
-          <w:tcPr>
-            <w:tcW w:w="1985" w:type="dxa"/>
-          </w:tcPr>
-          <w:p>
-            <w:pPr>
-              <w:widowControl w:val="0"/>
-              <w:rPr>
-                <w:rFonts w:ascii="Arial" w:eastAsia="Calibri" w:hAnsi="Arial" w:cs="Arial"/>
-                <w:sz w:val="20"/>
-                <w:szCs w:val="20"/>
-              </w:rPr>
-            </w:pPr>
-          </w:p>
-        </w:tc>
-      </w:tr>
-    </w:tbl>
-    <w:p>
-      <w:pPr>
-        <w:rPr>
-          <w:rFonts w:ascii="Arial" w:hAnsi="Arial" w:cs="Arial"/>
-          <w:sz w:val="24"/>
-          <w:szCs w:val="24"/>
-        </w:rPr>
-      </w:pPr>
-    </w:p>
-    <w:p>
-      <w:pPr>
-        <w:rPr>
-          <w:rFonts w:ascii="Arial" w:hAnsi="Arial" w:cs="Arial"/>
-          <w:sz w:val="24"/>
-          <w:szCs w:val="24"/>
-        </w:rPr>
-      </w:pPr>
-      <w:r>
-        <w:rPr>
-          <w:rFonts w:ascii="Arial" w:hAnsi="Arial" w:cs="Arial"/>
-          <w:sz w:val="24"/>
-          <w:szCs w:val="24"/>
-        </w:rPr>
-        <w:t xml:space="preserve">{%p </w:t>
-      </w:r>
-      <w:r>
-        <w:rPr>
-          <w:rFonts w:ascii="Arial" w:hAnsi="Arial" w:cs="Arial"/>
-          <w:sz w:val="24"/>
-          <w:szCs w:val="24"/>
-        </w:rPr>
-        <w:t>el</w:t>
-      </w:r>
-      <w:r>
-        <w:rPr>
-          <w:rFonts w:ascii="Arial" w:hAnsi="Arial" w:cs="Arial"/>
-          <w:sz w:val="24"/>
-          <w:szCs w:val="24"/>
-        </w:rPr>
-        <w:t xml:space="preserve">if field.is_object_list() %} </w:t>
-      </w:r>
-    </w:p>
-    <w:p>
-      <w:pPr>
-        <w:pStyle w:val="Heading2"/>
-        <w:rPr>
-          <w:rFonts w:ascii="Arial" w:hAnsi="Arial" w:cs="Arial"/>
-          <w:sz w:val="24"/>
-          <w:szCs w:val="24"/>
-        </w:rPr>
-      </w:pPr>
-      <w:r>
-        <w:rPr>
-          <w:rFonts w:ascii="Arial" w:hAnsi="Arial" w:cs="Arial"/>
-          <w:sz w:val="24"/>
-          <w:szCs w:val="24"/>
-        </w:rPr>
-        <w:t>{{ field.label }}</w:t>
+        <w:t xml:space="preserve">{{ </w:t>
+      </w:r>
+      <w:proofErr w:type="spellStart"/>
+      <w:r>
+        <w:rPr>
+          <w:rFonts w:ascii="Arial" w:hAnsi="Arial" w:cs="Arial"/>
+          <w:sz w:val="24"/>
+          <w:szCs w:val="24"/>
+        </w:rPr>
+        <w:t>field.label</w:t>
+      </w:r>
+      <w:proofErr w:type="spellEnd"/>
+      <w:r>
+        <w:rPr>
+          <w:rFonts w:ascii="Arial" w:hAnsi="Arial" w:cs="Arial"/>
+          <w:sz w:val="24"/>
+          <w:szCs w:val="24"/>
+        </w:rPr>
+        <w:t xml:space="preserve"> }}</w:t>
       </w:r>
     </w:p>
     <w:tbl>
@@ -2186,7 +1650,47 @@
                 <w:sz w:val="24"/>
                 <w:szCs w:val="24"/>
               </w:rPr>
-              <w:t>{%tc for column in field.columns() %}</w:t>
+              <w:t>{%</w:t>
+            </w:r>
+            <w:proofErr w:type="spellStart"/>
+            <w:r>
+              <w:rPr>
+                <w:rFonts w:ascii="Arial" w:hAnsi="Arial" w:cs="Arial"/>
+                <w:b/>
+                <w:sz w:val="24"/>
+                <w:szCs w:val="24"/>
+              </w:rPr>
+              <w:t>tc</w:t>
+            </w:r>
+            <w:proofErr w:type="spellEnd"/>
+            <w:r>
+              <w:rPr>
+                <w:rFonts w:ascii="Arial" w:hAnsi="Arial" w:cs="Arial"/>
+                <w:b/>
+                <w:sz w:val="24"/>
+                <w:szCs w:val="24"/>
+              </w:rPr>
+              <w:t xml:space="preserve"> for column in </w:t>
+            </w:r>
+            <w:proofErr w:type="spellStart"/>
+            <w:r>
+              <w:rPr>
+                <w:rFonts w:ascii="Arial" w:hAnsi="Arial" w:cs="Arial"/>
+                <w:b/>
+                <w:sz w:val="24"/>
+                <w:szCs w:val="24"/>
+              </w:rPr>
+              <w:t>field.columns</w:t>
+            </w:r>
+            <w:proofErr w:type="spellEnd"/>
+            <w:r>
+              <w:rPr>
+                <w:rFonts w:ascii="Arial" w:hAnsi="Arial" w:cs="Arial"/>
+                <w:b/>
+                <w:sz w:val="24"/>
+                <w:szCs w:val="24"/>
+              </w:rPr>
+              <w:t>() %}</w:t>
             </w:r>
           </w:p>
         </w:tc>
@@ -2234,7 +1738,47 @@
                 <w:sz w:val="24"/>
                 <w:szCs w:val="24"/>
               </w:rPr>
-              <w:t>{%tc endfor %}</w:t>
+              <w:t>{%</w:t>
+            </w:r>
+            <w:proofErr w:type="spellStart"/>
+            <w:r>
+              <w:rPr>
+                <w:rFonts w:ascii="Arial" w:hAnsi="Arial" w:cs="Arial"/>
+                <w:b/>
+                <w:sz w:val="24"/>
+                <w:szCs w:val="24"/>
+              </w:rPr>
+              <w:t>tc</w:t>
+            </w:r>
+            <w:proofErr w:type="spellEnd"/>
+            <w:r>
+              <w:rPr>
+                <w:rFonts w:ascii="Arial" w:hAnsi="Arial" w:cs="Arial"/>
+                <w:b/>
+                <w:sz w:val="24"/>
+                <w:szCs w:val="24"/>
+              </w:rPr>
+              <w:t xml:space="preserve"> </w:t>
+            </w:r>
+            <w:proofErr w:type="spellStart"/>
+            <w:r>
+              <w:rPr>
+                <w:rFonts w:ascii="Arial" w:hAnsi="Arial" w:cs="Arial"/>
+                <w:b/>
+                <w:sz w:val="24"/>
+                <w:szCs w:val="24"/>
+              </w:rPr>
+              <w:t>endfor</w:t>
+            </w:r>
+            <w:proofErr w:type="spellEnd"/>
+            <w:r>
+              <w:rPr>
+                <w:rFonts w:ascii="Arial" w:hAnsi="Arial" w:cs="Arial"/>
+                <w:b/>
+                <w:sz w:val="24"/>
+                <w:szCs w:val="24"/>
+              </w:rPr>
+              <w:t xml:space="preserve"> %}</w:t>
             </w:r>
           </w:p>
         </w:tc>
@@ -2258,7 +1802,25 @@
                 <w:sz w:val="24"/>
                 <w:szCs w:val="24"/>
               </w:rPr>
-              <w:t>{%tr for row in field.overflow_value() %}</w:t>
+              <w:t xml:space="preserve">{%tr for row in </w:t>
+            </w:r>
+            <w:proofErr w:type="spellStart"/>
+            <w:r>
+              <w:rPr>
+                <w:rFonts w:ascii="Arial" w:hAnsi="Arial" w:cs="Arial"/>
+                <w:sz w:val="24"/>
+                <w:szCs w:val="24"/>
+              </w:rPr>
+              <w:t>field.overflow_value</w:t>
+            </w:r>
+            <w:proofErr w:type="spellEnd"/>
+            <w:r>
+              <w:rPr>
+                <w:rFonts w:ascii="Arial" w:hAnsi="Arial" w:cs="Arial"/>
+                <w:sz w:val="24"/>
+                <w:szCs w:val="24"/>
+              </w:rPr>
+              <w:t>() %}</w:t>
             </w:r>
           </w:p>
         </w:tc>
@@ -2310,7 +1872,43 @@
                 <w:sz w:val="24"/>
                 <w:szCs w:val="24"/>
               </w:rPr>
-              <w:t>{%tc for column in field.columns() %}</w:t>
+              <w:t>{%</w:t>
+            </w:r>
+            <w:proofErr w:type="spellStart"/>
+            <w:r>
+              <w:rPr>
+                <w:rFonts w:ascii="Arial" w:hAnsi="Arial" w:cs="Arial"/>
+                <w:sz w:val="24"/>
+                <w:szCs w:val="24"/>
+              </w:rPr>
+              <w:t>tc</w:t>
+            </w:r>
+            <w:proofErr w:type="spellEnd"/>
+            <w:r>
+              <w:rPr>
+                <w:rFonts w:ascii="Arial" w:hAnsi="Arial" w:cs="Arial"/>
+                <w:sz w:val="24"/>
+                <w:szCs w:val="24"/>
+              </w:rPr>
+              <w:t xml:space="preserve"> for column in </w:t>
+            </w:r>
+            <w:proofErr w:type="spellStart"/>
+            <w:r>
+              <w:rPr>
+                <w:rFonts w:ascii="Arial" w:hAnsi="Arial" w:cs="Arial"/>
+                <w:sz w:val="24"/>
+                <w:szCs w:val="24"/>
+              </w:rPr>
+              <w:t>field.columns</w:t>
+            </w:r>
+            <w:proofErr w:type="spellEnd"/>
+            <w:r>
+              <w:rPr>
+                <w:rFonts w:ascii="Arial" w:hAnsi="Arial" w:cs="Arial"/>
+                <w:sz w:val="24"/>
+                <w:szCs w:val="24"/>
+              </w:rPr>
+              <w:t>() %}</w:t>
             </w:r>
           </w:p>
         </w:tc>
@@ -2332,7 +1930,25 @@
                 <w:sz w:val="24"/>
                 <w:szCs w:val="24"/>
               </w:rPr>
-              <w:t>{{ safeattr(row, key(column)) }}</w:t>
+              <w:t xml:space="preserve">{{ </w:t>
+            </w:r>
+            <w:proofErr w:type="spellStart"/>
+            <w:r>
+              <w:rPr>
+                <w:rFonts w:ascii="Arial" w:hAnsi="Arial" w:cs="Arial"/>
+                <w:sz w:val="24"/>
+                <w:szCs w:val="24"/>
+              </w:rPr>
+              <w:t>safeattr</w:t>
+            </w:r>
+            <w:proofErr w:type="spellEnd"/>
+            <w:r>
+              <w:rPr>
+                <w:rFonts w:ascii="Arial" w:hAnsi="Arial" w:cs="Arial"/>
+                <w:sz w:val="24"/>
+                <w:szCs w:val="24"/>
+              </w:rPr>
+              <w:t>(row, key(column)) }}</w:t>
             </w:r>
           </w:p>
         </w:tc>
@@ -2354,7 +1970,43 @@
                 <w:sz w:val="24"/>
                 <w:szCs w:val="24"/>
               </w:rPr>
-              <w:t>{%tc endfor %}</w:t>
+              <w:t>{%</w:t>
+            </w:r>
+            <w:proofErr w:type="spellStart"/>
+            <w:r>
+              <w:rPr>
+                <w:rFonts w:ascii="Arial" w:hAnsi="Arial" w:cs="Arial"/>
+                <w:sz w:val="24"/>
+                <w:szCs w:val="24"/>
+              </w:rPr>
+              <w:t>tc</w:t>
+            </w:r>
+            <w:proofErr w:type="spellEnd"/>
+            <w:r>
+              <w:rPr>
+                <w:rFonts w:ascii="Arial" w:hAnsi="Arial" w:cs="Arial"/>
+                <w:sz w:val="24"/>
+                <w:szCs w:val="24"/>
+              </w:rPr>
+              <w:t xml:space="preserve"> </w:t>
+            </w:r>
+            <w:proofErr w:type="spellStart"/>
+            <w:r>
+              <w:rPr>
+                <w:rFonts w:ascii="Arial" w:hAnsi="Arial" w:cs="Arial"/>
+                <w:sz w:val="24"/>
+                <w:szCs w:val="24"/>
+              </w:rPr>
+              <w:t>endfor</w:t>
+            </w:r>
+            <w:proofErr w:type="spellEnd"/>
+            <w:r>
+              <w:rPr>
+                <w:rFonts w:ascii="Arial" w:hAnsi="Arial" w:cs="Arial"/>
+                <w:sz w:val="24"/>
+                <w:szCs w:val="24"/>
+              </w:rPr>
+              <w:t xml:space="preserve"> %}</w:t>
             </w:r>
           </w:p>
         </w:tc>
@@ -2378,7 +2030,25 @@
                 <w:sz w:val="24"/>
                 <w:szCs w:val="24"/>
               </w:rPr>
-              <w:t>{%tr endfor %}</w:t>
+              <w:t xml:space="preserve">{%tr </w:t>
+            </w:r>
+            <w:proofErr w:type="spellStart"/>
+            <w:r>
+              <w:rPr>
+                <w:rFonts w:ascii="Arial" w:hAnsi="Arial" w:cs="Arial"/>
+                <w:sz w:val="24"/>
+                <w:szCs w:val="24"/>
+              </w:rPr>
+              <w:t>endfor</w:t>
+            </w:r>
+            <w:proofErr w:type="spellEnd"/>
+            <w:r>
+              <w:rPr>
+                <w:rFonts w:ascii="Arial" w:hAnsi="Arial" w:cs="Arial"/>
+                <w:sz w:val="24"/>
+                <w:szCs w:val="24"/>
+              </w:rPr>
+              <w:t xml:space="preserve"> %}</w:t>
             </w:r>
           </w:p>
         </w:tc>
@@ -2435,7 +2105,43 @@
           <w:sz w:val="24"/>
           <w:szCs w:val="24"/>
         </w:rPr>
-        <w:t>{%p elif field.is_list() %}</w:t>
+        <w:t xml:space="preserve">{%p </w:t>
+      </w:r>
+      <w:proofErr w:type="spellStart"/>
+      <w:r>
+        <w:rPr>
+          <w:rFonts w:ascii="Arial" w:hAnsi="Arial" w:cs="Arial"/>
+          <w:sz w:val="24"/>
+          <w:szCs w:val="24"/>
+        </w:rPr>
+        <w:t>elif</w:t>
+      </w:r>
+      <w:proofErr w:type="spellEnd"/>
+      <w:r>
+        <w:rPr>
+          <w:rFonts w:ascii="Arial" w:hAnsi="Arial" w:cs="Arial"/>
+          <w:sz w:val="24"/>
+          <w:szCs w:val="24"/>
+        </w:rPr>
+        <w:t xml:space="preserve"> </w:t>
+      </w:r>
+      <w:proofErr w:type="spellStart"/>
+      <w:r>
+        <w:rPr>
+          <w:rFonts w:ascii="Arial" w:hAnsi="Arial" w:cs="Arial"/>
+          <w:sz w:val="24"/>
+          <w:szCs w:val="24"/>
+        </w:rPr>
+        <w:t>field.is_list</w:t>
+      </w:r>
+      <w:proofErr w:type="spellEnd"/>
+      <w:r>
+        <w:rPr>
+          <w:rFonts w:ascii="Arial" w:hAnsi="Arial" w:cs="Arial"/>
+          <w:sz w:val="24"/>
+          <w:szCs w:val="24"/>
+        </w:rPr>
+        <w:t>() %}</w:t>
       </w:r>
     </w:p>
     <w:p>
@@ -2462,8 +2168,25 @@
           <w:sz w:val="24"/>
           <w:szCs w:val="24"/>
         </w:rPr>
-        <w:lastRenderedPageBreak/>
-        <w:t>{{ field.label }}</w:t>
+        <w:t xml:space="preserve">{{ </w:t>
+      </w:r>
+      <w:proofErr w:type="spellStart"/>
+      <w:r>
+        <w:rPr>
+          <w:rFonts w:ascii="Arial" w:hAnsi="Arial" w:cs="Arial"/>
+          <w:sz w:val="24"/>
+          <w:szCs w:val="24"/>
+        </w:rPr>
+        <w:t>field.label</w:t>
+      </w:r>
+      <w:proofErr w:type="spellEnd"/>
+      <w:r>
+        <w:rPr>
+          <w:rFonts w:ascii="Arial" w:hAnsi="Arial" w:cs="Arial"/>
+          <w:sz w:val="24"/>
+          <w:szCs w:val="24"/>
+        </w:rPr>
+        <w:t xml:space="preserve"> }}</w:t>
       </w:r>
     </w:p>
     <w:p>
@@ -2485,7 +2208,25 @@
           <w:sz w:val="24"/>
           <w:szCs w:val="24"/>
         </w:rPr>
-        <w:t>{%p for item in field.overflow_value() %}</w:t>
+        <w:t xml:space="preserve">{%p for item in </w:t>
+      </w:r>
+      <w:proofErr w:type="spellStart"/>
+      <w:r>
+        <w:rPr>
+          <w:rFonts w:ascii="Arial" w:hAnsi="Arial" w:cs="Arial"/>
+          <w:sz w:val="24"/>
+          <w:szCs w:val="24"/>
+        </w:rPr>
+        <w:t>field.overflow_value</w:t>
+      </w:r>
+      <w:proofErr w:type="spellEnd"/>
+      <w:r>
+        <w:rPr>
+          <w:rFonts w:ascii="Arial" w:hAnsi="Arial" w:cs="Arial"/>
+          <w:sz w:val="24"/>
+          <w:szCs w:val="24"/>
+        </w:rPr>
+        <w:t>() %}</w:t>
       </w:r>
     </w:p>
     <w:p>
@@ -2529,7 +2270,25 @@
           <w:sz w:val="24"/>
           <w:szCs w:val="24"/>
         </w:rPr>
-        <w:t>{%p endfor %}</w:t>
+        <w:t xml:space="preserve">{%p </w:t>
+      </w:r>
+      <w:proofErr w:type="spellStart"/>
+      <w:r>
+        <w:rPr>
+          <w:rFonts w:ascii="Arial" w:hAnsi="Arial" w:cs="Arial"/>
+          <w:sz w:val="24"/>
+          <w:szCs w:val="24"/>
+        </w:rPr>
+        <w:t>endfor</w:t>
+      </w:r>
+      <w:proofErr w:type="spellEnd"/>
+      <w:r>
+        <w:rPr>
+          <w:rFonts w:ascii="Arial" w:hAnsi="Arial" w:cs="Arial"/>
+          <w:sz w:val="24"/>
+          <w:szCs w:val="24"/>
+        </w:rPr>
+        <w:t xml:space="preserve"> %}</w:t>
       </w:r>
     </w:p>
     <w:p>
@@ -2573,15 +2332,89 @@
           <w:sz w:val="24"/>
           <w:szCs w:val="24"/>
         </w:rPr>
-        <w:t>{{ field.label }}</w:t>
-      </w:r>
-      <w:r>
-        <w:rPr>
-          <w:rFonts w:ascii="Arial" w:hAnsi="Arial" w:cs="Arial"/>
-          <w:sz w:val="24"/>
-          <w:szCs w:val="24"/>
-        </w:rPr>
-        <w:t>: {{ field.overflow_value(overflow_message= RFAaffidavit.default_overflow_message) }}</w:t>
+        <w:t xml:space="preserve">{{ </w:t>
+      </w:r>
+      <w:proofErr w:type="spellStart"/>
+      <w:r>
+        <w:rPr>
+          <w:rFonts w:ascii="Arial" w:hAnsi="Arial" w:cs="Arial"/>
+          <w:b/>
+          <w:sz w:val="24"/>
+          <w:szCs w:val="24"/>
+        </w:rPr>
+        <w:t>field.label</w:t>
+      </w:r>
+      <w:proofErr w:type="spellEnd"/>
+      <w:r>
+        <w:rPr>
+          <w:rFonts w:ascii="Arial" w:hAnsi="Arial" w:cs="Arial"/>
+          <w:b/>
+          <w:sz w:val="24"/>
+          <w:szCs w:val="24"/>
+        </w:rPr>
+        <w:t xml:space="preserve"> }}</w:t>
+      </w:r>
+      <w:r>
+        <w:rPr>
+          <w:rFonts w:ascii="Arial" w:hAnsi="Arial" w:cs="Arial"/>
+          <w:sz w:val="24"/>
+          <w:szCs w:val="24"/>
+        </w:rPr>
+        <w:t xml:space="preserve">: {{ </w:t>
+      </w:r>
+      <w:proofErr w:type="spellStart"/>
+      <w:r>
+        <w:rPr>
+          <w:rFonts w:ascii="Arial" w:hAnsi="Arial" w:cs="Arial"/>
+          <w:sz w:val="24"/>
+          <w:szCs w:val="24"/>
+        </w:rPr>
+        <w:t>field.overflow_value</w:t>
+      </w:r>
+      <w:proofErr w:type="spellEnd"/>
+      <w:r>
+        <w:rPr>
+          <w:rFonts w:ascii="Arial" w:hAnsi="Arial" w:cs="Arial"/>
+          <w:sz w:val="24"/>
+          <w:szCs w:val="24"/>
+        </w:rPr>
+        <w:t>(</w:t>
+      </w:r>
+      <w:proofErr w:type="spellStart"/>
+      <w:r>
+        <w:rPr>
+          <w:rFonts w:ascii="Arial" w:hAnsi="Arial" w:cs="Arial"/>
+          <w:sz w:val="24"/>
+          <w:szCs w:val="24"/>
+        </w:rPr>
+        <w:t>overflow_message</w:t>
+      </w:r>
+      <w:proofErr w:type="spellEnd"/>
+      <w:r>
+        <w:rPr>
+          <w:rFonts w:ascii="Arial" w:hAnsi="Arial" w:cs="Arial"/>
+          <w:sz w:val="24"/>
+          <w:szCs w:val="24"/>
+        </w:rPr>
+        <w:t xml:space="preserve">= </w:t>
+      </w:r>
+      <w:proofErr w:type="spellStart"/>
+      <w:r>
+        <w:rPr>
+          <w:rFonts w:ascii="Arial" w:hAnsi="Arial" w:cs="Arial"/>
+          <w:sz w:val="24"/>
+          <w:szCs w:val="24"/>
+        </w:rPr>
+        <w:t>RFAaffidavit.default_overflow_message</w:t>
+      </w:r>
+      <w:proofErr w:type="spellEnd"/>
+      <w:r>
+        <w:rPr>
+          <w:rFonts w:ascii="Arial" w:hAnsi="Arial" w:cs="Arial"/>
+          <w:sz w:val="24"/>
+          <w:szCs w:val="24"/>
+        </w:rPr>
+        <w:t>) }}</w:t>
       </w:r>
     </w:p>
     <w:p>
@@ -2615,7 +2448,42 @@
           <w:sz w:val="24"/>
           <w:szCs w:val="24"/>
         </w:rPr>
-        <w:t>{%p endfor %}</w:t>
+        <w:t xml:space="preserve">{%p </w:t>
+      </w:r>
+      <w:proofErr w:type="spellStart"/>
+      <w:r>
+        <w:rPr>
+          <w:rFonts w:ascii="Arial" w:hAnsi="Arial" w:cs="Arial"/>
+          <w:sz w:val="24"/>
+          <w:szCs w:val="24"/>
+        </w:rPr>
+        <w:t>endfor</w:t>
+      </w:r>
+      <w:proofErr w:type="spellEnd"/>
+      <w:r>
+        <w:rPr>
+          <w:rFonts w:ascii="Arial" w:hAnsi="Arial" w:cs="Arial"/>
+          <w:sz w:val="24"/>
+          <w:szCs w:val="24"/>
+        </w:rPr>
+        <w:t xml:space="preserve"> %}</w:t>
+      </w:r>
+    </w:p>
+    <w:p>
+      <w:pPr>
+        <w:rPr>
+          <w:rFonts w:ascii="Arial" w:hAnsi="Arial" w:cs="Arial"/>
+          <w:sz w:val="24"/>
+          <w:szCs w:val="24"/>
+        </w:rPr>
+      </w:pPr>
+      <w:r>
+        <w:rPr>
+          <w:rFonts w:ascii="Arial" w:hAnsi="Arial" w:cs="Arial"/>
+          <w:sz w:val="24"/>
+          <w:szCs w:val="24"/>
+        </w:rPr>
+        <w:t>{%p endif %}</w:t>
       </w:r>
     </w:p>
     <w:p>

</xml_diff>

<commit_message>
updated addenda to use user_selected_county in headers
</commit_message>
<xml_diff>
--- a/docassemble/RFApackage/data/templates/RFAaffidavit_addendum.docx
+++ b/docassemble/RFApackage/data/templates/RFAaffidavit_addendum.docx
@@ -80,23 +80,29 @@
         </w:rPr>
         <w:t xml:space="preserve">Family Division, {{ </w:t>
       </w:r>
-      <w:proofErr w:type="spellStart"/>
       <w:r>
         <w:rPr>
           <w:rFonts w:ascii="Arial" w:hAnsi="Arial" w:cs="Arial"/>
           <w:sz w:val="28"/>
           <w:szCs w:val="28"/>
         </w:rPr>
-        <w:t>trial_court.address.county</w:t>
-      </w:r>
-      <w:proofErr w:type="spellEnd"/>
+        <w:t>user_selected_county</w:t>
+      </w:r>
       <w:r>
         <w:rPr>
           <w:rFonts w:ascii="Arial" w:hAnsi="Arial" w:cs="Arial"/>
           <w:sz w:val="28"/>
           <w:szCs w:val="28"/>
         </w:rPr>
-        <w:t xml:space="preserve"> }} Unit</w:t>
+        <w:t xml:space="preserve"> </w:t>
+      </w:r>
+      <w:r>
+        <w:rPr>
+          <w:rFonts w:ascii="Arial" w:hAnsi="Arial" w:cs="Arial"/>
+          <w:sz w:val="28"/>
+          <w:szCs w:val="28"/>
+        </w:rPr>
+        <w:t>}} Unit</w:t>
       </w:r>
     </w:p>
     <w:p>
@@ -115,41 +121,13 @@
         </w:rPr>
         <w:t xml:space="preserve">{%p if </w:t>
       </w:r>
-      <w:proofErr w:type="spellStart"/>
-      <w:r>
-        <w:rPr>
-          <w:rFonts w:ascii="Arial" w:hAnsi="Arial" w:cs="Arial"/>
-          <w:sz w:val="24"/>
-          <w:szCs w:val="24"/>
-        </w:rPr>
-        <w:t>who_needs_protection</w:t>
-      </w:r>
-      <w:proofErr w:type="spellEnd"/>
-      <w:r>
-        <w:rPr>
-          <w:rFonts w:ascii="Arial" w:hAnsi="Arial" w:cs="Arial"/>
-          <w:sz w:val="24"/>
-          <w:szCs w:val="24"/>
-        </w:rPr>
-        <w:t xml:space="preserve"> == '</w:t>
-      </w:r>
-      <w:proofErr w:type="spellStart"/>
-      <w:r>
-        <w:rPr>
-          <w:rFonts w:ascii="Arial" w:hAnsi="Arial" w:cs="Arial"/>
-          <w:sz w:val="24"/>
-          <w:szCs w:val="24"/>
-        </w:rPr>
-        <w:t>order_obo_child</w:t>
-      </w:r>
-      <w:proofErr w:type="spellEnd"/>
-      <w:r>
-        <w:rPr>
-          <w:rFonts w:ascii="Arial" w:hAnsi="Arial" w:cs="Arial"/>
-          <w:sz w:val="24"/>
-          <w:szCs w:val="24"/>
-        </w:rPr>
-        <w:t>'</w:t>
+      <w:r>
+        <w:rPr>
+          <w:rFonts w:ascii="Arial" w:hAnsi="Arial" w:cs="Arial"/>
+          <w:sz w:val="24"/>
+          <w:szCs w:val="24"/>
+        </w:rPr>
+        <w:t>who_needs_protection == 'order_obo_child'</w:t>
       </w:r>
       <w:r>
         <w:rPr>
@@ -201,36 +179,8 @@
           <w:sz w:val="28"/>
           <w:szCs w:val="28"/>
         </w:rPr>
-        <w:t xml:space="preserve">[0] }} v. {{ </w:t>
-      </w:r>
-      <w:proofErr w:type="spellStart"/>
-      <w:r>
-        <w:rPr>
-          <w:rFonts w:ascii="Arial" w:hAnsi="Arial" w:cs="Arial"/>
-          <w:sz w:val="28"/>
-          <w:szCs w:val="28"/>
-        </w:rPr>
-        <w:t>other_parties</w:t>
-      </w:r>
-      <w:proofErr w:type="spellEnd"/>
-      <w:r>
-        <w:rPr>
-          <w:rFonts w:ascii="Arial" w:hAnsi="Arial" w:cs="Arial"/>
-          <w:sz w:val="28"/>
-          <w:szCs w:val="28"/>
-        </w:rPr>
-        <w:t>[0</w:t>
-      </w:r>
-      <w:proofErr w:type="gramStart"/>
-      <w:r>
-        <w:rPr>
-          <w:rFonts w:ascii="Arial" w:hAnsi="Arial" w:cs="Arial"/>
-          <w:sz w:val="28"/>
-          <w:szCs w:val="28"/>
-        </w:rPr>
-        <w:t>] }}</w:t>
-      </w:r>
-      <w:proofErr w:type="gramEnd"/>
+        <w:t>[0] }} v. {{ other_parties[0] }}</w:t>
+      </w:r>
     </w:p>
     <w:p>
       <w:pPr>
@@ -274,25 +224,7 @@
           <w:sz w:val="28"/>
           <w:szCs w:val="28"/>
         </w:rPr>
-        <w:t xml:space="preserve">{{ users[0] }} v. {{ </w:t>
-      </w:r>
-      <w:proofErr w:type="spellStart"/>
-      <w:r>
-        <w:rPr>
-          <w:rFonts w:ascii="Arial" w:hAnsi="Arial" w:cs="Arial"/>
-          <w:sz w:val="28"/>
-          <w:szCs w:val="28"/>
-        </w:rPr>
-        <w:t>other_parties</w:t>
-      </w:r>
-      <w:proofErr w:type="spellEnd"/>
-      <w:r>
-        <w:rPr>
-          <w:rFonts w:ascii="Arial" w:hAnsi="Arial" w:cs="Arial"/>
-          <w:sz w:val="28"/>
-          <w:szCs w:val="28"/>
-        </w:rPr>
-        <w:t>[0] }}</w:t>
+        <w:t>{{ users[0] }} v. {{ other_parties[0] }}</w:t>
       </w:r>
     </w:p>
     <w:p>
@@ -328,7 +260,6 @@
         </w:rPr>
         <w:t xml:space="preserve">{%p if </w:t>
       </w:r>
-      <w:proofErr w:type="spellStart"/>
       <w:r>
         <w:rPr>
           <w:rFonts w:ascii="Arial" w:hAnsi="Arial" w:cs="Arial"/>
@@ -343,16 +274,7 @@
           <w:sz w:val="24"/>
           <w:szCs w:val="24"/>
         </w:rPr>
-        <w:t>affidavit.enabled</w:t>
-      </w:r>
-      <w:proofErr w:type="spellEnd"/>
-      <w:r>
-        <w:rPr>
-          <w:rFonts w:ascii="Arial" w:hAnsi="Arial" w:cs="Arial"/>
-          <w:sz w:val="24"/>
-          <w:szCs w:val="24"/>
-        </w:rPr>
-        <w:t xml:space="preserve"> %}</w:t>
+        <w:t>affidavit.enabled %}</w:t>
       </w:r>
     </w:p>
     <w:p>
@@ -371,7 +293,6 @@
         </w:rPr>
         <w:t xml:space="preserve">{%p for field in </w:t>
       </w:r>
-      <w:proofErr w:type="spellStart"/>
       <w:r>
         <w:rPr>
           <w:rFonts w:ascii="Arial" w:hAnsi="Arial" w:cs="Arial"/>
@@ -386,16 +307,7 @@
           <w:sz w:val="24"/>
           <w:szCs w:val="24"/>
         </w:rPr>
-        <w:t>.overflow</w:t>
-      </w:r>
-      <w:proofErr w:type="spellEnd"/>
-      <w:r>
-        <w:rPr>
-          <w:rFonts w:ascii="Arial" w:hAnsi="Arial" w:cs="Arial"/>
-          <w:sz w:val="24"/>
-          <w:szCs w:val="24"/>
-        </w:rPr>
-        <w:t>()</w:t>
+        <w:t>.overflow()</w:t>
       </w:r>
       <w:r>
         <w:rPr>
@@ -444,25 +356,7 @@
           <w:sz w:val="24"/>
           <w:szCs w:val="24"/>
         </w:rPr>
-        <w:t xml:space="preserve">if </w:t>
-      </w:r>
-      <w:proofErr w:type="spellStart"/>
-      <w:r>
-        <w:rPr>
-          <w:rFonts w:ascii="Arial" w:hAnsi="Arial" w:cs="Arial"/>
-          <w:sz w:val="24"/>
-          <w:szCs w:val="24"/>
-        </w:rPr>
-        <w:t>field.is_object_list</w:t>
-      </w:r>
-      <w:proofErr w:type="spellEnd"/>
-      <w:r>
-        <w:rPr>
-          <w:rFonts w:ascii="Arial" w:hAnsi="Arial" w:cs="Arial"/>
-          <w:sz w:val="24"/>
-          <w:szCs w:val="24"/>
-        </w:rPr>
-        <w:t xml:space="preserve">() %} </w:t>
+        <w:t xml:space="preserve">if field.is_object_list() %} </w:t>
       </w:r>
     </w:p>
     <w:p>
@@ -480,16 +374,7 @@
           <w:sz w:val="24"/>
           <w:szCs w:val="24"/>
         </w:rPr>
-        <w:t xml:space="preserve">{{ </w:t>
-      </w:r>
-      <w:proofErr w:type="spellStart"/>
-      <w:r>
-        <w:rPr>
-          <w:rFonts w:ascii="Arial" w:hAnsi="Arial" w:cs="Arial"/>
-          <w:sz w:val="24"/>
-          <w:szCs w:val="24"/>
-        </w:rPr>
-        <w:t>field.</w:t>
+        <w:t>{{ field.</w:t>
       </w:r>
       <w:r>
         <w:rPr>
@@ -499,7 +384,6 @@
         </w:rPr>
         <w:t>label</w:t>
       </w:r>
-      <w:proofErr w:type="spellEnd"/>
       <w:r>
         <w:rPr>
           <w:rFonts w:ascii="Arial" w:hAnsi="Arial" w:cs="Arial"/>
@@ -541,47 +425,7 @@
                 <w:sz w:val="24"/>
                 <w:szCs w:val="24"/>
               </w:rPr>
-              <w:t>{%</w:t>
-            </w:r>
-            <w:proofErr w:type="spellStart"/>
-            <w:r>
-              <w:rPr>
-                <w:rFonts w:ascii="Arial" w:hAnsi="Arial" w:cs="Arial"/>
-                <w:b/>
-                <w:sz w:val="24"/>
-                <w:szCs w:val="24"/>
-              </w:rPr>
-              <w:t>tc</w:t>
-            </w:r>
-            <w:proofErr w:type="spellEnd"/>
-            <w:r>
-              <w:rPr>
-                <w:rFonts w:ascii="Arial" w:hAnsi="Arial" w:cs="Arial"/>
-                <w:b/>
-                <w:sz w:val="24"/>
-                <w:szCs w:val="24"/>
-              </w:rPr>
-              <w:t xml:space="preserve"> for column in </w:t>
-            </w:r>
-            <w:proofErr w:type="spellStart"/>
-            <w:r>
-              <w:rPr>
-                <w:rFonts w:ascii="Arial" w:hAnsi="Arial" w:cs="Arial"/>
-                <w:b/>
-                <w:sz w:val="24"/>
-                <w:szCs w:val="24"/>
-              </w:rPr>
-              <w:t>field.columns</w:t>
-            </w:r>
-            <w:proofErr w:type="spellEnd"/>
-            <w:r>
-              <w:rPr>
-                <w:rFonts w:ascii="Arial" w:hAnsi="Arial" w:cs="Arial"/>
-                <w:b/>
-                <w:sz w:val="24"/>
-                <w:szCs w:val="24"/>
-              </w:rPr>
-              <w:t>() %}</w:t>
+              <w:t>{%tc for column in field.columns() %}</w:t>
             </w:r>
           </w:p>
         </w:tc>
@@ -647,47 +491,7 @@
                 <w:sz w:val="24"/>
                 <w:szCs w:val="24"/>
               </w:rPr>
-              <w:t>{%</w:t>
-            </w:r>
-            <w:proofErr w:type="spellStart"/>
-            <w:r>
-              <w:rPr>
-                <w:rFonts w:ascii="Arial" w:hAnsi="Arial" w:cs="Arial"/>
-                <w:b/>
-                <w:sz w:val="24"/>
-                <w:szCs w:val="24"/>
-              </w:rPr>
-              <w:t>tc</w:t>
-            </w:r>
-            <w:proofErr w:type="spellEnd"/>
-            <w:r>
-              <w:rPr>
-                <w:rFonts w:ascii="Arial" w:hAnsi="Arial" w:cs="Arial"/>
-                <w:b/>
-                <w:sz w:val="24"/>
-                <w:szCs w:val="24"/>
-              </w:rPr>
-              <w:t xml:space="preserve"> </w:t>
-            </w:r>
-            <w:proofErr w:type="spellStart"/>
-            <w:r>
-              <w:rPr>
-                <w:rFonts w:ascii="Arial" w:hAnsi="Arial" w:cs="Arial"/>
-                <w:b/>
-                <w:sz w:val="24"/>
-                <w:szCs w:val="24"/>
-              </w:rPr>
-              <w:t>endfor</w:t>
-            </w:r>
-            <w:proofErr w:type="spellEnd"/>
-            <w:r>
-              <w:rPr>
-                <w:rFonts w:ascii="Arial" w:hAnsi="Arial" w:cs="Arial"/>
-                <w:b/>
-                <w:sz w:val="24"/>
-                <w:szCs w:val="24"/>
-              </w:rPr>
-              <w:t xml:space="preserve"> %}</w:t>
+              <w:t>{%tc endfor %}</w:t>
             </w:r>
           </w:p>
         </w:tc>
@@ -711,25 +515,7 @@
                 <w:sz w:val="24"/>
                 <w:szCs w:val="24"/>
               </w:rPr>
-              <w:t xml:space="preserve">{%tr for row in </w:t>
-            </w:r>
-            <w:proofErr w:type="spellStart"/>
-            <w:r>
-              <w:rPr>
-                <w:rFonts w:ascii="Arial" w:hAnsi="Arial" w:cs="Arial"/>
-                <w:sz w:val="24"/>
-                <w:szCs w:val="24"/>
-              </w:rPr>
-              <w:t>field.overflow_value</w:t>
-            </w:r>
-            <w:proofErr w:type="spellEnd"/>
-            <w:r>
-              <w:rPr>
-                <w:rFonts w:ascii="Arial" w:hAnsi="Arial" w:cs="Arial"/>
-                <w:sz w:val="24"/>
-                <w:szCs w:val="24"/>
-              </w:rPr>
-              <w:t>() %}</w:t>
+              <w:t>{%tr for row in field.overflow_value() %}</w:t>
             </w:r>
           </w:p>
         </w:tc>
@@ -781,43 +567,7 @@
                 <w:sz w:val="24"/>
                 <w:szCs w:val="24"/>
               </w:rPr>
-              <w:t>{%</w:t>
-            </w:r>
-            <w:proofErr w:type="spellStart"/>
-            <w:r>
-              <w:rPr>
-                <w:rFonts w:ascii="Arial" w:hAnsi="Arial" w:cs="Arial"/>
-                <w:sz w:val="24"/>
-                <w:szCs w:val="24"/>
-              </w:rPr>
-              <w:t>tc</w:t>
-            </w:r>
-            <w:proofErr w:type="spellEnd"/>
-            <w:r>
-              <w:rPr>
-                <w:rFonts w:ascii="Arial" w:hAnsi="Arial" w:cs="Arial"/>
-                <w:sz w:val="24"/>
-                <w:szCs w:val="24"/>
-              </w:rPr>
-              <w:t xml:space="preserve"> for column in </w:t>
-            </w:r>
-            <w:proofErr w:type="spellStart"/>
-            <w:r>
-              <w:rPr>
-                <w:rFonts w:ascii="Arial" w:hAnsi="Arial" w:cs="Arial"/>
-                <w:sz w:val="24"/>
-                <w:szCs w:val="24"/>
-              </w:rPr>
-              <w:t>field.columns</w:t>
-            </w:r>
-            <w:proofErr w:type="spellEnd"/>
-            <w:r>
-              <w:rPr>
-                <w:rFonts w:ascii="Arial" w:hAnsi="Arial" w:cs="Arial"/>
-                <w:sz w:val="24"/>
-                <w:szCs w:val="24"/>
-              </w:rPr>
-              <w:t>() %}</w:t>
+              <w:t>{%tc for column in field.columns() %}</w:t>
             </w:r>
           </w:p>
         </w:tc>
@@ -839,25 +589,7 @@
                 <w:sz w:val="24"/>
                 <w:szCs w:val="24"/>
               </w:rPr>
-              <w:t xml:space="preserve">{{ </w:t>
-            </w:r>
-            <w:proofErr w:type="spellStart"/>
-            <w:r>
-              <w:rPr>
-                <w:rFonts w:ascii="Arial" w:hAnsi="Arial" w:cs="Arial"/>
-                <w:sz w:val="24"/>
-                <w:szCs w:val="24"/>
-              </w:rPr>
-              <w:t>safeattr</w:t>
-            </w:r>
-            <w:proofErr w:type="spellEnd"/>
-            <w:r>
-              <w:rPr>
-                <w:rFonts w:ascii="Arial" w:hAnsi="Arial" w:cs="Arial"/>
-                <w:sz w:val="24"/>
-                <w:szCs w:val="24"/>
-              </w:rPr>
-              <w:t>(row, key(column)) }}</w:t>
+              <w:t>{{ safeattr(row, key(column)) }}</w:t>
             </w:r>
           </w:p>
         </w:tc>
@@ -879,43 +611,7 @@
                 <w:sz w:val="24"/>
                 <w:szCs w:val="24"/>
               </w:rPr>
-              <w:t>{%</w:t>
-            </w:r>
-            <w:proofErr w:type="spellStart"/>
-            <w:r>
-              <w:rPr>
-                <w:rFonts w:ascii="Arial" w:hAnsi="Arial" w:cs="Arial"/>
-                <w:sz w:val="24"/>
-                <w:szCs w:val="24"/>
-              </w:rPr>
-              <w:t>tc</w:t>
-            </w:r>
-            <w:proofErr w:type="spellEnd"/>
-            <w:r>
-              <w:rPr>
-                <w:rFonts w:ascii="Arial" w:hAnsi="Arial" w:cs="Arial"/>
-                <w:sz w:val="24"/>
-                <w:szCs w:val="24"/>
-              </w:rPr>
-              <w:t xml:space="preserve"> </w:t>
-            </w:r>
-            <w:proofErr w:type="spellStart"/>
-            <w:r>
-              <w:rPr>
-                <w:rFonts w:ascii="Arial" w:hAnsi="Arial" w:cs="Arial"/>
-                <w:sz w:val="24"/>
-                <w:szCs w:val="24"/>
-              </w:rPr>
-              <w:t>endfor</w:t>
-            </w:r>
-            <w:proofErr w:type="spellEnd"/>
-            <w:r>
-              <w:rPr>
-                <w:rFonts w:ascii="Arial" w:hAnsi="Arial" w:cs="Arial"/>
-                <w:sz w:val="24"/>
-                <w:szCs w:val="24"/>
-              </w:rPr>
-              <w:t xml:space="preserve"> %}</w:t>
+              <w:t>{%tc endfor %}</w:t>
             </w:r>
           </w:p>
         </w:tc>
@@ -939,25 +635,7 @@
                 <w:sz w:val="24"/>
                 <w:szCs w:val="24"/>
               </w:rPr>
-              <w:t xml:space="preserve">{%tr </w:t>
-            </w:r>
-            <w:proofErr w:type="spellStart"/>
-            <w:r>
-              <w:rPr>
-                <w:rFonts w:ascii="Arial" w:hAnsi="Arial" w:cs="Arial"/>
-                <w:sz w:val="24"/>
-                <w:szCs w:val="24"/>
-              </w:rPr>
-              <w:t>endfor</w:t>
-            </w:r>
-            <w:proofErr w:type="spellEnd"/>
-            <w:r>
-              <w:rPr>
-                <w:rFonts w:ascii="Arial" w:hAnsi="Arial" w:cs="Arial"/>
-                <w:sz w:val="24"/>
-                <w:szCs w:val="24"/>
-              </w:rPr>
-              <w:t xml:space="preserve"> %}</w:t>
+              <w:t>{%tr endfor %}</w:t>
             </w:r>
           </w:p>
         </w:tc>
@@ -1014,43 +692,7 @@
           <w:sz w:val="24"/>
           <w:szCs w:val="24"/>
         </w:rPr>
-        <w:t xml:space="preserve">{%p </w:t>
-      </w:r>
-      <w:proofErr w:type="spellStart"/>
-      <w:r>
-        <w:rPr>
-          <w:rFonts w:ascii="Arial" w:hAnsi="Arial" w:cs="Arial"/>
-          <w:sz w:val="24"/>
-          <w:szCs w:val="24"/>
-        </w:rPr>
-        <w:t>elif</w:t>
-      </w:r>
-      <w:proofErr w:type="spellEnd"/>
-      <w:r>
-        <w:rPr>
-          <w:rFonts w:ascii="Arial" w:hAnsi="Arial" w:cs="Arial"/>
-          <w:sz w:val="24"/>
-          <w:szCs w:val="24"/>
-        </w:rPr>
-        <w:t xml:space="preserve"> </w:t>
-      </w:r>
-      <w:proofErr w:type="spellStart"/>
-      <w:r>
-        <w:rPr>
-          <w:rFonts w:ascii="Arial" w:hAnsi="Arial" w:cs="Arial"/>
-          <w:sz w:val="24"/>
-          <w:szCs w:val="24"/>
-        </w:rPr>
-        <w:t>field.is_list</w:t>
-      </w:r>
-      <w:proofErr w:type="spellEnd"/>
-      <w:r>
-        <w:rPr>
-          <w:rFonts w:ascii="Arial" w:hAnsi="Arial" w:cs="Arial"/>
-          <w:sz w:val="24"/>
-          <w:szCs w:val="24"/>
-        </w:rPr>
-        <w:t>() %}</w:t>
+        <w:t>{%p elif field.is_list() %}</w:t>
       </w:r>
     </w:p>
     <w:p>
@@ -1077,16 +719,7 @@
           <w:sz w:val="24"/>
           <w:szCs w:val="24"/>
         </w:rPr>
-        <w:t xml:space="preserve">{{ </w:t>
-      </w:r>
-      <w:proofErr w:type="spellStart"/>
-      <w:r>
-        <w:rPr>
-          <w:rFonts w:ascii="Arial" w:hAnsi="Arial" w:cs="Arial"/>
-          <w:sz w:val="24"/>
-          <w:szCs w:val="24"/>
-        </w:rPr>
-        <w:t>field.</w:t>
+        <w:t>{{ field.</w:t>
       </w:r>
       <w:r>
         <w:rPr>
@@ -1096,7 +729,6 @@
         </w:rPr>
         <w:t>label</w:t>
       </w:r>
-      <w:proofErr w:type="spellEnd"/>
       <w:r>
         <w:rPr>
           <w:rFonts w:ascii="Arial" w:hAnsi="Arial" w:cs="Arial"/>
@@ -1125,25 +757,7 @@
           <w:sz w:val="24"/>
           <w:szCs w:val="24"/>
         </w:rPr>
-        <w:t xml:space="preserve">{%p for item in </w:t>
-      </w:r>
-      <w:proofErr w:type="spellStart"/>
-      <w:r>
-        <w:rPr>
-          <w:rFonts w:ascii="Arial" w:hAnsi="Arial" w:cs="Arial"/>
-          <w:sz w:val="24"/>
-          <w:szCs w:val="24"/>
-        </w:rPr>
-        <w:t>field.overflow_value</w:t>
-      </w:r>
-      <w:proofErr w:type="spellEnd"/>
-      <w:r>
-        <w:rPr>
-          <w:rFonts w:ascii="Arial" w:hAnsi="Arial" w:cs="Arial"/>
-          <w:sz w:val="24"/>
-          <w:szCs w:val="24"/>
-        </w:rPr>
-        <w:t>() %}</w:t>
+        <w:t>{%p for item in field.overflow_value() %}</w:t>
       </w:r>
     </w:p>
     <w:p>
@@ -1187,18 +801,8 @@
           <w:sz w:val="24"/>
           <w:szCs w:val="24"/>
         </w:rPr>
-        <w:t xml:space="preserve">{%p </w:t>
-      </w:r>
-      <w:proofErr w:type="spellStart"/>
-      <w:r>
-        <w:rPr>
-          <w:rFonts w:ascii="Arial" w:hAnsi="Arial" w:cs="Arial"/>
-          <w:sz w:val="24"/>
-          <w:szCs w:val="24"/>
-        </w:rPr>
-        <w:t>endfor</w:t>
-      </w:r>
-      <w:proofErr w:type="spellEnd"/>
+        <w:t>{%p endfor</w:t>
+      </w:r>
       <w:r>
         <w:rPr>
           <w:rFonts w:ascii="Arial" w:hAnsi="Arial" w:cs="Arial"/>
@@ -1265,9 +869,8 @@
           <w:sz w:val="24"/>
           <w:szCs w:val="24"/>
         </w:rPr>
-        <w:t xml:space="preserve">{{ </w:t>
-      </w:r>
-      <w:proofErr w:type="spellStart"/>
+        <w:t>{{ field.</w:t>
+      </w:r>
       <w:r>
         <w:rPr>
           <w:rFonts w:ascii="Arial" w:hAnsi="Arial" w:cs="Arial"/>
@@ -1275,7 +878,7 @@
           <w:sz w:val="24"/>
           <w:szCs w:val="24"/>
         </w:rPr>
-        <w:t>field.</w:t>
+        <w:t>label</w:t>
       </w:r>
       <w:r>
         <w:rPr>
@@ -1284,16 +887,6 @@
           <w:sz w:val="24"/>
           <w:szCs w:val="24"/>
         </w:rPr>
-        <w:t>label</w:t>
-      </w:r>
-      <w:proofErr w:type="spellEnd"/>
-      <w:r>
-        <w:rPr>
-          <w:rFonts w:ascii="Arial" w:hAnsi="Arial" w:cs="Arial"/>
-          <w:b/>
-          <w:sz w:val="24"/>
-          <w:szCs w:val="24"/>
-        </w:rPr>
         <w:t xml:space="preserve"> }}</w:t>
       </w:r>
       <w:r>
@@ -1302,43 +895,157 @@
           <w:sz w:val="24"/>
           <w:szCs w:val="24"/>
         </w:rPr>
-        <w:t xml:space="preserve">: {{ </w:t>
-      </w:r>
-      <w:proofErr w:type="spellStart"/>
-      <w:r>
-        <w:rPr>
-          <w:rFonts w:ascii="Arial" w:hAnsi="Arial" w:cs="Arial"/>
-          <w:sz w:val="24"/>
-          <w:szCs w:val="24"/>
-        </w:rPr>
-        <w:t>field.overflow_value</w:t>
-      </w:r>
-      <w:proofErr w:type="spellEnd"/>
-      <w:r>
-        <w:rPr>
-          <w:rFonts w:ascii="Arial" w:hAnsi="Arial" w:cs="Arial"/>
-          <w:sz w:val="24"/>
-          <w:szCs w:val="24"/>
-        </w:rPr>
-        <w:t>(</w:t>
-      </w:r>
-      <w:proofErr w:type="spellStart"/>
-      <w:r>
-        <w:rPr>
-          <w:rFonts w:ascii="Arial" w:hAnsi="Arial" w:cs="Arial"/>
-          <w:sz w:val="24"/>
-          <w:szCs w:val="24"/>
-        </w:rPr>
-        <w:t>overflow_message</w:t>
-      </w:r>
-      <w:proofErr w:type="spellEnd"/>
-      <w:r>
-        <w:rPr>
-          <w:rFonts w:ascii="Arial" w:hAnsi="Arial" w:cs="Arial"/>
-          <w:sz w:val="24"/>
-          <w:szCs w:val="24"/>
-        </w:rPr>
-        <w:t>=</w:t>
+        <w:t>: {{ field.overflow_value(</w:t>
+      </w:r>
+      <w:r>
+        <w:rPr>
+          <w:rFonts w:ascii="Arial" w:hAnsi="Arial" w:cs="Arial"/>
+          <w:sz w:val="24"/>
+          <w:szCs w:val="24"/>
+        </w:rPr>
+        <w:t>overflow_message=</w:t>
+      </w:r>
+      <w:r>
+        <w:rPr>
+          <w:rFonts w:ascii="Arial" w:hAnsi="Arial" w:cs="Arial"/>
+          <w:sz w:val="24"/>
+          <w:szCs w:val="24"/>
+        </w:rPr>
+        <w:t xml:space="preserve"> RFAaffidavit</w:t>
+      </w:r>
+      <w:r>
+        <w:rPr>
+          <w:rFonts w:ascii="Arial" w:hAnsi="Arial" w:cs="Arial"/>
+          <w:sz w:val="24"/>
+          <w:szCs w:val="24"/>
+        </w:rPr>
+        <w:t>.default_overflow_message</w:t>
+      </w:r>
+      <w:r>
+        <w:rPr>
+          <w:rFonts w:ascii="Arial" w:hAnsi="Arial" w:cs="Arial"/>
+          <w:sz w:val="24"/>
+          <w:szCs w:val="24"/>
+        </w:rPr>
+        <w:t>) }}</w:t>
+      </w:r>
+    </w:p>
+    <w:p>
+      <w:pPr>
+        <w:rPr>
+          <w:rFonts w:ascii="Arial" w:hAnsi="Arial" w:cs="Arial"/>
+          <w:sz w:val="24"/>
+          <w:szCs w:val="24"/>
+        </w:rPr>
+      </w:pPr>
+      <w:r>
+        <w:rPr>
+          <w:rFonts w:ascii="Arial" w:hAnsi="Arial" w:cs="Arial"/>
+          <w:sz w:val="24"/>
+          <w:szCs w:val="24"/>
+        </w:rPr>
+        <w:t>{%p endif %}</w:t>
+      </w:r>
+    </w:p>
+    <w:p>
+      <w:pPr>
+        <w:rPr>
+          <w:rFonts w:ascii="Arial" w:hAnsi="Arial" w:cs="Arial"/>
+          <w:sz w:val="24"/>
+          <w:szCs w:val="24"/>
+        </w:rPr>
+      </w:pPr>
+      <w:r>
+        <w:rPr>
+          <w:rFonts w:ascii="Arial" w:hAnsi="Arial" w:cs="Arial"/>
+          <w:sz w:val="24"/>
+          <w:szCs w:val="24"/>
+        </w:rPr>
+        <w:lastRenderedPageBreak/>
+        <w:t>{%p endfor %}</w:t>
+      </w:r>
+    </w:p>
+    <w:p>
+      <w:pPr>
+        <w:rPr>
+          <w:rFonts w:ascii="Arial" w:hAnsi="Arial" w:cs="Arial"/>
+          <w:sz w:val="24"/>
+          <w:szCs w:val="24"/>
+        </w:rPr>
+      </w:pPr>
+      <w:r>
+        <w:rPr>
+          <w:rFonts w:ascii="Arial" w:hAnsi="Arial" w:cs="Arial"/>
+          <w:sz w:val="24"/>
+          <w:szCs w:val="24"/>
+        </w:rPr>
+        <w:t>{%p endif %}</w:t>
+      </w:r>
+    </w:p>
+    <w:p>
+      <w:pPr>
+        <w:rPr>
+          <w:rFonts w:ascii="Arial" w:hAnsi="Arial" w:cs="Arial"/>
+          <w:sz w:val="24"/>
+          <w:szCs w:val="24"/>
+        </w:rPr>
+      </w:pPr>
+      <w:r>
+        <w:rPr>
+          <w:rFonts w:ascii="Arial" w:hAnsi="Arial" w:cs="Arial"/>
+          <w:sz w:val="24"/>
+          <w:szCs w:val="24"/>
+        </w:rPr>
+        <w:t xml:space="preserve">{%p if </w:t>
+      </w:r>
+      <w:r>
+        <w:rPr>
+          <w:rFonts w:ascii="Arial" w:hAnsi="Arial" w:cs="Arial"/>
+          <w:sz w:val="24"/>
+          <w:szCs w:val="24"/>
+        </w:rPr>
+        <w:t>RFAaffidavitonbehalfofminor</w:t>
+      </w:r>
+      <w:r>
+        <w:rPr>
+          <w:rFonts w:ascii="Arial" w:hAnsi="Arial" w:cs="Arial"/>
+          <w:sz w:val="24"/>
+          <w:szCs w:val="24"/>
+        </w:rPr>
+        <w:t>.enabled %}</w:t>
+      </w:r>
+    </w:p>
+    <w:p>
+      <w:pPr>
+        <w:rPr>
+          <w:rFonts w:ascii="Arial" w:hAnsi="Arial" w:cs="Arial"/>
+          <w:sz w:val="24"/>
+          <w:szCs w:val="24"/>
+        </w:rPr>
+      </w:pPr>
+      <w:r>
+        <w:rPr>
+          <w:rFonts w:ascii="Arial" w:hAnsi="Arial" w:cs="Arial"/>
+          <w:sz w:val="24"/>
+          <w:szCs w:val="24"/>
+        </w:rPr>
+        <w:t xml:space="preserve">{%p for field in </w:t>
+      </w:r>
+      <w:r>
+        <w:rPr>
+          <w:rFonts w:ascii="Arial" w:hAnsi="Arial" w:cs="Arial"/>
+          <w:sz w:val="24"/>
+          <w:szCs w:val="24"/>
+        </w:rPr>
+        <w:t>RFAaffidavitonbehalfofminor</w:t>
+      </w:r>
+      <w:r>
+        <w:rPr>
+          <w:rFonts w:ascii="Arial" w:hAnsi="Arial" w:cs="Arial"/>
+          <w:sz w:val="24"/>
+          <w:szCs w:val="24"/>
+        </w:rPr>
+        <w:t>.overflow()</w:t>
       </w:r>
       <w:r>
         <w:rPr>
@@ -1348,196 +1055,6 @@
         </w:rPr>
         <w:t xml:space="preserve"> </w:t>
       </w:r>
-      <w:proofErr w:type="spellStart"/>
-      <w:r>
-        <w:rPr>
-          <w:rFonts w:ascii="Arial" w:hAnsi="Arial" w:cs="Arial"/>
-          <w:sz w:val="24"/>
-          <w:szCs w:val="24"/>
-        </w:rPr>
-        <w:t>RFAaffidavit</w:t>
-      </w:r>
-      <w:r>
-        <w:rPr>
-          <w:rFonts w:ascii="Arial" w:hAnsi="Arial" w:cs="Arial"/>
-          <w:sz w:val="24"/>
-          <w:szCs w:val="24"/>
-        </w:rPr>
-        <w:t>.default_overflow_message</w:t>
-      </w:r>
-      <w:proofErr w:type="spellEnd"/>
-      <w:r>
-        <w:rPr>
-          <w:rFonts w:ascii="Arial" w:hAnsi="Arial" w:cs="Arial"/>
-          <w:sz w:val="24"/>
-          <w:szCs w:val="24"/>
-        </w:rPr>
-        <w:t>) }}</w:t>
-      </w:r>
-    </w:p>
-    <w:p>
-      <w:pPr>
-        <w:rPr>
-          <w:rFonts w:ascii="Arial" w:hAnsi="Arial" w:cs="Arial"/>
-          <w:sz w:val="24"/>
-          <w:szCs w:val="24"/>
-        </w:rPr>
-      </w:pPr>
-      <w:r>
-        <w:rPr>
-          <w:rFonts w:ascii="Arial" w:hAnsi="Arial" w:cs="Arial"/>
-          <w:sz w:val="24"/>
-          <w:szCs w:val="24"/>
-        </w:rPr>
-        <w:t>{%p endif %}</w:t>
-      </w:r>
-    </w:p>
-    <w:p>
-      <w:pPr>
-        <w:rPr>
-          <w:rFonts w:ascii="Arial" w:hAnsi="Arial" w:cs="Arial"/>
-          <w:sz w:val="24"/>
-          <w:szCs w:val="24"/>
-        </w:rPr>
-      </w:pPr>
-      <w:r>
-        <w:rPr>
-          <w:rFonts w:ascii="Arial" w:hAnsi="Arial" w:cs="Arial"/>
-          <w:sz w:val="24"/>
-          <w:szCs w:val="24"/>
-        </w:rPr>
-        <w:lastRenderedPageBreak/>
-        <w:t xml:space="preserve">{%p </w:t>
-      </w:r>
-      <w:proofErr w:type="spellStart"/>
-      <w:r>
-        <w:rPr>
-          <w:rFonts w:ascii="Arial" w:hAnsi="Arial" w:cs="Arial"/>
-          <w:sz w:val="24"/>
-          <w:szCs w:val="24"/>
-        </w:rPr>
-        <w:t>endfor</w:t>
-      </w:r>
-      <w:proofErr w:type="spellEnd"/>
-      <w:r>
-        <w:rPr>
-          <w:rFonts w:ascii="Arial" w:hAnsi="Arial" w:cs="Arial"/>
-          <w:sz w:val="24"/>
-          <w:szCs w:val="24"/>
-        </w:rPr>
-        <w:t xml:space="preserve"> %}</w:t>
-      </w:r>
-    </w:p>
-    <w:p>
-      <w:pPr>
-        <w:rPr>
-          <w:rFonts w:ascii="Arial" w:hAnsi="Arial" w:cs="Arial"/>
-          <w:sz w:val="24"/>
-          <w:szCs w:val="24"/>
-        </w:rPr>
-      </w:pPr>
-      <w:r>
-        <w:rPr>
-          <w:rFonts w:ascii="Arial" w:hAnsi="Arial" w:cs="Arial"/>
-          <w:sz w:val="24"/>
-          <w:szCs w:val="24"/>
-        </w:rPr>
-        <w:t>{%p endif %}</w:t>
-      </w:r>
-    </w:p>
-    <w:p>
-      <w:pPr>
-        <w:rPr>
-          <w:rFonts w:ascii="Arial" w:hAnsi="Arial" w:cs="Arial"/>
-          <w:sz w:val="24"/>
-          <w:szCs w:val="24"/>
-        </w:rPr>
-      </w:pPr>
-      <w:r>
-        <w:rPr>
-          <w:rFonts w:ascii="Arial" w:hAnsi="Arial" w:cs="Arial"/>
-          <w:sz w:val="24"/>
-          <w:szCs w:val="24"/>
-        </w:rPr>
-        <w:t xml:space="preserve">{%p if </w:t>
-      </w:r>
-      <w:proofErr w:type="spellStart"/>
-      <w:r>
-        <w:rPr>
-          <w:rFonts w:ascii="Arial" w:hAnsi="Arial" w:cs="Arial"/>
-          <w:sz w:val="24"/>
-          <w:szCs w:val="24"/>
-        </w:rPr>
-        <w:t>RFAaffidavitonbehalfofminor</w:t>
-      </w:r>
-      <w:r>
-        <w:rPr>
-          <w:rFonts w:ascii="Arial" w:hAnsi="Arial" w:cs="Arial"/>
-          <w:sz w:val="24"/>
-          <w:szCs w:val="24"/>
-        </w:rPr>
-        <w:t>.enabled</w:t>
-      </w:r>
-      <w:proofErr w:type="spellEnd"/>
-      <w:r>
-        <w:rPr>
-          <w:rFonts w:ascii="Arial" w:hAnsi="Arial" w:cs="Arial"/>
-          <w:sz w:val="24"/>
-          <w:szCs w:val="24"/>
-        </w:rPr>
-        <w:t xml:space="preserve"> %}</w:t>
-      </w:r>
-    </w:p>
-    <w:p>
-      <w:pPr>
-        <w:rPr>
-          <w:rFonts w:ascii="Arial" w:hAnsi="Arial" w:cs="Arial"/>
-          <w:sz w:val="24"/>
-          <w:szCs w:val="24"/>
-        </w:rPr>
-      </w:pPr>
-      <w:r>
-        <w:rPr>
-          <w:rFonts w:ascii="Arial" w:hAnsi="Arial" w:cs="Arial"/>
-          <w:sz w:val="24"/>
-          <w:szCs w:val="24"/>
-        </w:rPr>
-        <w:t xml:space="preserve">{%p for field in </w:t>
-      </w:r>
-      <w:proofErr w:type="spellStart"/>
-      <w:r>
-        <w:rPr>
-          <w:rFonts w:ascii="Arial" w:hAnsi="Arial" w:cs="Arial"/>
-          <w:sz w:val="24"/>
-          <w:szCs w:val="24"/>
-        </w:rPr>
-        <w:t>RFAaffidavitonbehalfofminor</w:t>
-      </w:r>
-      <w:r>
-        <w:rPr>
-          <w:rFonts w:ascii="Arial" w:hAnsi="Arial" w:cs="Arial"/>
-          <w:sz w:val="24"/>
-          <w:szCs w:val="24"/>
-        </w:rPr>
-        <w:t>.overflow</w:t>
-      </w:r>
-      <w:proofErr w:type="spellEnd"/>
-      <w:r>
-        <w:rPr>
-          <w:rFonts w:ascii="Arial" w:hAnsi="Arial" w:cs="Arial"/>
-          <w:sz w:val="24"/>
-          <w:szCs w:val="24"/>
-        </w:rPr>
-        <w:t>()</w:t>
-      </w:r>
-      <w:r>
-        <w:rPr>
-          <w:rFonts w:ascii="Arial" w:hAnsi="Arial" w:cs="Arial"/>
-          <w:sz w:val="24"/>
-          <w:szCs w:val="24"/>
-        </w:rPr>
-        <w:t xml:space="preserve"> </w:t>
-      </w:r>
       <w:r>
         <w:rPr>
           <w:rFonts w:ascii="Arial" w:hAnsi="Arial" w:cs="Arial"/>
@@ -1561,25 +1078,7 @@
           <w:sz w:val="24"/>
           <w:szCs w:val="24"/>
         </w:rPr>
-        <w:t xml:space="preserve">{%p if </w:t>
-      </w:r>
-      <w:proofErr w:type="spellStart"/>
-      <w:r>
-        <w:rPr>
-          <w:rFonts w:ascii="Arial" w:hAnsi="Arial" w:cs="Arial"/>
-          <w:sz w:val="24"/>
-          <w:szCs w:val="24"/>
-        </w:rPr>
-        <w:t>field.is_object_list</w:t>
-      </w:r>
-      <w:proofErr w:type="spellEnd"/>
-      <w:r>
-        <w:rPr>
-          <w:rFonts w:ascii="Arial" w:hAnsi="Arial" w:cs="Arial"/>
-          <w:sz w:val="24"/>
-          <w:szCs w:val="24"/>
-        </w:rPr>
-        <w:t xml:space="preserve">() %} </w:t>
+        <w:t xml:space="preserve">{%p if field.is_object_list() %} </w:t>
       </w:r>
     </w:p>
     <w:p>
@@ -1597,25 +1096,7 @@
           <w:sz w:val="24"/>
           <w:szCs w:val="24"/>
         </w:rPr>
-        <w:t xml:space="preserve">{{ </w:t>
-      </w:r>
-      <w:proofErr w:type="spellStart"/>
-      <w:r>
-        <w:rPr>
-          <w:rFonts w:ascii="Arial" w:hAnsi="Arial" w:cs="Arial"/>
-          <w:sz w:val="24"/>
-          <w:szCs w:val="24"/>
-        </w:rPr>
-        <w:t>field.label</w:t>
-      </w:r>
-      <w:proofErr w:type="spellEnd"/>
-      <w:r>
-        <w:rPr>
-          <w:rFonts w:ascii="Arial" w:hAnsi="Arial" w:cs="Arial"/>
-          <w:sz w:val="24"/>
-          <w:szCs w:val="24"/>
-        </w:rPr>
-        <w:t xml:space="preserve"> }}</w:t>
+        <w:t>{{ field.label }}</w:t>
       </w:r>
     </w:p>
     <w:tbl>
@@ -1650,47 +1131,7 @@
                 <w:sz w:val="24"/>
                 <w:szCs w:val="24"/>
               </w:rPr>
-              <w:t>{%</w:t>
-            </w:r>
-            <w:proofErr w:type="spellStart"/>
-            <w:r>
-              <w:rPr>
-                <w:rFonts w:ascii="Arial" w:hAnsi="Arial" w:cs="Arial"/>
-                <w:b/>
-                <w:sz w:val="24"/>
-                <w:szCs w:val="24"/>
-              </w:rPr>
-              <w:t>tc</w:t>
-            </w:r>
-            <w:proofErr w:type="spellEnd"/>
-            <w:r>
-              <w:rPr>
-                <w:rFonts w:ascii="Arial" w:hAnsi="Arial" w:cs="Arial"/>
-                <w:b/>
-                <w:sz w:val="24"/>
-                <w:szCs w:val="24"/>
-              </w:rPr>
-              <w:t xml:space="preserve"> for column in </w:t>
-            </w:r>
-            <w:proofErr w:type="spellStart"/>
-            <w:r>
-              <w:rPr>
-                <w:rFonts w:ascii="Arial" w:hAnsi="Arial" w:cs="Arial"/>
-                <w:b/>
-                <w:sz w:val="24"/>
-                <w:szCs w:val="24"/>
-              </w:rPr>
-              <w:t>field.columns</w:t>
-            </w:r>
-            <w:proofErr w:type="spellEnd"/>
-            <w:r>
-              <w:rPr>
-                <w:rFonts w:ascii="Arial" w:hAnsi="Arial" w:cs="Arial"/>
-                <w:b/>
-                <w:sz w:val="24"/>
-                <w:szCs w:val="24"/>
-              </w:rPr>
-              <w:t>() %}</w:t>
+              <w:t>{%tc for column in field.columns() %}</w:t>
             </w:r>
           </w:p>
         </w:tc>
@@ -1738,47 +1179,7 @@
                 <w:sz w:val="24"/>
                 <w:szCs w:val="24"/>
               </w:rPr>
-              <w:t>{%</w:t>
-            </w:r>
-            <w:proofErr w:type="spellStart"/>
-            <w:r>
-              <w:rPr>
-                <w:rFonts w:ascii="Arial" w:hAnsi="Arial" w:cs="Arial"/>
-                <w:b/>
-                <w:sz w:val="24"/>
-                <w:szCs w:val="24"/>
-              </w:rPr>
-              <w:t>tc</w:t>
-            </w:r>
-            <w:proofErr w:type="spellEnd"/>
-            <w:r>
-              <w:rPr>
-                <w:rFonts w:ascii="Arial" w:hAnsi="Arial" w:cs="Arial"/>
-                <w:b/>
-                <w:sz w:val="24"/>
-                <w:szCs w:val="24"/>
-              </w:rPr>
-              <w:t xml:space="preserve"> </w:t>
-            </w:r>
-            <w:proofErr w:type="spellStart"/>
-            <w:r>
-              <w:rPr>
-                <w:rFonts w:ascii="Arial" w:hAnsi="Arial" w:cs="Arial"/>
-                <w:b/>
-                <w:sz w:val="24"/>
-                <w:szCs w:val="24"/>
-              </w:rPr>
-              <w:t>endfor</w:t>
-            </w:r>
-            <w:proofErr w:type="spellEnd"/>
-            <w:r>
-              <w:rPr>
-                <w:rFonts w:ascii="Arial" w:hAnsi="Arial" w:cs="Arial"/>
-                <w:b/>
-                <w:sz w:val="24"/>
-                <w:szCs w:val="24"/>
-              </w:rPr>
-              <w:t xml:space="preserve"> %}</w:t>
+              <w:t>{%tc endfor %}</w:t>
             </w:r>
           </w:p>
         </w:tc>
@@ -1802,25 +1203,7 @@
                 <w:sz w:val="24"/>
                 <w:szCs w:val="24"/>
               </w:rPr>
-              <w:t xml:space="preserve">{%tr for row in </w:t>
-            </w:r>
-            <w:proofErr w:type="spellStart"/>
-            <w:r>
-              <w:rPr>
-                <w:rFonts w:ascii="Arial" w:hAnsi="Arial" w:cs="Arial"/>
-                <w:sz w:val="24"/>
-                <w:szCs w:val="24"/>
-              </w:rPr>
-              <w:t>field.overflow_value</w:t>
-            </w:r>
-            <w:proofErr w:type="spellEnd"/>
-            <w:r>
-              <w:rPr>
-                <w:rFonts w:ascii="Arial" w:hAnsi="Arial" w:cs="Arial"/>
-                <w:sz w:val="24"/>
-                <w:szCs w:val="24"/>
-              </w:rPr>
-              <w:t>() %}</w:t>
+              <w:t>{%tr for row in field.overflow_value() %}</w:t>
             </w:r>
           </w:p>
         </w:tc>
@@ -1872,43 +1255,7 @@
                 <w:sz w:val="24"/>
                 <w:szCs w:val="24"/>
               </w:rPr>
-              <w:t>{%</w:t>
-            </w:r>
-            <w:proofErr w:type="spellStart"/>
-            <w:r>
-              <w:rPr>
-                <w:rFonts w:ascii="Arial" w:hAnsi="Arial" w:cs="Arial"/>
-                <w:sz w:val="24"/>
-                <w:szCs w:val="24"/>
-              </w:rPr>
-              <w:t>tc</w:t>
-            </w:r>
-            <w:proofErr w:type="spellEnd"/>
-            <w:r>
-              <w:rPr>
-                <w:rFonts w:ascii="Arial" w:hAnsi="Arial" w:cs="Arial"/>
-                <w:sz w:val="24"/>
-                <w:szCs w:val="24"/>
-              </w:rPr>
-              <w:t xml:space="preserve"> for column in </w:t>
-            </w:r>
-            <w:proofErr w:type="spellStart"/>
-            <w:r>
-              <w:rPr>
-                <w:rFonts w:ascii="Arial" w:hAnsi="Arial" w:cs="Arial"/>
-                <w:sz w:val="24"/>
-                <w:szCs w:val="24"/>
-              </w:rPr>
-              <w:t>field.columns</w:t>
-            </w:r>
-            <w:proofErr w:type="spellEnd"/>
-            <w:r>
-              <w:rPr>
-                <w:rFonts w:ascii="Arial" w:hAnsi="Arial" w:cs="Arial"/>
-                <w:sz w:val="24"/>
-                <w:szCs w:val="24"/>
-              </w:rPr>
-              <w:t>() %}</w:t>
+              <w:t>{%tc for column in field.columns() %}</w:t>
             </w:r>
           </w:p>
         </w:tc>
@@ -1930,25 +1277,7 @@
                 <w:sz w:val="24"/>
                 <w:szCs w:val="24"/>
               </w:rPr>
-              <w:t xml:space="preserve">{{ </w:t>
-            </w:r>
-            <w:proofErr w:type="spellStart"/>
-            <w:r>
-              <w:rPr>
-                <w:rFonts w:ascii="Arial" w:hAnsi="Arial" w:cs="Arial"/>
-                <w:sz w:val="24"/>
-                <w:szCs w:val="24"/>
-              </w:rPr>
-              <w:t>safeattr</w:t>
-            </w:r>
-            <w:proofErr w:type="spellEnd"/>
-            <w:r>
-              <w:rPr>
-                <w:rFonts w:ascii="Arial" w:hAnsi="Arial" w:cs="Arial"/>
-                <w:sz w:val="24"/>
-                <w:szCs w:val="24"/>
-              </w:rPr>
-              <w:t>(row, key(column)) }}</w:t>
+              <w:t>{{ safeattr(row, key(column)) }}</w:t>
             </w:r>
           </w:p>
         </w:tc>
@@ -1970,43 +1299,7 @@
                 <w:sz w:val="24"/>
                 <w:szCs w:val="24"/>
               </w:rPr>
-              <w:t>{%</w:t>
-            </w:r>
-            <w:proofErr w:type="spellStart"/>
-            <w:r>
-              <w:rPr>
-                <w:rFonts w:ascii="Arial" w:hAnsi="Arial" w:cs="Arial"/>
-                <w:sz w:val="24"/>
-                <w:szCs w:val="24"/>
-              </w:rPr>
-              <w:t>tc</w:t>
-            </w:r>
-            <w:proofErr w:type="spellEnd"/>
-            <w:r>
-              <w:rPr>
-                <w:rFonts w:ascii="Arial" w:hAnsi="Arial" w:cs="Arial"/>
-                <w:sz w:val="24"/>
-                <w:szCs w:val="24"/>
-              </w:rPr>
-              <w:t xml:space="preserve"> </w:t>
-            </w:r>
-            <w:proofErr w:type="spellStart"/>
-            <w:r>
-              <w:rPr>
-                <w:rFonts w:ascii="Arial" w:hAnsi="Arial" w:cs="Arial"/>
-                <w:sz w:val="24"/>
-                <w:szCs w:val="24"/>
-              </w:rPr>
-              <w:t>endfor</w:t>
-            </w:r>
-            <w:proofErr w:type="spellEnd"/>
-            <w:r>
-              <w:rPr>
-                <w:rFonts w:ascii="Arial" w:hAnsi="Arial" w:cs="Arial"/>
-                <w:sz w:val="24"/>
-                <w:szCs w:val="24"/>
-              </w:rPr>
-              <w:t xml:space="preserve"> %}</w:t>
+              <w:t>{%tc endfor %}</w:t>
             </w:r>
           </w:p>
         </w:tc>
@@ -2030,25 +1323,7 @@
                 <w:sz w:val="24"/>
                 <w:szCs w:val="24"/>
               </w:rPr>
-              <w:t xml:space="preserve">{%tr </w:t>
-            </w:r>
-            <w:proofErr w:type="spellStart"/>
-            <w:r>
-              <w:rPr>
-                <w:rFonts w:ascii="Arial" w:hAnsi="Arial" w:cs="Arial"/>
-                <w:sz w:val="24"/>
-                <w:szCs w:val="24"/>
-              </w:rPr>
-              <w:t>endfor</w:t>
-            </w:r>
-            <w:proofErr w:type="spellEnd"/>
-            <w:r>
-              <w:rPr>
-                <w:rFonts w:ascii="Arial" w:hAnsi="Arial" w:cs="Arial"/>
-                <w:sz w:val="24"/>
-                <w:szCs w:val="24"/>
-              </w:rPr>
-              <w:t xml:space="preserve"> %}</w:t>
+              <w:t>{%tr endfor %}</w:t>
             </w:r>
           </w:p>
         </w:tc>
@@ -2105,43 +1380,7 @@
           <w:sz w:val="24"/>
           <w:szCs w:val="24"/>
         </w:rPr>
-        <w:t xml:space="preserve">{%p </w:t>
-      </w:r>
-      <w:proofErr w:type="spellStart"/>
-      <w:r>
-        <w:rPr>
-          <w:rFonts w:ascii="Arial" w:hAnsi="Arial" w:cs="Arial"/>
-          <w:sz w:val="24"/>
-          <w:szCs w:val="24"/>
-        </w:rPr>
-        <w:t>elif</w:t>
-      </w:r>
-      <w:proofErr w:type="spellEnd"/>
-      <w:r>
-        <w:rPr>
-          <w:rFonts w:ascii="Arial" w:hAnsi="Arial" w:cs="Arial"/>
-          <w:sz w:val="24"/>
-          <w:szCs w:val="24"/>
-        </w:rPr>
-        <w:t xml:space="preserve"> </w:t>
-      </w:r>
-      <w:proofErr w:type="spellStart"/>
-      <w:r>
-        <w:rPr>
-          <w:rFonts w:ascii="Arial" w:hAnsi="Arial" w:cs="Arial"/>
-          <w:sz w:val="24"/>
-          <w:szCs w:val="24"/>
-        </w:rPr>
-        <w:t>field.is_list</w:t>
-      </w:r>
-      <w:proofErr w:type="spellEnd"/>
-      <w:r>
-        <w:rPr>
-          <w:rFonts w:ascii="Arial" w:hAnsi="Arial" w:cs="Arial"/>
-          <w:sz w:val="24"/>
-          <w:szCs w:val="24"/>
-        </w:rPr>
-        <w:t>() %}</w:t>
+        <w:t>{%p elif field.is_list() %}</w:t>
       </w:r>
     </w:p>
     <w:p>
@@ -2168,25 +1407,7 @@
           <w:sz w:val="24"/>
           <w:szCs w:val="24"/>
         </w:rPr>
-        <w:t xml:space="preserve">{{ </w:t>
-      </w:r>
-      <w:proofErr w:type="spellStart"/>
-      <w:r>
-        <w:rPr>
-          <w:rFonts w:ascii="Arial" w:hAnsi="Arial" w:cs="Arial"/>
-          <w:sz w:val="24"/>
-          <w:szCs w:val="24"/>
-        </w:rPr>
-        <w:t>field.label</w:t>
-      </w:r>
-      <w:proofErr w:type="spellEnd"/>
-      <w:r>
-        <w:rPr>
-          <w:rFonts w:ascii="Arial" w:hAnsi="Arial" w:cs="Arial"/>
-          <w:sz w:val="24"/>
-          <w:szCs w:val="24"/>
-        </w:rPr>
-        <w:t xml:space="preserve"> }}</w:t>
+        <w:t>{{ field.label }}</w:t>
       </w:r>
     </w:p>
     <w:p>
@@ -2208,25 +1429,7 @@
           <w:sz w:val="24"/>
           <w:szCs w:val="24"/>
         </w:rPr>
-        <w:t xml:space="preserve">{%p for item in </w:t>
-      </w:r>
-      <w:proofErr w:type="spellStart"/>
-      <w:r>
-        <w:rPr>
-          <w:rFonts w:ascii="Arial" w:hAnsi="Arial" w:cs="Arial"/>
-          <w:sz w:val="24"/>
-          <w:szCs w:val="24"/>
-        </w:rPr>
-        <w:t>field.overflow_value</w:t>
-      </w:r>
-      <w:proofErr w:type="spellEnd"/>
-      <w:r>
-        <w:rPr>
-          <w:rFonts w:ascii="Arial" w:hAnsi="Arial" w:cs="Arial"/>
-          <w:sz w:val="24"/>
-          <w:szCs w:val="24"/>
-        </w:rPr>
-        <w:t>() %}</w:t>
+        <w:t>{%p for item in field.overflow_value() %}</w:t>
       </w:r>
     </w:p>
     <w:p>
@@ -2270,25 +1473,7 @@
           <w:sz w:val="24"/>
           <w:szCs w:val="24"/>
         </w:rPr>
-        <w:t xml:space="preserve">{%p </w:t>
-      </w:r>
-      <w:proofErr w:type="spellStart"/>
-      <w:r>
-        <w:rPr>
-          <w:rFonts w:ascii="Arial" w:hAnsi="Arial" w:cs="Arial"/>
-          <w:sz w:val="24"/>
-          <w:szCs w:val="24"/>
-        </w:rPr>
-        <w:t>endfor</w:t>
-      </w:r>
-      <w:proofErr w:type="spellEnd"/>
-      <w:r>
-        <w:rPr>
-          <w:rFonts w:ascii="Arial" w:hAnsi="Arial" w:cs="Arial"/>
-          <w:sz w:val="24"/>
-          <w:szCs w:val="24"/>
-        </w:rPr>
-        <w:t xml:space="preserve"> %}</w:t>
+        <w:t>{%p endfor %}</w:t>
       </w:r>
     </w:p>
     <w:p>
@@ -2332,89 +1517,15 @@
           <w:sz w:val="24"/>
           <w:szCs w:val="24"/>
         </w:rPr>
-        <w:t xml:space="preserve">{{ </w:t>
-      </w:r>
-      <w:proofErr w:type="spellStart"/>
-      <w:r>
-        <w:rPr>
-          <w:rFonts w:ascii="Arial" w:hAnsi="Arial" w:cs="Arial"/>
-          <w:b/>
-          <w:sz w:val="24"/>
-          <w:szCs w:val="24"/>
-        </w:rPr>
-        <w:t>field.label</w:t>
-      </w:r>
-      <w:proofErr w:type="spellEnd"/>
-      <w:r>
-        <w:rPr>
-          <w:rFonts w:ascii="Arial" w:hAnsi="Arial" w:cs="Arial"/>
-          <w:b/>
-          <w:sz w:val="24"/>
-          <w:szCs w:val="24"/>
-        </w:rPr>
-        <w:t xml:space="preserve"> }}</w:t>
-      </w:r>
-      <w:r>
-        <w:rPr>
-          <w:rFonts w:ascii="Arial" w:hAnsi="Arial" w:cs="Arial"/>
-          <w:sz w:val="24"/>
-          <w:szCs w:val="24"/>
-        </w:rPr>
-        <w:t xml:space="preserve">: {{ </w:t>
-      </w:r>
-      <w:proofErr w:type="spellStart"/>
-      <w:r>
-        <w:rPr>
-          <w:rFonts w:ascii="Arial" w:hAnsi="Arial" w:cs="Arial"/>
-          <w:sz w:val="24"/>
-          <w:szCs w:val="24"/>
-        </w:rPr>
-        <w:t>field.overflow_value</w:t>
-      </w:r>
-      <w:proofErr w:type="spellEnd"/>
-      <w:r>
-        <w:rPr>
-          <w:rFonts w:ascii="Arial" w:hAnsi="Arial" w:cs="Arial"/>
-          <w:sz w:val="24"/>
-          <w:szCs w:val="24"/>
-        </w:rPr>
-        <w:t>(</w:t>
-      </w:r>
-      <w:proofErr w:type="spellStart"/>
-      <w:r>
-        <w:rPr>
-          <w:rFonts w:ascii="Arial" w:hAnsi="Arial" w:cs="Arial"/>
-          <w:sz w:val="24"/>
-          <w:szCs w:val="24"/>
-        </w:rPr>
-        <w:t>overflow_message</w:t>
-      </w:r>
-      <w:proofErr w:type="spellEnd"/>
-      <w:r>
-        <w:rPr>
-          <w:rFonts w:ascii="Arial" w:hAnsi="Arial" w:cs="Arial"/>
-          <w:sz w:val="24"/>
-          <w:szCs w:val="24"/>
-        </w:rPr>
-        <w:t xml:space="preserve">= </w:t>
-      </w:r>
-      <w:proofErr w:type="spellStart"/>
-      <w:r>
-        <w:rPr>
-          <w:rFonts w:ascii="Arial" w:hAnsi="Arial" w:cs="Arial"/>
-          <w:sz w:val="24"/>
-          <w:szCs w:val="24"/>
-        </w:rPr>
-        <w:t>RFAaffidavit.default_overflow_message</w:t>
-      </w:r>
-      <w:proofErr w:type="spellEnd"/>
-      <w:r>
-        <w:rPr>
-          <w:rFonts w:ascii="Arial" w:hAnsi="Arial" w:cs="Arial"/>
-          <w:sz w:val="24"/>
-          <w:szCs w:val="24"/>
-        </w:rPr>
-        <w:t>) }}</w:t>
+        <w:t>{{ field.label }}</w:t>
+      </w:r>
+      <w:r>
+        <w:rPr>
+          <w:rFonts w:ascii="Arial" w:hAnsi="Arial" w:cs="Arial"/>
+          <w:sz w:val="24"/>
+          <w:szCs w:val="24"/>
+        </w:rPr>
+        <w:t>: {{ field.overflow_value(overflow_message= RFAaffidavit.default_overflow_message) }}</w:t>
       </w:r>
     </w:p>
     <w:p>
@@ -2448,25 +1559,7 @@
           <w:sz w:val="24"/>
           <w:szCs w:val="24"/>
         </w:rPr>
-        <w:t xml:space="preserve">{%p </w:t>
-      </w:r>
-      <w:proofErr w:type="spellStart"/>
-      <w:r>
-        <w:rPr>
-          <w:rFonts w:ascii="Arial" w:hAnsi="Arial" w:cs="Arial"/>
-          <w:sz w:val="24"/>
-          <w:szCs w:val="24"/>
-        </w:rPr>
-        <w:t>endfor</w:t>
-      </w:r>
-      <w:proofErr w:type="spellEnd"/>
-      <w:r>
-        <w:rPr>
-          <w:rFonts w:ascii="Arial" w:hAnsi="Arial" w:cs="Arial"/>
-          <w:sz w:val="24"/>
-          <w:szCs w:val="24"/>
-        </w:rPr>
-        <w:t xml:space="preserve"> %}</w:t>
+        <w:t>{%p endfor %}</w:t>
       </w:r>
     </w:p>
     <w:p>

</xml_diff>